<commit_message>
Checkpoint 2: Reactor Design and Analysis
</commit_message>
<xml_diff>
--- a/Term Project - WORKING.docx
+++ b/Term Project - WORKING.docx
@@ -808,7 +808,7 @@
           <w:r>
             <w:fldChar w:fldCharType="separate"/>
           </w:r>
-          <w:hyperlink w:anchor="_Toc224082091" w:history="1">
+          <w:hyperlink w:anchor="_Toc224148620" w:history="1">
             <w:r>
               <w:rPr>
                 <w:rStyle w:val="Hyperlink"/>
@@ -833,7 +833,7 @@
                 <w:rFonts w:asciiTheme="majorBidi" w:hAnsiTheme="majorBidi" w:cstheme="majorBidi"/>
                 <w:noProof/>
               </w:rPr>
-              <w:t>Process Description (a short introduction, suggest no more than 1 page)</w:t>
+              <w:t>Process Description</w:t>
             </w:r>
             <w:r>
               <w:rPr>
@@ -854,7 +854,7 @@
                 <w:noProof/>
                 <w:webHidden/>
               </w:rPr>
-              <w:instrText xml:space="preserve"> PAGEREF _Toc224082091 \h </w:instrText>
+              <w:instrText xml:space="preserve"> PAGEREF _Toc224148620 \h </w:instrText>
             </w:r>
             <w:r>
               <w:rPr>
@@ -896,7 +896,7 @@
               <w14:ligatures w14:val="standardContextual"/>
             </w:rPr>
           </w:pPr>
-          <w:hyperlink w:anchor="_Toc224082092" w:history="1">
+          <w:hyperlink w:anchor="_Toc224148621" w:history="1">
             <w:r>
               <w:rPr>
                 <w:rStyle w:val="Hyperlink"/>
@@ -941,7 +941,7 @@
                 <w:noProof/>
                 <w:webHidden/>
               </w:rPr>
-              <w:instrText xml:space="preserve"> PAGEREF _Toc224082092 \h </w:instrText>
+              <w:instrText xml:space="preserve"> PAGEREF _Toc224148621 \h </w:instrText>
             </w:r>
             <w:r>
               <w:rPr>
@@ -983,7 +983,7 @@
               <w14:ligatures w14:val="standardContextual"/>
             </w:rPr>
           </w:pPr>
-          <w:hyperlink w:anchor="_Toc224082093" w:history="1">
+          <w:hyperlink w:anchor="_Toc224148622" w:history="1">
             <w:r>
               <w:rPr>
                 <w:rStyle w:val="Hyperlink"/>
@@ -1029,7 +1029,7 @@
                 <w:noProof/>
                 <w:webHidden/>
               </w:rPr>
-              <w:instrText xml:space="preserve"> PAGEREF _Toc224082093 \h </w:instrText>
+              <w:instrText xml:space="preserve"> PAGEREF _Toc224148622 \h </w:instrText>
             </w:r>
             <w:r>
               <w:rPr>
@@ -1071,7 +1071,7 @@
               <w14:ligatures w14:val="standardContextual"/>
             </w:rPr>
           </w:pPr>
-          <w:hyperlink w:anchor="_Toc224082094" w:history="1">
+          <w:hyperlink w:anchor="_Toc224148623" w:history="1">
             <w:r>
               <w:rPr>
                 <w:rStyle w:val="Hyperlink"/>
@@ -1117,7 +1117,7 @@
                 <w:noProof/>
                 <w:webHidden/>
               </w:rPr>
-              <w:instrText xml:space="preserve"> PAGEREF _Toc224082094 \h </w:instrText>
+              <w:instrText xml:space="preserve"> PAGEREF _Toc224148623 \h </w:instrText>
             </w:r>
             <w:r>
               <w:rPr>
@@ -1159,7 +1159,7 @@
               <w14:ligatures w14:val="standardContextual"/>
             </w:rPr>
           </w:pPr>
-          <w:hyperlink w:anchor="_Toc224082095" w:history="1">
+          <w:hyperlink w:anchor="_Toc224148624" w:history="1">
             <w:r>
               <w:rPr>
                 <w:rStyle w:val="Hyperlink"/>
@@ -1205,7 +1205,7 @@
                 <w:noProof/>
                 <w:webHidden/>
               </w:rPr>
-              <w:instrText xml:space="preserve"> PAGEREF _Toc224082095 \h </w:instrText>
+              <w:instrText xml:space="preserve"> PAGEREF _Toc224148624 \h </w:instrText>
             </w:r>
             <w:r>
               <w:rPr>
@@ -1247,10 +1247,11 @@
               <w14:ligatures w14:val="standardContextual"/>
             </w:rPr>
           </w:pPr>
-          <w:hyperlink w:anchor="_Toc224082096" w:history="1">
+          <w:hyperlink w:anchor="_Toc224148625" w:history="1">
             <w:r>
               <w:rPr>
                 <w:rStyle w:val="Hyperlink"/>
+                <w:rFonts w:asciiTheme="majorBidi" w:hAnsiTheme="majorBidi" w:cstheme="majorBidi"/>
                 <w:noProof/>
               </w:rPr>
               <w:t>6.</w:t>
@@ -1271,7 +1272,7 @@
                 <w:rFonts w:asciiTheme="majorBidi" w:hAnsiTheme="majorBidi" w:cstheme="majorBidi"/>
                 <w:noProof/>
               </w:rPr>
-              <w:t>Reactor Analysis [eg. design spec, sensitivity analysis, calculator block, recycle stream, optimization])</w:t>
+              <w:t>Reactor Analysis</w:t>
             </w:r>
             <w:r>
               <w:rPr>
@@ -1292,7 +1293,7 @@
                 <w:noProof/>
                 <w:webHidden/>
               </w:rPr>
-              <w:instrText xml:space="preserve"> PAGEREF _Toc224082096 \h </w:instrText>
+              <w:instrText xml:space="preserve"> PAGEREF _Toc224148625 \h </w:instrText>
             </w:r>
             <w:r>
               <w:rPr>
@@ -1313,6 +1314,170 @@
                 <w:webHidden/>
               </w:rPr>
               <w:t>7</w:t>
+            </w:r>
+            <w:r>
+              <w:rPr>
+                <w:noProof/>
+                <w:webHidden/>
+              </w:rPr>
+              <w:fldChar w:fldCharType="end"/>
+            </w:r>
+          </w:hyperlink>
+        </w:p>
+        <w:p>
+          <w:pPr>
+            <w:pStyle w:val="TOC3"/>
+            <w:tabs>
+              <w:tab w:val="left" w:pos="1200"/>
+              <w:tab w:val="right" w:leader="dot" w:pos="9962"/>
+            </w:tabs>
+            <w:rPr>
+              <w:noProof/>
+            </w:rPr>
+          </w:pPr>
+          <w:hyperlink w:anchor="_Toc224148626" w:history="1">
+            <w:r>
+              <w:rPr>
+                <w:rStyle w:val="Hyperlink"/>
+                <w:noProof/>
+              </w:rPr>
+              <w:t>6.1</w:t>
+            </w:r>
+            <w:r>
+              <w:rPr>
+                <w:noProof/>
+              </w:rPr>
+              <w:tab/>
+            </w:r>
+            <w:r>
+              <w:rPr>
+                <w:rStyle w:val="Hyperlink"/>
+                <w:noProof/>
+              </w:rPr>
+              <w:t>Reactor Size</w:t>
+            </w:r>
+            <w:r>
+              <w:rPr>
+                <w:noProof/>
+                <w:webHidden/>
+              </w:rPr>
+              <w:tab/>
+            </w:r>
+            <w:r>
+              <w:rPr>
+                <w:noProof/>
+                <w:webHidden/>
+              </w:rPr>
+              <w:fldChar w:fldCharType="begin"/>
+            </w:r>
+            <w:r>
+              <w:rPr>
+                <w:noProof/>
+                <w:webHidden/>
+              </w:rPr>
+              <w:instrText xml:space="preserve"> PAGEREF _Toc224148626 \h </w:instrText>
+            </w:r>
+            <w:r>
+              <w:rPr>
+                <w:noProof/>
+                <w:webHidden/>
+              </w:rPr>
+            </w:r>
+            <w:r>
+              <w:rPr>
+                <w:noProof/>
+                <w:webHidden/>
+              </w:rPr>
+              <w:fldChar w:fldCharType="separate"/>
+            </w:r>
+            <w:r>
+              <w:rPr>
+                <w:noProof/>
+                <w:webHidden/>
+              </w:rPr>
+              <w:t>7</w:t>
+            </w:r>
+            <w:r>
+              <w:rPr>
+                <w:noProof/>
+                <w:webHidden/>
+              </w:rPr>
+              <w:fldChar w:fldCharType="end"/>
+            </w:r>
+          </w:hyperlink>
+        </w:p>
+        <w:p>
+          <w:pPr>
+            <w:pStyle w:val="TOC3"/>
+            <w:tabs>
+              <w:tab w:val="left" w:pos="1200"/>
+              <w:tab w:val="right" w:leader="dot" w:pos="9962"/>
+            </w:tabs>
+            <w:rPr>
+              <w:noProof/>
+            </w:rPr>
+          </w:pPr>
+          <w:hyperlink w:anchor="_Toc224148627" w:history="1">
+            <w:r>
+              <w:rPr>
+                <w:rStyle w:val="Hyperlink"/>
+                <w:noProof/>
+              </w:rPr>
+              <w:t>6.2</w:t>
+            </w:r>
+            <w:r>
+              <w:rPr>
+                <w:noProof/>
+              </w:rPr>
+              <w:tab/>
+            </w:r>
+            <w:r>
+              <w:rPr>
+                <w:rStyle w:val="Hyperlink"/>
+                <w:noProof/>
+              </w:rPr>
+              <w:t>Selected Reactor Specification</w:t>
+            </w:r>
+            <w:r>
+              <w:rPr>
+                <w:noProof/>
+                <w:webHidden/>
+              </w:rPr>
+              <w:tab/>
+            </w:r>
+            <w:r>
+              <w:rPr>
+                <w:noProof/>
+                <w:webHidden/>
+              </w:rPr>
+              <w:fldChar w:fldCharType="begin"/>
+            </w:r>
+            <w:r>
+              <w:rPr>
+                <w:noProof/>
+                <w:webHidden/>
+              </w:rPr>
+              <w:instrText xml:space="preserve"> PAGEREF _Toc224148627 \h </w:instrText>
+            </w:r>
+            <w:r>
+              <w:rPr>
+                <w:noProof/>
+                <w:webHidden/>
+              </w:rPr>
+            </w:r>
+            <w:r>
+              <w:rPr>
+                <w:noProof/>
+                <w:webHidden/>
+              </w:rPr>
+              <w:fldChar w:fldCharType="separate"/>
+            </w:r>
+            <w:r>
+              <w:rPr>
+                <w:noProof/>
+                <w:webHidden/>
+              </w:rPr>
+              <w:t>8</w:t>
             </w:r>
             <w:r>
               <w:rPr>
@@ -1334,7 +1499,7 @@
               <w14:ligatures w14:val="standardContextual"/>
             </w:rPr>
           </w:pPr>
-          <w:hyperlink w:anchor="_Toc224082097" w:history="1">
+          <w:hyperlink w:anchor="_Toc224148628" w:history="1">
             <w:r>
               <w:rPr>
                 <w:rStyle w:val="Hyperlink"/>
@@ -1379,7 +1544,7 @@
                 <w:noProof/>
                 <w:webHidden/>
               </w:rPr>
-              <w:instrText xml:space="preserve"> PAGEREF _Toc224082097 \h </w:instrText>
+              <w:instrText xml:space="preserve"> PAGEREF _Toc224148628 \h </w:instrText>
             </w:r>
             <w:r>
               <w:rPr>
@@ -1399,7 +1564,7 @@
                 <w:noProof/>
                 <w:webHidden/>
               </w:rPr>
-              <w:t>7</w:t>
+              <w:t>8</w:t>
             </w:r>
             <w:r>
               <w:rPr>
@@ -1421,7 +1586,7 @@
               <w14:ligatures w14:val="standardContextual"/>
             </w:rPr>
           </w:pPr>
-          <w:hyperlink w:anchor="_Toc224082098" w:history="1">
+          <w:hyperlink w:anchor="_Toc224148629" w:history="1">
             <w:r>
               <w:rPr>
                 <w:rStyle w:val="Hyperlink"/>
@@ -1466,7 +1631,7 @@
                 <w:noProof/>
                 <w:webHidden/>
               </w:rPr>
-              <w:instrText xml:space="preserve"> PAGEREF _Toc224082098 \h </w:instrText>
+              <w:instrText xml:space="preserve"> PAGEREF _Toc224148629 \h </w:instrText>
             </w:r>
             <w:r>
               <w:rPr>
@@ -1486,7 +1651,7 @@
                 <w:noProof/>
                 <w:webHidden/>
               </w:rPr>
-              <w:t>7</w:t>
+              <w:t>8</w:t>
             </w:r>
             <w:r>
               <w:rPr>
@@ -1508,7 +1673,7 @@
               <w14:ligatures w14:val="standardContextual"/>
             </w:rPr>
           </w:pPr>
-          <w:hyperlink w:anchor="_Toc224082099" w:history="1">
+          <w:hyperlink w:anchor="_Toc224148630" w:history="1">
             <w:r>
               <w:rPr>
                 <w:rStyle w:val="Hyperlink"/>
@@ -1553,7 +1718,7 @@
                 <w:noProof/>
                 <w:webHidden/>
               </w:rPr>
-              <w:instrText xml:space="preserve"> PAGEREF _Toc224082099 \h </w:instrText>
+              <w:instrText xml:space="preserve"> PAGEREF _Toc224148630 \h </w:instrText>
             </w:r>
             <w:r>
               <w:rPr>
@@ -1573,7 +1738,7 @@
                 <w:noProof/>
                 <w:webHidden/>
               </w:rPr>
-              <w:t>7</w:t>
+              <w:t>8</w:t>
             </w:r>
             <w:r>
               <w:rPr>
@@ -1595,7 +1760,7 @@
               <w14:ligatures w14:val="standardContextual"/>
             </w:rPr>
           </w:pPr>
-          <w:hyperlink w:anchor="_Toc224082100" w:history="1">
+          <w:hyperlink w:anchor="_Toc224148631" w:history="1">
             <w:r>
               <w:rPr>
                 <w:rStyle w:val="Hyperlink"/>
@@ -1640,7 +1805,7 @@
                 <w:noProof/>
                 <w:webHidden/>
               </w:rPr>
-              <w:instrText xml:space="preserve"> PAGEREF _Toc224082100 \h </w:instrText>
+              <w:instrText xml:space="preserve"> PAGEREF _Toc224148631 \h </w:instrText>
             </w:r>
             <w:r>
               <w:rPr>
@@ -1660,7 +1825,7 @@
                 <w:noProof/>
                 <w:webHidden/>
               </w:rPr>
-              <w:t>7</w:t>
+              <w:t>8</w:t>
             </w:r>
             <w:r>
               <w:rPr>
@@ -1682,7 +1847,7 @@
               <w14:ligatures w14:val="standardContextual"/>
             </w:rPr>
           </w:pPr>
-          <w:hyperlink w:anchor="_Toc224082101" w:history="1">
+          <w:hyperlink w:anchor="_Toc224148632" w:history="1">
             <w:r>
               <w:rPr>
                 <w:rStyle w:val="Hyperlink"/>
@@ -1727,7 +1892,7 @@
                 <w:noProof/>
                 <w:webHidden/>
               </w:rPr>
-              <w:instrText xml:space="preserve"> PAGEREF _Toc224082101 \h </w:instrText>
+              <w:instrText xml:space="preserve"> PAGEREF _Toc224148632 \h </w:instrText>
             </w:r>
             <w:r>
               <w:rPr>
@@ -1747,7 +1912,7 @@
                 <w:noProof/>
                 <w:webHidden/>
               </w:rPr>
-              <w:t>7</w:t>
+              <w:t>8</w:t>
             </w:r>
             <w:r>
               <w:rPr>
@@ -1769,7 +1934,7 @@
               <w14:ligatures w14:val="standardContextual"/>
             </w:rPr>
           </w:pPr>
-          <w:hyperlink w:anchor="_Toc224082102" w:history="1">
+          <w:hyperlink w:anchor="_Toc224148633" w:history="1">
             <w:r>
               <w:rPr>
                 <w:rStyle w:val="Hyperlink"/>
@@ -1814,7 +1979,7 @@
                 <w:noProof/>
                 <w:webHidden/>
               </w:rPr>
-              <w:instrText xml:space="preserve"> PAGEREF _Toc224082102 \h </w:instrText>
+              <w:instrText xml:space="preserve"> PAGEREF _Toc224148633 \h </w:instrText>
             </w:r>
             <w:r>
               <w:rPr>
@@ -1834,7 +1999,7 @@
                 <w:noProof/>
                 <w:webHidden/>
               </w:rPr>
-              <w:t>7</w:t>
+              <w:t>8</w:t>
             </w:r>
             <w:r>
               <w:rPr>
@@ -1856,7 +2021,7 @@
               <w14:ligatures w14:val="standardContextual"/>
             </w:rPr>
           </w:pPr>
-          <w:hyperlink w:anchor="_Toc224082103" w:history="1">
+          <w:hyperlink w:anchor="_Toc224148634" w:history="1">
             <w:r>
               <w:rPr>
                 <w:rStyle w:val="Hyperlink"/>
@@ -1900,7 +2065,7 @@
                 <w:noProof/>
                 <w:webHidden/>
               </w:rPr>
-              <w:instrText xml:space="preserve"> PAGEREF _Toc224082103 \h </w:instrText>
+              <w:instrText xml:space="preserve"> PAGEREF _Toc224148634 \h </w:instrText>
             </w:r>
             <w:r>
               <w:rPr>
@@ -1920,7 +2085,7 @@
                 <w:noProof/>
                 <w:webHidden/>
               </w:rPr>
-              <w:t>9</w:t>
+              <w:t>10</w:t>
             </w:r>
             <w:r>
               <w:rPr>
@@ -1932,6 +2097,13 @@
           </w:hyperlink>
         </w:p>
         <w:p>
+          <w:pPr>
+            <w:rPr>
+              <w:b/>
+              <w:bCs/>
+              <w:noProof/>
+            </w:rPr>
+          </w:pPr>
           <w:r>
             <w:rPr>
               <w:b/>
@@ -1944,37 +2116,21 @@
       </w:sdtContent>
     </w:sdt>
     <w:p>
-      <w:pPr>
-        <w:spacing w:after="160" w:line="259" w:lineRule="auto"/>
-        <w:rPr>
-          <w:rFonts w:asciiTheme="majorBidi" w:eastAsia="SimSun" w:hAnsiTheme="majorBidi" w:cstheme="majorBidi"/>
-          <w:b/>
-          <w:bCs/>
-          <w:sz w:val="36"/>
-          <w:szCs w:val="26"/>
-        </w:rPr>
-      </w:pPr>
       <w:r>
         <w:rPr>
           <w:rFonts w:asciiTheme="majorBidi" w:hAnsiTheme="majorBidi" w:cstheme="majorBidi"/>
         </w:rPr>
-        <w:t>Update the table above by right clicking and selecting “Update Field”</w:t>
-      </w:r>
-      <w:r>
+        <w:br w:type="page"/>
+      </w:r>
+    </w:p>
+    <w:p>
+      <w:pPr>
+        <w:pStyle w:val="Heading2"/>
         <w:rPr>
           <w:rFonts w:asciiTheme="majorBidi" w:hAnsiTheme="majorBidi" w:cstheme="majorBidi"/>
         </w:rPr>
-        <w:br w:type="page"/>
-      </w:r>
-    </w:p>
-    <w:p>
-      <w:pPr>
-        <w:pStyle w:val="Heading2"/>
-        <w:rPr>
-          <w:rFonts w:asciiTheme="majorBidi" w:hAnsiTheme="majorBidi" w:cstheme="majorBidi"/>
-        </w:rPr>
-      </w:pPr>
-      <w:bookmarkStart w:id="1" w:name="_Toc224082091"/>
+      </w:pPr>
+      <w:bookmarkStart w:id="1" w:name="_Toc224148620"/>
       <w:r>
         <w:rPr>
           <w:rFonts w:asciiTheme="majorBidi" w:hAnsiTheme="majorBidi" w:cstheme="majorBidi"/>
@@ -1992,7 +2148,10 @@
     </w:p>
     <w:p>
       <w:r>
-        <w:t xml:space="preserve">Aniline is a simple primary aromatic amines used for many applications, including polyurethane intermediate, rubber chemicals, and even rocket fuels </w:t>
+        <w:t>Aniline is a simple primary aromatic amine used for many applications, including polyurethane intermediate, rubber chemicals, and even rocket fuels</w:t>
+      </w:r>
+      <w:r>
+        <w:t xml:space="preserve"> </w:t>
       </w:r>
       <w:r>
         <w:fldChar w:fldCharType="begin"/>
@@ -2010,12 +2169,42 @@
         <w:fldChar w:fldCharType="end"/>
       </w:r>
       <w:r>
-        <w:t xml:space="preserve">. The primary way of aniline production is the hydrogenation of nitrobenzene. This process can be done in both vapour and liquid phase across a range of different catalysts </w:t>
+        <w:t xml:space="preserve">. </w:t>
+      </w:r>
+      <w:r>
+        <w:t>The primary way of aniline production is the hydrogenation of nitrobenzene, accounting for 85% of global aniline production</w:t>
+      </w:r>
+      <w:r>
+        <w:t xml:space="preserve"> </w:t>
       </w:r>
       <w:r>
         <w:fldChar w:fldCharType="begin"/>
       </w:r>
       <w:r>
+        <w:instrText xml:space="preserve"> ADDIN ZOTERO_ITEM CSL_CITATION {"citationID":"JmVY68hl","properties":{"formattedCitation":"[2]","plainCitation":"[2]","noteIndex":0},"citationItems":[{"id":901,"uris":["http://zotero.org/users/15288956/items/WBHRAL9M"],"itemData":{"id":901,"type":"chapter","abstract":"Selective catalytic hydrogenation of nitroarenes is of great importance for dyestuff and pharmaceutical industry. In this chapter, the main industrial methods for aniline production and aniline market are firstly reviewed. Moreover, breakthroughs in the development of multiple catalytic technologies in the past decade are summarized, including direct hydrogenation using hydrogen; transfer hydrogenation using reductive agents; photocatalytic hydrogenation using hole scavenger; electrocatalytic hydrogenation accompanied by water oxidation. For direct catalytic hydrogenation, representative catalysts include metal, metal oxide/sulfide/carbides/nitrides/boride, and functional carbon material, and the crucial factors to tune their activity and selectivity are discussed such as metal–support interaction, size effect, alloy effect, defect engineering, and so on. Catalytic transfer hydrogenation, photocatalytic and electrocatalytic hydrogenation, these catalysts abstract hydrogen species from the hydrogen donor and stabilizes it on the catalyst surface, restricting active H* recombination, and then the active hydrogen species can be promptly transferred to nitroarenes for the hydrogenation. It is worth mentioning that the light harvesting and charge separation of photocatalysts and the conductivity of electrocatalysts should also be considered together for the overall performance.","container-title":"Industrial Arene Chemistry","DOI":"10.1002/9783527827992.ch50","ISBN":"978-3-527-82799-2","language":"en","note":"section: 50\n_eprint: https://onlinelibrary.wiley.com/doi/pdf/10.1002/9783527827992.ch50","page":"1479-1524","publisher":"John Wiley &amp; Sons, Ltd","source":"Wiley Online Library","title":"Selective Catalytic Hydrogenation of Nitroarenes to Anilines","URL":"https://onlinelibrary.wiley.com/doi/abs/10.1002/9783527827992.ch50","author":[{"family":"Gao","given":"Ruijie"},{"family":"Peng","given":"Chong"},{"family":"Zou","given":"Ji-Jun"}],"accessed":{"date-parts":[["2026",2,11]]},"issued":{"date-parts":[["2023"]]}}}],"schema":"https://github.com/citation-style-language/schema/raw/master/csl-citation.json"} </w:instrText>
+      </w:r>
+      <w:r>
+        <w:fldChar w:fldCharType="separate"/>
+      </w:r>
+      <w:r>
+        <w:t>[2]</w:t>
+      </w:r>
+      <w:r>
+        <w:fldChar w:fldCharType="end"/>
+      </w:r>
+      <w:r>
+        <w:t xml:space="preserve">. </w:t>
+      </w:r>
+      <w:r>
+        <w:t>This process can be carried out in both vapour and liquid phases across a range of different catalysts</w:t>
+      </w:r>
+      <w:r>
+        <w:t xml:space="preserve"> </w:t>
+      </w:r>
+      <w:r>
+        <w:fldChar w:fldCharType="begin"/>
+      </w:r>
+      <w:r>
         <w:instrText xml:space="preserve"> ADDIN ZOTERO_ITEM CSL_CITATION {"citationID":"I0WHjvxE","properties":{"formattedCitation":"[2]","plainCitation":"[2]","noteIndex":0},"citationItems":[{"id":901,"uris":["http://zotero.org/users/15288956/items/WBHRAL9M"],"itemData":{"id":901,"type":"chapter","abstract":"Selective catalytic hydrogenation of nitroarenes is of great importance for dyestuff and pharmaceutical industry. In this chapter, the main industrial methods for aniline production and aniline market are firstly reviewed. Moreover, breakthroughs in the development of multiple catalytic technologies in the past decade are summarized, including direct hydrogenation using hydrogen; transfer hydrogenation using reductive agents; photocatalytic hydrogenation using hole scavenger; electrocatalytic hydrogenation accompanied by water oxidation. For direct catalytic hydrogenation, representative catalysts include metal, metal oxide/sulfide/carbides/nitrides/boride, and functional carbon material, and the crucial factors to tune their activity and selectivity are discussed such as metal–support interaction, size effect, alloy effect, defect engineering, and so on. Catalytic transfer hydrogenation, photocatalytic and electrocatalytic hydrogenation, these catalysts abstract hydrogen species from the hydrogen donor and stabilizes it on the catalyst surface, restricting active H* recombination, and then the active hydrogen species can be promptly transferred to nitroarenes for the hydrogenation. It is worth mentioning that the light harvesting and charge separation of photocatalysts and the conductivity of electrocatalysts should also be considered together for the overall performance.","container-title":"Industrial Arene Chemistry","DOI":"10.1002/9783527827992.ch50","ISBN":"978-3-527-82799-2","language":"en","note":"section: 50\n_eprint: https://onlinelibrary.wiley.com/doi/pdf/10.1002/9783527827992.ch50","page":"1479-1524","publisher":"John Wiley &amp; Sons, Ltd","source":"Wiley Online Library","title":"Selective Catalytic Hydrogenation of Nitroarenes to Anilines","URL":"https://onlinelibrary.wiley.com/doi/abs/10.1002/9783527827992.ch50","author":[{"family":"Gao","given":"Ruijie"},{"family":"Peng","given":"Chong"},{"family":"Zou","given":"Ji-Jun"}],"accessed":{"date-parts":[["2026",2,11]]},"issued":{"date-parts":[["2023"]]}}}],"schema":"https://github.com/citation-style-language/schema/raw/master/csl-citation.json"} </w:instrText>
       </w:r>
       <w:r>
@@ -2028,7 +2217,16 @@
         <w:fldChar w:fldCharType="end"/>
       </w:r>
       <w:r>
-        <w:t xml:space="preserve">. In 2024, the global aniline market is worth 12.3 billion USD and is predicted to grow to 20.4 billion USD by 2033, amounting to around 16.14 million tonnes produced per year </w:t>
+        <w:t xml:space="preserve">. </w:t>
+      </w:r>
+      <w:r>
+        <w:t>I</w:t>
+      </w:r>
+      <w:r>
+        <w:t>n 2024, the global aniline market is worth 12.3 billion USD and is predicted to grow to 20.4 billion USD by 2033, amounting to around 16.14 million tonnes produced per year</w:t>
+      </w:r>
+      <w:r>
+        <w:t xml:space="preserve"> </w:t>
       </w:r>
       <w:r>
         <w:fldChar w:fldCharType="begin"/>
@@ -2070,13 +2268,7 @@
     <w:p/>
     <w:p>
       <w:r>
-        <w:t>Our simulation will focus on the production of aniline via</w:t>
-      </w:r>
-      <w:r>
-        <w:t xml:space="preserve"> the liquid-phase catalytic</w:t>
-      </w:r>
-      <w:r>
-        <w:t xml:space="preserve"> hydrogenation of nitrobenzene. This process is comprised of one reaction, as follows:</w:t>
+        <w:t>Our simulation will focus on the production of aniline via the liquid-phase catalytic hydrogenation of nitrobenzene. This process is comprised of one reaction, as follows:</w:t>
       </w:r>
     </w:p>
     <w:p>
@@ -2084,54 +2276,96 @@
         <w:jc w:val="center"/>
       </w:pPr>
       <w:r>
-        <w:t>C6H5NO2 + 3 H2 -&gt; C6H5NH2 + 2H2O (1)</w:t>
+        <w:t>C</w:t>
+      </w:r>
+      <w:r>
+        <w:rPr>
+          <w:vertAlign w:val="subscript"/>
+        </w:rPr>
+        <w:t>6</w:t>
+      </w:r>
+      <w:r>
+        <w:t>H</w:t>
+      </w:r>
+      <w:r>
+        <w:rPr>
+          <w:vertAlign w:val="subscript"/>
+        </w:rPr>
+        <w:t>5</w:t>
+      </w:r>
+      <w:r>
+        <w:t>NO</w:t>
+      </w:r>
+      <w:r>
+        <w:rPr>
+          <w:vertAlign w:val="subscript"/>
+        </w:rPr>
+        <w:t>2</w:t>
+      </w:r>
+      <w:r>
+        <w:t xml:space="preserve"> + 3 H</w:t>
+      </w:r>
+      <w:r>
+        <w:rPr>
+          <w:vertAlign w:val="subscript"/>
+        </w:rPr>
+        <w:t>2</w:t>
+      </w:r>
+      <w:r>
+        <w:t xml:space="preserve"> -&gt; C</w:t>
+      </w:r>
+      <w:r>
+        <w:rPr>
+          <w:vertAlign w:val="subscript"/>
+        </w:rPr>
+        <w:t>6</w:t>
+      </w:r>
+      <w:r>
+        <w:t>H</w:t>
+      </w:r>
+      <w:r>
+        <w:rPr>
+          <w:vertAlign w:val="subscript"/>
+        </w:rPr>
+        <w:t>5</w:t>
+      </w:r>
+      <w:r>
+        <w:t>NH</w:t>
+      </w:r>
+      <w:r>
+        <w:rPr>
+          <w:vertAlign w:val="subscript"/>
+        </w:rPr>
+        <w:t>2</w:t>
+      </w:r>
+      <w:r>
+        <w:t xml:space="preserve"> + 2</w:t>
+      </w:r>
+      <w:r>
+        <w:t xml:space="preserve"> </w:t>
+      </w:r>
+      <w:r>
+        <w:t>H</w:t>
+      </w:r>
+      <w:r>
+        <w:rPr>
+          <w:vertAlign w:val="subscript"/>
+        </w:rPr>
+        <w:t>2</w:t>
+      </w:r>
+      <w:r>
+        <w:t>O (1)</w:t>
       </w:r>
     </w:p>
     <w:p/>
     <w:p>
       <w:r>
-        <w:t xml:space="preserve">Reaction 1 is a highly exothermic reaction carried out at </w:t>
-      </w:r>
-      <w:r>
-        <w:t>1</w:t>
-      </w:r>
-      <w:r>
-        <w:t xml:space="preserve"> – </w:t>
-      </w:r>
-      <w:r>
-        <w:t>3</w:t>
+        <w:t>Reaction 1 is a highly exothermic reaction carried out at 1 – 3 MPa pressure and 200 - 300 C, combining hydrogen gas with liquid or gas-phase nitrobenzene</w:t>
       </w:r>
       <w:r>
         <w:t xml:space="preserve"> </w:t>
       </w:r>
       <w:r>
-        <w:t>MPa</w:t>
-      </w:r>
-      <w:r>
-        <w:t xml:space="preserve"> pressure and </w:t>
-      </w:r>
-      <w:r>
-        <w:t>20</w:t>
-      </w:r>
-      <w:r>
-        <w:t>0</w:t>
-      </w:r>
-      <w:r>
-        <w:t xml:space="preserve"> - </w:t>
-      </w:r>
-      <w:r>
-        <w:t>30</w:t>
-      </w:r>
-      <w:r>
-        <w:t xml:space="preserve">0 C, combining hydrogen gas with liquid </w:t>
-      </w:r>
-      <w:r>
-        <w:t xml:space="preserve">or gas-phase </w:t>
-      </w:r>
-      <w:r>
-        <w:t xml:space="preserve">nitrobenzene </w:t>
-      </w:r>
-      <w:r>
         <w:fldChar w:fldCharType="begin"/>
       </w:r>
       <w:r>
@@ -2147,31 +2381,19 @@
         <w:fldChar w:fldCharType="end"/>
       </w:r>
       <w:r>
-        <w:t xml:space="preserve">. </w:t>
-      </w:r>
-      <w:r>
-        <w:t xml:space="preserve">The hydrogenation of benzene accounts for 85% of global aniline production </w:t>
-      </w:r>
-      <w:r>
-        <w:fldChar w:fldCharType="begin"/>
-      </w:r>
-      <w:r>
-        <w:instrText xml:space="preserve"> ADDIN ZOTERO_ITEM CSL_CITATION {"citationID":"JmVY68hl","properties":{"formattedCitation":"[2]","plainCitation":"[2]","noteIndex":0},"citationItems":[{"id":901,"uris":["http://zotero.org/users/15288956/items/WBHRAL9M"],"itemData":{"id":901,"type":"chapter","abstract":"Selective catalytic hydrogenation of nitroarenes is of great importance for dyestuff and pharmaceutical industry. In this chapter, the main industrial methods for aniline production and aniline market are firstly reviewed. Moreover, breakthroughs in the development of multiple catalytic technologies in the past decade are summarized, including direct hydrogenation using hydrogen; transfer hydrogenation using reductive agents; photocatalytic hydrogenation using hole scavenger; electrocatalytic hydrogenation accompanied by water oxidation. For direct catalytic hydrogenation, representative catalysts include metal, metal oxide/sulfide/carbides/nitrides/boride, and functional carbon material, and the crucial factors to tune their activity and selectivity are discussed such as metal–support interaction, size effect, alloy effect, defect engineering, and so on. Catalytic transfer hydrogenation, photocatalytic and electrocatalytic hydrogenation, these catalysts abstract hydrogen species from the hydrogen donor and stabilizes it on the catalyst surface, restricting active H* recombination, and then the active hydrogen species can be promptly transferred to nitroarenes for the hydrogenation. It is worth mentioning that the light harvesting and charge separation of photocatalysts and the conductivity of electrocatalysts should also be considered together for the overall performance.","container-title":"Industrial Arene Chemistry","DOI":"10.1002/9783527827992.ch50","ISBN":"978-3-527-82799-2","language":"en","note":"section: 50\n_eprint: https://onlinelibrary.wiley.com/doi/pdf/10.1002/9783527827992.ch50","page":"1479-1524","publisher":"John Wiley &amp; Sons, Ltd","source":"Wiley Online Library","title":"Selective Catalytic Hydrogenation of Nitroarenes to Anilines","URL":"https://onlinelibrary.wiley.com/doi/abs/10.1002/9783527827992.ch50","author":[{"family":"Gao","given":"Ruijie"},{"family":"Peng","given":"Chong"},{"family":"Zou","given":"Ji-Jun"}],"accessed":{"date-parts":[["2026",2,11]]},"issued":{"date-parts":[["2023"]]}}}],"schema":"https://github.com/citation-style-language/schema/raw/master/csl-citation.json"} </w:instrText>
-      </w:r>
-      <w:r>
-        <w:fldChar w:fldCharType="separate"/>
-      </w:r>
-      <w:r>
-        <w:t>[2]</w:t>
-      </w:r>
-      <w:r>
-        <w:fldChar w:fldCharType="end"/>
-      </w:r>
-      <w:r>
-        <w:t xml:space="preserve">. </w:t>
-      </w:r>
-      <w:r>
-        <w:t xml:space="preserve">Vapour-phase hydrogenation is selected for this project due to availability of reaction kinetics data. This reaction is run with the following catalyst composition </w:t>
+        <w:t>.</w:t>
+      </w:r>
+      <w:r>
+        <w:t xml:space="preserve"> </w:t>
+      </w:r>
+      <w:r>
+        <w:t>V</w:t>
+      </w:r>
+      <w:r>
+        <w:t>apour-phase hydrogenation is selected for this project due to the availability of reaction kinetics data. This reaction is run with the following catalyst composition</w:t>
+      </w:r>
+      <w:r>
+        <w:t xml:space="preserve"> </w:t>
       </w:r>
       <w:r>
         <w:fldChar w:fldCharType="begin"/>
@@ -2203,6 +2425,9 @@
       <w:r>
         <w:t>20% copper plus nickel on asbestos</w:t>
       </w:r>
+      <w:r>
+        <w:t xml:space="preserve"> carrier</w:t>
+      </w:r>
     </w:p>
     <w:p>
       <w:pPr>
@@ -2228,6 +2453,63 @@
         <w:t>Cadmium in proportion of 15% to copper and nickel</w:t>
       </w:r>
     </w:p>
+    <w:p>
+      <w:r>
+        <w:t>While current Canadian regulations prohibit the use of asbestos</w:t>
+      </w:r>
+      <w:r>
+        <w:t xml:space="preserve"> </w:t>
+      </w:r>
+      <w:r>
+        <w:fldChar w:fldCharType="begin"/>
+      </w:r>
+      <w:r>
+        <w:instrText xml:space="preserve"> ADDIN ZOTERO_ITEM CSL_CITATION {"citationID":"SXYqozyW","properties":{"formattedCitation":"[6]","plainCitation":"[6]","noteIndex":0},"citationItems":[{"id":1020,"uris":["http://zotero.org/users/15288956/items/DAPC6D4M"],"itemData":{"id":1020,"type":"webpage","abstract":"Asbestos was a popular material used widely in construction and many other industries.  Asbestos poses health risks only when fibres are present in the air that people breathe.","genre":"education and awareness","language":"eng","note":"Last Modified: 2023-02-10","title":"Asbestos and your health","URL":"https://www.canada.ca/en/health-canada/services/air-quality/indoor-air-contaminants/health-risks-asbestos.html","author":[{"literal":"Health Canada"}],"accessed":{"date-parts":[["2026",3,11]]},"issued":{"date-parts":[["2012",10,14]]}}}],"schema":"https://github.com/citation-style-language/schema/raw/master/csl-citation.json"} </w:instrText>
+      </w:r>
+      <w:r>
+        <w:fldChar w:fldCharType="separate"/>
+      </w:r>
+      <w:r>
+        <w:t>[6]</w:t>
+      </w:r>
+      <w:r>
+        <w:fldChar w:fldCharType="end"/>
+      </w:r>
+      <w:r>
+        <w:t xml:space="preserve">, </w:t>
+      </w:r>
+      <w:r>
+        <w:t>kinetic data provided by Rihani et al. are still used in this report</w:t>
+      </w:r>
+      <w:r>
+        <w:t xml:space="preserve"> </w:t>
+      </w:r>
+      <w:r>
+        <w:fldChar w:fldCharType="begin"/>
+      </w:r>
+      <w:r>
+        <w:instrText xml:space="preserve"> ADDIN ZOTERO_ITEM CSL_CITATION {"citationID":"SEvdlhbU","properties":{"formattedCitation":"[5]","plainCitation":"[5]","noteIndex":0},"citationItems":[{"id":959,"uris":["http://zotero.org/users/15288956/items/TD8LN5TE"],"itemData":{"id":959,"type":"article-journal","container-title":"Industrial &amp; Engineering Chemistry Process Design and Development","DOI":"10.1021/i260016a012","ISSN":"0196-4305, 1541-5716","issue":"4","journalAbbreviation":"Ind. Eng. Chem. Proc. Des. Dev.","language":"en","page":"403-410","source":"DOI.org (Crossref)","title":"Kinetics of Catalytic Vapor-Phase Hydrogenation of Nitrobenzene to Aniline","volume":"4","author":[{"family":"Rihani","given":"D. N."},{"family":"Narayanan","given":"T. K."},{"family":"Doraiswamy","given":"L. K."}],"issued":{"date-parts":[["1965",10]]}}}],"schema":"https://github.com/citation-style-language/schema/raw/master/csl-citation.json"} </w:instrText>
+      </w:r>
+      <w:r>
+        <w:fldChar w:fldCharType="separate"/>
+      </w:r>
+      <w:r>
+        <w:t>[5]</w:t>
+      </w:r>
+      <w:r>
+        <w:fldChar w:fldCharType="end"/>
+      </w:r>
+      <w:r>
+        <w:t xml:space="preserve"> </w:t>
+      </w:r>
+      <w:r>
+        <w:t>due to difficulties in obtaining kinetic data for other catalyst types</w:t>
+      </w:r>
+      <w:r>
+        <w:t>. It is assumed that other similar copper-nickel catalysts will have similar reaction kinetics.</w:t>
+      </w:r>
+    </w:p>
+    <w:p/>
     <w:p>
       <w:pPr>
         <w:sectPr>
@@ -2245,7 +2527,7 @@
         </w:sectPr>
       </w:pPr>
       <w:r>
-        <w:t>For the purpose of this report, nitrobenzene feed used is of technical grade with 99.8 wt% purity</w:t>
+        <w:t>For the purpose of this report, the nitrobenzene feed used is of technical grade with 99.8 wt% purity</w:t>
       </w:r>
       <w:r>
         <w:t xml:space="preserve"> </w:t>
@@ -2254,13 +2536,13 @@
         <w:fldChar w:fldCharType="begin"/>
       </w:r>
       <w:r>
-        <w:instrText xml:space="preserve"> ADDIN ZOTERO_ITEM CSL_CITATION {"citationID":"GgTFGu44","properties":{"formattedCitation":"[6]","plainCitation":"[6]","noteIndex":0},"citationItems":[{"id":1003,"uris":["http://zotero.org/users/15288956/items/LY2HTXPS"],"itemData":{"id":1003,"type":"report","collection-title":"Preview","number":"INTRATEC-ICC-PREV-293-B-PREM-USA","publisher-place":"United States","title":"Nitrobenzene Production from Benzene (KBR)","URL":"https://cdn.intratec.us/_nt/docs/icc/previews/INTRATEC-ICC-PREV-293-B-PREM-USA.pdf","author":[{"literal":"Intratec Solutions LLC (www.intratec.us)"}],"accessed":{"date-parts":[["2026",3,10]]},"issued":{"date-parts":[["2025"]]}}}],"schema":"https://github.com/citation-style-language/schema/raw/master/csl-citation.json"} </w:instrText>
+        <w:instrText xml:space="preserve"> ADDIN ZOTERO_ITEM CSL_CITATION {"citationID":"GgTFGu44","properties":{"formattedCitation":"[7]","plainCitation":"[7]","noteIndex":0},"citationItems":[{"id":1003,"uris":["http://zotero.org/users/15288956/items/LY2HTXPS"],"itemData":{"id":1003,"type":"report","collection-title":"Preview","number":"INTRATEC-ICC-PREV-293-B-PREM-USA","publisher-place":"United States","title":"Nitrobenzene Production from Benzene (KBR)","URL":"https://cdn.intratec.us/_nt/docs/icc/previews/INTRATEC-ICC-PREV-293-B-PREM-USA.pdf","author":[{"literal":"Intratec Solutions LLC (www.intratec.us)"}],"accessed":{"date-parts":[["2026",3,10]]},"issued":{"date-parts":[["2025"]]}}}],"schema":"https://github.com/citation-style-language/schema/raw/master/csl-citation.json"} </w:instrText>
       </w:r>
       <w:r>
         <w:fldChar w:fldCharType="separate"/>
       </w:r>
       <w:r>
-        <w:t>[6]</w:t>
+        <w:t>[7]</w:t>
       </w:r>
       <w:r>
         <w:fldChar w:fldCharType="end"/>
@@ -2269,10 +2551,10 @@
         <w:t xml:space="preserve">. </w:t>
       </w:r>
       <w:r>
-        <w:t>Similarly,</w:t>
-      </w:r>
-      <w:r>
-        <w:t xml:space="preserve"> aniline production is targeted for technical grade with 99.5 wt% purity </w:t>
+        <w:t>Similarly, aniline production is targeted for technical grade with 99.5 wt% purity</w:t>
+      </w:r>
+      <w:r>
+        <w:t xml:space="preserve"> </w:t>
       </w:r>
       <w:r>
         <w:fldChar w:fldCharType="begin"/>
@@ -2290,7 +2572,13 @@
         <w:fldChar w:fldCharType="end"/>
       </w:r>
       <w:r>
-        <w:t>. Remaining impurity for feed is assumed to be water, while remaining impurity for product is simulated in aspen.</w:t>
+        <w:t xml:space="preserve">. </w:t>
+      </w:r>
+      <w:r>
+        <w:t>The remaining impurity for the feed is assumed to be water, while the remaining impurity for the product is simulated in Aspen</w:t>
+      </w:r>
+      <w:r>
+        <w:t>.</w:t>
       </w:r>
       <w:r>
         <w:t xml:space="preserve"> </w:t>
@@ -2303,7 +2591,7 @@
           <w:rFonts w:asciiTheme="majorBidi" w:hAnsiTheme="majorBidi" w:cstheme="majorBidi"/>
         </w:rPr>
       </w:pPr>
-      <w:bookmarkStart w:id="2" w:name="_Toc224082092"/>
+      <w:bookmarkStart w:id="2" w:name="_Toc224148621"/>
       <w:r>
         <w:lastRenderedPageBreak/>
         <w:t>Block Flow Diagram</w:t>
@@ -2401,7 +2689,7 @@
           <w:rFonts w:asciiTheme="majorBidi" w:hAnsiTheme="majorBidi" w:cstheme="majorBidi"/>
         </w:rPr>
       </w:pPr>
-      <w:bookmarkStart w:id="3" w:name="_Toc224082093"/>
+      <w:bookmarkStart w:id="3" w:name="_Toc224148622"/>
       <w:r>
         <w:rPr>
           <w:rFonts w:asciiTheme="majorBidi" w:hAnsiTheme="majorBidi" w:cstheme="majorBidi"/>
@@ -2470,7 +2758,85 @@
         <w:jc w:val="center"/>
       </w:pPr>
       <w:r>
-        <w:t>C6H5NO2 + 3 H2 -&gt; C6H5NH2 + 2H2O (1)</w:t>
+        <w:t>C</w:t>
+      </w:r>
+      <w:r>
+        <w:rPr>
+          <w:vertAlign w:val="subscript"/>
+        </w:rPr>
+        <w:t>6</w:t>
+      </w:r>
+      <w:r>
+        <w:t>H</w:t>
+      </w:r>
+      <w:r>
+        <w:rPr>
+          <w:vertAlign w:val="subscript"/>
+        </w:rPr>
+        <w:t>5</w:t>
+      </w:r>
+      <w:r>
+        <w:t>NO</w:t>
+      </w:r>
+      <w:r>
+        <w:rPr>
+          <w:vertAlign w:val="subscript"/>
+        </w:rPr>
+        <w:t>2</w:t>
+      </w:r>
+      <w:r>
+        <w:t xml:space="preserve"> + 3 H</w:t>
+      </w:r>
+      <w:r>
+        <w:rPr>
+          <w:vertAlign w:val="subscript"/>
+        </w:rPr>
+        <w:t>2</w:t>
+      </w:r>
+      <w:r>
+        <w:t xml:space="preserve"> -&gt; C</w:t>
+      </w:r>
+      <w:r>
+        <w:rPr>
+          <w:vertAlign w:val="subscript"/>
+        </w:rPr>
+        <w:t>6</w:t>
+      </w:r>
+      <w:r>
+        <w:t>H</w:t>
+      </w:r>
+      <w:r>
+        <w:rPr>
+          <w:vertAlign w:val="subscript"/>
+        </w:rPr>
+        <w:t>5</w:t>
+      </w:r>
+      <w:r>
+        <w:t>NH</w:t>
+      </w:r>
+      <w:r>
+        <w:rPr>
+          <w:vertAlign w:val="subscript"/>
+        </w:rPr>
+        <w:t>2</w:t>
+      </w:r>
+      <w:r>
+        <w:t xml:space="preserve"> + 2</w:t>
+      </w:r>
+      <w:r>
+        <w:t xml:space="preserve"> </w:t>
+      </w:r>
+      <w:r>
+        <w:t>H</w:t>
+      </w:r>
+      <w:r>
+        <w:rPr>
+          <w:vertAlign w:val="subscript"/>
+        </w:rPr>
+        <w:t>2</w:t>
+      </w:r>
+      <w:r>
+        <w:t>O (1)</w:t>
       </w:r>
     </w:p>
     <w:p>
@@ -2602,7 +2968,31 @@
               <w:jc w:val="center"/>
             </w:pPr>
             <w:r>
-              <w:t>C6H5NO2</w:t>
+              <w:t>C</w:t>
+            </w:r>
+            <w:r>
+              <w:rPr>
+                <w:vertAlign w:val="subscript"/>
+              </w:rPr>
+              <w:t>6</w:t>
+            </w:r>
+            <w:r>
+              <w:t>H</w:t>
+            </w:r>
+            <w:r>
+              <w:rPr>
+                <w:vertAlign w:val="subscript"/>
+              </w:rPr>
+              <w:t>5</w:t>
+            </w:r>
+            <w:r>
+              <w:t>NO</w:t>
+            </w:r>
+            <w:r>
+              <w:rPr>
+                <w:vertAlign w:val="subscript"/>
+              </w:rPr>
+              <w:t>2</w:t>
             </w:r>
           </w:p>
         </w:tc>
@@ -2631,7 +3021,31 @@
               <w:jc w:val="center"/>
             </w:pPr>
             <w:r>
-              <w:t>C6H5NH2</w:t>
+              <w:t>C</w:t>
+            </w:r>
+            <w:r>
+              <w:rPr>
+                <w:vertAlign w:val="subscript"/>
+              </w:rPr>
+              <w:t>6</w:t>
+            </w:r>
+            <w:r>
+              <w:t>H</w:t>
+            </w:r>
+            <w:r>
+              <w:rPr>
+                <w:vertAlign w:val="subscript"/>
+              </w:rPr>
+              <w:t>5</w:t>
+            </w:r>
+            <w:r>
+              <w:t>NH</w:t>
+            </w:r>
+            <w:r>
+              <w:rPr>
+                <w:vertAlign w:val="subscript"/>
+              </w:rPr>
+              <w:t>2</w:t>
             </w:r>
           </w:p>
         </w:tc>
@@ -2660,7 +3074,16 @@
               <w:jc w:val="center"/>
             </w:pPr>
             <w:r>
-              <w:t>H2O</w:t>
+              <w:t>H</w:t>
+            </w:r>
+            <w:r>
+              <w:rPr>
+                <w:vertAlign w:val="subscript"/>
+              </w:rPr>
+              <w:t>2</w:t>
+            </w:r>
+            <w:r>
+              <w:t>O</w:t>
             </w:r>
           </w:p>
         </w:tc>
@@ -2681,7 +3104,7 @@
           <w:rFonts w:asciiTheme="majorBidi" w:hAnsiTheme="majorBidi" w:cstheme="majorBidi"/>
         </w:rPr>
       </w:pPr>
-      <w:bookmarkStart w:id="4" w:name="_Toc224082094"/>
+      <w:bookmarkStart w:id="4" w:name="_Toc224148623"/>
       <w:r>
         <w:rPr>
           <w:rFonts w:asciiTheme="majorBidi" w:hAnsiTheme="majorBidi" w:cstheme="majorBidi"/>
@@ -2702,13 +3125,19 @@
         <w:jc w:val="both"/>
       </w:pPr>
       <w:r>
-        <w:t xml:space="preserve">Operating condition for the process lies around </w:t>
+        <w:t xml:space="preserve">Operating condition for the process lie around </w:t>
       </w:r>
       <w:r>
         <w:t>1</w:t>
       </w:r>
       <w:r>
-        <w:t xml:space="preserve"> – </w:t>
+        <w:t xml:space="preserve"> </w:t>
+      </w:r>
+      <w:r>
+        <w:t>-</w:t>
+      </w:r>
+      <w:r>
+        <w:t xml:space="preserve"> </w:t>
       </w:r>
       <w:r>
         <w:t>3</w:t>
@@ -2765,19 +3194,10 @@
         <w:t xml:space="preserve">. </w:t>
       </w:r>
       <w:r>
-        <w:t>The reaction species comprise of an amine (aniline) and a nitroaromatic compound (nitrobenzene) in liquid phase. It also contains hydrogen gas, which is insoluble in atmospheric pressure. Given this, the system would be classified as a chemical system at</w:t>
-      </w:r>
-      <w:r>
-        <w:t xml:space="preserve"> high</w:t>
-      </w:r>
-      <w:r>
-        <w:t xml:space="preserve"> pressure. A suitable overall property method would be an activity coefficient model such as </w:t>
-      </w:r>
-      <w:r>
-        <w:t>SR-POLAR, SRK, PSRK and others</w:t>
-      </w:r>
-      <w:r>
-        <w:t>, with addition of Henry’s method to model the hydrogen gas.</w:t>
+        <w:t>The reaction species comprise of an amine (aniline) and a nitroaromatic compound (nitrobenzene) in the liquid phase. It also contains hydrogen gas, which is insoluble at atmospheric pressure. Given this, the system would be classified as a chemical system at high pressure. A suitable overall property method would be an activity coefficient model, such as SR-POLAR, SRK, PSRK, or others</w:t>
+      </w:r>
+      <w:r>
+        <w:t>.</w:t>
       </w:r>
       <w:r>
         <w:t xml:space="preserve"> </w:t>
@@ -2798,7 +3218,7 @@
           <w:rFonts w:asciiTheme="majorBidi" w:hAnsiTheme="majorBidi" w:cstheme="majorBidi"/>
         </w:rPr>
       </w:pPr>
-      <w:bookmarkStart w:id="5" w:name="_Toc224082095"/>
+      <w:bookmarkStart w:id="5" w:name="_Toc224148624"/>
       <w:r>
         <w:rPr>
           <w:rFonts w:asciiTheme="majorBidi" w:hAnsiTheme="majorBidi" w:cstheme="majorBidi"/>
@@ -2816,7 +3236,19 @@
     </w:p>
     <w:p>
       <w:r>
-        <w:t>The reactor setup will facilitate the hydrogenation of nitrobenzene in liquid phase via metal catalysts.</w:t>
+        <w:t xml:space="preserve">The reactor setup will facilitate the hydrogenation of nitrobenzene in </w:t>
+      </w:r>
+      <w:r>
+        <w:t>vapour</w:t>
+      </w:r>
+      <w:r>
+        <w:t xml:space="preserve"> phase via </w:t>
+      </w:r>
+      <w:r>
+        <w:t xml:space="preserve">copper-nickel </w:t>
+      </w:r>
+      <w:r>
+        <w:t>catalysts.</w:t>
       </w:r>
       <w:r>
         <w:t xml:space="preserve"> </w:t>
@@ -2836,46 +3268,226 @@
         <w:jc w:val="center"/>
       </w:pPr>
       <w:r>
-        <w:t>C6H5NO2 + 3 H2 -&gt; C6H5NH2 + 2H2O (1)</w:t>
+        <w:t>C</w:t>
+      </w:r>
+      <w:r>
+        <w:rPr>
+          <w:vertAlign w:val="subscript"/>
+        </w:rPr>
+        <w:t>6</w:t>
+      </w:r>
+      <w:r>
+        <w:t>H</w:t>
+      </w:r>
+      <w:r>
+        <w:rPr>
+          <w:vertAlign w:val="subscript"/>
+        </w:rPr>
+        <w:t>5</w:t>
+      </w:r>
+      <w:r>
+        <w:t>NO</w:t>
+      </w:r>
+      <w:r>
+        <w:rPr>
+          <w:vertAlign w:val="subscript"/>
+        </w:rPr>
+        <w:t>2</w:t>
+      </w:r>
+      <w:r>
+        <w:t xml:space="preserve"> + 3 H</w:t>
+      </w:r>
+      <w:r>
+        <w:rPr>
+          <w:vertAlign w:val="subscript"/>
+        </w:rPr>
+        <w:t>2</w:t>
+      </w:r>
+      <w:r>
+        <w:t xml:space="preserve"> -&gt; C</w:t>
+      </w:r>
+      <w:r>
+        <w:rPr>
+          <w:vertAlign w:val="subscript"/>
+        </w:rPr>
+        <w:t>6</w:t>
+      </w:r>
+      <w:r>
+        <w:t>H</w:t>
+      </w:r>
+      <w:r>
+        <w:rPr>
+          <w:vertAlign w:val="subscript"/>
+        </w:rPr>
+        <w:t>5</w:t>
+      </w:r>
+      <w:r>
+        <w:t>NH</w:t>
+      </w:r>
+      <w:r>
+        <w:rPr>
+          <w:vertAlign w:val="subscript"/>
+        </w:rPr>
+        <w:t>2</w:t>
+      </w:r>
+      <w:r>
+        <w:t xml:space="preserve"> + 2</w:t>
+      </w:r>
+      <w:r>
+        <w:t xml:space="preserve"> </w:t>
+      </w:r>
+      <w:r>
+        <w:t>H</w:t>
+      </w:r>
+      <w:r>
+        <w:rPr>
+          <w:vertAlign w:val="subscript"/>
+        </w:rPr>
+        <w:t>2</w:t>
+      </w:r>
+      <w:r>
+        <w:t>O (1)</w:t>
       </w:r>
     </w:p>
     <w:p/>
     <w:p>
       <w:r>
-        <w:t xml:space="preserve">For the process, nitrobenzene is dissolved in solvent such as methanol, isopropanol, or ethanol </w:t>
+        <w:t>Within the reactor, both mass transfer and reaction kinetics affect the reaction rate. In mass transfer, three phases are identified: dissolution of H</w:t>
+      </w:r>
+      <w:r>
+        <w:rPr>
+          <w:vertAlign w:val="subscript"/>
+        </w:rPr>
+        <w:t>2</w:t>
+      </w:r>
+      <w:r>
+        <w:t xml:space="preserve"> in the liquid, diffusion of dissolved H</w:t>
+      </w:r>
+      <w:r>
+        <w:rPr>
+          <w:vertAlign w:val="subscript"/>
+        </w:rPr>
+        <w:t>2</w:t>
+      </w:r>
+      <w:r>
+        <w:t xml:space="preserve"> and the reactant to the catalyst surface, and intra-particle diffusion to the active sites</w:t>
+      </w:r>
+      <w:r>
+        <w:t xml:space="preserve"> </w:t>
       </w:r>
       <w:r>
         <w:fldChar w:fldCharType="begin"/>
       </w:r>
       <w:r>
-        <w:instrText xml:space="preserve"> ADDIN ZOTERO_ITEM CSL_CITATION {"citationID":"lOkPLG1j","properties":{"formattedCitation":"[7]","plainCitation":"[7]","noteIndex":0},"citationItems":[{"id":903,"uris":["http://zotero.org/users/15288956/items/J865HSAR"],"itemData":{"id":903,"type":"article-journal","abstract":"Hydrogenation of nitrobenzene (NB) was carried out in methanol solutions (initial concentration 0.8moll−1) over a Pd/C catalyst (3wt.% of Pd; reaction mixture contained 2.2mgPdl−1) over the pressure range of 2–4MPa and temperature 30–70°C in a laboratory scale batch reactor. Zero order kinetics was observed at hydrogen pressures above 2MPa Under applied experimental conditions the apparent activation energy was 35±1kJmol−1. A detailed analysis of the reaction mixture inspired the hypothesis that a C6H5–NO(H) moiety is formed on the catalyst surface and it undergoes further condensation to azoxybenzene (AOB) releasing water. However, very low concentrations of azobenzene (AB) and hydrazobenzene (HAB) in the reaction mixture indicate that the reaction route to the formation of aniline by hydrogenation of AOB to AB, hydrazobenzene (HAB) and subsequent hydrogenolysis to AN is of low probability. Hydrogenolysis of AOB to C6H5–NO(H) and C6H5–N(H), where the latter is hydrogenated to AN, is more likely. Based on the experimental observations a new reaction scheme for the heterogeneous catalytic hydrogenation of NB was proposed.","container-title":"Applied Catalysis A: General","DOI":"10.1016/j.apcata.2015.04.002","ISSN":"0926-860X","journalAbbreviation":"Applied Catalysis A: General","page":"66-76","source":"ScienceDirect","title":"Liquid phase hydrogenation of nitrobenzene","volume":"499","author":[{"family":"Turáková","given":"Mária"},{"family":"Salmi","given":"Tapio"},{"family":"Eränen","given":"Kari"},{"family":"Wärnå","given":"Johan"},{"family":"Murzin","given":"Dmitry Yu."},{"family":"Králik","given":"Milan"}],"issued":{"date-parts":[["2015",6,25]]}}}],"schema":"https://github.com/citation-style-language/schema/raw/master/csl-citation.json"} </w:instrText>
+        <w:instrText xml:space="preserve"> ADDIN ZOTERO_ITEM CSL_CITATION {"citationID":"zUZ3gc7s","properties":{"formattedCitation":"[8]","plainCitation":"[8]","noteIndex":0},"citationItems":[{"id":907,"uris":["http://zotero.org/users/15288956/items/5ZV3SRA4"],"itemData":{"id":907,"type":"article-journal","abstract":"Halogenated aromatic anilines are series of crucial intermediates for the synthesis of pigments, medicines and pesticides in the fine chemistry. However, efficient inhibition of undesired dehalogenation is difficult to achieve in the commonly used batch reactors. Although employing continuous flow technology and modified catalysts could alleviate dehalogenation, obtaining high selectivity of halogenated aromatic anilines especially for brominated aromatic amines and iodine aromatic amines is still challenging. In this study, a continuous flow system based on micro-packed bed reactor was developed and a kinetic model of the hydrogenation of halogenated nitrobenzene was established. Kinetic parameters for the reductions of p-chloronitrobenzene, p-bromonitrobenzene and p-iodonitrobenzene were acquired and the kinetic model exhibited good fit for the transformation of each substance. Moreover, the accuracy of kinetic model was validated by the comparison with the values in literature. The obtained kinetic model offered helpful information for the process optimization of hydrogenation of halogenated nitroaromatics in continuous flow system.","container-title":"Chemical Engineering Science","DOI":"10.1016/j.ces.2022.117483","ISSN":"0009-2509","journalAbbreviation":"Chemical Engineering Science","page":"117483","source":"ScienceDirect","title":"Hydrogenation kinetics of halogenated nitroaromatics over Pt/C in a continuous Micro-packed bed reactor","volume":"251","author":[{"family":"Duan","given":"Xiaonan"},{"family":"Yin","given":"Jiabin"},{"family":"Huang","given":"Mengmeng"},{"family":"Wang","given":"Peixia"},{"family":"Zhang","given":"Jisong"}],"issued":{"date-parts":[["2022",4,6]]}}}],"schema":"https://github.com/citation-style-language/schema/raw/master/csl-citation.json"} </w:instrText>
       </w:r>
       <w:r>
         <w:fldChar w:fldCharType="separate"/>
       </w:r>
       <w:r>
+        <w:t>[8]</w:t>
+      </w:r>
+      <w:r>
+        <w:fldChar w:fldCharType="end"/>
+      </w:r>
+      <w:r>
+        <w:t xml:space="preserve">. </w:t>
+      </w:r>
+      <w:r>
+        <w:t>Mass transfer limitation can be mitigated by increasing temperature, increasing mixing, and reducing catalyst size</w:t>
+      </w:r>
+      <w:r>
+        <w:t xml:space="preserve"> </w:t>
+      </w:r>
+      <w:r>
+        <w:fldChar w:fldCharType="begin"/>
+      </w:r>
+      <w:r>
+        <w:instrText xml:space="preserve"> ADDIN ZOTERO_ITEM CSL_CITATION {"citationID":"p87gGSp3","properties":{"formattedCitation":"[9], [10]","plainCitation":"[9], [10]","noteIndex":0},"citationItems":[{"id":910,"uris":["http://zotero.org/users/15288956/items/9IRR2I2R"],"itemData":{"id":910,"type":"article-journal","abstract":"This paper deals with the modelling of a multiphase batch reaction: catalyzed nitrobenzene hydrogenation. The reactor's gas–liquid mass transfer parameters in the absence of any reaction are first identified, and the solubility of hydrogen in the reactional medium is also measured. A reaction kinetics and heat parameter identification method is then developed. This method is based on a light experimental procedure, requiring measurement of only temperature and pressure variations in the batch reactor. This study is carried out in an isothermal batch and semi-batch reactor, whose initial temperature varies between 283 and 333K. A simplified model associating the hydrodynamic gas–liquid mass transfer parameters and the chemical kinetics processes is developed. The key parameters that can influence the reaction development are the hydrogen pressure, the coolant temperature, the quantity of catalyst pellets and the stirring speed. The developed model also allows the precise simulation of the extent of reaction and the temperature evolution of the studied multiphase catalytic reaction.","container-title":"Chemical Engineering Journal","DOI":"10.1016/j.cej.2006.08.012","ISSN":"1385-8947","issue":"1","journalAbbreviation":"Chemical Engineering Journal","page":"19-28","source":"ScienceDirect","title":"Methodology of multiphase reaction kinetics and hydrodynamics identification: Application to catalyzed nitrobenzene hydrogenation","title-short":"Methodology of multiphase reaction kinetics and hydrodynamics identification","volume":"124","author":[{"family":"Frikha","given":"Nader"},{"family":"Schaer","given":"Eric"},{"family":"Houzelot","given":"Jean-Léon"}],"issued":{"date-parts":[["2006",11,1]]}}},{"id":906,"uris":["http://zotero.org/users/15288956/items/65WQEF7Q"],"itemData":{"id":906,"type":"article-journal","container-title":"Asian Journal of Chemistry","issue":"3","page":"1001-1005","title":"Kinetics Approach for Hydrogenation of Nitrobenzene to p-Aminophenol in a Four-Phase System","volume":"23","author":[{"family":"Li","given":"Guangxue"},{"family":"Ma","given":"Jianhua"},{"family":"Peng","given":"Xinhua"},{"family":"Lv","given":"Chunxu"}],"issued":{"date-parts":[["2011"]]}}}],"schema":"https://github.com/citation-style-language/schema/raw/master/csl-citation.json"} </w:instrText>
+      </w:r>
+      <w:r>
+        <w:fldChar w:fldCharType="separate"/>
+      </w:r>
+      <w:r>
+        <w:t>[9], [10]</w:t>
+      </w:r>
+      <w:r>
+        <w:fldChar w:fldCharType="end"/>
+      </w:r>
+      <w:r>
+        <w:t xml:space="preserve">. </w:t>
+      </w:r>
+      <w:r>
+        <w:t>For simulation purposes, the effect of mass transfer limitation will be ignored.</w:t>
+      </w:r>
+    </w:p>
+    <w:p/>
+    <w:p>
+      <w:r>
+        <w:t>Our main objective is to produce 100,000 tonnes of aniline per year, or 1100 tonne-mol per year, roughly 1/3 of the newly operational aniline plant production in 2026</w:t>
+      </w:r>
+      <w:r>
+        <w:t xml:space="preserve"> </w:t>
+      </w:r>
+      <w:r>
+        <w:fldChar w:fldCharType="begin"/>
+      </w:r>
+      <w:r>
+        <w:instrText xml:space="preserve"> ADDIN ZOTERO_ITEM CSL_CITATION {"citationID":"4pArSiAC","properties":{"formattedCitation":"[11]","plainCitation":"[11]","noteIndex":0},"citationItems":[{"id":1012,"uris":["http://zotero.org/users/15288956/items/KLRHWUDS"],"itemData":{"id":1012,"type":"webpage","genre":"March 2026","title":"Aniline Market Analysis: Industry Market Size, Plant Capacity, Production, Operating Efficiency, Demand &amp; Supply, End-User Industries, Sales Channel, Regional Demand, Company Share, Foreign Trade, Manufacturing Process, Policy and Regulatory Landscape, 2015-2032","URL":"https://www.chemanalyst.com/industry-report/aniline-market-282","author":[{"literal":"ChemAnalyst"}],"accessed":{"date-parts":[["2026",3,10]]}}}],"schema":"https://github.com/citation-style-language/schema/raw/master/csl-citation.json"} </w:instrText>
+      </w:r>
+      <w:r>
+        <w:fldChar w:fldCharType="separate"/>
+      </w:r>
+      <w:r>
+        <w:t>[11]</w:t>
+      </w:r>
+      <w:r>
+        <w:fldChar w:fldCharType="end"/>
+      </w:r>
+      <w:r>
+        <w:t xml:space="preserve">. </w:t>
+      </w:r>
+      <w:r>
+        <w:t>To start, an overall efficiency of 80% is assumed, requiring a feed rate of 1375 tonne-mol per year. Furthermore, the nitrobenzene feed is assumed to be technical grade (99.8 wt% purity), with the remaining impurity being water</w:t>
+      </w:r>
+      <w:r>
+        <w:t xml:space="preserve"> </w:t>
+      </w:r>
+      <w:r>
+        <w:fldChar w:fldCharType="begin"/>
+      </w:r>
+      <w:r>
+        <w:instrText xml:space="preserve"> ADDIN ZOTERO_ITEM CSL_CITATION {"citationID":"hON9MH8f","properties":{"formattedCitation":"[7]","plainCitation":"[7]","noteIndex":0},"citationItems":[{"id":1003,"uris":["http://zotero.org/users/15288956/items/LY2HTXPS"],"itemData":{"id":1003,"type":"report","collection-title":"Preview","number":"INTRATEC-ICC-PREV-293-B-PREM-USA","publisher-place":"United States","title":"Nitrobenzene Production from Benzene (KBR)","URL":"https://cdn.intratec.us/_nt/docs/icc/previews/INTRATEC-ICC-PREV-293-B-PREM-USA.pdf","author":[{"literal":"Intratec Solutions LLC (www.intratec.us)"}],"accessed":{"date-parts":[["2026",3,10]]},"issued":{"date-parts":[["2025"]]}}}],"schema":"https://github.com/citation-style-language/schema/raw/master/csl-citation.json"} </w:instrText>
+      </w:r>
+      <w:r>
+        <w:fldChar w:fldCharType="separate"/>
+      </w:r>
+      <w:r>
         <w:t>[7]</w:t>
       </w:r>
       <w:r>
         <w:fldChar w:fldCharType="end"/>
       </w:r>
       <w:r>
-        <w:t xml:space="preserve">. Additionally, solvent </w:t>
-      </w:r>
-      <w:r>
-        <w:t xml:space="preserve">helps maintain reaction temperature. This is important as reaction (1) is highly exothermic </w:t>
+        <w:t xml:space="preserve">, </w:t>
+      </w:r>
+      <w:r>
+        <w:t>and is fed at a 1:5 ratio with hydrogen, providing good conversion while remaining economical</w:t>
+      </w:r>
+      <w:r>
+        <w:t xml:space="preserve"> </w:t>
       </w:r>
       <w:r>
         <w:fldChar w:fldCharType="begin"/>
       </w:r>
       <w:r>
-        <w:instrText xml:space="preserve"> ADDIN ZOTERO_ITEM CSL_CITATION {"citationID":"sAXxMkBt","properties":{"formattedCitation":"[7]","plainCitation":"[7]","noteIndex":0},"citationItems":[{"id":903,"uris":["http://zotero.org/users/15288956/items/J865HSAR"],"itemData":{"id":903,"type":"article-journal","abstract":"Hydrogenation of nitrobenzene (NB) was carried out in methanol solutions (initial concentration 0.8moll−1) over a Pd/C catalyst (3wt.% of Pd; reaction mixture contained 2.2mgPdl−1) over the pressure range of 2–4MPa and temperature 30–70°C in a laboratory scale batch reactor. Zero order kinetics was observed at hydrogen pressures above 2MPa Under applied experimental conditions the apparent activation energy was 35±1kJmol−1. A detailed analysis of the reaction mixture inspired the hypothesis that a C6H5–NO(H) moiety is formed on the catalyst surface and it undergoes further condensation to azoxybenzene (AOB) releasing water. However, very low concentrations of azobenzene (AB) and hydrazobenzene (HAB) in the reaction mixture indicate that the reaction route to the formation of aniline by hydrogenation of AOB to AB, hydrazobenzene (HAB) and subsequent hydrogenolysis to AN is of low probability. Hydrogenolysis of AOB to C6H5–NO(H) and C6H5–N(H), where the latter is hydrogenated to AN, is more likely. Based on the experimental observations a new reaction scheme for the heterogeneous catalytic hydrogenation of NB was proposed.","container-title":"Applied Catalysis A: General","DOI":"10.1016/j.apcata.2015.04.002","ISSN":"0926-860X","journalAbbreviation":"Applied Catalysis A: General","page":"66-76","source":"ScienceDirect","title":"Liquid phase hydrogenation of nitrobenzene","volume":"499","author":[{"family":"Turáková","given":"Mária"},{"family":"Salmi","given":"Tapio"},{"family":"Eränen","given":"Kari"},{"family":"Wärnå","given":"Johan"},{"family":"Murzin","given":"Dmitry Yu."},{"family":"Králik","given":"Milan"}],"issued":{"date-parts":[["2015",6,25]]}}}],"schema":"https://github.com/citation-style-language/schema/raw/master/csl-citation.json"} </w:instrText>
+        <w:instrText xml:space="preserve"> ADDIN ZOTERO_ITEM CSL_CITATION {"citationID":"XN3L6qw2","properties":{"formattedCitation":"[2], [5]","plainCitation":"[2], [5]","noteIndex":0},"citationItems":[{"id":901,"uris":["http://zotero.org/users/15288956/items/WBHRAL9M"],"itemData":{"id":901,"type":"chapter","abstract":"Selective catalytic hydrogenation of nitroarenes is of great importance for dyestuff and pharmaceutical industry. In this chapter, the main industrial methods for aniline production and aniline market are firstly reviewed. Moreover, breakthroughs in the development of multiple catalytic technologies in the past decade are summarized, including direct hydrogenation using hydrogen; transfer hydrogenation using reductive agents; photocatalytic hydrogenation using hole scavenger; electrocatalytic hydrogenation accompanied by water oxidation. For direct catalytic hydrogenation, representative catalysts include metal, metal oxide/sulfide/carbides/nitrides/boride, and functional carbon material, and the crucial factors to tune their activity and selectivity are discussed such as metal–support interaction, size effect, alloy effect, defect engineering, and so on. Catalytic transfer hydrogenation, photocatalytic and electrocatalytic hydrogenation, these catalysts abstract hydrogen species from the hydrogen donor and stabilizes it on the catalyst surface, restricting active H* recombination, and then the active hydrogen species can be promptly transferred to nitroarenes for the hydrogenation. It is worth mentioning that the light harvesting and charge separation of photocatalysts and the conductivity of electrocatalysts should also be considered together for the overall performance.","container-title":"Industrial Arene Chemistry","DOI":"10.1002/9783527827992.ch50","ISBN":"978-3-527-82799-2","language":"en","note":"section: 50\n_eprint: https://onlinelibrary.wiley.com/doi/pdf/10.1002/9783527827992.ch50","page":"1479-1524","publisher":"John Wiley &amp; Sons, Ltd","source":"Wiley Online Library","title":"Selective Catalytic Hydrogenation of Nitroarenes to Anilines","URL":"https://onlinelibrary.wiley.com/doi/abs/10.1002/9783527827992.ch50","author":[{"family":"Gao","given":"Ruijie"},{"family":"Peng","given":"Chong"},{"family":"Zou","given":"Ji-Jun"}],"accessed":{"date-parts":[["2026",2,11]]},"issued":{"date-parts":[["2023"]]}}},{"id":959,"uris":["http://zotero.org/users/15288956/items/TD8LN5TE"],"itemData":{"id":959,"type":"article-journal","container-title":"Industrial &amp; Engineering Chemistry Process Design and Development","DOI":"10.1021/i260016a012","ISSN":"0196-4305, 1541-5716","issue":"4","journalAbbreviation":"Ind. Eng. Chem. Proc. Des. Dev.","language":"en","page":"403-410","source":"DOI.org (Crossref)","title":"Kinetics of Catalytic Vapor-Phase Hydrogenation of Nitrobenzene to Aniline","volume":"4","author":[{"family":"Rihani","given":"D. N."},{"family":"Narayanan","given":"T. K."},{"family":"Doraiswamy","given":"L. K."}],"issued":{"date-parts":[["1965",10]]}}}],"schema":"https://github.com/citation-style-language/schema/raw/master/csl-citation.json"} </w:instrText>
       </w:r>
       <w:r>
         <w:fldChar w:fldCharType="separate"/>
       </w:r>
       <w:r>
-        <w:t>[7]</w:t>
+        <w:t>[2], [5]</w:t>
       </w:r>
       <w:r>
         <w:fldChar w:fldCharType="end"/>
@@ -2887,289 +3499,145 @@
     <w:p/>
     <w:p>
       <w:r>
-        <w:t xml:space="preserve">Within the reactor, both mass transfer and reaction kinetic affects the reaction rate. On mass transfer, three phases are identified: dissolution of H2 in liquid, diffusion of dissolved H2 and reactant to catalyst surface, and intra-particle diffusion to the active sides </w:t>
+        <w:t>Reaction is simulated in a Plug Flow Reactor (RPLUG) under constant conditions of 1.5 MPa and 350</w:t>
+      </w:r>
+      <w:r>
+        <w:rPr>
+          <w:rFonts w:cstheme="majorBidi"/>
+        </w:rPr>
+        <w:t>°</w:t>
+      </w:r>
+      <w:r>
+        <w:t>C</w:t>
+      </w:r>
+      <w:r>
+        <w:t>. Reactor size is based on Díaz et al., with a multitube setup comprising 204 tubes, each 12 m long and 0.0978 m in diameter</w:t>
+      </w:r>
+      <w:r>
+        <w:t xml:space="preserve"> </w:t>
       </w:r>
       <w:r>
         <w:fldChar w:fldCharType="begin"/>
       </w:r>
       <w:r>
-        <w:instrText xml:space="preserve"> ADDIN ZOTERO_ITEM CSL_CITATION {"citationID":"zUZ3gc7s","properties":{"formattedCitation":"[8]","plainCitation":"[8]","noteIndex":0},"citationItems":[{"id":907,"uris":["http://zotero.org/users/15288956/items/5ZV3SRA4"],"itemData":{"id":907,"type":"article-journal","abstract":"Halogenated aromatic anilines are series of crucial intermediates for the synthesis of pigments, medicines and pesticides in the fine chemistry. However, efficient inhibition of undesired dehalogenation is difficult to achieve in the commonly used batch reactors. Although employing continuous flow technology and modified catalysts could alleviate dehalogenation, obtaining high selectivity of halogenated aromatic anilines especially for brominated aromatic amines and iodine aromatic amines is still challenging. In this study, a continuous flow system based on micro-packed bed reactor was developed and a kinetic model of the hydrogenation of halogenated nitrobenzene was established. Kinetic parameters for the reductions of p-chloronitrobenzene, p-bromonitrobenzene and p-iodonitrobenzene were acquired and the kinetic model exhibited good fit for the transformation of each substance. Moreover, the accuracy of kinetic model was validated by the comparison with the values in literature. The obtained kinetic model offered helpful information for the process optimization of hydrogenation of halogenated nitroaromatics in continuous flow system.","container-title":"Chemical Engineering Science","DOI":"10.1016/j.ces.2022.117483","ISSN":"0009-2509","journalAbbreviation":"Chemical Engineering Science","page":"117483","source":"ScienceDirect","title":"Hydrogenation kinetics of halogenated nitroaromatics over Pt/C in a continuous Micro-packed bed reactor","volume":"251","author":[{"family":"Duan","given":"Xiaonan"},{"family":"Yin","given":"Jiabin"},{"family":"Huang","given":"Mengmeng"},{"family":"Wang","given":"Peixia"},{"family":"Zhang","given":"Jisong"}],"issued":{"date-parts":[["2022",4,6]]}}}],"schema":"https://github.com/citation-style-language/schema/raw/master/csl-citation.json"} </w:instrText>
+        <w:instrText xml:space="preserve"> ADDIN ZOTERO_ITEM CSL_CITATION {"citationID":"yamXGkvi","properties":{"formattedCitation":"[12]","plainCitation":"[12]","noteIndex":0},"citationItems":[{"id":1015,"uris":["http://zotero.org/users/15288956/items/A6XUDAQV"],"itemData":{"id":1015,"type":"article-journal","abstract":"A numerical study of aniline production by hydrogenation of nitrobenzene (NBH) and hydrogen production by steam methane reforming (SMR) in a directly coupled membrane reactor is developed. This membrane reactor was proposed aiming to decarbonize heating in SMR and to favor the recovery of all products. Aniline recovery is improved in this reactor as water, a byproduct in NBH, is consumed in SMR. The simulation is performed using a heterogeneous-one dimensional model (Dusty gas model) and results are compared against the homogeneous model. The operating conditions of the reactor were selected using a multi-objective optimization method, genetic algorithms. The aims of the optimization were: methane conversion maximization, minimum membrane area, minimum reactor size, hydrogen yield maximization, nitrobenzene conversion maximization and the maximization of hydrogen recovery. This process was able to achieve complete conversion of methane and nitrobenzene. The hydrogen yield achieved can be as high as the maximum (</w:instrText>
+      </w:r>
+      <w:r>
+        <w:rPr>
+          <w:rFonts w:ascii="Cambria Math" w:hAnsi="Cambria Math" w:cs="Cambria Math"/>
+        </w:rPr>
+        <w:instrText>∼</w:instrText>
+      </w:r>
+      <w:r>
+        <w:instrText xml:space="preserve">4). 35% of this hydrogen was used as a reactant for aniline production. 99% of the unreacted hydrogen was recovered and purified. As the steam flow was minimized, aniline was obtained with a molar composition (70%), 2.1 times higher than that obtained in a conventional process for aniline production (33%). CO2 was obtained with a purity of 97%, hence, CO2 carbon capture and storage techniques were also favored. In addition, the energy requirements of heating of feedstock, reaction and recovery system of this novel process was 2.7 times lower than that of conventional processes carried out independently.","container-title":"International Journal of Hydrogen Energy","DOI":"10.1016/j.ijhydene.2022.01.128","ISSN":"0360-3199","issue":"19","journalAbbreviation":"International Journal of Hydrogen Energy","page":"10483-10499","publisher":"Elsevier","source":"ScienceDirect","title":"Multi-objective optimization of aniline and hydrogen production in a directly coupled membrane reactor","volume":"47","author":[{"family":"Díaz","given":"Grisales"},{"family":"Hugo","given":"Víctor"},{"family":"Willis","given":"Mark J."}],"issued":{"date-parts":[["2022",3,1]]}}}],"schema":"https://github.com/citation-style-language/schema/raw/master/csl-citation.json"} </w:instrText>
       </w:r>
       <w:r>
         <w:fldChar w:fldCharType="separate"/>
       </w:r>
       <w:r>
-        <w:t>[8]</w:t>
+        <w:t>[12]</w:t>
       </w:r>
       <w:r>
         <w:fldChar w:fldCharType="end"/>
       </w:r>
       <w:r>
-        <w:t xml:space="preserve">. Mass transfer limitation can be mitigated by: increasing temperature, increasing mixing, and reducing catalyst size </w:t>
+        <w:t>.</w:t>
+      </w:r>
+      <w:r>
+        <w:t xml:space="preserve"> </w:t>
+      </w:r>
+      <w:r>
+        <w:t>At the current reactor condition, literature sources suggest conversion between 95 ~ 99.9%, depending on flowrate and catalyst weight</w:t>
+      </w:r>
+      <w:r>
+        <w:t xml:space="preserve"> </w:t>
       </w:r>
       <w:r>
         <w:fldChar w:fldCharType="begin"/>
       </w:r>
       <w:r>
-        <w:instrText xml:space="preserve"> ADDIN ZOTERO_ITEM CSL_CITATION {"citationID":"p87gGSp3","properties":{"formattedCitation":"[9], [10]","plainCitation":"[9], [10]","noteIndex":0},"citationItems":[{"id":910,"uris":["http://zotero.org/users/15288956/items/9IRR2I2R"],"itemData":{"id":910,"type":"article-journal","abstract":"This paper deals with the modelling of a multiphase batch reaction: catalyzed nitrobenzene hydrogenation. The reactor's gas–liquid mass transfer parameters in the absence of any reaction are first identified, and the solubility of hydrogen in the reactional medium is also measured. A reaction kinetics and heat parameter identification method is then developed. This method is based on a light experimental procedure, requiring measurement of only temperature and pressure variations in the batch reactor. This study is carried out in an isothermal batch and semi-batch reactor, whose initial temperature varies between 283 and 333K. A simplified model associating the hydrodynamic gas–liquid mass transfer parameters and the chemical kinetics processes is developed. The key parameters that can influence the reaction development are the hydrogen pressure, the coolant temperature, the quantity of catalyst pellets and the stirring speed. The developed model also allows the precise simulation of the extent of reaction and the temperature evolution of the studied multiphase catalytic reaction.","container-title":"Chemical Engineering Journal","DOI":"10.1016/j.cej.2006.08.012","ISSN":"1385-8947","issue":"1","journalAbbreviation":"Chemical Engineering Journal","page":"19-28","source":"ScienceDirect","title":"Methodology of multiphase reaction kinetics and hydrodynamics identification: Application to catalyzed nitrobenzene hydrogenation","title-short":"Methodology of multiphase reaction kinetics and hydrodynamics identification","volume":"124","author":[{"family":"Frikha","given":"Nader"},{"family":"Schaer","given":"Eric"},{"family":"Houzelot","given":"Jean-Léon"}],"issued":{"date-parts":[["2006",11,1]]}}},{"id":906,"uris":["http://zotero.org/users/15288956/items/65WQEF7Q"],"itemData":{"id":906,"type":"article-journal","container-title":"Asian Journal of Chemistry","issue":"3","page":"1001-1005","title":"Kinetics Approach for Hydrogenation of Nitrobenzene to p-Aminophenol in a Four-Phase System","volume":"23","author":[{"family":"Li","given":"Guangxue"},{"family":"Ma","given":"Jianhua"},{"family":"Peng","given":"Xinhua"},{"family":"Lv","given":"Chunxu"}],"issued":{"date-parts":[["2011"]]}}}],"schema":"https://github.com/citation-style-language/schema/raw/master/csl-citation.json"} </w:instrText>
+        <w:instrText xml:space="preserve"> ADDIN ZOTERO_ITEM CSL_CITATION {"citationID":"EaCFK5HJ","properties":{"formattedCitation":"[5], [12]","plainCitation":"[5], [12]","noteIndex":0},"citationItems":[{"id":959,"uris":["http://zotero.org/users/15288956/items/TD8LN5TE"],"itemData":{"id":959,"type":"article-journal","container-title":"Industrial &amp; Engineering Chemistry Process Design and Development","DOI":"10.1021/i260016a012","ISSN":"0196-4305, 1541-5716","issue":"4","journalAbbreviation":"Ind. Eng. Chem. Proc. Des. Dev.","language":"en","page":"403-410","source":"DOI.org (Crossref)","title":"Kinetics of Catalytic Vapor-Phase Hydrogenation of Nitrobenzene to Aniline","volume":"4","author":[{"family":"Rihani","given":"D. N."},{"family":"Narayanan","given":"T. K."},{"family":"Doraiswamy","given":"L. K."}],"issued":{"date-parts":[["1965",10]]}}},{"id":1015,"uris":["http://zotero.org/users/15288956/items/A6XUDAQV"],"itemData":{"id":1015,"type":"article-journal","abstract":"A numerical study of aniline production by hydrogenation of nitrobenzene (NBH) and hydrogen production by steam methane reforming (SMR) in a directly coupled membrane reactor is developed. This membrane reactor was proposed aiming to decarbonize heating in SMR and to favor the recovery of all products. Aniline recovery is improved in this reactor as water, a byproduct in NBH, is consumed in SMR. The simulation is performed using a heterogeneous-one dimensional model (Dusty gas model) and results are compared against the homogeneous model. The operating conditions of the reactor were selected using a multi-objective optimization method, genetic algorithms. The aims of the optimization were: methane conversion maximization, minimum membrane area, minimum reactor size, hydrogen yield maximization, nitrobenzene conversion maximization and the maximization of hydrogen recovery. This process was able to achieve complete conversion of methane and nitrobenzene. The hydrogen yield achieved can be as high as the maximum (</w:instrText>
+      </w:r>
+      <w:r>
+        <w:rPr>
+          <w:rFonts w:ascii="Cambria Math" w:hAnsi="Cambria Math" w:cs="Cambria Math"/>
+        </w:rPr>
+        <w:instrText>∼</w:instrText>
+      </w:r>
+      <w:r>
+        <w:instrText xml:space="preserve">4). 35% of this hydrogen was used as a reactant for aniline production. 99% of the unreacted hydrogen was recovered and purified. As the steam flow was minimized, aniline was obtained with a molar composition (70%), 2.1 times higher than that obtained in a conventional process for aniline production (33%). CO2 was obtained with a purity of 97%, hence, CO2 carbon capture and storage techniques were also favored. In addition, the energy requirements of heating of feedstock, reaction and recovery system of this novel process was 2.7 times lower than that of conventional processes carried out independently.","container-title":"International Journal of Hydrogen Energy","DOI":"10.1016/j.ijhydene.2022.01.128","ISSN":"0360-3199","issue":"19","journalAbbreviation":"International Journal of Hydrogen Energy","page":"10483-10499","publisher":"Elsevier","source":"ScienceDirect","title":"Multi-objective optimization of aniline and hydrogen production in a directly coupled membrane reactor","volume":"47","author":[{"family":"Díaz","given":"Grisales"},{"family":"Hugo","given":"Víctor"},{"family":"Willis","given":"Mark J."}],"issued":{"date-parts":[["2022",3,1]]}}}],"schema":"https://github.com/citation-style-language/schema/raw/master/csl-citation.json"} </w:instrText>
       </w:r>
       <w:r>
         <w:fldChar w:fldCharType="separate"/>
       </w:r>
       <w:r>
-        <w:t>[9], [10]</w:t>
+        <w:t>[5], [12]</w:t>
       </w:r>
       <w:r>
         <w:fldChar w:fldCharType="end"/>
       </w:r>
       <w:r>
-        <w:t>. For simulation purposes, effect of mass transfer limitation will be ignored.</w:t>
+        <w:t xml:space="preserve">. </w:t>
+      </w:r>
+      <w:r>
+        <w:t>As both aniline and nitrobenzene are bulk chemicals, high conversion is important for financial security. Therefore, a 99.5% multipass conversion is targeted. Due to limited catalyst information, a generic copper-nickel catalyst physical property is used, yielding a voidage of 0.6 and a bulk density of 1422 kg/m</w:t>
+      </w:r>
+      <w:r>
+        <w:rPr>
+          <w:vertAlign w:val="superscript"/>
+        </w:rPr>
+        <w:t>3</w:t>
+      </w:r>
+      <w:r>
+        <w:t xml:space="preserve"> </w:t>
+      </w:r>
+      <w:r>
+        <w:fldChar w:fldCharType="begin"/>
+      </w:r>
+      <w:r>
+        <w:instrText xml:space="preserve"> ADDIN ZOTERO_ITEM CSL_CITATION {"citationID":"u4iNudYi","properties":{"formattedCitation":"[13]","plainCitation":"[13]","noteIndex":0},"citationItems":[{"id":1018,"uris":["http://zotero.org/users/15288956/items/7E8A2K3H"],"itemData":{"id":1018,"type":"article-journal","abstract":"Dry-Reforming-of-Methane (DRM) presents an attractive process for the conversion of CO2 and CH4 to syngas. Catalyst deactivation by carbon formation is a major challenge hindering DRM scale-up. A novel bimetallic Ni/Cu catalyst developed previously in our lab demonstrated significant carbon resistance and superior stability compared to conventional Ni catalysts. This paper presents the kinetics of the bimetallic catalyst. A unique approach utilizing carbon formation rates obtained from Density-Function-Theory (DFT) results is presented to scale monometallic Ni catalyst kinetics. The developed kinetics model incorporated within a 1-D pseudohomogeneous reactor-bed model was validated with thermodynamics and experimental results. The experimental results were obtained at 923-K temperature, flowrates (30 mL/min-250 mL/min), catalyst-loading (&lt;10 mg), and bed-dilution (&lt;500 mg). Additionally, the catalysts were characterized to identify crystal phase, surface area, pore-volume, and composition using XRD, BET-BJH, and ICP analysis, respectively. The developed kinetics model and the associated characterization dataset could be used for future scalability/reproducibility assessments.","container-title":"Chemical Engineering Science","DOI":"10.1016/j.ces.2022.118315","ISSN":"0009-2509","journalAbbreviation":"Chemical Engineering Science","page":"118315","source":"ScienceDirect","title":"Conceptual modeling of a reactor bed of a nickel-copper bi-metallic catalyst for dry reforming of methane","volume":"267","author":[{"family":"Khan","given":"Murtaza A."},{"family":"Challiwala","given":"Mohamed S."},{"family":"Prakash","given":"Anuj V."},{"family":"Elbashir","given":"Nimir O."}],"issued":{"date-parts":[["2023",3,5]]}}}],"schema":"https://github.com/citation-style-language/schema/raw/master/csl-citation.json"} </w:instrText>
+      </w:r>
+      <w:r>
+        <w:fldChar w:fldCharType="separate"/>
+      </w:r>
+      <w:r>
+        <w:t>[13]</w:t>
+      </w:r>
+      <w:r>
+        <w:fldChar w:fldCharType="end"/>
+      </w:r>
+      <w:r>
+        <w:t>.</w:t>
       </w:r>
     </w:p>
     <w:p/>
     <w:p>
       <w:r>
-        <w:t xml:space="preserve">Our main objective, is to produce 100,000 tonnes of aniline per year or 1100 </w:t>
-      </w:r>
-      <w:r>
-        <w:t xml:space="preserve">tonne-mol </w:t>
-      </w:r>
-      <w:r>
-        <w:t>per year, roughly 1/3</w:t>
-      </w:r>
-      <w:r>
-        <w:rPr>
-          <w:vertAlign w:val="superscript"/>
-        </w:rPr>
-        <w:t>rd</w:t>
-      </w:r>
-      <w:r>
-        <w:t xml:space="preserve"> of newly-operational aniline plant production in 2026 </w:t>
+        <w:t xml:space="preserve">Kinetic data for the vapour-phase hydrogenation of benzene are taken from Rihani et al </w:t>
       </w:r>
       <w:r>
         <w:fldChar w:fldCharType="begin"/>
       </w:r>
       <w:r>
-        <w:instrText xml:space="preserve"> ADDIN ZOTERO_ITEM CSL_CITATION {"citationID":"4pArSiAC","properties":{"formattedCitation":"[11]","plainCitation":"[11]","noteIndex":0},"citationItems":[{"id":1012,"uris":["http://zotero.org/users/15288956/items/KLRHWUDS"],"itemData":{"id":1012,"type":"webpage","genre":"March 2026","title":"Aniline Market Analysis: Industry Market Size, Plant Capacity, Production, Operating Efficiency, Demand &amp; Supply, End-User Industries, Sales Channel, Regional Demand, Company Share, Foreign Trade, Manufacturing Process, Policy and Regulatory Landscape, 2015-2032","URL":"https://www.chemanalyst.com/industry-report/aniline-market-282","author":[{"literal":"ChemAnalyst"}],"accessed":{"date-parts":[["2026",3,10]]}}}],"schema":"https://github.com/citation-style-language/schema/raw/master/csl-citation.json"} </w:instrText>
+        <w:instrText xml:space="preserve"> ADDIN ZOTERO_ITEM CSL_CITATION {"citationID":"uxe1iN7F","properties":{"formattedCitation":"[5]","plainCitation":"[5]","noteIndex":0},"citationItems":[{"id":959,"uris":["http://zotero.org/users/15288956/items/TD8LN5TE"],"itemData":{"id":959,"type":"article-journal","container-title":"Industrial &amp; Engineering Chemistry Process Design and Development","DOI":"10.1021/i260016a012","ISSN":"0196-4305, 1541-5716","issue":"4","journalAbbreviation":"Ind. Eng. Chem. Proc. Des. Dev.","language":"en","page":"403-410","source":"DOI.org (Crossref)","title":"Kinetics of Catalytic Vapor-Phase Hydrogenation of Nitrobenzene to Aniline","volume":"4","author":[{"family":"Rihani","given":"D. N."},{"family":"Narayanan","given":"T. K."},{"family":"Doraiswamy","given":"L. K."}],"issued":{"date-parts":[["1965",10]]}}}],"schema":"https://github.com/citation-style-language/schema/raw/master/csl-citation.json"} </w:instrText>
       </w:r>
       <w:r>
         <w:fldChar w:fldCharType="separate"/>
       </w:r>
       <w:r>
-        <w:t>[11]</w:t>
+        <w:t>[5]</w:t>
       </w:r>
       <w:r>
         <w:fldChar w:fldCharType="end"/>
       </w:r>
       <w:r>
-        <w:t>.</w:t>
-      </w:r>
-      <w:r>
-        <w:t xml:space="preserve"> </w:t>
-      </w:r>
-      <w:r>
-        <w:t xml:space="preserve">To start, overall efficiency is assumed to be 80%, requiring feed rate of 1375 </w:t>
-      </w:r>
-      <w:r>
-        <w:t>tonne-mol</w:t>
-      </w:r>
-      <w:r>
-        <w:t xml:space="preserve"> </w:t>
-      </w:r>
-      <w:r>
-        <w:t>per year. Furthermore, n</w:t>
-      </w:r>
-      <w:r>
-        <w:t xml:space="preserve">itrobenzene feed is </w:t>
-      </w:r>
-      <w:r>
-        <w:t xml:space="preserve">assumed to be of technical grade (99.8 wt% purity), with remaining impurities being water </w:t>
-      </w:r>
-      <w:r>
-        <w:fldChar w:fldCharType="begin"/>
-      </w:r>
-      <w:r>
-        <w:instrText xml:space="preserve"> ADDIN ZOTERO_ITEM CSL_CITATION {"citationID":"hON9MH8f","properties":{"formattedCitation":"[6]","plainCitation":"[6]","noteIndex":0},"citationItems":[{"id":1003,"uris":["http://zotero.org/users/15288956/items/LY2HTXPS"],"itemData":{"id":1003,"type":"report","collection-title":"Preview","number":"INTRATEC-ICC-PREV-293-B-PREM-USA","publisher-place":"United States","title":"Nitrobenzene Production from Benzene (KBR)","URL":"https://cdn.intratec.us/_nt/docs/icc/previews/INTRATEC-ICC-PREV-293-B-PREM-USA.pdf","author":[{"literal":"Intratec Solutions LLC (www.intratec.us)"}],"accessed":{"date-parts":[["2026",3,10]]},"issued":{"date-parts":[["2025"]]}}}],"schema":"https://github.com/citation-style-language/schema/raw/master/csl-citation.json"} </w:instrText>
-      </w:r>
-      <w:r>
-        <w:fldChar w:fldCharType="separate"/>
-      </w:r>
-      <w:r>
-        <w:t>[6]</w:t>
-      </w:r>
-      <w:r>
-        <w:fldChar w:fldCharType="end"/>
-      </w:r>
-      <w:r>
-        <w:t xml:space="preserve">, and is fed </w:t>
-      </w:r>
-      <w:r>
-        <w:t xml:space="preserve">at a ratio of 1:5 with hydrogen, providing good conversion while still being economical </w:t>
-      </w:r>
-      <w:r>
-        <w:fldChar w:fldCharType="begin"/>
-      </w:r>
-      <w:r>
-        <w:instrText xml:space="preserve"> ADDIN ZOTERO_ITEM CSL_CITATION {"citationID":"XN3L6qw2","properties":{"formattedCitation":"[2], [5]","plainCitation":"[2], [5]","noteIndex":0},"citationItems":[{"id":901,"uris":["http://zotero.org/users/15288956/items/WBHRAL9M"],"itemData":{"id":901,"type":"chapter","abstract":"Selective catalytic hydrogenation of nitroarenes is of great importance for dyestuff and pharmaceutical industry. In this chapter, the main industrial methods for aniline production and aniline market are firstly reviewed. Moreover, breakthroughs in the development of multiple catalytic technologies in the past decade are summarized, including direct hydrogenation using hydrogen; transfer hydrogenation using reductive agents; photocatalytic hydrogenation using hole scavenger; electrocatalytic hydrogenation accompanied by water oxidation. For direct catalytic hydrogenation, representative catalysts include metal, metal oxide/sulfide/carbides/nitrides/boride, and functional carbon material, and the crucial factors to tune their activity and selectivity are discussed such as metal–support interaction, size effect, alloy effect, defect engineering, and so on. Catalytic transfer hydrogenation, photocatalytic and electrocatalytic hydrogenation, these catalysts abstract hydrogen species from the hydrogen donor and stabilizes it on the catalyst surface, restricting active H* recombination, and then the active hydrogen species can be promptly transferred to nitroarenes for the hydrogenation. It is worth mentioning that the light harvesting and charge separation of photocatalysts and the conductivity of electrocatalysts should also be considered together for the overall performance.","container-title":"Industrial Arene Chemistry","DOI":"10.1002/9783527827992.ch50","ISBN":"978-3-527-82799-2","language":"en","note":"section: 50\n_eprint: https://onlinelibrary.wiley.com/doi/pdf/10.1002/9783527827992.ch50","page":"1479-1524","publisher":"John Wiley &amp; Sons, Ltd","source":"Wiley Online Library","title":"Selective Catalytic Hydrogenation of Nitroarenes to Anilines","URL":"https://onlinelibrary.wiley.com/doi/abs/10.1002/9783527827992.ch50","author":[{"family":"Gao","given":"Ruijie"},{"family":"Peng","given":"Chong"},{"family":"Zou","given":"Ji-Jun"}],"accessed":{"date-parts":[["2026",2,11]]},"issued":{"date-parts":[["2023"]]}}},{"id":959,"uris":["http://zotero.org/users/15288956/items/TD8LN5TE"],"itemData":{"id":959,"type":"article-journal","container-title":"Industrial &amp; Engineering Chemistry Process Design and Development","DOI":"10.1021/i260016a012","ISSN":"0196-4305, 1541-5716","issue":"4","journalAbbreviation":"Ind. Eng. Chem. Proc. Des. Dev.","language":"en","page":"403-410","source":"DOI.org (Crossref)","title":"Kinetics of Catalytic Vapor-Phase Hydrogenation of Nitrobenzene to Aniline","volume":"4","author":[{"family":"Rihani","given":"D. N."},{"family":"Narayanan","given":"T. K."},{"family":"Doraiswamy","given":"L. K."}],"issued":{"date-parts":[["1965",10]]}}}],"schema":"https://github.com/citation-style-language/schema/raw/master/csl-citation.json"} </w:instrText>
-      </w:r>
-      <w:r>
-        <w:fldChar w:fldCharType="separate"/>
-      </w:r>
-      <w:r>
-        <w:t>[2], [5]</w:t>
-      </w:r>
-      <w:r>
-        <w:fldChar w:fldCharType="end"/>
-      </w:r>
-      <w:r>
-        <w:t>.</w:t>
-      </w:r>
-    </w:p>
-    <w:p/>
-    <w:p>
-      <w:r>
-        <w:t>Reaction</w:t>
-      </w:r>
-      <w:r>
-        <w:t xml:space="preserve"> is simulated</w:t>
-      </w:r>
-      <w:r>
-        <w:t xml:space="preserve"> in a Plug Flow Reactor (RPLUG), with constant condition of 1.5 MPa and 350 C. Reactor size is based on Diaz et al, with a multitube setup with </w:t>
-      </w:r>
-      <w:r>
-        <w:t xml:space="preserve">204 tubes, each of 12 m length and 0.0978 m diameter </w:t>
-      </w:r>
-      <w:r>
-        <w:fldChar w:fldCharType="begin"/>
-      </w:r>
-      <w:r>
-        <w:instrText xml:space="preserve"> ADDIN ZOTERO_ITEM CSL_CITATION {"citationID":"yamXGkvi","properties":{"formattedCitation":"[12]","plainCitation":"[12]","noteIndex":0},"citationItems":[{"id":1015,"uris":["http://zotero.org/users/15288956/items/A6XUDAQV"],"itemData":{"id":1015,"type":"article-journal","abstract":"A numerical study of aniline production by hydrogenation of nitrobenzene (NBH) and hydrogen production by steam methane reforming (SMR) in a directly coupled membrane reactor is developed. This membrane reactor was proposed aiming to decarbonize heating in SMR and to favor the recovery of all products. Aniline recovery is improved in this reactor as water, a byproduct in NBH, is consumed in SMR. The simulation is performed using a heterogeneous-one dimensional model (Dusty gas model) and results are compared against the homogeneous model. The operating conditions of the reactor were selected using a multi-objective optimization method, genetic algorithms. The aims of the optimization were: methane conversion maximization, minimum membrane area, minimum reactor size, hydrogen yield maximization, nitrobenzene conversion maximization and the maximization of hydrogen recovery. This process was able to achieve complete conversion of methane and nitrobenzene. The hydrogen yield achieved can be as high as the maximum (</w:instrText>
-      </w:r>
-      <w:r>
-        <w:rPr>
-          <w:rFonts w:ascii="Cambria Math" w:hAnsi="Cambria Math" w:cs="Cambria Math"/>
-        </w:rPr>
-        <w:instrText>∼</w:instrText>
-      </w:r>
-      <w:r>
-        <w:instrText xml:space="preserve">4). 35% of this hydrogen was used as a reactant for aniline production. 99% of the unreacted hydrogen was recovered and purified. As the steam flow was minimized, aniline was obtained with a molar composition (70%), 2.1 times higher than that obtained in a conventional process for aniline production (33%). CO2 was obtained with a purity of 97%, hence, CO2 carbon capture and storage techniques were also favored. In addition, the energy requirements of heating of feedstock, reaction and recovery system of this novel process was 2.7 times lower than that of conventional processes carried out independently.","container-title":"International Journal of Hydrogen Energy","DOI":"10.1016/j.ijhydene.2022.01.128","ISSN":"0360-3199","issue":"19","journalAbbreviation":"International Journal of Hydrogen Energy","page":"10483-10499","publisher":"Elsevier","source":"ScienceDirect","title":"Multi-objective optimization of aniline and hydrogen production in a directly coupled membrane reactor","volume":"47","author":[{"family":"Díaz","given":"Grisales"},{"family":"Hugo","given":"Víctor"},{"family":"Willis","given":"Mark J."}],"issued":{"date-parts":[["2022",3,1]]}}}],"schema":"https://github.com/citation-style-language/schema/raw/master/csl-citation.json"} </w:instrText>
-      </w:r>
-      <w:r>
-        <w:fldChar w:fldCharType="separate"/>
-      </w:r>
-      <w:r>
-        <w:t>[12]</w:t>
-      </w:r>
-      <w:r>
-        <w:fldChar w:fldCharType="end"/>
-      </w:r>
-      <w:r>
-        <w:t>.</w:t>
-      </w:r>
-      <w:r>
-        <w:t xml:space="preserve"> </w:t>
-      </w:r>
-      <w:r>
-        <w:t xml:space="preserve">At current reactor condition, literature sources suggests conversion between 95 ~ 99.9%, </w:t>
-      </w:r>
-      <w:r>
-        <w:t xml:space="preserve">depending on flowrate and catalyst weight </w:t>
-      </w:r>
-      <w:r>
-        <w:fldChar w:fldCharType="begin"/>
-      </w:r>
-      <w:r>
-        <w:instrText xml:space="preserve"> ADDIN ZOTERO_ITEM CSL_CITATION {"citationID":"EaCFK5HJ","properties":{"formattedCitation":"[5], [12]","plainCitation":"[5], [12]","noteIndex":0},"citationItems":[{"id":959,"uris":["http://zotero.org/users/15288956/items/TD8LN5TE"],"itemData":{"id":959,"type":"article-journal","container-title":"Industrial &amp; Engineering Chemistry Process Design and Development","DOI":"10.1021/i260016a012","ISSN":"0196-4305, 1541-5716","issue":"4","journalAbbreviation":"Ind. Eng. Chem. Proc. Des. Dev.","language":"en","page":"403-410","source":"DOI.org (Crossref)","title":"Kinetics of Catalytic Vapor-Phase Hydrogenation of Nitrobenzene to Aniline","volume":"4","author":[{"family":"Rihani","given":"D. N."},{"family":"Narayanan","given":"T. K."},{"family":"Doraiswamy","given":"L. K."}],"issued":{"date-parts":[["1965",10]]}}},{"id":1015,"uris":["http://zotero.org/users/15288956/items/A6XUDAQV"],"itemData":{"id":1015,"type":"article-journal","abstract":"A numerical study of aniline production by hydrogenation of nitrobenzene (NBH) and hydrogen production by steam methane reforming (SMR) in a directly coupled membrane reactor is developed. This membrane reactor was proposed aiming to decarbonize heating in SMR and to favor the recovery of all products. Aniline recovery is improved in this reactor as water, a byproduct in NBH, is consumed in SMR. The simulation is performed using a heterogeneous-one dimensional model (Dusty gas model) and results are compared against the homogeneous model. The operating conditions of the reactor were selected using a multi-objective optimization method, genetic algorithms. The aims of the optimization were: methane conversion maximization, minimum membrane area, minimum reactor size, hydrogen yield maximization, nitrobenzene conversion maximization and the maximization of hydrogen recovery. This process was able to achieve complete conversion of methane and nitrobenzene. The hydrogen yield achieved can be as high as the maximum (</w:instrText>
-      </w:r>
-      <w:r>
-        <w:rPr>
-          <w:rFonts w:ascii="Cambria Math" w:hAnsi="Cambria Math" w:cs="Cambria Math"/>
-        </w:rPr>
-        <w:instrText>∼</w:instrText>
-      </w:r>
-      <w:r>
-        <w:instrText xml:space="preserve">4). 35% of this hydrogen was used as a reactant for aniline production. 99% of the unreacted hydrogen was recovered and purified. As the steam flow was minimized, aniline was obtained with a molar composition (70%), 2.1 times higher than that obtained in a conventional process for aniline production (33%). CO2 was obtained with a purity of 97%, hence, CO2 carbon capture and storage techniques were also favored. In addition, the energy requirements of heating of feedstock, reaction and recovery system of this novel process was 2.7 times lower than that of conventional processes carried out independently.","container-title":"International Journal of Hydrogen Energy","DOI":"10.1016/j.ijhydene.2022.01.128","ISSN":"0360-3199","issue":"19","journalAbbreviation":"International Journal of Hydrogen Energy","page":"10483-10499","publisher":"Elsevier","source":"ScienceDirect","title":"Multi-objective optimization of aniline and hydrogen production in a directly coupled membrane reactor","volume":"47","author":[{"family":"Díaz","given":"Grisales"},{"family":"Hugo","given":"Víctor"},{"family":"Willis","given":"Mark J."}],"issued":{"date-parts":[["2022",3,1]]}}}],"schema":"https://github.com/citation-style-language/schema/raw/master/csl-citation.json"} </w:instrText>
-      </w:r>
-      <w:r>
-        <w:fldChar w:fldCharType="separate"/>
-      </w:r>
-      <w:r>
-        <w:t>[5], [12]</w:t>
-      </w:r>
-      <w:r>
-        <w:fldChar w:fldCharType="end"/>
-      </w:r>
-      <w:r>
-        <w:t>.</w:t>
-      </w:r>
-      <w:r>
-        <w:t xml:space="preserve"> </w:t>
-      </w:r>
-      <w:r>
-        <w:t xml:space="preserve">As both aniline and nitrobenzene are bulk chemicals, high conversion is important for financial security. </w:t>
-      </w:r>
-      <w:r>
-        <w:t>Therefore, a multipass conversion of 95% is targeted.</w:t>
-      </w:r>
-      <w:r>
-        <w:t xml:space="preserve"> Due to limited catalyst information, a generic copper-nickel catalyst physical property is used, giving 0.6 voidage and bulk density of 1422 kg/m3</w:t>
-      </w:r>
-      <w:r>
-        <w:t xml:space="preserve"> </w:t>
-      </w:r>
-      <w:r>
-        <w:fldChar w:fldCharType="begin"/>
-      </w:r>
-      <w:r>
-        <w:instrText xml:space="preserve"> ADDIN ZOTERO_ITEM CSL_CITATION {"citationID":"u4iNudYi","properties":{"formattedCitation":"[13]","plainCitation":"[13]","noteIndex":0},"citationItems":[{"id":1018,"uris":["http://zotero.org/users/15288956/items/7E8A2K3H"],"itemData":{"id":1018,"type":"article-journal","abstract":"Dry-Reforming-of-Methane (DRM) presents an attractive process for the conversion of CO2 and CH4 to syngas. Catalyst deactivation by carbon formation is a major challenge hindering DRM scale-up. A novel bimetallic Ni/Cu catalyst developed previously in our lab demonstrated significant carbon resistance and superior stability compared to conventional Ni catalysts. This paper presents the kinetics of the bimetallic catalyst. A unique approach utilizing carbon formation rates obtained from Density-Function-Theory (DFT) results is presented to scale monometallic Ni catalyst kinetics. The developed kinetics model incorporated within a 1-D pseudohomogeneous reactor-bed model was validated with thermodynamics and experimental results. The experimental results were obtained at 923-K temperature, flowrates (30 mL/min-250 mL/min), catalyst-loading (&lt;10 mg), and bed-dilution (&lt;500 mg). Additionally, the catalysts were characterized to identify crystal phase, surface area, pore-volume, and composition using XRD, BET-BJH, and ICP analysis, respectively. The developed kinetics model and the associated characterization dataset could be used for future scalability/reproducibility assessments.","container-title":"Chemical Engineering Science","DOI":"10.1016/j.ces.2022.118315","ISSN":"0009-2509","journalAbbreviation":"Chemical Engineering Science","page":"118315","source":"ScienceDirect","title":"Conceptual modeling of a reactor bed of a nickel-copper bi-metallic catalyst for dry reforming of methane","volume":"267","author":[{"family":"Khan","given":"Murtaza A."},{"family":"Challiwala","given":"Mohamed S."},{"family":"Prakash","given":"Anuj V."},{"family":"Elbashir","given":"Nimir O."}],"issued":{"date-parts":[["2023",3,5]]}}}],"schema":"https://github.com/citation-style-language/schema/raw/master/csl-citation.json"} </w:instrText>
-      </w:r>
-      <w:r>
-        <w:fldChar w:fldCharType="separate"/>
-      </w:r>
-      <w:r>
-        <w:t>[13]</w:t>
-      </w:r>
-      <w:r>
-        <w:fldChar w:fldCharType="end"/>
-      </w:r>
-      <w:r>
-        <w:t>.</w:t>
-      </w:r>
-    </w:p>
-    <w:p/>
-    <w:p>
-      <w:r>
-        <w:t>Kinetic data for the vapour-phase hydrogenation of benzene is taken from Rihani et al</w:t>
-      </w:r>
-      <w:r>
-        <w:t xml:space="preserve"> </w:t>
-      </w:r>
-      <w:r>
-        <w:fldChar w:fldCharType="begin"/>
-      </w:r>
-      <w:r>
-        <w:instrText xml:space="preserve"> ADDIN ZOTERO_ITEM CSL_CITATION {"citationID":"NWLPVBY0","properties":{"formattedCitation":"[5]","plainCitation":"[5]","noteIndex":0},"citationItems":[{"id":959,"uris":["http://zotero.org/users/15288956/items/TD8LN5TE"],"itemData":{"id":959,"type":"article-journal","container-title":"Industrial &amp; Engineering Chemistry Process Design and Development","DOI":"10.1021/i260016a012","ISSN":"0196-4305, 1541-5716","issue":"4","journalAbbreviation":"Ind. Eng. Chem. Proc. Des. Dev.","language":"en","page":"403-410","source":"DOI.org (Crossref)","title":"Kinetics of Catalytic Vapor-Phase Hydrogenation of Nitrobenzene to Aniline","volume":"4","author":[{"family":"Rihani","given":"D. N."},{"family":"Narayanan","given":"T. K."},{"family":"Doraiswamy","given":"L. K."}],"issued":{"date-parts":[["1965",10]]}}}],"schema":"https://github.com/citation-style-language/schema/raw/master/csl-citation.json"} </w:instrText>
-      </w:r>
-      <w:r>
-        <w:fldChar w:fldCharType="separate"/>
-      </w:r>
-      <w:r>
-        <w:t>[5]</w:t>
-      </w:r>
-      <w:r>
-        <w:fldChar w:fldCharType="end"/>
-      </w:r>
-      <w:r>
-        <w:t>. A</w:t>
-      </w:r>
-      <w:r>
-        <w:t>s</w:t>
-      </w:r>
-      <w:r>
-        <w:t xml:space="preserve"> is common in Aspen, the catalyst is not accounted for in components, rather being a part of the rate law.</w:t>
-      </w:r>
-      <w:r>
-        <w:t xml:space="preserve"> The presented powerlaw reaction kinetic is as follows:</w:t>
+        <w:t xml:space="preserve">. </w:t>
+      </w:r>
+      <w:r>
+        <w:t>As is common in Aspen, the catalyst is not accounted for in components, rather being a part of the rate law. The presented powerlaw reaction kinetics is as follows</w:t>
+      </w:r>
+      <w:r>
+        <w:t>:</w:t>
       </w:r>
     </w:p>
     <w:p/>
@@ -3691,7 +4159,6 @@
           <w:rPr>
             <w:rFonts w:ascii="Cambria Math" w:hAnsi="Cambria Math"/>
           </w:rPr>
-          <w:lastRenderedPageBreak/>
           <m:t>k=0.0001125</m:t>
         </m:r>
         <m:f>
@@ -3805,6 +4272,7 @@
           <w:rPr>
             <w:rFonts w:ascii="Cambria Math" w:hAnsi="Cambria Math"/>
           </w:rPr>
+          <w:lastRenderedPageBreak/>
           <m:t>E=68507</m:t>
         </m:r>
         <m:f>
@@ -3848,12 +4316,16 @@
     </w:p>
     <w:p>
       <w:r>
-        <w:t>With the reaction kinetic and reactor conditions defined above, reaction quickly reached 100% conversion, as shown in image below. This signifies that the current reaction condition works really well and it might be worth the effort to reduce efficiencies to save on operating costs.</w:t>
-      </w:r>
-    </w:p>
+        <w:t>With the reaction kinetics and reactor conditions defined above, the reaction quickly reached 100% conversion, as shown in Figure 2 below. This indicates that the current reaction conditions work very well, and it might be worth the effort to reduce efficiency to save on operating costs.</w:t>
+      </w:r>
+    </w:p>
+    <w:p/>
     <w:p>
       <w:commentRangeStart w:id="6"/>
       <w:r>
+        <w:rPr>
+          <w:noProof/>
+        </w:rPr>
         <w:drawing>
           <wp:inline distT="0" distB="0" distL="0" distR="0" wp14:anchorId="1E6271C9" wp14:editId="15CA61FC">
             <wp:extent cx="6332220" cy="3211830"/>
@@ -3909,8 +4381,11 @@
     <w:p>
       <w:pPr>
         <w:pStyle w:val="Heading2"/>
-      </w:pPr>
-      <w:bookmarkStart w:id="7" w:name="_Toc224082096"/>
+        <w:rPr>
+          <w:rFonts w:asciiTheme="majorBidi" w:hAnsiTheme="majorBidi" w:cstheme="majorBidi"/>
+        </w:rPr>
+      </w:pPr>
+      <w:bookmarkStart w:id="7" w:name="_Toc224148625"/>
       <w:commentRangeStart w:id="8"/>
       <w:commentRangeStart w:id="9"/>
       <w:commentRangeStart w:id="10"/>
@@ -3924,13 +4399,14 @@
         <w:rPr>
           <w:rFonts w:asciiTheme="majorBidi" w:hAnsiTheme="majorBidi" w:cstheme="majorBidi"/>
         </w:rPr>
-        <w:t>Analysis [eg. design spec, sensitivity analysis, calculator block, recycle stream, optimization])</w:t>
+        <w:t>Analysis</w:t>
       </w:r>
       <w:bookmarkEnd w:id="7"/>
       <w:commentRangeEnd w:id="8"/>
       <w:r>
         <w:rPr>
           <w:rStyle w:val="CommentReference"/>
+          <w:rFonts w:asciiTheme="majorBidi" w:hAnsiTheme="majorBidi" w:cstheme="majorBidi"/>
           <w:sz w:val="36"/>
           <w:szCs w:val="26"/>
         </w:rPr>
@@ -3940,6 +4416,7 @@
       <w:r>
         <w:rPr>
           <w:rStyle w:val="CommentReference"/>
+          <w:rFonts w:asciiTheme="majorBidi" w:hAnsiTheme="majorBidi" w:cstheme="majorBidi"/>
           <w:sz w:val="36"/>
           <w:szCs w:val="26"/>
         </w:rPr>
@@ -3949,6 +4426,7 @@
       <w:r>
         <w:rPr>
           <w:rStyle w:val="CommentReference"/>
+          <w:rFonts w:asciiTheme="majorBidi" w:hAnsiTheme="majorBidi" w:cstheme="majorBidi"/>
           <w:sz w:val="36"/>
           <w:szCs w:val="26"/>
         </w:rPr>
@@ -3956,10 +4434,315 @@
       </w:r>
     </w:p>
     <w:p>
+      <w:r>
+        <w:t>From Figure 2 above, it is clear that the system is overspecified for the current input and reaction kinetics. This means that parts of the reactor are underutilised, wasting precious resources. Therefore, the main target of this reactor analysis section is to adjust reactor size so that reactants reach their target conversion near the end of their residence time.</w:t>
+      </w:r>
+    </w:p>
+    <w:p/>
+    <w:p>
+      <w:pPr>
+        <w:pStyle w:val="Heading3"/>
+      </w:pPr>
+      <w:bookmarkStart w:id="11" w:name="_Toc224148626"/>
+      <w:r>
+        <w:t>Reactor Size</w:t>
+      </w:r>
+      <w:bookmarkEnd w:id="11"/>
+    </w:p>
+    <w:p>
+      <w:r>
+        <w:t xml:space="preserve">Two reactor size variables are manipulated: length and number of tubes. This </w:t>
+      </w:r>
+      <w:r>
+        <w:t>analysis is conducted through sensitivity analysis, with the following bounds:</w:t>
+      </w:r>
+    </w:p>
+    <w:p/>
+    <w:p>
+      <w:r>
+        <w:t>Table 2: Sensitivity Analysis Setup for Reactor Size</w:t>
+      </w:r>
+    </w:p>
+    <w:tbl>
+      <w:tblPr>
+        <w:tblStyle w:val="TableGrid"/>
+        <w:tblW w:w="0" w:type="auto"/>
+        <w:tblLook w:val="04A0" w:firstRow="1" w:lastRow="0" w:firstColumn="1" w:lastColumn="0" w:noHBand="0" w:noVBand="1"/>
+      </w:tblPr>
+      <w:tblGrid>
+        <w:gridCol w:w="3320"/>
+        <w:gridCol w:w="3321"/>
+        <w:gridCol w:w="3321"/>
+      </w:tblGrid>
+      <w:tr>
+        <w:tc>
+          <w:tcPr>
+            <w:tcW w:w="3320" w:type="dxa"/>
+          </w:tcPr>
+          <w:p/>
+        </w:tc>
+        <w:tc>
+          <w:tcPr>
+            <w:tcW w:w="3321" w:type="dxa"/>
+          </w:tcPr>
+          <w:p>
+            <w:r>
+              <w:t>Reactor Length (m)</w:t>
+            </w:r>
+          </w:p>
+        </w:tc>
+        <w:tc>
+          <w:tcPr>
+            <w:tcW w:w="3321" w:type="dxa"/>
+          </w:tcPr>
+          <w:p>
+            <w:r>
+              <w:t>Number of Tubes</w:t>
+            </w:r>
+          </w:p>
+        </w:tc>
+      </w:tr>
+      <w:tr>
+        <w:tc>
+          <w:tcPr>
+            <w:tcW w:w="3320" w:type="dxa"/>
+          </w:tcPr>
+          <w:p>
+            <w:r>
+              <w:t>Lower Bound</w:t>
+            </w:r>
+          </w:p>
+        </w:tc>
+        <w:tc>
+          <w:tcPr>
+            <w:tcW w:w="3321" w:type="dxa"/>
+          </w:tcPr>
+          <w:p>
+            <w:r>
+              <w:t>2</w:t>
+            </w:r>
+          </w:p>
+        </w:tc>
+        <w:tc>
+          <w:tcPr>
+            <w:tcW w:w="3321" w:type="dxa"/>
+          </w:tcPr>
+          <w:p>
+            <w:r>
+              <w:t>20</w:t>
+            </w:r>
+          </w:p>
+        </w:tc>
+      </w:tr>
+      <w:tr>
+        <w:tc>
+          <w:tcPr>
+            <w:tcW w:w="3320" w:type="dxa"/>
+          </w:tcPr>
+          <w:p>
+            <w:r>
+              <w:t>Upper Bound</w:t>
+            </w:r>
+          </w:p>
+        </w:tc>
+        <w:tc>
+          <w:tcPr>
+            <w:tcW w:w="3321" w:type="dxa"/>
+          </w:tcPr>
+          <w:p>
+            <w:r>
+              <w:t>12</w:t>
+            </w:r>
+          </w:p>
+        </w:tc>
+        <w:tc>
+          <w:tcPr>
+            <w:tcW w:w="3321" w:type="dxa"/>
+          </w:tcPr>
+          <w:p>
+            <w:r>
+              <w:t>204</w:t>
+            </w:r>
+          </w:p>
+        </w:tc>
+      </w:tr>
+      <w:tr>
+        <w:tc>
+          <w:tcPr>
+            <w:tcW w:w="3320" w:type="dxa"/>
+          </w:tcPr>
+          <w:p>
+            <w:r>
+              <w:t>Increment</w:t>
+            </w:r>
+          </w:p>
+        </w:tc>
+        <w:tc>
+          <w:tcPr>
+            <w:tcW w:w="3321" w:type="dxa"/>
+          </w:tcPr>
+          <w:p>
+            <w:r>
+              <w:t>0.5</w:t>
+            </w:r>
+          </w:p>
+        </w:tc>
+        <w:tc>
+          <w:tcPr>
+            <w:tcW w:w="3321" w:type="dxa"/>
+          </w:tcPr>
+          <w:p>
+            <w:r>
+              <w:t>2</w:t>
+            </w:r>
+          </w:p>
+        </w:tc>
+      </w:tr>
+    </w:tbl>
+    <w:p/>
+    <w:p>
+      <w:r>
+        <w:t>Running sensitivity analysis, many size ranges achieve the targeted nitrobenzene conversion. Of these, a final reactor design with a length of 4.5 m and 50 tubes is selected. It is selected as it reached 100% nitrobenzene conversion, reducing separation costs down the line.</w:t>
+      </w:r>
+    </w:p>
+    <w:p/>
+    <w:p>
+      <w:pPr>
+        <w:pStyle w:val="Heading3"/>
+      </w:pPr>
+      <w:bookmarkStart w:id="12" w:name="_Toc224148627"/>
+      <w:r>
+        <w:t>Selected</w:t>
+      </w:r>
+      <w:r>
+        <w:t xml:space="preserve"> Reactor Specification</w:t>
+      </w:r>
+      <w:bookmarkEnd w:id="12"/>
+    </w:p>
+    <w:p>
+      <w:r>
+        <w:t>The final reactor design is an isothermic reactor with the following specification:</w:t>
+      </w:r>
+    </w:p>
+    <w:p>
+      <w:pPr>
+        <w:pStyle w:val="ListParagraph"/>
+        <w:numPr>
+          <w:ilvl w:val="0"/>
+          <w:numId w:val="26"/>
+        </w:numPr>
+      </w:pPr>
+      <w:r>
+        <w:t>Temperature: 350</w:t>
+      </w:r>
+      <w:r>
+        <w:rPr>
+          <w:rFonts w:cstheme="majorBidi"/>
+        </w:rPr>
+        <w:t>°</w:t>
+      </w:r>
+      <w:r>
+        <w:t>C</w:t>
+      </w:r>
+    </w:p>
+    <w:p>
+      <w:pPr>
+        <w:pStyle w:val="ListParagraph"/>
+        <w:numPr>
+          <w:ilvl w:val="0"/>
+          <w:numId w:val="26"/>
+        </w:numPr>
+      </w:pPr>
+      <w:r>
+        <w:t>Pressure: 1.5 atm</w:t>
+      </w:r>
+    </w:p>
+    <w:p>
+      <w:pPr>
+        <w:pStyle w:val="ListParagraph"/>
+        <w:numPr>
+          <w:ilvl w:val="0"/>
+          <w:numId w:val="26"/>
+        </w:numPr>
+      </w:pPr>
+      <w:r>
+        <w:t>Length: 4.5 metre</w:t>
+      </w:r>
+      <w:r>
+        <w:t>s</w:t>
+      </w:r>
+    </w:p>
+    <w:p>
+      <w:pPr>
+        <w:pStyle w:val="ListParagraph"/>
+        <w:numPr>
+          <w:ilvl w:val="0"/>
+          <w:numId w:val="26"/>
+        </w:numPr>
+      </w:pPr>
+      <w:r>
+        <w:t>Number of tubes: 50</w:t>
+      </w:r>
+    </w:p>
+    <w:p>
+      <w:r>
+        <w:t xml:space="preserve">Figure 3 below shows the molar composition throughout the reactor. </w:t>
+      </w:r>
+      <w:r>
+        <w:t>Complete</w:t>
+      </w:r>
+      <w:r>
+        <w:t xml:space="preserve"> nitrobenzene conversion is achieved near the reactor outlet, utilising the entire reactor. </w:t>
+      </w:r>
+      <w:r>
+        <w:drawing>
+          <wp:inline distT="0" distB="0" distL="0" distR="0" wp14:anchorId="32E9483C" wp14:editId="08708E12">
+            <wp:extent cx="6332220" cy="3197225"/>
+            <wp:effectExtent l="0" t="0" r="0" b="3175"/>
+            <wp:docPr id="281162379" name="Picture 1"/>
+            <wp:cNvGraphicFramePr>
+              <a:graphicFrameLocks xmlns:a="http://schemas.openxmlformats.org/drawingml/2006/main" noChangeAspect="1"/>
+            </wp:cNvGraphicFramePr>
+            <a:graphic xmlns:a="http://schemas.openxmlformats.org/drawingml/2006/main">
+              <a:graphicData uri="http://schemas.openxmlformats.org/drawingml/2006/picture">
+                <pic:pic xmlns:pic="http://schemas.openxmlformats.org/drawingml/2006/picture">
+                  <pic:nvPicPr>
+                    <pic:cNvPr id="281162379" name=""/>
+                    <pic:cNvPicPr/>
+                  </pic:nvPicPr>
+                  <pic:blipFill>
+                    <a:blip r:embed="rId25"/>
+                    <a:stretch>
+                      <a:fillRect/>
+                    </a:stretch>
+                  </pic:blipFill>
+                  <pic:spPr>
+                    <a:xfrm>
+                      <a:off x="0" y="0"/>
+                      <a:ext cx="6332220" cy="3197225"/>
+                    </a:xfrm>
+                    <a:prstGeom prst="rect">
+                      <a:avLst/>
+                    </a:prstGeom>
+                  </pic:spPr>
+                </pic:pic>
+              </a:graphicData>
+            </a:graphic>
+          </wp:inline>
+        </w:drawing>
+      </w:r>
+    </w:p>
+    <w:p>
+      <w:r>
+        <w:t>Figure 3: Molar composition over reactor length for the selected reactor design specifications</w:t>
+      </w:r>
+    </w:p>
+    <w:p/>
+    <w:p>
       <w:pPr>
         <w:pStyle w:val="Heading2"/>
       </w:pPr>
-      <w:bookmarkStart w:id="11" w:name="_Toc224082097"/>
+      <w:bookmarkStart w:id="13" w:name="_Toc224148628"/>
       <w:r>
         <w:rPr>
           <w:rFonts w:asciiTheme="majorBidi" w:hAnsiTheme="majorBidi" w:cstheme="majorBidi"/>
@@ -3972,13 +4755,13 @@
         </w:rPr>
         <w:t>Design</w:t>
       </w:r>
-      <w:bookmarkEnd w:id="11"/>
+      <w:bookmarkEnd w:id="13"/>
     </w:p>
     <w:p>
       <w:pPr>
         <w:pStyle w:val="Heading2"/>
       </w:pPr>
-      <w:bookmarkStart w:id="12" w:name="_Toc224082098"/>
+      <w:bookmarkStart w:id="14" w:name="_Toc224148629"/>
       <w:r>
         <w:rPr>
           <w:rFonts w:asciiTheme="majorBidi" w:hAnsiTheme="majorBidi" w:cstheme="majorBidi"/>
@@ -3991,46 +4774,46 @@
         </w:rPr>
         <w:t>Analysis</w:t>
       </w:r>
-      <w:bookmarkEnd w:id="12"/>
+      <w:bookmarkEnd w:id="14"/>
     </w:p>
     <w:p>
       <w:pPr>
         <w:pStyle w:val="Heading2"/>
       </w:pPr>
-      <w:bookmarkStart w:id="13" w:name="_Toc224082099"/>
+      <w:bookmarkStart w:id="15" w:name="_Toc224148630"/>
       <w:r>
         <w:rPr>
           <w:rFonts w:asciiTheme="majorBidi" w:hAnsiTheme="majorBidi" w:cstheme="majorBidi"/>
         </w:rPr>
         <w:t>Heat Exchanger Design</w:t>
       </w:r>
-      <w:bookmarkEnd w:id="13"/>
+      <w:bookmarkEnd w:id="15"/>
     </w:p>
     <w:p>
       <w:pPr>
         <w:pStyle w:val="Heading2"/>
       </w:pPr>
-      <w:bookmarkStart w:id="14" w:name="_Toc224082100"/>
+      <w:bookmarkStart w:id="16" w:name="_Toc224148631"/>
       <w:r>
         <w:rPr>
           <w:rFonts w:asciiTheme="majorBidi" w:hAnsiTheme="majorBidi" w:cstheme="majorBidi"/>
         </w:rPr>
         <w:t>Heat Exchanger Analysis</w:t>
       </w:r>
-      <w:bookmarkEnd w:id="14"/>
+      <w:bookmarkEnd w:id="16"/>
     </w:p>
     <w:p>
       <w:pPr>
         <w:pStyle w:val="Heading2"/>
       </w:pPr>
-      <w:bookmarkStart w:id="15" w:name="_Toc224082101"/>
+      <w:bookmarkStart w:id="17" w:name="_Toc224148632"/>
       <w:r>
         <w:rPr>
           <w:rFonts w:asciiTheme="majorBidi" w:hAnsiTheme="majorBidi" w:cstheme="majorBidi"/>
         </w:rPr>
         <w:t>Discussion/reflection</w:t>
       </w:r>
-      <w:bookmarkEnd w:id="15"/>
+      <w:bookmarkEnd w:id="17"/>
       <w:r>
         <w:rPr>
           <w:rFonts w:asciiTheme="majorBidi" w:hAnsiTheme="majorBidi" w:cstheme="majorBidi"/>
@@ -4042,14 +4825,14 @@
       <w:pPr>
         <w:pStyle w:val="Heading2"/>
       </w:pPr>
-      <w:bookmarkStart w:id="16" w:name="_Toc224082102"/>
+      <w:bookmarkStart w:id="18" w:name="_Toc224148633"/>
       <w:r>
         <w:rPr>
           <w:rFonts w:asciiTheme="majorBidi" w:hAnsiTheme="majorBidi" w:cstheme="majorBidi"/>
         </w:rPr>
         <w:t>Next steps</w:t>
       </w:r>
-      <w:bookmarkEnd w:id="16"/>
+      <w:bookmarkEnd w:id="18"/>
     </w:p>
     <w:p>
       <w:pPr>
@@ -4069,11 +4852,11 @@
       <w:pPr>
         <w:pStyle w:val="Heading2"/>
       </w:pPr>
-      <w:bookmarkStart w:id="17" w:name="_Toc224082103"/>
+      <w:bookmarkStart w:id="19" w:name="_Toc224148634"/>
       <w:r>
         <w:t>References</w:t>
       </w:r>
-      <w:bookmarkEnd w:id="17"/>
+      <w:bookmarkEnd w:id="19"/>
     </w:p>
     <w:p>
       <w:pPr>
@@ -4201,6 +4984,18 @@
       </w:r>
       <w:r>
         <w:tab/>
+        <w:t>Health Canada, ‘Asbestos and your health’. Accessed: Mar. 11, 2026. [Online]. Available: https://www.canada.ca/en/health-canada/services/air-quality/indoor-air-contaminants/health-risks-asbestos.html</w:t>
+      </w:r>
+    </w:p>
+    <w:p>
+      <w:pPr>
+        <w:pStyle w:val="Bibliography"/>
+      </w:pPr>
+      <w:r>
+        <w:t>[7]</w:t>
+      </w:r>
+      <w:r>
+        <w:tab/>
         <w:t>Intratec Solutions LLC (www.intratec.us), ‘Nitrobenzene Production from Benzene (KBR)’, United States, INTRATEC-ICC-PREV-293-B-PREM-USA, 2025. Accessed: Mar. 10, 2026. [Online]. Available: https://cdn.intratec.us/_nt/docs/icc/previews/INTRATEC-ICC-PREV-293-B-PREM-USA.pdf</w:t>
       </w:r>
     </w:p>
@@ -4209,21 +5004,21 @@
         <w:pStyle w:val="Bibliography"/>
       </w:pPr>
       <w:r>
-        <w:t>[7]</w:t>
+        <w:t>[8]</w:t>
       </w:r>
       <w:r>
         <w:tab/>
-        <w:t xml:space="preserve">M. Turáková, T. Salmi, K. Eränen, J. Wärnå, D. Yu. Murzin, and M. Králik, ‘Liquid phase hydrogenation of nitrobenzene’, </w:t>
+        <w:t xml:space="preserve">X. Duan, J. Yin, M. Huang, P. Wang, and J. Zhang, ‘Hydrogenation kinetics of halogenated nitroaromatics over Pt/C in a continuous Micro-packed bed reactor’, </w:t>
       </w:r>
       <w:r>
         <w:rPr>
           <w:i/>
           <w:iCs/>
         </w:rPr>
-        <w:t>Applied Catalysis A: General</w:t>
-      </w:r>
-      <w:r>
-        <w:t>, vol. 499, pp. 66–76, Jun. 2015, doi: 10.1016/j.apcata.2015.04.002.</w:t>
+        <w:t>Chemical Engineering Science</w:t>
+      </w:r>
+      <w:r>
+        <w:t>, vol. 251, p. 117483, Apr. 2022, doi: 10.1016/j.ces.2022.117483.</w:t>
       </w:r>
     </w:p>
     <w:p>
@@ -4231,21 +5026,21 @@
         <w:pStyle w:val="Bibliography"/>
       </w:pPr>
       <w:r>
-        <w:t>[8]</w:t>
+        <w:t>[9]</w:t>
       </w:r>
       <w:r>
         <w:tab/>
-        <w:t xml:space="preserve">X. Duan, J. Yin, M. Huang, P. Wang, and J. Zhang, ‘Hydrogenation kinetics of halogenated nitroaromatics over Pt/C in a continuous Micro-packed bed reactor’, </w:t>
+        <w:t xml:space="preserve">N. Frikha, E. Schaer, and J.-L. Houzelot, ‘Methodology of multiphase reaction kinetics and hydrodynamics identification: Application to catalyzed nitrobenzene hydrogenation’, </w:t>
       </w:r>
       <w:r>
         <w:rPr>
           <w:i/>
           <w:iCs/>
         </w:rPr>
-        <w:t>Chemical Engineering Science</w:t>
-      </w:r>
-      <w:r>
-        <w:t>, vol. 251, p. 117483, Apr. 2022, doi: 10.1016/j.ces.2022.117483.</w:t>
+        <w:t>Chemical Engineering Journal</w:t>
+      </w:r>
+      <w:r>
+        <w:t>, vol. 124, no. 1, pp. 19–28, Nov. 2006, doi: 10.1016/j.cej.2006.08.012.</w:t>
       </w:r>
     </w:p>
     <w:p>
@@ -4253,21 +5048,21 @@
         <w:pStyle w:val="Bibliography"/>
       </w:pPr>
       <w:r>
-        <w:t>[9]</w:t>
+        <w:t>[10]</w:t>
       </w:r>
       <w:r>
         <w:tab/>
-        <w:t xml:space="preserve">N. Frikha, E. Schaer, and J.-L. Houzelot, ‘Methodology of multiphase reaction kinetics and hydrodynamics identification: Application to catalyzed nitrobenzene hydrogenation’, </w:t>
+        <w:t xml:space="preserve">G. Li, J. Ma, X. Peng, and C. Lv, ‘Kinetics Approach for Hydrogenation of Nitrobenzene to p-Aminophenol in a Four-Phase System’, </w:t>
       </w:r>
       <w:r>
         <w:rPr>
           <w:i/>
           <w:iCs/>
         </w:rPr>
-        <w:t>Chemical Engineering Journal</w:t>
-      </w:r>
-      <w:r>
-        <w:t>, vol. 124, no. 1, pp. 19–28, Nov. 2006, doi: 10.1016/j.cej.2006.08.012.</w:t>
+        <w:t>Asian Journal of Chemistry</w:t>
+      </w:r>
+      <w:r>
+        <w:t>, vol. 23, no. 3, pp. 1001–1005, 2011.</w:t>
       </w:r>
     </w:p>
     <w:p>
@@ -4275,21 +5070,33 @@
         <w:pStyle w:val="Bibliography"/>
       </w:pPr>
       <w:r>
-        <w:t>[10]</w:t>
+        <w:t>[11]</w:t>
       </w:r>
       <w:r>
         <w:tab/>
-        <w:t xml:space="preserve">G. Li, J. Ma, X. Peng, and C. Lv, ‘Kinetics Approach for Hydrogenation of Nitrobenzene to p-Aminophenol in a Four-Phase System’, </w:t>
+        <w:t>ChemAnalyst, ‘Aniline Market Analysis: Industry Market Size, Plant Capacity, Production, Operating Efficiency, Demand &amp; Supply, End-User Industries, Sales Channel, Regional Demand, Company Share, Foreign Trade, Manufacturing Process, Policy and Regulatory Landscape, 2015-2032’. Accessed: Mar. 10, 2026. [Online]. Available: https://www.chemanalyst.com/industry-report/aniline-market-282</w:t>
+      </w:r>
+    </w:p>
+    <w:p>
+      <w:pPr>
+        <w:pStyle w:val="Bibliography"/>
+      </w:pPr>
+      <w:r>
+        <w:t>[12]</w:t>
+      </w:r>
+      <w:r>
+        <w:tab/>
+        <w:t xml:space="preserve">G. Díaz, V. Hugo, and M. J. Willis, ‘Multi-objective optimization of aniline and hydrogen production in a directly coupled membrane reactor’, </w:t>
       </w:r>
       <w:r>
         <w:rPr>
           <w:i/>
           <w:iCs/>
         </w:rPr>
-        <w:t>Asian Journal of Chemistry</w:t>
-      </w:r>
-      <w:r>
-        <w:t>, vol. 23, no. 3, pp. 1001–1005, 2011.</w:t>
+        <w:t>International Journal of Hydrogen Energy</w:t>
+      </w:r>
+      <w:r>
+        <w:t>, vol. 47, no. 19, pp. 10483–10499, Mar. 2022, doi: 10.1016/j.ijhydene.2022.01.128.</w:t>
       </w:r>
     </w:p>
     <w:p>
@@ -4297,51 +5104,17 @@
         <w:pStyle w:val="Bibliography"/>
       </w:pPr>
       <w:r>
-        <w:t>[11]</w:t>
+        <w:t>[13]</w:t>
       </w:r>
       <w:r>
         <w:tab/>
-        <w:t>ChemAnalyst, ‘Aniline Market Analysis: Industry Market Size, Plant Capacity, Production, Operating Efficiency, Demand &amp; Supply, End-User Industries, Sales Channel, Regional Demand, Company Share, Foreign Trade, Manufacturing Process, Policy and Regulatory Landscape, 2015-2032’. Accessed: Mar. 10, 2026. [Online]. Available: https://www.chemanalyst.com/industry-report/aniline-market-282</w:t>
-      </w:r>
-    </w:p>
-    <w:p>
-      <w:pPr>
-        <w:pStyle w:val="Bibliography"/>
-      </w:pPr>
-      <w:r>
-        <w:t>[12]</w:t>
-      </w:r>
-      <w:r>
-        <w:tab/>
-        <w:t xml:space="preserve">G. Díaz, V. Hugo, and M. J. Willis, ‘Multi-objective optimization of aniline and hydrogen production in a directly coupled membrane reactor’, </w:t>
+        <w:t xml:space="preserve">M. A. Khan, M. S. Challiwala, A. V. Prakash, and N. O. Elbashir, ‘Conceptual modeling of a reactor bed of a nickel-copper bi-metallic catalyst for dry reforming of methane’, </w:t>
       </w:r>
       <w:r>
         <w:rPr>
           <w:i/>
           <w:iCs/>
         </w:rPr>
-        <w:t>International Journal of Hydrogen Energy</w:t>
-      </w:r>
-      <w:r>
-        <w:t>, vol. 47, no. 19, pp. 10483–10499, Mar. 2022, doi: 10.1016/j.ijhydene.2022.01.128.</w:t>
-      </w:r>
-    </w:p>
-    <w:p>
-      <w:pPr>
-        <w:pStyle w:val="Bibliography"/>
-      </w:pPr>
-      <w:r>
-        <w:t>[13]</w:t>
-      </w:r>
-      <w:r>
-        <w:tab/>
-        <w:t xml:space="preserve">M. A. Khan, M. S. Challiwala, A. V. Prakash, and N. O. Elbashir, ‘Conceptual modeling of a reactor bed of a nickel-copper bi-metallic catalyst for dry reforming of methane’, </w:t>
-      </w:r>
-      <w:r>
-        <w:rPr>
-          <w:i/>
-          <w:iCs/>
-        </w:rPr>
         <w:t>Chemical Engineering Science</w:t>
       </w:r>
       <w:r>
@@ -4360,6 +5133,98 @@
         </w:rPr>
         <w:lastRenderedPageBreak/>
         <w:fldChar w:fldCharType="end"/>
+      </w:r>
+    </w:p>
+    <w:p>
+      <w:pPr>
+        <w:spacing w:after="160" w:line="259" w:lineRule="auto"/>
+        <w:rPr>
+          <w:rFonts w:cstheme="majorBidi"/>
+        </w:rPr>
+      </w:pPr>
+      <w:r>
+        <w:rPr>
+          <w:rFonts w:cstheme="majorBidi"/>
+        </w:rPr>
+        <w:br w:type="page"/>
+      </w:r>
+    </w:p>
+    <w:p>
+      <w:pPr>
+        <w:rPr>
+          <w:rFonts w:cstheme="majorBidi"/>
+          <w:b/>
+          <w:bCs/>
+        </w:rPr>
+      </w:pPr>
+      <w:r>
+        <w:rPr>
+          <w:rFonts w:cstheme="majorBidi"/>
+          <w:b/>
+          <w:bCs/>
+        </w:rPr>
+        <w:lastRenderedPageBreak/>
+        <w:t>Appendix A: Rate Constants Conversion</w:t>
+      </w:r>
+    </w:p>
+    <w:p>
+      <w:pPr>
+        <w:rPr>
+          <w:rFonts w:cstheme="majorBidi"/>
+        </w:rPr>
+      </w:pPr>
+    </w:p>
+    <w:p>
+      <w:pPr>
+        <w:rPr>
+          <w:rFonts w:cstheme="majorBidi"/>
+        </w:rPr>
+      </w:pPr>
+      <w:r>
+        <w:rPr>
+          <w:noProof/>
+        </w:rPr>
+        <w:drawing>
+          <wp:inline distT="0" distB="0" distL="0" distR="0" wp14:anchorId="0E9CD92C" wp14:editId="1B6BBA1F">
+            <wp:extent cx="6332220" cy="4878070"/>
+            <wp:effectExtent l="0" t="0" r="0" b="0"/>
+            <wp:docPr id="1465135078" name="Picture 1"/>
+            <wp:cNvGraphicFramePr>
+              <a:graphicFrameLocks xmlns:a="http://schemas.openxmlformats.org/drawingml/2006/main" noChangeAspect="1"/>
+            </wp:cNvGraphicFramePr>
+            <a:graphic xmlns:a="http://schemas.openxmlformats.org/drawingml/2006/main">
+              <a:graphicData uri="http://schemas.openxmlformats.org/drawingml/2006/picture">
+                <pic:pic xmlns:pic="http://schemas.openxmlformats.org/drawingml/2006/picture">
+                  <pic:nvPicPr>
+                    <pic:cNvPr id="1465135078" name=""/>
+                    <pic:cNvPicPr/>
+                  </pic:nvPicPr>
+                  <pic:blipFill>
+                    <a:blip r:embed="rId26"/>
+                    <a:stretch>
+                      <a:fillRect/>
+                    </a:stretch>
+                  </pic:blipFill>
+                  <pic:spPr>
+                    <a:xfrm>
+                      <a:off x="0" y="0"/>
+                      <a:ext cx="6332220" cy="4878070"/>
+                    </a:xfrm>
+                    <a:prstGeom prst="rect">
+                      <a:avLst/>
+                    </a:prstGeom>
+                  </pic:spPr>
+                </pic:pic>
+              </a:graphicData>
+            </a:graphic>
+          </wp:inline>
+        </w:drawing>
+      </w:r>
+      <w:r>
+        <w:rPr>
+          <w:rFonts w:cstheme="majorBidi"/>
+        </w:rPr>
+        <w:t xml:space="preserve"> </w:t>
       </w:r>
     </w:p>
     <w:sectPr>
@@ -4921,6 +5786,118 @@
     </w:lvl>
   </w:abstractNum>
   <w:abstractNum w:abstractNumId="2" w15:restartNumberingAfterBreak="0">
+    <w:nsid w:val="0EE93BCC"/>
+    <w:multiLevelType w:val="hybridMultilevel"/>
+    <w:tmpl w:val="66D20FCC"/>
+    <w:lvl w:ilvl="0" w:tplc="B2668928">
+      <w:numFmt w:val="bullet"/>
+      <w:lvlText w:val="-"/>
+      <w:lvlJc w:val="left"/>
+      <w:pPr>
+        <w:ind w:left="720" w:hanging="360"/>
+      </w:pPr>
+      <w:rPr>
+        <w:rFonts w:ascii="Times New Roman" w:eastAsia="Times New Roman" w:hAnsi="Times New Roman" w:cs="Times New Roman" w:hint="default"/>
+      </w:rPr>
+    </w:lvl>
+    <w:lvl w:ilvl="1" w:tplc="10090003" w:tentative="1">
+      <w:start w:val="1"/>
+      <w:numFmt w:val="bullet"/>
+      <w:lvlText w:val="o"/>
+      <w:lvlJc w:val="left"/>
+      <w:pPr>
+        <w:ind w:left="1440" w:hanging="360"/>
+      </w:pPr>
+      <w:rPr>
+        <w:rFonts w:ascii="Courier New" w:hAnsi="Courier New" w:cs="Courier New" w:hint="default"/>
+      </w:rPr>
+    </w:lvl>
+    <w:lvl w:ilvl="2" w:tplc="10090005" w:tentative="1">
+      <w:start w:val="1"/>
+      <w:numFmt w:val="bullet"/>
+      <w:lvlText w:val=""/>
+      <w:lvlJc w:val="left"/>
+      <w:pPr>
+        <w:ind w:left="2160" w:hanging="360"/>
+      </w:pPr>
+      <w:rPr>
+        <w:rFonts w:ascii="Wingdings" w:hAnsi="Wingdings" w:hint="default"/>
+      </w:rPr>
+    </w:lvl>
+    <w:lvl w:ilvl="3" w:tplc="10090001" w:tentative="1">
+      <w:start w:val="1"/>
+      <w:numFmt w:val="bullet"/>
+      <w:lvlText w:val=""/>
+      <w:lvlJc w:val="left"/>
+      <w:pPr>
+        <w:ind w:left="2880" w:hanging="360"/>
+      </w:pPr>
+      <w:rPr>
+        <w:rFonts w:ascii="Symbol" w:hAnsi="Symbol" w:hint="default"/>
+      </w:rPr>
+    </w:lvl>
+    <w:lvl w:ilvl="4" w:tplc="10090003" w:tentative="1">
+      <w:start w:val="1"/>
+      <w:numFmt w:val="bullet"/>
+      <w:lvlText w:val="o"/>
+      <w:lvlJc w:val="left"/>
+      <w:pPr>
+        <w:ind w:left="3600" w:hanging="360"/>
+      </w:pPr>
+      <w:rPr>
+        <w:rFonts w:ascii="Courier New" w:hAnsi="Courier New" w:cs="Courier New" w:hint="default"/>
+      </w:rPr>
+    </w:lvl>
+    <w:lvl w:ilvl="5" w:tplc="10090005" w:tentative="1">
+      <w:start w:val="1"/>
+      <w:numFmt w:val="bullet"/>
+      <w:lvlText w:val=""/>
+      <w:lvlJc w:val="left"/>
+      <w:pPr>
+        <w:ind w:left="4320" w:hanging="360"/>
+      </w:pPr>
+      <w:rPr>
+        <w:rFonts w:ascii="Wingdings" w:hAnsi="Wingdings" w:hint="default"/>
+      </w:rPr>
+    </w:lvl>
+    <w:lvl w:ilvl="6" w:tplc="10090001" w:tentative="1">
+      <w:start w:val="1"/>
+      <w:numFmt w:val="bullet"/>
+      <w:lvlText w:val=""/>
+      <w:lvlJc w:val="left"/>
+      <w:pPr>
+        <w:ind w:left="5040" w:hanging="360"/>
+      </w:pPr>
+      <w:rPr>
+        <w:rFonts w:ascii="Symbol" w:hAnsi="Symbol" w:hint="default"/>
+      </w:rPr>
+    </w:lvl>
+    <w:lvl w:ilvl="7" w:tplc="10090003" w:tentative="1">
+      <w:start w:val="1"/>
+      <w:numFmt w:val="bullet"/>
+      <w:lvlText w:val="o"/>
+      <w:lvlJc w:val="left"/>
+      <w:pPr>
+        <w:ind w:left="5760" w:hanging="360"/>
+      </w:pPr>
+      <w:rPr>
+        <w:rFonts w:ascii="Courier New" w:hAnsi="Courier New" w:cs="Courier New" w:hint="default"/>
+      </w:rPr>
+    </w:lvl>
+    <w:lvl w:ilvl="8" w:tplc="10090005" w:tentative="1">
+      <w:start w:val="1"/>
+      <w:numFmt w:val="bullet"/>
+      <w:lvlText w:val=""/>
+      <w:lvlJc w:val="left"/>
+      <w:pPr>
+        <w:ind w:left="6480" w:hanging="360"/>
+      </w:pPr>
+      <w:rPr>
+        <w:rFonts w:ascii="Wingdings" w:hAnsi="Wingdings" w:hint="default"/>
+      </w:rPr>
+    </w:lvl>
+  </w:abstractNum>
+  <w:abstractNum w:abstractNumId="3" w15:restartNumberingAfterBreak="0">
     <w:nsid w:val="128D5E15"/>
     <w:multiLevelType w:val="hybridMultilevel"/>
     <w:tmpl w:val="923C8398"/>
@@ -5009,7 +5986,7 @@
       </w:pPr>
     </w:lvl>
   </w:abstractNum>
-  <w:abstractNum w:abstractNumId="3" w15:restartNumberingAfterBreak="0">
+  <w:abstractNum w:abstractNumId="4" w15:restartNumberingAfterBreak="0">
     <w:nsid w:val="18327C5C"/>
     <w:multiLevelType w:val="hybridMultilevel"/>
     <w:tmpl w:val="65247DB8"/>
@@ -5095,7 +6072,7 @@
       </w:pPr>
     </w:lvl>
   </w:abstractNum>
-  <w:abstractNum w:abstractNumId="4" w15:restartNumberingAfterBreak="0">
+  <w:abstractNum w:abstractNumId="5" w15:restartNumberingAfterBreak="0">
     <w:nsid w:val="2B272030"/>
     <w:multiLevelType w:val="hybridMultilevel"/>
     <w:tmpl w:val="0152238C"/>
@@ -5209,7 +6186,7 @@
       </w:rPr>
     </w:lvl>
   </w:abstractNum>
-  <w:abstractNum w:abstractNumId="5" w15:restartNumberingAfterBreak="0">
+  <w:abstractNum w:abstractNumId="6" w15:restartNumberingAfterBreak="0">
     <w:nsid w:val="429752E1"/>
     <w:multiLevelType w:val="hybridMultilevel"/>
     <w:tmpl w:val="985C7C72"/>
@@ -5322,7 +6299,7 @@
       </w:rPr>
     </w:lvl>
   </w:abstractNum>
-  <w:abstractNum w:abstractNumId="6" w15:restartNumberingAfterBreak="0">
+  <w:abstractNum w:abstractNumId="7" w15:restartNumberingAfterBreak="0">
     <w:nsid w:val="42CD67B2"/>
     <w:multiLevelType w:val="hybridMultilevel"/>
     <w:tmpl w:val="C908E9A0"/>
@@ -5435,7 +6412,7 @@
       </w:rPr>
     </w:lvl>
   </w:abstractNum>
-  <w:abstractNum w:abstractNumId="7" w15:restartNumberingAfterBreak="0">
+  <w:abstractNum w:abstractNumId="8" w15:restartNumberingAfterBreak="0">
     <w:nsid w:val="44D97645"/>
     <w:multiLevelType w:val="hybridMultilevel"/>
     <w:tmpl w:val="1F8C97E6"/>
@@ -5548,7 +6525,7 @@
       </w:rPr>
     </w:lvl>
   </w:abstractNum>
-  <w:abstractNum w:abstractNumId="8" w15:restartNumberingAfterBreak="0">
+  <w:abstractNum w:abstractNumId="9" w15:restartNumberingAfterBreak="0">
     <w:nsid w:val="46AF5E79"/>
     <w:multiLevelType w:val="hybridMultilevel"/>
     <w:tmpl w:val="E47291F6"/>
@@ -5637,7 +6614,119 @@
       </w:pPr>
     </w:lvl>
   </w:abstractNum>
-  <w:abstractNum w:abstractNumId="9" w15:restartNumberingAfterBreak="0">
+  <w:abstractNum w:abstractNumId="10" w15:restartNumberingAfterBreak="0">
+    <w:nsid w:val="46BA05B9"/>
+    <w:multiLevelType w:val="hybridMultilevel"/>
+    <w:tmpl w:val="63AAD756"/>
+    <w:lvl w:ilvl="0" w:tplc="B2668928">
+      <w:numFmt w:val="bullet"/>
+      <w:lvlText w:val="-"/>
+      <w:lvlJc w:val="left"/>
+      <w:pPr>
+        <w:ind w:left="783" w:hanging="360"/>
+      </w:pPr>
+      <w:rPr>
+        <w:rFonts w:ascii="Times New Roman" w:eastAsia="Times New Roman" w:hAnsi="Times New Roman" w:cs="Times New Roman" w:hint="default"/>
+      </w:rPr>
+    </w:lvl>
+    <w:lvl w:ilvl="1" w:tplc="10090003" w:tentative="1">
+      <w:start w:val="1"/>
+      <w:numFmt w:val="bullet"/>
+      <w:lvlText w:val="o"/>
+      <w:lvlJc w:val="left"/>
+      <w:pPr>
+        <w:ind w:left="1503" w:hanging="360"/>
+      </w:pPr>
+      <w:rPr>
+        <w:rFonts w:ascii="Courier New" w:hAnsi="Courier New" w:cs="Courier New" w:hint="default"/>
+      </w:rPr>
+    </w:lvl>
+    <w:lvl w:ilvl="2" w:tplc="10090005" w:tentative="1">
+      <w:start w:val="1"/>
+      <w:numFmt w:val="bullet"/>
+      <w:lvlText w:val=""/>
+      <w:lvlJc w:val="left"/>
+      <w:pPr>
+        <w:ind w:left="2223" w:hanging="360"/>
+      </w:pPr>
+      <w:rPr>
+        <w:rFonts w:ascii="Wingdings" w:hAnsi="Wingdings" w:hint="default"/>
+      </w:rPr>
+    </w:lvl>
+    <w:lvl w:ilvl="3" w:tplc="10090001" w:tentative="1">
+      <w:start w:val="1"/>
+      <w:numFmt w:val="bullet"/>
+      <w:lvlText w:val=""/>
+      <w:lvlJc w:val="left"/>
+      <w:pPr>
+        <w:ind w:left="2943" w:hanging="360"/>
+      </w:pPr>
+      <w:rPr>
+        <w:rFonts w:ascii="Symbol" w:hAnsi="Symbol" w:hint="default"/>
+      </w:rPr>
+    </w:lvl>
+    <w:lvl w:ilvl="4" w:tplc="10090003" w:tentative="1">
+      <w:start w:val="1"/>
+      <w:numFmt w:val="bullet"/>
+      <w:lvlText w:val="o"/>
+      <w:lvlJc w:val="left"/>
+      <w:pPr>
+        <w:ind w:left="3663" w:hanging="360"/>
+      </w:pPr>
+      <w:rPr>
+        <w:rFonts w:ascii="Courier New" w:hAnsi="Courier New" w:cs="Courier New" w:hint="default"/>
+      </w:rPr>
+    </w:lvl>
+    <w:lvl w:ilvl="5" w:tplc="10090005" w:tentative="1">
+      <w:start w:val="1"/>
+      <w:numFmt w:val="bullet"/>
+      <w:lvlText w:val=""/>
+      <w:lvlJc w:val="left"/>
+      <w:pPr>
+        <w:ind w:left="4383" w:hanging="360"/>
+      </w:pPr>
+      <w:rPr>
+        <w:rFonts w:ascii="Wingdings" w:hAnsi="Wingdings" w:hint="default"/>
+      </w:rPr>
+    </w:lvl>
+    <w:lvl w:ilvl="6" w:tplc="10090001" w:tentative="1">
+      <w:start w:val="1"/>
+      <w:numFmt w:val="bullet"/>
+      <w:lvlText w:val=""/>
+      <w:lvlJc w:val="left"/>
+      <w:pPr>
+        <w:ind w:left="5103" w:hanging="360"/>
+      </w:pPr>
+      <w:rPr>
+        <w:rFonts w:ascii="Symbol" w:hAnsi="Symbol" w:hint="default"/>
+      </w:rPr>
+    </w:lvl>
+    <w:lvl w:ilvl="7" w:tplc="10090003" w:tentative="1">
+      <w:start w:val="1"/>
+      <w:numFmt w:val="bullet"/>
+      <w:lvlText w:val="o"/>
+      <w:lvlJc w:val="left"/>
+      <w:pPr>
+        <w:ind w:left="5823" w:hanging="360"/>
+      </w:pPr>
+      <w:rPr>
+        <w:rFonts w:ascii="Courier New" w:hAnsi="Courier New" w:cs="Courier New" w:hint="default"/>
+      </w:rPr>
+    </w:lvl>
+    <w:lvl w:ilvl="8" w:tplc="10090005" w:tentative="1">
+      <w:start w:val="1"/>
+      <w:numFmt w:val="bullet"/>
+      <w:lvlText w:val=""/>
+      <w:lvlJc w:val="left"/>
+      <w:pPr>
+        <w:ind w:left="6543" w:hanging="360"/>
+      </w:pPr>
+      <w:rPr>
+        <w:rFonts w:ascii="Wingdings" w:hAnsi="Wingdings" w:hint="default"/>
+      </w:rPr>
+    </w:lvl>
+  </w:abstractNum>
+  <w:abstractNum w:abstractNumId="11" w15:restartNumberingAfterBreak="0">
     <w:nsid w:val="47B230E8"/>
     <w:multiLevelType w:val="hybridMultilevel"/>
     <w:tmpl w:val="2460EFC8"/>
@@ -5749,7 +6838,7 @@
       </w:rPr>
     </w:lvl>
   </w:abstractNum>
-  <w:abstractNum w:abstractNumId="10" w15:restartNumberingAfterBreak="0">
+  <w:abstractNum w:abstractNumId="12" w15:restartNumberingAfterBreak="0">
     <w:nsid w:val="4C4C4CF5"/>
     <w:multiLevelType w:val="multilevel"/>
     <w:tmpl w:val="E96098D2"/>
@@ -5888,7 +6977,7 @@
       </w:rPr>
     </w:lvl>
   </w:abstractNum>
-  <w:abstractNum w:abstractNumId="11" w15:restartNumberingAfterBreak="0">
+  <w:abstractNum w:abstractNumId="13" w15:restartNumberingAfterBreak="0">
     <w:nsid w:val="4DAF0291"/>
     <w:multiLevelType w:val="hybridMultilevel"/>
     <w:tmpl w:val="29E4996E"/>
@@ -6000,7 +7089,7 @@
       </w:rPr>
     </w:lvl>
   </w:abstractNum>
-  <w:abstractNum w:abstractNumId="12" w15:restartNumberingAfterBreak="0">
+  <w:abstractNum w:abstractNumId="14" w15:restartNumberingAfterBreak="0">
     <w:nsid w:val="520B3ACA"/>
     <w:multiLevelType w:val="hybridMultilevel"/>
     <w:tmpl w:val="29005AFA"/>
@@ -6090,7 +7179,7 @@
       </w:pPr>
     </w:lvl>
   </w:abstractNum>
-  <w:abstractNum w:abstractNumId="13" w15:restartNumberingAfterBreak="0">
+  <w:abstractNum w:abstractNumId="15" w15:restartNumberingAfterBreak="0">
     <w:nsid w:val="5B8E12E4"/>
     <w:multiLevelType w:val="hybridMultilevel"/>
     <w:tmpl w:val="B6F2E9F2"/>
@@ -6203,7 +7292,7 @@
       </w:rPr>
     </w:lvl>
   </w:abstractNum>
-  <w:abstractNum w:abstractNumId="14" w15:restartNumberingAfterBreak="0">
+  <w:abstractNum w:abstractNumId="16" w15:restartNumberingAfterBreak="0">
     <w:nsid w:val="5F5506BC"/>
     <w:multiLevelType w:val="hybridMultilevel"/>
     <w:tmpl w:val="74F44B5A"/>
@@ -6315,7 +7404,7 @@
       </w:rPr>
     </w:lvl>
   </w:abstractNum>
-  <w:abstractNum w:abstractNumId="15" w15:restartNumberingAfterBreak="0">
+  <w:abstractNum w:abstractNumId="17" w15:restartNumberingAfterBreak="0">
     <w:nsid w:val="60683C73"/>
     <w:multiLevelType w:val="hybridMultilevel"/>
     <w:tmpl w:val="E4821408"/>
@@ -6428,7 +7517,7 @@
       </w:rPr>
     </w:lvl>
   </w:abstractNum>
-  <w:abstractNum w:abstractNumId="16" w15:restartNumberingAfterBreak="0">
+  <w:abstractNum w:abstractNumId="18" w15:restartNumberingAfterBreak="0">
     <w:nsid w:val="60D80090"/>
     <w:multiLevelType w:val="hybridMultilevel"/>
     <w:tmpl w:val="923C8398"/>
@@ -6517,7 +7606,7 @@
       </w:pPr>
     </w:lvl>
   </w:abstractNum>
-  <w:abstractNum w:abstractNumId="17" w15:restartNumberingAfterBreak="0">
+  <w:abstractNum w:abstractNumId="19" w15:restartNumberingAfterBreak="0">
     <w:nsid w:val="65B94A0D"/>
     <w:multiLevelType w:val="hybridMultilevel"/>
     <w:tmpl w:val="3CEA6082"/>
@@ -6630,7 +7719,7 @@
       </w:rPr>
     </w:lvl>
   </w:abstractNum>
-  <w:abstractNum w:abstractNumId="18" w15:restartNumberingAfterBreak="0">
+  <w:abstractNum w:abstractNumId="20" w15:restartNumberingAfterBreak="0">
     <w:nsid w:val="78286FAA"/>
     <w:multiLevelType w:val="hybridMultilevel"/>
     <w:tmpl w:val="4D38E38A"/>
@@ -6743,7 +7832,7 @@
       </w:rPr>
     </w:lvl>
   </w:abstractNum>
-  <w:abstractNum w:abstractNumId="19" w15:restartNumberingAfterBreak="0">
+  <w:abstractNum w:abstractNumId="21" w15:restartNumberingAfterBreak="0">
     <w:nsid w:val="78C61315"/>
     <w:multiLevelType w:val="hybridMultilevel"/>
     <w:tmpl w:val="BB86A986"/>
@@ -6832,7 +7921,7 @@
       </w:pPr>
     </w:lvl>
   </w:abstractNum>
-  <w:abstractNum w:abstractNumId="20" w15:restartNumberingAfterBreak="0">
+  <w:abstractNum w:abstractNumId="22" w15:restartNumberingAfterBreak="0">
     <w:nsid w:val="7A210904"/>
     <w:multiLevelType w:val="hybridMultilevel"/>
     <w:tmpl w:val="01D0D0A4"/>
@@ -6945,7 +8034,7 @@
       </w:rPr>
     </w:lvl>
   </w:abstractNum>
-  <w:abstractNum w:abstractNumId="21" w15:restartNumberingAfterBreak="0">
+  <w:abstractNum w:abstractNumId="23" w15:restartNumberingAfterBreak="0">
     <w:nsid w:val="7A9F73AE"/>
     <w:multiLevelType w:val="hybridMultilevel"/>
     <w:tmpl w:val="4BB6EC66"/>
@@ -7032,76 +8121,82 @@
     </w:lvl>
   </w:abstractNum>
   <w:num w:numId="1" w16cid:durableId="1586258855">
+    <w:abstractNumId w:val="4"/>
+  </w:num>
+  <w:num w:numId="2" w16cid:durableId="236477724">
+    <w:abstractNumId w:val="15"/>
+  </w:num>
+  <w:num w:numId="3" w16cid:durableId="1451558140">
+    <w:abstractNumId w:val="12"/>
+  </w:num>
+  <w:num w:numId="4" w16cid:durableId="1887910767">
+    <w:abstractNumId w:val="12"/>
+  </w:num>
+  <w:num w:numId="5" w16cid:durableId="1249803139">
+    <w:abstractNumId w:val="14"/>
+  </w:num>
+  <w:num w:numId="6" w16cid:durableId="690377468">
+    <w:abstractNumId w:val="17"/>
+  </w:num>
+  <w:num w:numId="7" w16cid:durableId="1485780486">
     <w:abstractNumId w:val="3"/>
   </w:num>
-  <w:num w:numId="2" w16cid:durableId="236477724">
-    <w:abstractNumId w:val="13"/>
+  <w:num w:numId="8" w16cid:durableId="1253126374">
+    <w:abstractNumId w:val="7"/>
   </w:num>
-  <w:num w:numId="3" w16cid:durableId="1451558140">
-    <w:abstractNumId w:val="10"/>
-  </w:num>
-  <w:num w:numId="4" w16cid:durableId="1887910767">
-    <w:abstractNumId w:val="10"/>
-  </w:num>
-  <w:num w:numId="5" w16cid:durableId="1249803139">
-    <w:abstractNumId w:val="12"/>
-  </w:num>
-  <w:num w:numId="6" w16cid:durableId="690377468">
-    <w:abstractNumId w:val="15"/>
-  </w:num>
-  <w:num w:numId="7" w16cid:durableId="1485780486">
-    <w:abstractNumId w:val="2"/>
-  </w:num>
-  <w:num w:numId="8" w16cid:durableId="1253126374">
+  <w:num w:numId="9" w16cid:durableId="288243995">
     <w:abstractNumId w:val="6"/>
   </w:num>
-  <w:num w:numId="9" w16cid:durableId="288243995">
-    <w:abstractNumId w:val="5"/>
-  </w:num>
   <w:num w:numId="10" w16cid:durableId="1185023424">
-    <w:abstractNumId w:val="20"/>
+    <w:abstractNumId w:val="22"/>
   </w:num>
   <w:num w:numId="11" w16cid:durableId="679432445">
-    <w:abstractNumId w:val="4"/>
+    <w:abstractNumId w:val="5"/>
   </w:num>
   <w:num w:numId="12" w16cid:durableId="1327779423">
     <w:abstractNumId w:val="1"/>
   </w:num>
   <w:num w:numId="13" w16cid:durableId="659505599">
-    <w:abstractNumId w:val="21"/>
+    <w:abstractNumId w:val="23"/>
   </w:num>
   <w:num w:numId="14" w16cid:durableId="259604377">
-    <w:abstractNumId w:val="8"/>
+    <w:abstractNumId w:val="9"/>
   </w:num>
   <w:num w:numId="15" w16cid:durableId="1409183534">
     <w:abstractNumId w:val="0"/>
   </w:num>
   <w:num w:numId="16" w16cid:durableId="738019079">
+    <w:abstractNumId w:val="21"/>
+  </w:num>
+  <w:num w:numId="17" w16cid:durableId="1202136711">
+    <w:abstractNumId w:val="18"/>
+  </w:num>
+  <w:num w:numId="18" w16cid:durableId="511921417">
+    <w:abstractNumId w:val="8"/>
+  </w:num>
+  <w:num w:numId="19" w16cid:durableId="888692045">
+    <w:abstractNumId w:val="12"/>
+  </w:num>
+  <w:num w:numId="20" w16cid:durableId="1995254823">
+    <w:abstractNumId w:val="16"/>
+  </w:num>
+  <w:num w:numId="21" w16cid:durableId="844902352">
+    <w:abstractNumId w:val="20"/>
+  </w:num>
+  <w:num w:numId="22" w16cid:durableId="1366978176">
     <w:abstractNumId w:val="19"/>
   </w:num>
-  <w:num w:numId="17" w16cid:durableId="1202136711">
-    <w:abstractNumId w:val="16"/>
+  <w:num w:numId="23" w16cid:durableId="481968941">
+    <w:abstractNumId w:val="11"/>
   </w:num>
-  <w:num w:numId="18" w16cid:durableId="511921417">
-    <w:abstractNumId w:val="7"/>
+  <w:num w:numId="24" w16cid:durableId="996148635">
+    <w:abstractNumId w:val="13"/>
   </w:num>
-  <w:num w:numId="19" w16cid:durableId="888692045">
+  <w:num w:numId="25" w16cid:durableId="887181041">
     <w:abstractNumId w:val="10"/>
   </w:num>
-  <w:num w:numId="20" w16cid:durableId="1995254823">
-    <w:abstractNumId w:val="14"/>
-  </w:num>
-  <w:num w:numId="21" w16cid:durableId="844902352">
-    <w:abstractNumId w:val="18"/>
-  </w:num>
-  <w:num w:numId="22" w16cid:durableId="1366978176">
-    <w:abstractNumId w:val="17"/>
-  </w:num>
-  <w:num w:numId="23" w16cid:durableId="481968941">
-    <w:abstractNumId w:val="9"/>
-  </w:num>
-  <w:num w:numId="24" w16cid:durableId="996148635">
-    <w:abstractNumId w:val="11"/>
+  <w:num w:numId="26" w16cid:durableId="1662344992">
+    <w:abstractNumId w:val="2"/>
   </w:num>
 </w:numbering>
 </file>
@@ -8145,6 +9240,19 @@
       <w:ind w:left="384" w:hanging="384"/>
     </w:pPr>
   </w:style>
+  <w:style w:type="paragraph" w:styleId="TOC3">
+    <w:name w:val="toc 3"/>
+    <w:basedOn w:val="Normal"/>
+    <w:next w:val="Normal"/>
+    <w:autoRedefine/>
+    <w:uiPriority w:val="39"/>
+    <w:unhideWhenUsed/>
+    <w:rsid w:val="004C2862"/>
+    <w:pPr>
+      <w:spacing w:after="100"/>
+      <w:ind w:left="480"/>
+    </w:pPr>
+  </w:style>
 </w:styles>
 </file>
 
@@ -8418,19 +9526,6 @@
 </file>
 
 <file path=customXml/item2.xml><?xml version="1.0" encoding="utf-8"?>
-<?mso-contentType ?>
-<FormTemplates xmlns="http://schemas.microsoft.com/sharepoint/v3/contenttype/forms">
-  <Display>DocumentLibraryForm</Display>
-  <Edit>DocumentLibraryForm</Edit>
-  <New>DocumentLibraryForm</New>
-</FormTemplates>
-</file>
-
-<file path=customXml/item3.xml><?xml version="1.0" encoding="utf-8"?>
-<b:Sources xmlns:b="http://schemas.openxmlformats.org/officeDocument/2006/bibliography" xmlns="http://schemas.openxmlformats.org/officeDocument/2006/bibliography" SelectedStyle="\APASixthEditionOfficeOnline.xsl" StyleName="APA" Version="6"/>
-</file>
-
-<file path=customXml/item4.xml><?xml version="1.0" encoding="utf-8"?>
 <ct:contentTypeSchema xmlns:ct="http://schemas.microsoft.com/office/2006/metadata/contentType" xmlns:ma="http://schemas.microsoft.com/office/2006/metadata/properties/metaAttributes" ct:_="" ma:_="" ma:contentTypeName="Document" ma:contentTypeID="0x010100C107646D0035FA4C8F1F95DBA74C7670" ma:contentTypeVersion="18" ma:contentTypeDescription="Create a new document." ma:contentTypeScope="" ma:versionID="cee5fd123a01e1fbef544806d63a7bbe">
   <xsd:schema xmlns:xsd="http://www.w3.org/2001/XMLSchema" xmlns:xs="http://www.w3.org/2001/XMLSchema" xmlns:p="http://schemas.microsoft.com/office/2006/metadata/properties" xmlns:ns3="a169fe49-86d9-4b9f-a163-9271c3e82536" xmlns:ns4="9ec2d0b7-503f-4434-bd5e-691963e6366e" targetNamespace="http://schemas.microsoft.com/office/2006/metadata/properties" ma:root="true" ma:fieldsID="dda71d5f438c7df1ac194e497a63c795" ns3:_="" ns4:_="">
     <xsd:import namespace="a169fe49-86d9-4b9f-a163-9271c3e82536"/>
@@ -8683,6 +9778,19 @@
 </ct:contentTypeSchema>
 </file>
 
+<file path=customXml/item3.xml><?xml version="1.0" encoding="utf-8"?>
+<b:Sources xmlns:b="http://schemas.openxmlformats.org/officeDocument/2006/bibliography" xmlns="http://schemas.openxmlformats.org/officeDocument/2006/bibliography" SelectedStyle="\APASixthEditionOfficeOnline.xsl" StyleName="APA" Version="6"/>
+</file>
+
+<file path=customXml/item4.xml><?xml version="1.0" encoding="utf-8"?>
+<?mso-contentType ?>
+<FormTemplates xmlns="http://schemas.microsoft.com/sharepoint/v3/contenttype/forms">
+  <Display>DocumentLibraryForm</Display>
+  <Edit>DocumentLibraryForm</Edit>
+  <New>DocumentLibraryForm</New>
+</FormTemplates>
+</file>
+
 <file path=customXml/itemProps1.xml><?xml version="1.0" encoding="utf-8"?>
 <ds:datastoreItem xmlns:ds="http://schemas.openxmlformats.org/officeDocument/2006/customXml" ds:itemID="{2A4AFB90-AA70-40CB-8FEE-062855DEC269}">
   <ds:schemaRefs>
@@ -8694,22 +9802,6 @@
 </file>
 
 <file path=customXml/itemProps2.xml><?xml version="1.0" encoding="utf-8"?>
-<ds:datastoreItem xmlns:ds="http://schemas.openxmlformats.org/officeDocument/2006/customXml" ds:itemID="{04D26766-6D42-46FD-AE9C-F80BA223CA67}">
-  <ds:schemaRefs>
-    <ds:schemaRef ds:uri="http://schemas.microsoft.com/sharepoint/v3/contenttype/forms"/>
-  </ds:schemaRefs>
-</ds:datastoreItem>
-</file>
-
-<file path=customXml/itemProps3.xml><?xml version="1.0" encoding="utf-8"?>
-<ds:datastoreItem xmlns:ds="http://schemas.openxmlformats.org/officeDocument/2006/customXml" ds:itemID="{88749F4F-A6E8-4DC0-9276-CAFEB15C1658}">
-  <ds:schemaRefs>
-    <ds:schemaRef ds:uri="http://schemas.openxmlformats.org/officeDocument/2006/bibliography"/>
-  </ds:schemaRefs>
-</ds:datastoreItem>
-</file>
-
-<file path=customXml/itemProps4.xml><?xml version="1.0" encoding="utf-8"?>
 <ds:datastoreItem xmlns:ds="http://schemas.openxmlformats.org/officeDocument/2006/customXml" ds:itemID="{8D503597-69F4-42D1-91A8-F656D146B62B}">
   <ds:schemaRefs>
     <ds:schemaRef ds:uri="http://schemas.microsoft.com/office/2006/metadata/contentType"/>
@@ -8726,4 +9818,20 @@
     <ds:schemaRef ds:uri="http://schemas.microsoft.com/internal/obd"/>
   </ds:schemaRefs>
 </ds:datastoreItem>
+</file>
+
+<file path=customXml/itemProps3.xml><?xml version="1.0" encoding="utf-8"?>
+<ds:datastoreItem xmlns:ds="http://schemas.openxmlformats.org/officeDocument/2006/customXml" ds:itemID="{88749F4F-A6E8-4DC0-9276-CAFEB15C1658}">
+  <ds:schemaRefs>
+    <ds:schemaRef ds:uri="http://schemas.openxmlformats.org/officeDocument/2006/bibliography"/>
+  </ds:schemaRefs>
+</ds:datastoreItem>
+</file>
+
+<file path=customXml/itemProps4.xml><?xml version="1.0" encoding="utf-8"?>
+<ds:datastoreItem xmlns:ds="http://schemas.openxmlformats.org/officeDocument/2006/customXml" ds:itemID="{04D26766-6D42-46FD-AE9C-F80BA223CA67}">
+  <ds:schemaRefs>
+    <ds:schemaRef ds:uri="http://schemas.microsoft.com/sharepoint/v3/contenttype/forms"/>
+  </ds:schemaRefs>
+</ds:datastoreItem>
 </file>
</xml_diff>

<commit_message>
Nearly empty typst file setup
</commit_message>
<xml_diff>
--- a/Term Project - WORKING.docx
+++ b/Term Project - WORKING.docx
@@ -4695,6 +4695,9 @@
         <w:t xml:space="preserve"> nitrobenzene conversion is achieved near the reactor outlet, utilising the entire reactor. </w:t>
       </w:r>
       <w:r>
+        <w:rPr>
+          <w:noProof/>
+        </w:rPr>
         <w:drawing>
           <wp:inline distT="0" distB="0" distL="0" distR="0" wp14:anchorId="32E9483C" wp14:editId="08708E12">
             <wp:extent cx="6332220" cy="3197225"/>
@@ -4741,6 +4744,9 @@
     <w:p>
       <w:pPr>
         <w:pStyle w:val="Heading2"/>
+        <w:rPr>
+          <w:rFonts w:asciiTheme="majorBidi" w:hAnsiTheme="majorBidi" w:cstheme="majorBidi"/>
+        </w:rPr>
       </w:pPr>
       <w:bookmarkStart w:id="13" w:name="_Toc224148628"/>
       <w:r>
@@ -4758,6 +4764,336 @@
       <w:bookmarkEnd w:id="13"/>
     </w:p>
     <w:p>
+      <w:r>
+        <w:t>As the specified reactor design achieved an overall nitrobenzene conversion of 100%, only two separation steps are needed: to remove excess hydrogen gas, and purify aniline from water.</w:t>
+      </w:r>
+      <w:r>
+        <w:t xml:space="preserve"> Table </w:t>
+      </w:r>
+      <w:r>
+        <w:t xml:space="preserve">3 </w:t>
+      </w:r>
+      <w:r>
+        <w:t>below compares the different boiling points of compounds involved in this process.</w:t>
+      </w:r>
+    </w:p>
+    <w:p/>
+    <w:p>
+      <w:r>
+        <w:t>Table 3. Comparison of boiling points of compounds involved in aniline production.</w:t>
+      </w:r>
+    </w:p>
+    <w:tbl>
+      <w:tblPr>
+        <w:tblStyle w:val="TableGrid"/>
+        <w:tblW w:w="0" w:type="auto"/>
+        <w:tblLook w:val="04A0" w:firstRow="1" w:lastRow="0" w:firstColumn="1" w:lastColumn="0" w:noHBand="0" w:noVBand="1"/>
+      </w:tblPr>
+      <w:tblGrid>
+        <w:gridCol w:w="4981"/>
+        <w:gridCol w:w="4981"/>
+      </w:tblGrid>
+      <w:tr>
+        <w:tc>
+          <w:tcPr>
+            <w:tcW w:w="4981" w:type="dxa"/>
+          </w:tcPr>
+          <w:p>
+            <w:r>
+              <w:rPr>
+                <w:lang w:val="en-US" w:eastAsia="en-US"/>
+              </w:rPr>
+              <w:t>Compound</w:t>
+            </w:r>
+          </w:p>
+        </w:tc>
+        <w:tc>
+          <w:tcPr>
+            <w:tcW w:w="4981" w:type="dxa"/>
+          </w:tcPr>
+          <w:p>
+            <w:r>
+              <w:t>Boiling Point (C)</w:t>
+            </w:r>
+          </w:p>
+        </w:tc>
+      </w:tr>
+      <w:tr>
+        <w:tc>
+          <w:tcPr>
+            <w:tcW w:w="4981" w:type="dxa"/>
+          </w:tcPr>
+          <w:p>
+            <w:r>
+              <w:t>Hydrogen</w:t>
+            </w:r>
+          </w:p>
+        </w:tc>
+        <w:tc>
+          <w:tcPr>
+            <w:tcW w:w="4981" w:type="dxa"/>
+          </w:tcPr>
+          <w:p>
+            <w:r>
+              <w:t xml:space="preserve">-259.16 </w:t>
+            </w:r>
+            <w:r>
+              <w:fldChar w:fldCharType="begin"/>
+            </w:r>
+            <w:r>
+              <w:instrText xml:space="preserve"> ADDIN ZOTERO_ITEM CSL_CITATION {"citationID":"yJ9cq9jZ","properties":{"formattedCitation":"[14]","plainCitation":"[14]","noteIndex":0},"citationItems":[{"id":11,"uris":["http://zotero.org/users/15288956/items/7RV45IQ5"],"itemData":{"id":11,"type":"entry-encyclopedia","abstract":"Hydrogen is a chemical element; it has symbol H and atomic number 1. It is the lightest element and, at standard conditions, is a gas of diatomic molecules with the formula H2, sometimes called dihydrogen, but more commonly called hydrogen gas, molecular hydrogen or simply hydrogen. It is colorless, odorless, non-toxic, and highly combustible. Constituting about 75% of all normal matter, hydrogen is the most abundant chemical element in the universe. Stars, including the Sun, mainly consist of hydrogen in a plasma state, while on Earth, hydrogen is found in water, organic compounds, as dihydrogen, and in other molecular forms. The most common isotope of hydrogen (protium, 1H) consists of one proton, one electron, and no neutrons.\nIn the early universe, the formation of hydrogen's protons occurred in the first second after the Big Bang; neutral hydrogen atoms only formed about 370,000 years later during the recombination epoch as the universe cooled and plasma had cooled enough for electrons to remain bound to protons. Hydrogen, typically nonmetallic except under extreme pressure, readily forms covalent bonds with most nonmetals, contributing to the formation of compounds like water and various organic substances. Its role is crucial in acid-base reactions, which mainly involve proton exchange among soluble molecules. In ionic compounds, hydrogen can take the form of either a negatively charged anion, where it is known as hydride, or as a positively charged cation, H+. The cation, usually just a proton (symbol p), exhibits specific behavior in aqueous solutions and in ionic compounds involves screening of its electric charge by surrounding polar molecules or anions. Hydrogen's unique position as the only neutral atom for which the Schrödinger equation can be directly solved, has significantly contributed to the foundational principles of quantum mechanics through the exploration of its energetics and chemical bonding.\nHydrogen gas was first produced artificially in the early 16th century by reacting acids with metals. Henry Cavendish, in 1766–81, identified hydrogen gas as a distinct substance and discovered its property of producing water when burned; hence its name means \"water-former\" in Greek.\nMost hydrogen production occurs through steam reforming of natural gas; a smaller portion comes from energy-intensive methods such as the electrolysis of water. Its main industrial uses include fossil fuel processing, such as hydrocracking, and ammonia production, with emerging uses in fuel cells for electricity generation and as a heat source. When used in fuel cells, hydrogen's only emission at point of use is water vapor, though combustion can produce nitrogen oxides. Hydrogen's interaction with metals may cause embrittlement.","container-title":"Wikipedia","language":"en","license":"Creative Commons Attribution-ShareAlike License","note":"Page Version ID: 1246031915","source":"Wikipedia","title":"Hydrogen","URL":"https://en.wikipedia.org/w/index.php?title=Hydrogen&amp;oldid=1246031915","accessed":{"date-parts":[["2024",11,3]]},"issued":{"date-parts":[["2024",9,16]]}}}],"schema":"https://github.com/citation-style-language/schema/raw/master/csl-citation.json"} </w:instrText>
+            </w:r>
+            <w:r>
+              <w:fldChar w:fldCharType="separate"/>
+            </w:r>
+            <w:r>
+              <w:t>[14]</w:t>
+            </w:r>
+            <w:r>
+              <w:fldChar w:fldCharType="end"/>
+            </w:r>
+          </w:p>
+        </w:tc>
+      </w:tr>
+      <w:tr>
+        <w:tc>
+          <w:tcPr>
+            <w:tcW w:w="4981" w:type="dxa"/>
+          </w:tcPr>
+          <w:p>
+            <w:r>
+              <w:t>Nitrobenzene</w:t>
+            </w:r>
+          </w:p>
+        </w:tc>
+        <w:tc>
+          <w:tcPr>
+            <w:tcW w:w="4981" w:type="dxa"/>
+          </w:tcPr>
+          <w:p>
+            <w:r>
+              <w:t xml:space="preserve">210.8 </w:t>
+            </w:r>
+            <w:r>
+              <w:fldChar w:fldCharType="begin"/>
+            </w:r>
+            <w:r>
+              <w:instrText xml:space="preserve"> ADDIN ZOTERO_ITEM CSL_CITATION {"citationID":"gzdlZ9PK","properties":{"formattedCitation":"[15]","plainCitation":"[15]","noteIndex":0},"citationItems":[{"id":1081,"uris":["http://zotero.org/users/15288956/items/U3EQFVJU"],"itemData":{"id":1081,"type":"webpage","abstract":"Nitrobenzene | C6H5NO2 | CID 7416 - structure, chemical names, physical and chemical properties, classification, patents, literature, biological activities, safety/hazards/toxicity information, supplier lists, and more.","container-title":"PubChem","language":"en","title":"Nitrobenzene","URL":"https://pubchem.ncbi.nlm.nih.gov/compound/7416","accessed":{"date-parts":[["2026",3,25]]}}}],"schema":"https://github.com/citation-style-language/schema/raw/master/csl-citation.json"} </w:instrText>
+            </w:r>
+            <w:r>
+              <w:fldChar w:fldCharType="separate"/>
+            </w:r>
+            <w:r>
+              <w:t>[15]</w:t>
+            </w:r>
+            <w:r>
+              <w:fldChar w:fldCharType="end"/>
+            </w:r>
+          </w:p>
+        </w:tc>
+      </w:tr>
+      <w:tr>
+        <w:tc>
+          <w:tcPr>
+            <w:tcW w:w="4981" w:type="dxa"/>
+          </w:tcPr>
+          <w:p>
+            <w:r>
+              <w:t>Water</w:t>
+            </w:r>
+          </w:p>
+        </w:tc>
+        <w:tc>
+          <w:tcPr>
+            <w:tcW w:w="4981" w:type="dxa"/>
+          </w:tcPr>
+          <w:p>
+            <w:r>
+              <w:t xml:space="preserve">100 </w:t>
+            </w:r>
+            <w:r>
+              <w:fldChar w:fldCharType="begin"/>
+            </w:r>
+            <w:r>
+              <w:instrText xml:space="preserve"> ADDIN ZOTERO_ITEM CSL_CITATION {"citationID":"B3idRBNI","properties":{"formattedCitation":"[16]","plainCitation":"[16]","noteIndex":0},"citationItems":[{"id":1083,"uris":["http://zotero.org/users/15288956/items/AFSJ824L"],"itemData":{"id":1083,"type":"webpage","abstract":"Water | H2O | CID 962 - structure, chemical names, physical and chemical properties, classification, patents, literature, biological activities, safety/hazards/toxicity information, supplier lists, and more.","container-title":"PubChem","language":"en","title":"Water","URL":"https://pubchem.ncbi.nlm.nih.gov/compound/962","accessed":{"date-parts":[["2024",10,3]]}}}],"schema":"https://github.com/citation-style-language/schema/raw/master/csl-citation.json"} </w:instrText>
+            </w:r>
+            <w:r>
+              <w:fldChar w:fldCharType="separate"/>
+            </w:r>
+            <w:r>
+              <w:t>[16]</w:t>
+            </w:r>
+            <w:r>
+              <w:fldChar w:fldCharType="end"/>
+            </w:r>
+          </w:p>
+        </w:tc>
+      </w:tr>
+      <w:tr>
+        <w:tc>
+          <w:tcPr>
+            <w:tcW w:w="4981" w:type="dxa"/>
+          </w:tcPr>
+          <w:p>
+            <w:r>
+              <w:t>Aniline</w:t>
+            </w:r>
+          </w:p>
+        </w:tc>
+        <w:tc>
+          <w:tcPr>
+            <w:tcW w:w="4981" w:type="dxa"/>
+          </w:tcPr>
+          <w:p>
+            <w:r>
+              <w:t xml:space="preserve">184.1 </w:t>
+            </w:r>
+            <w:r>
+              <w:fldChar w:fldCharType="begin"/>
+            </w:r>
+            <w:r>
+              <w:instrText xml:space="preserve"> ADDIN ZOTERO_ITEM CSL_CITATION {"citationID":"WlqiRYjb","properties":{"formattedCitation":"[17]","plainCitation":"[17]","noteIndex":0},"citationItems":[{"id":1085,"uris":["http://zotero.org/users/15288956/items/SYPBJPTR"],"itemData":{"id":1085,"type":"webpage","abstract":"Aniline | C6H5NH2 or C6H7N | CID 6115 - structure, chemical names, physical and chemical properties, classification, patents, literature, biological activities, safety/hazards/toxicity information, supplier lists, and more.","container-title":"PubChem","language":"en","title":"Aniline","URL":"https://pubchem.ncbi.nlm.nih.gov/compound/6115","accessed":{"date-parts":[["2026",3,25]]}}}],"schema":"https://github.com/citation-style-language/schema/raw/master/csl-citation.json"} </w:instrText>
+            </w:r>
+            <w:r>
+              <w:fldChar w:fldCharType="separate"/>
+            </w:r>
+            <w:r>
+              <w:t>[17]</w:t>
+            </w:r>
+            <w:r>
+              <w:fldChar w:fldCharType="end"/>
+            </w:r>
+          </w:p>
+        </w:tc>
+      </w:tr>
+    </w:tbl>
+    <w:p/>
+    <w:p>
+      <w:pPr>
+        <w:pStyle w:val="Heading3"/>
+      </w:pPr>
+      <w:r>
+        <w:lastRenderedPageBreak/>
+        <w:t>Separation 1: Hydrogen Recycle</w:t>
+      </w:r>
+    </w:p>
+    <w:p>
+      <w:r>
+        <w:t xml:space="preserve">Hydrogen has a critical temperature of  -240.2 C, far lower than the operating reactor temperature </w:t>
+      </w:r>
+      <w:r>
+        <w:fldChar w:fldCharType="begin"/>
+      </w:r>
+      <w:r>
+        <w:instrText xml:space="preserve"> ADDIN ZOTERO_ITEM CSL_CITATION {"citationID":"NDdrJNs0","properties":{"formattedCitation":"[14]","plainCitation":"[14]","noteIndex":0},"citationItems":[{"id":11,"uris":["http://zotero.org/users/15288956/items/7RV45IQ5"],"itemData":{"id":11,"type":"entry-encyclopedia","abstract":"Hydrogen is a chemical element; it has symbol H and atomic number 1. It is the lightest element and, at standard conditions, is a gas of diatomic molecules with the formula H2, sometimes called dihydrogen, but more commonly called hydrogen gas, molecular hydrogen or simply hydrogen. It is colorless, odorless, non-toxic, and highly combustible. Constituting about 75% of all normal matter, hydrogen is the most abundant chemical element in the universe. Stars, including the Sun, mainly consist of hydrogen in a plasma state, while on Earth, hydrogen is found in water, organic compounds, as dihydrogen, and in other molecular forms. The most common isotope of hydrogen (protium, 1H) consists of one proton, one electron, and no neutrons.\nIn the early universe, the formation of hydrogen's protons occurred in the first second after the Big Bang; neutral hydrogen atoms only formed about 370,000 years later during the recombination epoch as the universe cooled and plasma had cooled enough for electrons to remain bound to protons. Hydrogen, typically nonmetallic except under extreme pressure, readily forms covalent bonds with most nonmetals, contributing to the formation of compounds like water and various organic substances. Its role is crucial in acid-base reactions, which mainly involve proton exchange among soluble molecules. In ionic compounds, hydrogen can take the form of either a negatively charged anion, where it is known as hydride, or as a positively charged cation, H+. The cation, usually just a proton (symbol p), exhibits specific behavior in aqueous solutions and in ionic compounds involves screening of its electric charge by surrounding polar molecules or anions. Hydrogen's unique position as the only neutral atom for which the Schrödinger equation can be directly solved, has significantly contributed to the foundational principles of quantum mechanics through the exploration of its energetics and chemical bonding.\nHydrogen gas was first produced artificially in the early 16th century by reacting acids with metals. Henry Cavendish, in 1766–81, identified hydrogen gas as a distinct substance and discovered its property of producing water when burned; hence its name means \"water-former\" in Greek.\nMost hydrogen production occurs through steam reforming of natural gas; a smaller portion comes from energy-intensive methods such as the electrolysis of water. Its main industrial uses include fossil fuel processing, such as hydrocracking, and ammonia production, with emerging uses in fuel cells for electricity generation and as a heat source. When used in fuel cells, hydrogen's only emission at point of use is water vapor, though combustion can produce nitrogen oxides. Hydrogen's interaction with metals may cause embrittlement.","container-title":"Wikipedia","language":"en","license":"Creative Commons Attribution-ShareAlike License","note":"Page Version ID: 1246031915","source":"Wikipedia","title":"Hydrogen","URL":"https://en.wikipedia.org/w/index.php?title=Hydrogen&amp;oldid=1246031915","accessed":{"date-parts":[["2024",11,3]]},"issued":{"date-parts":[["2024",9,16]]}}}],"schema":"https://github.com/citation-style-language/schema/raw/master/csl-citation.json"} </w:instrText>
+      </w:r>
+      <w:r>
+        <w:fldChar w:fldCharType="separate"/>
+      </w:r>
+      <w:r>
+        <w:t>[14]</w:t>
+      </w:r>
+      <w:r>
+        <w:fldChar w:fldCharType="end"/>
+      </w:r>
+      <w:r>
+        <w:t>. Due to this, hydrogen is considered to be incondensable at this state</w:t>
+      </w:r>
+      <w:r>
+        <w:t xml:space="preserve">; it can’t be liquefied by changing pressure </w:t>
+      </w:r>
+      <w:r>
+        <w:fldChar w:fldCharType="begin"/>
+      </w:r>
+      <w:r>
+        <w:instrText xml:space="preserve"> ADDIN ZOTERO_ITEM CSL_CITATION {"citationID":"PYqgSX9D","properties":{"formattedCitation":"[18]","plainCitation":"[18]","noteIndex":0},"citationItems":[{"id":1089,"uris":["http://zotero.org/users/15288956/items/7GWQHEIJ"],"itemData":{"id":1089,"type":"chapter","abstract":"Chapter 7. Engineering Equations of State for PVT Properties\nI am more than ever an admirer of van der Waals.\nLord Rayleigh (1891)\n From Chapter 6, it is obvious that we can calculate changes in U,...","container-title":"Introductory Chemical Engineering Thermodynamics","ISBN":"978-0-13-278848-9","language":"en","publisher":"Pearson","source":"learning.oreilly.com","title":"Chapter 1.  Basic Concepts","URL":"https://learning.oreilly.com/library/view/introductory-chemical-engineering/9780132788489/ch07.xhtml","author":[{"family":"Elliot","given":"J. Richard"},{"family":"Lira","given":"Carl T."}],"accessed":{"date-parts":[["2026",3,25]]},"issued":{"date-parts":[["2012",2]]}}}],"schema":"https://github.com/citation-style-language/schema/raw/master/csl-citation.json"} </w:instrText>
+      </w:r>
+      <w:r>
+        <w:fldChar w:fldCharType="separate"/>
+      </w:r>
+      <w:r>
+        <w:t>[18]</w:t>
+      </w:r>
+      <w:r>
+        <w:fldChar w:fldCharType="end"/>
+      </w:r>
+      <w:r>
+        <w:t>. Therefore, the two streams coming out of this block are a vapour-phase hydrogen</w:t>
+      </w:r>
+      <w:r>
+        <w:t xml:space="preserve"> </w:t>
+      </w:r>
+      <w:r>
+        <w:t>stream and a liquid-phase water</w:t>
+      </w:r>
+      <w:r>
+        <w:t>-</w:t>
+      </w:r>
+      <w:r>
+        <w:t>aniline mix</w:t>
+      </w:r>
+      <w:r>
+        <w:t>ture</w:t>
+      </w:r>
+      <w:r>
+        <w:t>.</w:t>
+      </w:r>
+      <w:r>
+        <w:t xml:space="preserve"> </w:t>
+      </w:r>
+      <w:r>
+        <w:t>In a later section of this report, the hydrogen stream is recycled back into the reactor. However, for simplicity, the hydrogen stream is treated as a waste stream in the next simulation.</w:t>
+      </w:r>
+    </w:p>
+    <w:p/>
+    <w:p>
+      <w:r>
+        <w:t>Due to the large boiling point</w:t>
+      </w:r>
+      <w:r>
+        <w:t xml:space="preserve"> </w:t>
+      </w:r>
+      <w:r>
+        <w:t>difference between hydrogen to water and aniline, a simple flash chamber can be used to complete this separation.</w:t>
+      </w:r>
+      <w:r>
+        <w:t xml:space="preserve"> </w:t>
+      </w:r>
+      <w:r>
+        <w:t xml:space="preserve">Because compounds tend to condense more readily at higher pressure, this flash chamber is operated at the same pressure as the reactor, at 1.5 MPa. As hydrogen is non-condensable, </w:t>
+      </w:r>
+      <w:r>
+        <w:t xml:space="preserve">the </w:t>
+      </w:r>
+      <w:r>
+        <w:t xml:space="preserve">flash temperature is set </w:t>
+      </w:r>
+      <w:r>
+        <w:t xml:space="preserve">below </w:t>
+      </w:r>
+      <w:r>
+        <w:t xml:space="preserve">the </w:t>
+      </w:r>
+      <w:r>
+        <w:t xml:space="preserve">bubble point </w:t>
+      </w:r>
+      <w:r>
+        <w:t xml:space="preserve">of </w:t>
+      </w:r>
+      <w:r>
+        <w:t>a water-aniline mixture.</w:t>
+      </w:r>
+    </w:p>
+    <w:p/>
+    <w:p>
+      <w:pPr>
+        <w:pStyle w:val="Heading3"/>
+      </w:pPr>
+      <w:r>
+        <w:t>Separation 2: Aniline Purification</w:t>
+      </w:r>
+    </w:p>
+    <w:p>
       <w:pPr>
         <w:pStyle w:val="Heading2"/>
       </w:pPr>
@@ -4839,7 +5175,6 @@
         <w:spacing w:line="360" w:lineRule="auto"/>
       </w:pPr>
       <w:r>
-        <w:lastRenderedPageBreak/>
         <w:br w:type="page"/>
       </w:r>
     </w:p>
@@ -5123,6 +5458,87 @@
     </w:p>
     <w:p>
       <w:pPr>
+        <w:pStyle w:val="Bibliography"/>
+      </w:pPr>
+      <w:r>
+        <w:lastRenderedPageBreak/>
+        <w:t>[14]</w:t>
+      </w:r>
+      <w:r>
+        <w:tab/>
+        <w:t xml:space="preserve">‘Hydrogen’, </w:t>
+      </w:r>
+      <w:r>
+        <w:rPr>
+          <w:i/>
+          <w:iCs/>
+        </w:rPr>
+        <w:t>Wikipedia</w:t>
+      </w:r>
+      <w:r>
+        <w:t>. Sep. 16, 2024. Accessed: Nov. 03, 2024. [Online]. Available: https://en.wikipedia.org/w/index.php?title=Hydrogen&amp;oldid=1246031915</w:t>
+      </w:r>
+    </w:p>
+    <w:p>
+      <w:pPr>
+        <w:pStyle w:val="Bibliography"/>
+      </w:pPr>
+      <w:r>
+        <w:t>[15]</w:t>
+      </w:r>
+      <w:r>
+        <w:tab/>
+        <w:t>‘Nitrobenzene’, PubChem. Accessed: Mar. 25, 2026. [Online]. Available: https://pubchem.ncbi.nlm.nih.gov/compound/7416</w:t>
+      </w:r>
+    </w:p>
+    <w:p>
+      <w:pPr>
+        <w:pStyle w:val="Bibliography"/>
+      </w:pPr>
+      <w:r>
+        <w:t>[16]</w:t>
+      </w:r>
+      <w:r>
+        <w:tab/>
+        <w:t>‘Water’, PubChem. Accessed: Oct. 03, 2024. [Online]. Available: https://pubchem.ncbi.nlm.nih.gov/compound/962</w:t>
+      </w:r>
+    </w:p>
+    <w:p>
+      <w:pPr>
+        <w:pStyle w:val="Bibliography"/>
+      </w:pPr>
+      <w:r>
+        <w:t>[17]</w:t>
+      </w:r>
+      <w:r>
+        <w:tab/>
+        <w:t>‘Aniline’, PubChem. Accessed: Mar. 25, 2026. [Online]. Available: https://pubchem.ncbi.nlm.nih.gov/compound/6115</w:t>
+      </w:r>
+    </w:p>
+    <w:p>
+      <w:pPr>
+        <w:pStyle w:val="Bibliography"/>
+      </w:pPr>
+      <w:r>
+        <w:t>[18]</w:t>
+      </w:r>
+      <w:r>
+        <w:tab/>
+        <w:t xml:space="preserve">J. R. Elliot and C. T. Lira, ‘Chapter 1.  Basic Concepts’, in </w:t>
+      </w:r>
+      <w:r>
+        <w:rPr>
+          <w:i/>
+          <w:iCs/>
+        </w:rPr>
+        <w:t>Introductory Chemical Engineering Thermodynamics</w:t>
+      </w:r>
+      <w:r>
+        <w:t>, Pearson, 2012. Accessed: Mar. 25, 2026. [Online]. Available: https://learning.oreilly.com/library/view/introductory-chemical-engineering/9780132788489/ch07.xhtml</w:t>
+      </w:r>
+    </w:p>
+    <w:p>
+      <w:pPr>
         <w:rPr>
           <w:rFonts w:cstheme="majorBidi"/>
         </w:rPr>
@@ -5131,7 +5547,6 @@
         <w:rPr>
           <w:rFonts w:cstheme="majorBidi"/>
         </w:rPr>
-        <w:lastRenderedPageBreak/>
         <w:fldChar w:fldCharType="end"/>
       </w:r>
     </w:p>
@@ -5318,9 +5733,9 @@
 <file path=word/commentsExtended.xml><?xml version="1.0" encoding="utf-8"?>
 <w15:commentsEx xmlns:wpc="http://schemas.microsoft.com/office/word/2010/wordprocessingCanvas" xmlns:cx="http://schemas.microsoft.com/office/drawing/2014/chartex" xmlns:cx1="http://schemas.microsoft.com/office/drawing/2015/9/8/chartex" xmlns:cx2="http://schemas.microsoft.com/office/drawing/2015/10/21/chartex" xmlns:cx3="http://schemas.microsoft.com/office/drawing/2016/5/9/chartex" xmlns:cx4="http://schemas.microsoft.com/office/drawing/2016/5/10/chartex" xmlns:cx5="http://schemas.microsoft.com/office/drawing/2016/5/11/chartex" xmlns:cx6="http://schemas.microsoft.com/office/drawing/2016/5/12/chartex" xmlns:cx7="http://schemas.microsoft.com/office/drawing/2016/5/13/chartex" xmlns:cx8="http://schemas.microsoft.com/office/drawing/2016/5/14/chartex" xmlns:mc="http://schemas.openxmlformats.org/markup-compatibility/2006" xmlns:aink="http://schemas.microsoft.com/office/drawing/2016/ink" xmlns:am3d="http://schemas.microsoft.com/office/drawing/2017/model3d" xmlns:o="urn:schemas-microsoft-com:office:office" xmlns:oel="http://schemas.microsoft.com/office/2019/extlst" xmlns:r="http://schemas.openxmlformats.org/officeDocument/2006/relationships" xmlns:m="http://schemas.openxmlformats.org/officeDocument/2006/math" xmlns:v="urn:schemas-microsoft-com:vml" xmlns:wp14="http://schemas.microsoft.com/office/word/2010/wordprocessingDrawing" xmlns:wp="http://schemas.openxmlformats.org/drawingml/2006/wordprocessingDrawing" xmlns:w10="urn:schemas-microsoft-com:office:word" xmlns:w="http://schemas.openxmlformats.org/wordprocessingml/2006/main" xmlns:w14="http://schemas.microsoft.com/office/word/2010/wordml" xmlns:w15="http://schemas.microsoft.com/office/word/2012/wordml" xmlns:w16cex="http://schemas.microsoft.com/office/word/2018/wordml/cex" xmlns:w16cid="http://schemas.microsoft.com/office/word/2016/wordml/cid" xmlns:w16="http://schemas.microsoft.com/office/word/2018/wordml" xmlns:w16du="http://schemas.microsoft.com/office/word/2023/wordml/word16du" xmlns:w16sdtdh="http://schemas.microsoft.com/office/word/2020/wordml/sdtdatahash" xmlns:w16sdtfl="http://schemas.microsoft.com/office/word/2024/wordml/sdtformatlock" xmlns:w16se="http://schemas.microsoft.com/office/word/2015/wordml/symex" xmlns:wpg="http://schemas.microsoft.com/office/word/2010/wordprocessingGroup" xmlns:wpi="http://schemas.microsoft.com/office/word/2010/wordprocessingInk" xmlns:wne="http://schemas.microsoft.com/office/word/2006/wordml" xmlns:wps="http://schemas.microsoft.com/office/word/2010/wordprocessingShape" mc:Ignorable="w14 w15 w16se w16cid w16 w16cex w16sdtdh w16sdtfl w16du wp14">
   <w15:commentEx w15:paraId="713B7780" w15:done="0"/>
-  <w15:commentEx w15:paraId="4EAD9D93" w15:done="0"/>
-  <w15:commentEx w15:paraId="1DD2819C" w15:paraIdParent="4EAD9D93" w15:done="0"/>
-  <w15:commentEx w15:paraId="2598566A" w15:paraIdParent="4EAD9D93" w15:done="0"/>
+  <w15:commentEx w15:paraId="4EAD9D93" w15:done="1"/>
+  <w15:commentEx w15:paraId="1DD2819C" w15:paraIdParent="4EAD9D93" w15:done="1"/>
+  <w15:commentEx w15:paraId="2598566A" w15:paraIdParent="4EAD9D93" w15:done="1"/>
 </w15:commentsEx>
 </file>
 

</xml_diff>

<commit_message>
Finish analysis of separation 1: flash chamber
</commit_message>
<xml_diff>
--- a/Term Project - WORKING.docx
+++ b/Term Project - WORKING.docx
@@ -2587,9 +2587,6 @@
     <w:p>
       <w:pPr>
         <w:pStyle w:val="Heading2"/>
-        <w:rPr>
-          <w:rFonts w:asciiTheme="majorBidi" w:hAnsiTheme="majorBidi" w:cstheme="majorBidi"/>
-        </w:rPr>
       </w:pPr>
       <w:bookmarkStart w:id="2" w:name="_Toc224148621"/>
       <w:r>
@@ -2599,6 +2596,65 @@
       <w:bookmarkEnd w:id="2"/>
     </w:p>
     <w:p>
+      <w:r>
+        <w:fldChar w:fldCharType="begin"/>
+      </w:r>
+      <w:r>
+        <w:instrText xml:space="preserve"> REF _Ref225351832 \h </w:instrText>
+      </w:r>
+      <w:r>
+        <w:instrText xml:space="preserve"> \* MERGEFORMAT </w:instrText>
+      </w:r>
+      <w:r>
+        <w:fldChar w:fldCharType="separate"/>
+      </w:r>
+      <w:r>
+        <w:rPr>
+          <w:color w:val="000000" w:themeColor="text1"/>
+        </w:rPr>
+        <w:t>Figure</w:t>
+      </w:r>
+      <w:r>
+        <w:rPr>
+          <w:i/>
+          <w:iCs/>
+          <w:color w:val="000000" w:themeColor="text1"/>
+        </w:rPr>
+        <w:t xml:space="preserve"> </w:t>
+      </w:r>
+      <w:r>
+        <w:rPr>
+          <w:noProof/>
+          <w:color w:val="000000" w:themeColor="text1"/>
+        </w:rPr>
+        <w:t>1</w:t>
+      </w:r>
+      <w:r>
+        <w:fldChar w:fldCharType="end"/>
+      </w:r>
+      <w:r>
+        <w:t xml:space="preserve"> </w:t>
+      </w:r>
+      <w:r>
+        <w:fldChar w:fldCharType="begin"/>
+      </w:r>
+      <w:r>
+        <w:instrText xml:space="preserve"> REF _Ref225351853 \p \h </w:instrText>
+      </w:r>
+      <w:r>
+        <w:fldChar w:fldCharType="separate"/>
+      </w:r>
+      <w:r>
+        <w:t>below</w:t>
+      </w:r>
+      <w:r>
+        <w:fldChar w:fldCharType="end"/>
+      </w:r>
+      <w:r>
+        <w:t xml:space="preserve"> shows the initially planned block flow diagram of this process. This diagram is provided as a guideline and is subject to change based on the analysis in this report.</w:t>
+      </w:r>
+    </w:p>
+    <w:p>
       <w:pPr>
         <w:spacing w:line="360" w:lineRule="auto"/>
         <w:rPr>
@@ -2608,10 +2664,8 @@
     </w:p>
     <w:p>
       <w:pPr>
+        <w:keepNext/>
         <w:spacing w:line="360" w:lineRule="auto"/>
-        <w:rPr>
-          <w:lang w:val="en-CA"/>
-        </w:rPr>
       </w:pPr>
       <w:r>
         <w:rPr>
@@ -2663,8 +2717,13 @@
     </w:p>
     <w:p>
       <w:pPr>
-        <w:spacing w:line="360" w:lineRule="auto"/>
-        <w:rPr>
+        <w:pStyle w:val="Caption"/>
+        <w:rPr>
+          <w:i w:val="0"/>
+          <w:iCs w:val="0"/>
+          <w:color w:val="000000" w:themeColor="text1"/>
+          <w:sz w:val="24"/>
+          <w:szCs w:val="24"/>
           <w:lang w:val="en-CA"/>
         </w:rPr>
         <w:sectPr>
@@ -2675,12 +2734,141 @@
           <w:docGrid w:linePitch="360"/>
         </w:sectPr>
       </w:pPr>
-      <w:r>
-        <w:rPr>
-          <w:lang w:val="en-CA"/>
-        </w:rPr>
-        <w:t>Figure 1: Block flow diagram for production of aniline from hydrogenation of nitrobenzene</w:t>
-      </w:r>
+      <w:bookmarkStart w:id="3" w:name="_Ref225351832"/>
+      <w:bookmarkStart w:id="4" w:name="_Ref225351853"/>
+      <w:r>
+        <w:rPr>
+          <w:i w:val="0"/>
+          <w:iCs w:val="0"/>
+          <w:color w:val="000000" w:themeColor="text1"/>
+          <w:sz w:val="24"/>
+          <w:szCs w:val="24"/>
+        </w:rPr>
+        <w:t xml:space="preserve">Figure </w:t>
+      </w:r>
+      <w:r>
+        <w:rPr>
+          <w:i w:val="0"/>
+          <w:iCs w:val="0"/>
+          <w:color w:val="000000" w:themeColor="text1"/>
+          <w:sz w:val="24"/>
+          <w:szCs w:val="24"/>
+        </w:rPr>
+        <w:fldChar w:fldCharType="begin"/>
+      </w:r>
+      <w:r>
+        <w:rPr>
+          <w:i w:val="0"/>
+          <w:iCs w:val="0"/>
+          <w:color w:val="000000" w:themeColor="text1"/>
+          <w:sz w:val="24"/>
+          <w:szCs w:val="24"/>
+        </w:rPr>
+        <w:instrText xml:space="preserve"> SEQ Figure \* ARABIC </w:instrText>
+      </w:r>
+      <w:r>
+        <w:rPr>
+          <w:i w:val="0"/>
+          <w:iCs w:val="0"/>
+          <w:color w:val="000000" w:themeColor="text1"/>
+          <w:sz w:val="24"/>
+          <w:szCs w:val="24"/>
+        </w:rPr>
+        <w:fldChar w:fldCharType="separate"/>
+      </w:r>
+      <w:r>
+        <w:rPr>
+          <w:i w:val="0"/>
+          <w:iCs w:val="0"/>
+          <w:noProof/>
+          <w:color w:val="000000" w:themeColor="text1"/>
+          <w:sz w:val="24"/>
+          <w:szCs w:val="24"/>
+        </w:rPr>
+        <w:t>1</w:t>
+      </w:r>
+      <w:r>
+        <w:rPr>
+          <w:i w:val="0"/>
+          <w:iCs w:val="0"/>
+          <w:color w:val="000000" w:themeColor="text1"/>
+          <w:sz w:val="24"/>
+          <w:szCs w:val="24"/>
+        </w:rPr>
+        <w:fldChar w:fldCharType="end"/>
+      </w:r>
+      <w:bookmarkEnd w:id="3"/>
+      <w:r>
+        <w:rPr>
+          <w:i w:val="0"/>
+          <w:iCs w:val="0"/>
+          <w:color w:val="000000" w:themeColor="text1"/>
+          <w:sz w:val="24"/>
+          <w:szCs w:val="24"/>
+        </w:rPr>
+        <w:t xml:space="preserve">: </w:t>
+      </w:r>
+      <w:r>
+        <w:rPr>
+          <w:i w:val="0"/>
+          <w:iCs w:val="0"/>
+          <w:color w:val="000000" w:themeColor="text1"/>
+          <w:sz w:val="24"/>
+          <w:szCs w:val="24"/>
+        </w:rPr>
+        <w:t>Initial planned b</w:t>
+      </w:r>
+      <w:r>
+        <w:rPr>
+          <w:i w:val="0"/>
+          <w:iCs w:val="0"/>
+          <w:color w:val="000000" w:themeColor="text1"/>
+          <w:sz w:val="24"/>
+          <w:szCs w:val="24"/>
+        </w:rPr>
+        <w:t xml:space="preserve">lock flow diagram for </w:t>
+      </w:r>
+      <w:r>
+        <w:rPr>
+          <w:i w:val="0"/>
+          <w:iCs w:val="0"/>
+          <w:color w:val="000000" w:themeColor="text1"/>
+          <w:sz w:val="24"/>
+          <w:szCs w:val="24"/>
+        </w:rPr>
+        <w:t xml:space="preserve">the </w:t>
+      </w:r>
+      <w:r>
+        <w:rPr>
+          <w:i w:val="0"/>
+          <w:iCs w:val="0"/>
+          <w:color w:val="000000" w:themeColor="text1"/>
+          <w:sz w:val="24"/>
+          <w:szCs w:val="24"/>
+        </w:rPr>
+        <w:t xml:space="preserve">production of aniline from </w:t>
+      </w:r>
+      <w:r>
+        <w:rPr>
+          <w:i w:val="0"/>
+          <w:iCs w:val="0"/>
+          <w:color w:val="000000" w:themeColor="text1"/>
+          <w:sz w:val="24"/>
+          <w:szCs w:val="24"/>
+        </w:rPr>
+        <w:t xml:space="preserve">the </w:t>
+      </w:r>
+      <w:r>
+        <w:rPr>
+          <w:i w:val="0"/>
+          <w:iCs w:val="0"/>
+          <w:color w:val="000000" w:themeColor="text1"/>
+          <w:sz w:val="24"/>
+          <w:szCs w:val="24"/>
+        </w:rPr>
+        <w:t>hydrogenation of nitrobenzene</w:t>
+      </w:r>
+      <w:bookmarkEnd w:id="4"/>
     </w:p>
     <w:p>
       <w:pPr>
@@ -2689,7 +2877,7 @@
           <w:rFonts w:asciiTheme="majorBidi" w:hAnsiTheme="majorBidi" w:cstheme="majorBidi"/>
         </w:rPr>
       </w:pPr>
-      <w:bookmarkStart w:id="3" w:name="_Toc224148622"/>
+      <w:bookmarkStart w:id="5" w:name="_Toc224148622"/>
       <w:r>
         <w:rPr>
           <w:rFonts w:asciiTheme="majorBidi" w:hAnsiTheme="majorBidi" w:cstheme="majorBidi"/>
@@ -2697,7 +2885,7 @@
         <w:lastRenderedPageBreak/>
         <w:t>Components</w:t>
       </w:r>
-      <w:bookmarkEnd w:id="3"/>
+      <w:bookmarkEnd w:id="5"/>
       <w:r>
         <w:rPr>
           <w:rFonts w:asciiTheme="majorBidi" w:hAnsiTheme="majorBidi" w:cstheme="majorBidi"/>
@@ -2851,23 +3039,216 @@
         <w:rPr>
           <w:lang w:val="en-CA"/>
         </w:rPr>
-        <w:t>The major components relevant to the simulation are listed in table 1 below.</w:t>
-      </w:r>
-    </w:p>
-    <w:p>
-      <w:pPr>
-        <w:spacing w:line="360" w:lineRule="auto"/>
-        <w:jc w:val="center"/>
+        <w:t xml:space="preserve">The major components relevant to the simulation are </w:t>
+      </w:r>
+      <w:r>
         <w:rPr>
           <w:lang w:val="en-CA"/>
         </w:rPr>
-      </w:pPr>
+        <w:t xml:space="preserve">listed in </w:t>
+      </w:r>
       <w:r>
         <w:rPr>
           <w:lang w:val="en-CA"/>
         </w:rPr>
-        <w:t>Table 1: Component names and formulas relevant to the simulation</w:t>
-      </w:r>
+        <w:fldChar w:fldCharType="begin"/>
+      </w:r>
+      <w:r>
+        <w:rPr>
+          <w:lang w:val="en-CA"/>
+        </w:rPr>
+        <w:instrText xml:space="preserve"> REF _Ref225351914 \h </w:instrText>
+      </w:r>
+      <w:r>
+        <w:rPr>
+          <w:lang w:val="en-CA"/>
+        </w:rPr>
+      </w:r>
+      <w:r>
+        <w:rPr>
+          <w:lang w:val="en-CA"/>
+        </w:rPr>
+        <w:instrText xml:space="preserve"> \* MERGEFORMAT </w:instrText>
+      </w:r>
+      <w:r>
+        <w:rPr>
+          <w:lang w:val="en-CA"/>
+        </w:rPr>
+        <w:fldChar w:fldCharType="separate"/>
+      </w:r>
+      <w:r>
+        <w:rPr>
+          <w:color w:val="000000" w:themeColor="text1"/>
+        </w:rPr>
+        <w:t xml:space="preserve">Table </w:t>
+      </w:r>
+      <w:r>
+        <w:rPr>
+          <w:noProof/>
+          <w:color w:val="000000" w:themeColor="text1"/>
+        </w:rPr>
+        <w:t>1</w:t>
+      </w:r>
+      <w:r>
+        <w:rPr>
+          <w:lang w:val="en-CA"/>
+        </w:rPr>
+        <w:fldChar w:fldCharType="end"/>
+      </w:r>
+      <w:r>
+        <w:rPr>
+          <w:lang w:val="en-CA"/>
+        </w:rPr>
+        <w:t xml:space="preserve"> </w:t>
+      </w:r>
+      <w:r>
+        <w:rPr>
+          <w:lang w:val="en-CA"/>
+        </w:rPr>
+        <w:fldChar w:fldCharType="begin"/>
+      </w:r>
+      <w:r>
+        <w:rPr>
+          <w:lang w:val="en-CA"/>
+        </w:rPr>
+        <w:instrText xml:space="preserve"> REF _Ref225351922 \p \h </w:instrText>
+      </w:r>
+      <w:r>
+        <w:rPr>
+          <w:lang w:val="en-CA"/>
+        </w:rPr>
+      </w:r>
+      <w:r>
+        <w:rPr>
+          <w:lang w:val="en-CA"/>
+        </w:rPr>
+        <w:instrText xml:space="preserve"> \* MERGEFORMAT </w:instrText>
+      </w:r>
+      <w:r>
+        <w:rPr>
+          <w:lang w:val="en-CA"/>
+        </w:rPr>
+        <w:fldChar w:fldCharType="separate"/>
+      </w:r>
+      <w:r>
+        <w:rPr>
+          <w:lang w:val="en-CA"/>
+        </w:rPr>
+        <w:t>below</w:t>
+      </w:r>
+      <w:r>
+        <w:rPr>
+          <w:lang w:val="en-CA"/>
+        </w:rPr>
+        <w:fldChar w:fldCharType="end"/>
+      </w:r>
+      <w:r>
+        <w:rPr>
+          <w:lang w:val="en-CA"/>
+        </w:rPr>
+        <w:t>.</w:t>
+      </w:r>
+    </w:p>
+    <w:p>
+      <w:pPr>
+        <w:pStyle w:val="Caption"/>
+        <w:keepNext/>
+        <w:rPr>
+          <w:i w:val="0"/>
+          <w:iCs w:val="0"/>
+          <w:color w:val="000000" w:themeColor="text1"/>
+          <w:sz w:val="24"/>
+          <w:szCs w:val="24"/>
+        </w:rPr>
+      </w:pPr>
+    </w:p>
+    <w:p>
+      <w:pPr>
+        <w:pStyle w:val="Caption"/>
+        <w:keepNext/>
+        <w:rPr>
+          <w:i w:val="0"/>
+          <w:iCs w:val="0"/>
+          <w:color w:val="000000" w:themeColor="text1"/>
+          <w:sz w:val="24"/>
+          <w:szCs w:val="24"/>
+        </w:rPr>
+      </w:pPr>
+      <w:bookmarkStart w:id="6" w:name="_Ref225351914"/>
+      <w:bookmarkStart w:id="7" w:name="_Ref225351922"/>
+      <w:r>
+        <w:rPr>
+          <w:i w:val="0"/>
+          <w:iCs w:val="0"/>
+          <w:color w:val="000000" w:themeColor="text1"/>
+          <w:sz w:val="24"/>
+          <w:szCs w:val="24"/>
+        </w:rPr>
+        <w:t xml:space="preserve">Table </w:t>
+      </w:r>
+      <w:r>
+        <w:rPr>
+          <w:i w:val="0"/>
+          <w:iCs w:val="0"/>
+          <w:color w:val="000000" w:themeColor="text1"/>
+          <w:sz w:val="24"/>
+          <w:szCs w:val="24"/>
+        </w:rPr>
+        <w:fldChar w:fldCharType="begin"/>
+      </w:r>
+      <w:r>
+        <w:rPr>
+          <w:i w:val="0"/>
+          <w:iCs w:val="0"/>
+          <w:color w:val="000000" w:themeColor="text1"/>
+          <w:sz w:val="24"/>
+          <w:szCs w:val="24"/>
+        </w:rPr>
+        <w:instrText xml:space="preserve"> SEQ Table \* ARABIC </w:instrText>
+      </w:r>
+      <w:r>
+        <w:rPr>
+          <w:i w:val="0"/>
+          <w:iCs w:val="0"/>
+          <w:color w:val="000000" w:themeColor="text1"/>
+          <w:sz w:val="24"/>
+          <w:szCs w:val="24"/>
+        </w:rPr>
+        <w:fldChar w:fldCharType="separate"/>
+      </w:r>
+      <w:r>
+        <w:rPr>
+          <w:i w:val="0"/>
+          <w:iCs w:val="0"/>
+          <w:noProof/>
+          <w:color w:val="000000" w:themeColor="text1"/>
+          <w:sz w:val="24"/>
+          <w:szCs w:val="24"/>
+        </w:rPr>
+        <w:t>1</w:t>
+      </w:r>
+      <w:r>
+        <w:rPr>
+          <w:i w:val="0"/>
+          <w:iCs w:val="0"/>
+          <w:color w:val="000000" w:themeColor="text1"/>
+          <w:sz w:val="24"/>
+          <w:szCs w:val="24"/>
+        </w:rPr>
+        <w:fldChar w:fldCharType="end"/>
+      </w:r>
+      <w:bookmarkEnd w:id="6"/>
+      <w:r>
+        <w:rPr>
+          <w:i w:val="0"/>
+          <w:iCs w:val="0"/>
+          <w:color w:val="000000" w:themeColor="text1"/>
+          <w:sz w:val="24"/>
+          <w:szCs w:val="24"/>
+        </w:rPr>
+        <w:t>: Component names and formulas relevant to the process simulation</w:t>
+      </w:r>
+      <w:bookmarkEnd w:id="7"/>
     </w:p>
     <w:tbl>
       <w:tblPr>
@@ -3104,14 +3485,14 @@
           <w:rFonts w:asciiTheme="majorBidi" w:hAnsiTheme="majorBidi" w:cstheme="majorBidi"/>
         </w:rPr>
       </w:pPr>
-      <w:bookmarkStart w:id="4" w:name="_Toc224148623"/>
+      <w:bookmarkStart w:id="8" w:name="_Toc224148623"/>
       <w:r>
         <w:rPr>
           <w:rFonts w:asciiTheme="majorBidi" w:hAnsiTheme="majorBidi" w:cstheme="majorBidi"/>
         </w:rPr>
         <w:t>Property method</w:t>
       </w:r>
-      <w:bookmarkEnd w:id="4"/>
+      <w:bookmarkEnd w:id="8"/>
       <w:r>
         <w:rPr>
           <w:rFonts w:asciiTheme="majorBidi" w:hAnsiTheme="majorBidi" w:cstheme="majorBidi"/>
@@ -3218,7 +3599,7 @@
           <w:rFonts w:asciiTheme="majorBidi" w:hAnsiTheme="majorBidi" w:cstheme="majorBidi"/>
         </w:rPr>
       </w:pPr>
-      <w:bookmarkStart w:id="5" w:name="_Toc224148624"/>
+      <w:bookmarkStart w:id="9" w:name="_Toc224148624"/>
       <w:r>
         <w:rPr>
           <w:rFonts w:asciiTheme="majorBidi" w:hAnsiTheme="majorBidi" w:cstheme="majorBidi"/>
@@ -3232,7 +3613,7 @@
         </w:rPr>
         <w:t>Design</w:t>
       </w:r>
-      <w:bookmarkEnd w:id="5"/>
+      <w:bookmarkEnd w:id="9"/>
     </w:p>
     <w:p>
       <w:r>
@@ -4316,12 +4697,70 @@
     </w:p>
     <w:p>
       <w:r>
-        <w:t>With the reaction kinetics and reactor conditions defined above, the reaction quickly reached 100% conversion, as shown in Figure 2 below. This indicates that the current reaction conditions work very well, and it might be worth the effort to reduce efficiency to save on operating costs.</w:t>
+        <w:t>With the reaction kinetics and reactor conditions defined above, the reaction quickly reached 100% conversion, as shown</w:t>
+      </w:r>
+      <w:r>
+        <w:t xml:space="preserve"> in </w:t>
+      </w:r>
+      <w:r>
+        <w:fldChar w:fldCharType="begin"/>
+      </w:r>
+      <w:r>
+        <w:instrText xml:space="preserve"> REF _Ref225351975 \h </w:instrText>
+      </w:r>
+      <w:r>
+        <w:instrText xml:space="preserve"> \* MERGEFORMAT </w:instrText>
+      </w:r>
+      <w:r>
+        <w:fldChar w:fldCharType="separate"/>
+      </w:r>
+      <w:r>
+        <w:rPr>
+          <w:color w:val="000000" w:themeColor="text1"/>
+        </w:rPr>
+        <w:t xml:space="preserve">Figure </w:t>
+      </w:r>
+      <w:r>
+        <w:rPr>
+          <w:noProof/>
+          <w:color w:val="000000" w:themeColor="text1"/>
+        </w:rPr>
+        <w:t>2</w:t>
+      </w:r>
+      <w:r>
+        <w:fldChar w:fldCharType="end"/>
+      </w:r>
+      <w:r>
+        <w:t xml:space="preserve"> </w:t>
+      </w:r>
+      <w:r>
+        <w:fldChar w:fldCharType="begin"/>
+      </w:r>
+      <w:r>
+        <w:instrText xml:space="preserve"> REF _Ref225351983 \p \h </w:instrText>
+      </w:r>
+      <w:r>
+        <w:instrText xml:space="preserve"> \* MERGEFORMAT </w:instrText>
+      </w:r>
+      <w:r>
+        <w:fldChar w:fldCharType="separate"/>
+      </w:r>
+      <w:r>
+        <w:t>below</w:t>
+      </w:r>
+      <w:r>
+        <w:fldChar w:fldCharType="end"/>
+      </w:r>
+      <w:r>
+        <w:t>. This indicates that the current reaction conditions work very well, and it might be worth the effort to reduce efficiency to save on operating costs.</w:t>
       </w:r>
     </w:p>
     <w:p/>
     <w:p>
-      <w:commentRangeStart w:id="6"/>
+      <w:pPr>
+        <w:keepNext/>
+      </w:pPr>
+      <w:commentRangeStart w:id="10"/>
       <w:r>
         <w:rPr>
           <w:noProof/>
@@ -4362,22 +4801,103 @@
           </wp:inline>
         </w:drawing>
       </w:r>
-      <w:commentRangeEnd w:id="6"/>
+      <w:commentRangeEnd w:id="10"/>
       <w:r>
         <w:rPr>
           <w:rStyle w:val="CommentReference"/>
           <w:sz w:val="24"/>
           <w:szCs w:val="24"/>
         </w:rPr>
-        <w:commentReference w:id="6"/>
-      </w:r>
-    </w:p>
-    <w:p>
-      <w:r>
-        <w:t>Figure 2: Molar composition profile over reactor length</w:t>
-      </w:r>
-    </w:p>
-    <w:p/>
+        <w:commentReference w:id="10"/>
+      </w:r>
+    </w:p>
+    <w:p>
+      <w:pPr>
+        <w:pStyle w:val="Caption"/>
+        <w:rPr>
+          <w:i w:val="0"/>
+          <w:iCs w:val="0"/>
+          <w:color w:val="000000" w:themeColor="text1"/>
+          <w:sz w:val="24"/>
+          <w:szCs w:val="24"/>
+        </w:rPr>
+      </w:pPr>
+      <w:bookmarkStart w:id="11" w:name="_Ref225351975"/>
+      <w:bookmarkStart w:id="12" w:name="_Ref225351983"/>
+      <w:r>
+        <w:rPr>
+          <w:i w:val="0"/>
+          <w:iCs w:val="0"/>
+          <w:color w:val="000000" w:themeColor="text1"/>
+          <w:sz w:val="24"/>
+          <w:szCs w:val="24"/>
+        </w:rPr>
+        <w:t xml:space="preserve">Figure </w:t>
+      </w:r>
+      <w:r>
+        <w:rPr>
+          <w:i w:val="0"/>
+          <w:iCs w:val="0"/>
+          <w:color w:val="000000" w:themeColor="text1"/>
+          <w:sz w:val="24"/>
+          <w:szCs w:val="24"/>
+        </w:rPr>
+        <w:fldChar w:fldCharType="begin"/>
+      </w:r>
+      <w:r>
+        <w:rPr>
+          <w:i w:val="0"/>
+          <w:iCs w:val="0"/>
+          <w:color w:val="000000" w:themeColor="text1"/>
+          <w:sz w:val="24"/>
+          <w:szCs w:val="24"/>
+        </w:rPr>
+        <w:instrText xml:space="preserve"> SEQ Figure \* ARABIC </w:instrText>
+      </w:r>
+      <w:r>
+        <w:rPr>
+          <w:i w:val="0"/>
+          <w:iCs w:val="0"/>
+          <w:color w:val="000000" w:themeColor="text1"/>
+          <w:sz w:val="24"/>
+          <w:szCs w:val="24"/>
+        </w:rPr>
+        <w:fldChar w:fldCharType="separate"/>
+      </w:r>
+      <w:r>
+        <w:rPr>
+          <w:i w:val="0"/>
+          <w:iCs w:val="0"/>
+          <w:noProof/>
+          <w:color w:val="000000" w:themeColor="text1"/>
+          <w:sz w:val="24"/>
+          <w:szCs w:val="24"/>
+        </w:rPr>
+        <w:t>2</w:t>
+      </w:r>
+      <w:r>
+        <w:rPr>
+          <w:i w:val="0"/>
+          <w:iCs w:val="0"/>
+          <w:color w:val="000000" w:themeColor="text1"/>
+          <w:sz w:val="24"/>
+          <w:szCs w:val="24"/>
+        </w:rPr>
+        <w:fldChar w:fldCharType="end"/>
+      </w:r>
+      <w:bookmarkEnd w:id="11"/>
+      <w:r>
+        <w:rPr>
+          <w:i w:val="0"/>
+          <w:iCs w:val="0"/>
+          <w:color w:val="000000" w:themeColor="text1"/>
+          <w:sz w:val="24"/>
+          <w:szCs w:val="24"/>
+        </w:rPr>
+        <w:t>: Molar composition profile over reactor length</w:t>
+      </w:r>
+      <w:bookmarkEnd w:id="12"/>
+    </w:p>
     <w:p>
       <w:pPr>
         <w:pStyle w:val="Heading2"/>
@@ -4385,10 +4905,10 @@
           <w:rFonts w:asciiTheme="majorBidi" w:hAnsiTheme="majorBidi" w:cstheme="majorBidi"/>
         </w:rPr>
       </w:pPr>
-      <w:bookmarkStart w:id="7" w:name="_Toc224148625"/>
-      <w:commentRangeStart w:id="8"/>
-      <w:commentRangeStart w:id="9"/>
-      <w:commentRangeStart w:id="10"/>
+      <w:bookmarkStart w:id="13" w:name="_Toc224148625"/>
+      <w:commentRangeStart w:id="14"/>
+      <w:commentRangeStart w:id="15"/>
+      <w:commentRangeStart w:id="16"/>
       <w:r>
         <w:rPr>
           <w:rFonts w:asciiTheme="majorBidi" w:hAnsiTheme="majorBidi" w:cstheme="majorBidi"/>
@@ -4401,8 +4921,8 @@
         </w:rPr>
         <w:t>Analysis</w:t>
       </w:r>
-      <w:bookmarkEnd w:id="7"/>
-      <w:commentRangeEnd w:id="8"/>
+      <w:bookmarkEnd w:id="13"/>
+      <w:commentRangeEnd w:id="14"/>
       <w:r>
         <w:rPr>
           <w:rStyle w:val="CommentReference"/>
@@ -4410,9 +4930,9 @@
           <w:sz w:val="36"/>
           <w:szCs w:val="26"/>
         </w:rPr>
-        <w:commentReference w:id="8"/>
-      </w:r>
-      <w:commentRangeEnd w:id="9"/>
+        <w:commentReference w:id="14"/>
+      </w:r>
+      <w:commentRangeEnd w:id="15"/>
       <w:r>
         <w:rPr>
           <w:rStyle w:val="CommentReference"/>
@@ -4420,9 +4940,9 @@
           <w:sz w:val="36"/>
           <w:szCs w:val="26"/>
         </w:rPr>
-        <w:commentReference w:id="9"/>
-      </w:r>
-      <w:commentRangeEnd w:id="10"/>
+        <w:commentReference w:id="15"/>
+      </w:r>
+      <w:commentRangeEnd w:id="16"/>
       <w:r>
         <w:rPr>
           <w:rStyle w:val="CommentReference"/>
@@ -4430,12 +4950,61 @@
           <w:sz w:val="36"/>
           <w:szCs w:val="26"/>
         </w:rPr>
-        <w:commentReference w:id="10"/>
-      </w:r>
-    </w:p>
-    <w:p>
-      <w:r>
-        <w:t>From Figure 2 above, it is clear that the system is overspecified for the current input and reaction kinetics. This means that parts of the reactor are underutilised, wasting precious resources. Therefore, the main target of this reactor analysis section is to adjust reactor size so that reactants reach their target conversion near the end of their residence time.</w:t>
+        <w:commentReference w:id="16"/>
+      </w:r>
+    </w:p>
+    <w:p>
+      <w:r>
+        <w:t xml:space="preserve">From </w:t>
+      </w:r>
+      <w:r>
+        <w:fldChar w:fldCharType="begin"/>
+      </w:r>
+      <w:r>
+        <w:instrText xml:space="preserve"> REF _Ref225351975 \h </w:instrText>
+      </w:r>
+      <w:r>
+        <w:instrText xml:space="preserve"> \* MERGEFORMAT </w:instrText>
+      </w:r>
+      <w:r>
+        <w:fldChar w:fldCharType="separate"/>
+      </w:r>
+      <w:r>
+        <w:rPr>
+          <w:color w:val="000000" w:themeColor="text1"/>
+        </w:rPr>
+        <w:t xml:space="preserve">Figure </w:t>
+      </w:r>
+      <w:r>
+        <w:rPr>
+          <w:noProof/>
+          <w:color w:val="000000" w:themeColor="text1"/>
+        </w:rPr>
+        <w:t>2</w:t>
+      </w:r>
+      <w:r>
+        <w:fldChar w:fldCharType="end"/>
+      </w:r>
+      <w:r>
+        <w:t xml:space="preserve"> </w:t>
+      </w:r>
+      <w:r>
+        <w:fldChar w:fldCharType="begin"/>
+      </w:r>
+      <w:r>
+        <w:instrText xml:space="preserve"> REF _Ref225351983 \p \h </w:instrText>
+      </w:r>
+      <w:r>
+        <w:fldChar w:fldCharType="separate"/>
+      </w:r>
+      <w:r>
+        <w:t>above</w:t>
+      </w:r>
+      <w:r>
+        <w:fldChar w:fldCharType="end"/>
+      </w:r>
+      <w:r>
+        <w:t>, it is clear that the system is overspecified for the current input and reaction kinetics. This means that parts of the reactor are underutilised, wasting precious resources. Therefore, the main target of this reactor analysis section is to adjust reactor size so that reactants reach their target conversion near the end of their residence time.</w:t>
       </w:r>
     </w:p>
     <w:p/>
@@ -4443,24 +5012,142 @@
       <w:pPr>
         <w:pStyle w:val="Heading3"/>
       </w:pPr>
-      <w:bookmarkStart w:id="11" w:name="_Toc224148626"/>
+      <w:bookmarkStart w:id="17" w:name="_Toc224148626"/>
       <w:r>
         <w:t>Reactor Size</w:t>
       </w:r>
-      <w:bookmarkEnd w:id="11"/>
+      <w:bookmarkEnd w:id="17"/>
     </w:p>
     <w:p>
       <w:r>
         <w:t xml:space="preserve">Two reactor size variables are manipulated: length and number of tubes. This </w:t>
       </w:r>
       <w:r>
-        <w:t>analysis is conducted through sensitivity analysis, with the following bounds:</w:t>
+        <w:t xml:space="preserve">analysis is conducted through sensitivity analysis, with the </w:t>
+      </w:r>
+      <w:r>
+        <w:t xml:space="preserve">bounds shown </w:t>
+      </w:r>
+      <w:r>
+        <w:t xml:space="preserve">in </w:t>
+      </w:r>
+      <w:r>
+        <w:fldChar w:fldCharType="begin"/>
+      </w:r>
+      <w:r>
+        <w:instrText xml:space="preserve"> REF _Ref225352090 \h </w:instrText>
+      </w:r>
+      <w:r>
+        <w:instrText xml:space="preserve"> \* MERGEFORMAT </w:instrText>
+      </w:r>
+      <w:r>
+        <w:fldChar w:fldCharType="separate"/>
+      </w:r>
+      <w:r>
+        <w:rPr>
+          <w:color w:val="000000" w:themeColor="text1"/>
+        </w:rPr>
+        <w:t xml:space="preserve">Table </w:t>
+      </w:r>
+      <w:r>
+        <w:rPr>
+          <w:noProof/>
+          <w:color w:val="000000" w:themeColor="text1"/>
+        </w:rPr>
+        <w:t>2</w:t>
+      </w:r>
+      <w:r>
+        <w:fldChar w:fldCharType="end"/>
+      </w:r>
+      <w:r>
+        <w:t>.</w:t>
       </w:r>
     </w:p>
     <w:p/>
     <w:p>
-      <w:r>
-        <w:t>Table 2: Sensitivity Analysis Setup for Reactor Size</w:t>
+      <w:pPr>
+        <w:pStyle w:val="Caption"/>
+        <w:keepNext/>
+        <w:rPr>
+          <w:i w:val="0"/>
+          <w:iCs w:val="0"/>
+          <w:color w:val="000000" w:themeColor="text1"/>
+          <w:sz w:val="24"/>
+          <w:szCs w:val="24"/>
+        </w:rPr>
+      </w:pPr>
+      <w:bookmarkStart w:id="18" w:name="_Ref225352090"/>
+      <w:r>
+        <w:rPr>
+          <w:i w:val="0"/>
+          <w:iCs w:val="0"/>
+          <w:color w:val="000000" w:themeColor="text1"/>
+          <w:sz w:val="24"/>
+          <w:szCs w:val="24"/>
+        </w:rPr>
+        <w:t xml:space="preserve">Table </w:t>
+      </w:r>
+      <w:r>
+        <w:rPr>
+          <w:i w:val="0"/>
+          <w:iCs w:val="0"/>
+          <w:color w:val="000000" w:themeColor="text1"/>
+          <w:sz w:val="24"/>
+          <w:szCs w:val="24"/>
+        </w:rPr>
+        <w:fldChar w:fldCharType="begin"/>
+      </w:r>
+      <w:r>
+        <w:rPr>
+          <w:i w:val="0"/>
+          <w:iCs w:val="0"/>
+          <w:color w:val="000000" w:themeColor="text1"/>
+          <w:sz w:val="24"/>
+          <w:szCs w:val="24"/>
+        </w:rPr>
+        <w:instrText xml:space="preserve"> SEQ Table \* ARABIC </w:instrText>
+      </w:r>
+      <w:r>
+        <w:rPr>
+          <w:i w:val="0"/>
+          <w:iCs w:val="0"/>
+          <w:color w:val="000000" w:themeColor="text1"/>
+          <w:sz w:val="24"/>
+          <w:szCs w:val="24"/>
+        </w:rPr>
+        <w:fldChar w:fldCharType="separate"/>
+      </w:r>
+      <w:r>
+        <w:rPr>
+          <w:i w:val="0"/>
+          <w:iCs w:val="0"/>
+          <w:noProof/>
+          <w:color w:val="000000" w:themeColor="text1"/>
+          <w:sz w:val="24"/>
+          <w:szCs w:val="24"/>
+        </w:rPr>
+        <w:t>2</w:t>
+      </w:r>
+      <w:r>
+        <w:rPr>
+          <w:i w:val="0"/>
+          <w:iCs w:val="0"/>
+          <w:color w:val="000000" w:themeColor="text1"/>
+          <w:sz w:val="24"/>
+          <w:szCs w:val="24"/>
+        </w:rPr>
+        <w:fldChar w:fldCharType="end"/>
+      </w:r>
+      <w:bookmarkEnd w:id="18"/>
+      <w:r>
+        <w:rPr>
+          <w:i w:val="0"/>
+          <w:iCs w:val="0"/>
+          <w:color w:val="000000" w:themeColor="text1"/>
+          <w:sz w:val="24"/>
+          <w:szCs w:val="24"/>
+        </w:rPr>
+        <w:t>: Sensitivity analysis setup for reactor size</w:t>
       </w:r>
     </w:p>
     <w:tbl>
@@ -4602,6 +5289,7 @@
     <w:p/>
     <w:p>
       <w:r>
+        <w:lastRenderedPageBreak/>
         <w:t>Running sensitivity analysis, many size ranges achieve the targeted nitrobenzene conversion. Of these, a final reactor design with a length of 4.5 m and 50 tubes is selected. It is selected as it reached 100% nitrobenzene conversion, reducing separation costs down the line.</w:t>
       </w:r>
     </w:p>
@@ -4610,14 +5298,14 @@
       <w:pPr>
         <w:pStyle w:val="Heading3"/>
       </w:pPr>
-      <w:bookmarkStart w:id="12" w:name="_Toc224148627"/>
+      <w:bookmarkStart w:id="19" w:name="_Toc224148627"/>
       <w:r>
         <w:t>Selected</w:t>
       </w:r>
       <w:r>
         <w:t xml:space="preserve"> Reactor Specification</w:t>
       </w:r>
-      <w:bookmarkEnd w:id="12"/>
+      <w:bookmarkEnd w:id="19"/>
     </w:p>
     <w:p>
       <w:r>
@@ -4686,7 +5374,56 @@
     </w:p>
     <w:p>
       <w:r>
-        <w:t xml:space="preserve">Figure 3 below shows the molar composition throughout the reactor. </w:t>
+        <w:fldChar w:fldCharType="begin"/>
+      </w:r>
+      <w:r>
+        <w:instrText xml:space="preserve"> REF _Ref225352147 \h </w:instrText>
+      </w:r>
+      <w:r>
+        <w:instrText xml:space="preserve"> \* MERGEFORMAT </w:instrText>
+      </w:r>
+      <w:r>
+        <w:fldChar w:fldCharType="separate"/>
+      </w:r>
+      <w:r>
+        <w:rPr>
+          <w:color w:val="000000" w:themeColor="text1"/>
+        </w:rPr>
+        <w:t xml:space="preserve">Figure </w:t>
+      </w:r>
+      <w:r>
+        <w:rPr>
+          <w:noProof/>
+          <w:color w:val="000000" w:themeColor="text1"/>
+        </w:rPr>
+        <w:t>3</w:t>
+      </w:r>
+      <w:r>
+        <w:fldChar w:fldCharType="end"/>
+      </w:r>
+      <w:r>
+        <w:t xml:space="preserve"> </w:t>
+      </w:r>
+      <w:r>
+        <w:fldChar w:fldCharType="begin"/>
+      </w:r>
+      <w:r>
+        <w:instrText xml:space="preserve"> REF _Ref225352155 \p \h </w:instrText>
+      </w:r>
+      <w:r>
+        <w:instrText xml:space="preserve"> \* MERGEFORMAT </w:instrText>
+      </w:r>
+      <w:r>
+        <w:fldChar w:fldCharType="separate"/>
+      </w:r>
+      <w:r>
+        <w:t>below</w:t>
+      </w:r>
+      <w:r>
+        <w:fldChar w:fldCharType="end"/>
+      </w:r>
+      <w:r>
+        <w:t xml:space="preserve"> shows the molar composition throughout the reactor. </w:t>
       </w:r>
       <w:r>
         <w:t>Complete</w:t>
@@ -4694,6 +5431,51 @@
       <w:r>
         <w:t xml:space="preserve"> nitrobenzene conversion is achieved near the reactor outlet, utilising the entire reactor. </w:t>
       </w:r>
+      <w:r>
+        <w:t xml:space="preserve">Stream composition exiting from the reactor </w:t>
+      </w:r>
+      <w:r>
+        <w:t xml:space="preserve">is shown </w:t>
+      </w:r>
+      <w:r>
+        <w:t xml:space="preserve">in </w:t>
+      </w:r>
+      <w:r>
+        <w:fldChar w:fldCharType="begin"/>
+      </w:r>
+      <w:r>
+        <w:instrText xml:space="preserve"> REF _Ref225352380 \h </w:instrText>
+      </w:r>
+      <w:r>
+        <w:instrText xml:space="preserve"> \* MERGEFORMAT </w:instrText>
+      </w:r>
+      <w:r>
+        <w:fldChar w:fldCharType="separate"/>
+      </w:r>
+      <w:r>
+        <w:rPr>
+          <w:color w:val="000000" w:themeColor="text1"/>
+        </w:rPr>
+        <w:t xml:space="preserve">Table </w:t>
+      </w:r>
+      <w:r>
+        <w:rPr>
+          <w:noProof/>
+          <w:color w:val="000000" w:themeColor="text1"/>
+        </w:rPr>
+        <w:t>3</w:t>
+      </w:r>
+      <w:r>
+        <w:fldChar w:fldCharType="end"/>
+      </w:r>
+      <w:r>
+        <w:t>.</w:t>
+      </w:r>
+    </w:p>
+    <w:p>
+      <w:pPr>
+        <w:keepNext/>
+      </w:pPr>
       <w:r>
         <w:rPr>
           <w:noProof/>
@@ -4736,10 +5518,362 @@
       </w:r>
     </w:p>
     <w:p>
-      <w:r>
-        <w:t>Figure 3: Molar composition over reactor length for the selected reactor design specifications</w:t>
-      </w:r>
-    </w:p>
+      <w:pPr>
+        <w:pStyle w:val="Caption"/>
+        <w:rPr>
+          <w:i w:val="0"/>
+          <w:iCs w:val="0"/>
+          <w:color w:val="000000" w:themeColor="text1"/>
+          <w:sz w:val="24"/>
+          <w:szCs w:val="24"/>
+        </w:rPr>
+      </w:pPr>
+      <w:bookmarkStart w:id="20" w:name="_Ref225352147"/>
+      <w:bookmarkStart w:id="21" w:name="_Ref225352155"/>
+      <w:r>
+        <w:rPr>
+          <w:i w:val="0"/>
+          <w:iCs w:val="0"/>
+          <w:color w:val="000000" w:themeColor="text1"/>
+          <w:sz w:val="24"/>
+          <w:szCs w:val="24"/>
+        </w:rPr>
+        <w:t xml:space="preserve">Figure </w:t>
+      </w:r>
+      <w:r>
+        <w:rPr>
+          <w:i w:val="0"/>
+          <w:iCs w:val="0"/>
+          <w:color w:val="000000" w:themeColor="text1"/>
+          <w:sz w:val="24"/>
+          <w:szCs w:val="24"/>
+        </w:rPr>
+        <w:fldChar w:fldCharType="begin"/>
+      </w:r>
+      <w:r>
+        <w:rPr>
+          <w:i w:val="0"/>
+          <w:iCs w:val="0"/>
+          <w:color w:val="000000" w:themeColor="text1"/>
+          <w:sz w:val="24"/>
+          <w:szCs w:val="24"/>
+        </w:rPr>
+        <w:instrText xml:space="preserve"> SEQ Figure \* ARABIC </w:instrText>
+      </w:r>
+      <w:r>
+        <w:rPr>
+          <w:i w:val="0"/>
+          <w:iCs w:val="0"/>
+          <w:color w:val="000000" w:themeColor="text1"/>
+          <w:sz w:val="24"/>
+          <w:szCs w:val="24"/>
+        </w:rPr>
+        <w:fldChar w:fldCharType="separate"/>
+      </w:r>
+      <w:r>
+        <w:rPr>
+          <w:i w:val="0"/>
+          <w:iCs w:val="0"/>
+          <w:noProof/>
+          <w:color w:val="000000" w:themeColor="text1"/>
+          <w:sz w:val="24"/>
+          <w:szCs w:val="24"/>
+        </w:rPr>
+        <w:t>3</w:t>
+      </w:r>
+      <w:r>
+        <w:rPr>
+          <w:i w:val="0"/>
+          <w:iCs w:val="0"/>
+          <w:color w:val="000000" w:themeColor="text1"/>
+          <w:sz w:val="24"/>
+          <w:szCs w:val="24"/>
+        </w:rPr>
+        <w:fldChar w:fldCharType="end"/>
+      </w:r>
+      <w:bookmarkEnd w:id="20"/>
+      <w:r>
+        <w:rPr>
+          <w:i w:val="0"/>
+          <w:iCs w:val="0"/>
+          <w:color w:val="000000" w:themeColor="text1"/>
+          <w:sz w:val="24"/>
+          <w:szCs w:val="24"/>
+        </w:rPr>
+        <w:t>: Molar composition over reactor length for the selected reactor design specifications</w:t>
+      </w:r>
+      <w:bookmarkEnd w:id="21"/>
+    </w:p>
+    <w:p>
+      <w:pPr>
+        <w:pStyle w:val="Caption"/>
+        <w:keepNext/>
+        <w:rPr>
+          <w:i w:val="0"/>
+          <w:iCs w:val="0"/>
+          <w:color w:val="000000" w:themeColor="text1"/>
+          <w:sz w:val="24"/>
+          <w:szCs w:val="24"/>
+        </w:rPr>
+      </w:pPr>
+      <w:bookmarkStart w:id="22" w:name="_Ref225352380"/>
+      <w:r>
+        <w:rPr>
+          <w:i w:val="0"/>
+          <w:iCs w:val="0"/>
+          <w:color w:val="000000" w:themeColor="text1"/>
+          <w:sz w:val="24"/>
+          <w:szCs w:val="24"/>
+        </w:rPr>
+        <w:t xml:space="preserve">Table </w:t>
+      </w:r>
+      <w:r>
+        <w:rPr>
+          <w:i w:val="0"/>
+          <w:iCs w:val="0"/>
+          <w:color w:val="000000" w:themeColor="text1"/>
+          <w:sz w:val="24"/>
+          <w:szCs w:val="24"/>
+        </w:rPr>
+        <w:fldChar w:fldCharType="begin"/>
+      </w:r>
+      <w:r>
+        <w:rPr>
+          <w:i w:val="0"/>
+          <w:iCs w:val="0"/>
+          <w:color w:val="000000" w:themeColor="text1"/>
+          <w:sz w:val="24"/>
+          <w:szCs w:val="24"/>
+        </w:rPr>
+        <w:instrText xml:space="preserve"> SEQ Table \* ARABIC </w:instrText>
+      </w:r>
+      <w:r>
+        <w:rPr>
+          <w:i w:val="0"/>
+          <w:iCs w:val="0"/>
+          <w:color w:val="000000" w:themeColor="text1"/>
+          <w:sz w:val="24"/>
+          <w:szCs w:val="24"/>
+        </w:rPr>
+        <w:fldChar w:fldCharType="separate"/>
+      </w:r>
+      <w:r>
+        <w:rPr>
+          <w:i w:val="0"/>
+          <w:iCs w:val="0"/>
+          <w:noProof/>
+          <w:color w:val="000000" w:themeColor="text1"/>
+          <w:sz w:val="24"/>
+          <w:szCs w:val="24"/>
+        </w:rPr>
+        <w:t>3</w:t>
+      </w:r>
+      <w:r>
+        <w:rPr>
+          <w:i w:val="0"/>
+          <w:iCs w:val="0"/>
+          <w:color w:val="000000" w:themeColor="text1"/>
+          <w:sz w:val="24"/>
+          <w:szCs w:val="24"/>
+        </w:rPr>
+        <w:fldChar w:fldCharType="end"/>
+      </w:r>
+      <w:bookmarkEnd w:id="22"/>
+      <w:r>
+        <w:rPr>
+          <w:i w:val="0"/>
+          <w:iCs w:val="0"/>
+          <w:color w:val="000000" w:themeColor="text1"/>
+          <w:sz w:val="24"/>
+          <w:szCs w:val="24"/>
+        </w:rPr>
+        <w:t>: Stream composition exiting from reactor</w:t>
+      </w:r>
+    </w:p>
+    <w:tbl>
+      <w:tblPr>
+        <w:tblStyle w:val="TableGrid"/>
+        <w:tblW w:w="0" w:type="auto"/>
+        <w:tblLook w:val="04A0" w:firstRow="1" w:lastRow="0" w:firstColumn="1" w:lastColumn="0" w:noHBand="0" w:noVBand="1"/>
+      </w:tblPr>
+      <w:tblGrid>
+        <w:gridCol w:w="3320"/>
+        <w:gridCol w:w="3321"/>
+        <w:gridCol w:w="3321"/>
+      </w:tblGrid>
+      <w:tr>
+        <w:tc>
+          <w:tcPr>
+            <w:tcW w:w="3320" w:type="dxa"/>
+          </w:tcPr>
+          <w:p>
+            <w:r>
+              <w:rPr>
+                <w:lang w:val="en-US" w:eastAsia="en-US"/>
+              </w:rPr>
+              <w:t>Compound</w:t>
+            </w:r>
+          </w:p>
+        </w:tc>
+        <w:tc>
+          <w:tcPr>
+            <w:tcW w:w="3321" w:type="dxa"/>
+          </w:tcPr>
+          <w:p>
+            <w:r>
+              <w:t>Mole Flow (kmol/hr)</w:t>
+            </w:r>
+          </w:p>
+        </w:tc>
+        <w:tc>
+          <w:tcPr>
+            <w:tcW w:w="3321" w:type="dxa"/>
+          </w:tcPr>
+          <w:p>
+            <w:r>
+              <w:t>Mass Flow (kg/hr)</w:t>
+            </w:r>
+          </w:p>
+        </w:tc>
+      </w:tr>
+      <w:tr>
+        <w:tc>
+          <w:tcPr>
+            <w:tcW w:w="3320" w:type="dxa"/>
+          </w:tcPr>
+          <w:p>
+            <w:r>
+              <w:t>Hydrogen</w:t>
+            </w:r>
+          </w:p>
+        </w:tc>
+        <w:tc>
+          <w:tcPr>
+            <w:tcW w:w="3321" w:type="dxa"/>
+          </w:tcPr>
+          <w:p>
+            <w:r>
+              <w:t>320.0</w:t>
+            </w:r>
+            <w:r>
+              <w:t>2</w:t>
+            </w:r>
+          </w:p>
+        </w:tc>
+        <w:tc>
+          <w:tcPr>
+            <w:tcW w:w="3321" w:type="dxa"/>
+          </w:tcPr>
+          <w:p>
+            <w:r>
+              <w:t>645.1</w:t>
+            </w:r>
+            <w:r>
+              <w:t>2</w:t>
+            </w:r>
+          </w:p>
+        </w:tc>
+      </w:tr>
+      <w:tr>
+        <w:tc>
+          <w:tcPr>
+            <w:tcW w:w="3320" w:type="dxa"/>
+          </w:tcPr>
+          <w:p>
+            <w:r>
+              <w:t>Nitrobenzene</w:t>
+            </w:r>
+          </w:p>
+        </w:tc>
+        <w:tc>
+          <w:tcPr>
+            <w:tcW w:w="3321" w:type="dxa"/>
+          </w:tcPr>
+          <w:p>
+            <w:r>
+              <w:t>0</w:t>
+            </w:r>
+          </w:p>
+        </w:tc>
+        <w:tc>
+          <w:tcPr>
+            <w:tcW w:w="3321" w:type="dxa"/>
+          </w:tcPr>
+          <w:p>
+            <w:r>
+              <w:t>0</w:t>
+            </w:r>
+          </w:p>
+        </w:tc>
+      </w:tr>
+      <w:tr>
+        <w:tc>
+          <w:tcPr>
+            <w:tcW w:w="3320" w:type="dxa"/>
+          </w:tcPr>
+          <w:p>
+            <w:r>
+              <w:t>Water</w:t>
+            </w:r>
+          </w:p>
+        </w:tc>
+        <w:tc>
+          <w:tcPr>
+            <w:tcW w:w="3321" w:type="dxa"/>
+          </w:tcPr>
+          <w:p>
+            <w:r>
+              <w:t>311.6</w:t>
+            </w:r>
+            <w:r>
+              <w:t>2</w:t>
+            </w:r>
+          </w:p>
+        </w:tc>
+        <w:tc>
+          <w:tcPr>
+            <w:tcW w:w="3321" w:type="dxa"/>
+          </w:tcPr>
+          <w:p>
+            <w:r>
+              <w:t>5614.01</w:t>
+            </w:r>
+          </w:p>
+        </w:tc>
+      </w:tr>
+      <w:tr>
+        <w:tc>
+          <w:tcPr>
+            <w:tcW w:w="3320" w:type="dxa"/>
+          </w:tcPr>
+          <w:p>
+            <w:r>
+              <w:t>Aniline</w:t>
+            </w:r>
+          </w:p>
+        </w:tc>
+        <w:tc>
+          <w:tcPr>
+            <w:tcW w:w="3321" w:type="dxa"/>
+          </w:tcPr>
+          <w:p>
+            <w:r>
+              <w:t>154.75</w:t>
+            </w:r>
+          </w:p>
+        </w:tc>
+        <w:tc>
+          <w:tcPr>
+            <w:tcW w:w="3321" w:type="dxa"/>
+          </w:tcPr>
+          <w:p>
+            <w:r>
+              <w:t>14411.95</w:t>
+            </w:r>
+          </w:p>
+        </w:tc>
+      </w:tr>
+    </w:tbl>
     <w:p/>
     <w:p>
       <w:pPr>
@@ -4748,7 +5882,7 @@
           <w:rFonts w:asciiTheme="majorBidi" w:hAnsiTheme="majorBidi" w:cstheme="majorBidi"/>
         </w:rPr>
       </w:pPr>
-      <w:bookmarkStart w:id="13" w:name="_Toc224148628"/>
+      <w:bookmarkStart w:id="23" w:name="_Toc224148628"/>
       <w:r>
         <w:rPr>
           <w:rFonts w:asciiTheme="majorBidi" w:hAnsiTheme="majorBidi" w:cstheme="majorBidi"/>
@@ -4761,27 +5895,160 @@
         </w:rPr>
         <w:t>Design</w:t>
       </w:r>
-      <w:bookmarkEnd w:id="13"/>
-    </w:p>
-    <w:p>
-      <w:r>
-        <w:t>As the specified reactor design achieved an overall nitrobenzene conversion of 100%, only two separation steps are needed: to remove excess hydrogen gas, and purify aniline from water.</w:t>
-      </w:r>
-      <w:r>
-        <w:t xml:space="preserve"> Table </w:t>
-      </w:r>
-      <w:r>
-        <w:t xml:space="preserve">3 </w:t>
-      </w:r>
-      <w:r>
-        <w:t>below compares the different boiling points of compounds involved in this process.</w:t>
-      </w:r>
-    </w:p>
-    <w:p/>
-    <w:p>
-      <w:r>
-        <w:t>Table 3. Comparison of boiling points of compounds involved in aniline production.</w:t>
-      </w:r>
+      <w:bookmarkEnd w:id="23"/>
+    </w:p>
+    <w:p>
+      <w:r>
+        <w:lastRenderedPageBreak/>
+        <w:t>As the specified reactor design achieved an overall nitrobenzene conversion of 100%, only two separation steps are needed: to remove excess hydrogen gas, and purify aniline from water</w:t>
+      </w:r>
+      <w:r>
+        <w:t>.</w:t>
+      </w:r>
+      <w:r>
+        <w:t xml:space="preserve"> </w:t>
+      </w:r>
+      <w:r>
+        <w:fldChar w:fldCharType="begin"/>
+      </w:r>
+      <w:r>
+        <w:instrText xml:space="preserve"> REF _Ref225352434 \h </w:instrText>
+      </w:r>
+      <w:r>
+        <w:fldChar w:fldCharType="separate"/>
+      </w:r>
+      <w:r>
+        <w:rPr>
+          <w:color w:val="000000" w:themeColor="text1"/>
+        </w:rPr>
+        <w:t xml:space="preserve">Table </w:t>
+      </w:r>
+      <w:r>
+        <w:rPr>
+          <w:noProof/>
+          <w:color w:val="000000" w:themeColor="text1"/>
+        </w:rPr>
+        <w:t>4</w:t>
+      </w:r>
+      <w:r>
+        <w:fldChar w:fldCharType="end"/>
+      </w:r>
+      <w:r>
+        <w:t xml:space="preserve"> </w:t>
+      </w:r>
+      <w:r>
+        <w:fldChar w:fldCharType="begin"/>
+      </w:r>
+      <w:r>
+        <w:instrText xml:space="preserve"> REF _Ref225352442 \p \h </w:instrText>
+      </w:r>
+      <w:r>
+        <w:fldChar w:fldCharType="separate"/>
+      </w:r>
+      <w:r>
+        <w:t>below</w:t>
+      </w:r>
+      <w:r>
+        <w:fldChar w:fldCharType="end"/>
+      </w:r>
+      <w:r>
+        <w:t xml:space="preserve"> compares the different boiling points of compounds involved in this process.</w:t>
+      </w:r>
+    </w:p>
+    <w:p>
+      <w:pPr>
+        <w:rPr>
+          <w:color w:val="000000" w:themeColor="text1"/>
+        </w:rPr>
+      </w:pPr>
+    </w:p>
+    <w:p>
+      <w:pPr>
+        <w:pStyle w:val="Caption"/>
+        <w:keepNext/>
+        <w:rPr>
+          <w:i w:val="0"/>
+          <w:iCs w:val="0"/>
+          <w:color w:val="000000" w:themeColor="text1"/>
+          <w:sz w:val="24"/>
+          <w:szCs w:val="24"/>
+        </w:rPr>
+      </w:pPr>
+      <w:bookmarkStart w:id="24" w:name="_Ref225352434"/>
+      <w:bookmarkStart w:id="25" w:name="_Ref225352442"/>
+      <w:r>
+        <w:rPr>
+          <w:i w:val="0"/>
+          <w:iCs w:val="0"/>
+          <w:color w:val="000000" w:themeColor="text1"/>
+          <w:sz w:val="24"/>
+          <w:szCs w:val="24"/>
+        </w:rPr>
+        <w:t xml:space="preserve">Table </w:t>
+      </w:r>
+      <w:r>
+        <w:rPr>
+          <w:i w:val="0"/>
+          <w:iCs w:val="0"/>
+          <w:color w:val="000000" w:themeColor="text1"/>
+          <w:sz w:val="24"/>
+          <w:szCs w:val="24"/>
+        </w:rPr>
+        <w:fldChar w:fldCharType="begin"/>
+      </w:r>
+      <w:r>
+        <w:rPr>
+          <w:i w:val="0"/>
+          <w:iCs w:val="0"/>
+          <w:color w:val="000000" w:themeColor="text1"/>
+          <w:sz w:val="24"/>
+          <w:szCs w:val="24"/>
+        </w:rPr>
+        <w:instrText xml:space="preserve"> SEQ Table \* ARABIC </w:instrText>
+      </w:r>
+      <w:r>
+        <w:rPr>
+          <w:i w:val="0"/>
+          <w:iCs w:val="0"/>
+          <w:color w:val="000000" w:themeColor="text1"/>
+          <w:sz w:val="24"/>
+          <w:szCs w:val="24"/>
+        </w:rPr>
+        <w:fldChar w:fldCharType="separate"/>
+      </w:r>
+      <w:r>
+        <w:rPr>
+          <w:i w:val="0"/>
+          <w:iCs w:val="0"/>
+          <w:noProof/>
+          <w:color w:val="000000" w:themeColor="text1"/>
+          <w:sz w:val="24"/>
+          <w:szCs w:val="24"/>
+        </w:rPr>
+        <w:t>4</w:t>
+      </w:r>
+      <w:r>
+        <w:rPr>
+          <w:i w:val="0"/>
+          <w:iCs w:val="0"/>
+          <w:color w:val="000000" w:themeColor="text1"/>
+          <w:sz w:val="24"/>
+          <w:szCs w:val="24"/>
+        </w:rPr>
+        <w:fldChar w:fldCharType="end"/>
+      </w:r>
+      <w:bookmarkEnd w:id="24"/>
+      <w:r>
+        <w:rPr>
+          <w:i w:val="0"/>
+          <w:iCs w:val="0"/>
+          <w:color w:val="000000" w:themeColor="text1"/>
+          <w:sz w:val="24"/>
+          <w:szCs w:val="24"/>
+        </w:rPr>
+        <w:t>: Comparison of boiling points of compounds involved in aniline production</w:t>
+      </w:r>
+      <w:bookmarkEnd w:id="25"/>
     </w:p>
     <w:tbl>
       <w:tblPr>
@@ -4973,225 +6240,1524 @@
         <w:pStyle w:val="Heading3"/>
       </w:pPr>
       <w:r>
+        <w:t>Separation 1: Hydrogen Recycle</w:t>
+      </w:r>
+    </w:p>
+    <w:p>
+      <w:r>
+        <w:t xml:space="preserve">Hydrogen has a critical temperature of  -240.2 C, far lower than the operating reactor temperature </w:t>
+      </w:r>
+      <w:r>
+        <w:fldChar w:fldCharType="begin"/>
+      </w:r>
+      <w:r>
+        <w:instrText xml:space="preserve"> ADDIN ZOTERO_ITEM CSL_CITATION {"citationID":"NDdrJNs0","properties":{"formattedCitation":"[14]","plainCitation":"[14]","noteIndex":0},"citationItems":[{"id":11,"uris":["http://zotero.org/users/15288956/items/7RV45IQ5"],"itemData":{"id":11,"type":"entry-encyclopedia","abstract":"Hydrogen is a chemical element; it has symbol H and atomic number 1. It is the lightest element and, at standard conditions, is a gas of diatomic molecules with the formula H2, sometimes called dihydrogen, but more commonly called hydrogen gas, molecular hydrogen or simply hydrogen. It is colorless, odorless, non-toxic, and highly combustible. Constituting about 75% of all normal matter, hydrogen is the most abundant chemical element in the universe. Stars, including the Sun, mainly consist of hydrogen in a plasma state, while on Earth, hydrogen is found in water, organic compounds, as dihydrogen, and in other molecular forms. The most common isotope of hydrogen (protium, 1H) consists of one proton, one electron, and no neutrons.\nIn the early universe, the formation of hydrogen's protons occurred in the first second after the Big Bang; neutral hydrogen atoms only formed about 370,000 years later during the recombination epoch as the universe cooled and plasma had cooled enough for electrons to remain bound to protons. Hydrogen, typically nonmetallic except under extreme pressure, readily forms covalent bonds with most nonmetals, contributing to the formation of compounds like water and various organic substances. Its role is crucial in acid-base reactions, which mainly involve proton exchange among soluble molecules. In ionic compounds, hydrogen can take the form of either a negatively charged anion, where it is known as hydride, or as a positively charged cation, H+. The cation, usually just a proton (symbol p), exhibits specific behavior in aqueous solutions and in ionic compounds involves screening of its electric charge by surrounding polar molecules or anions. Hydrogen's unique position as the only neutral atom for which the Schrödinger equation can be directly solved, has significantly contributed to the foundational principles of quantum mechanics through the exploration of its energetics and chemical bonding.\nHydrogen gas was first produced artificially in the early 16th century by reacting acids with metals. Henry Cavendish, in 1766–81, identified hydrogen gas as a distinct substance and discovered its property of producing water when burned; hence its name means \"water-former\" in Greek.\nMost hydrogen production occurs through steam reforming of natural gas; a smaller portion comes from energy-intensive methods such as the electrolysis of water. Its main industrial uses include fossil fuel processing, such as hydrocracking, and ammonia production, with emerging uses in fuel cells for electricity generation and as a heat source. When used in fuel cells, hydrogen's only emission at point of use is water vapor, though combustion can produce nitrogen oxides. Hydrogen's interaction with metals may cause embrittlement.","container-title":"Wikipedia","language":"en","license":"Creative Commons Attribution-ShareAlike License","note":"Page Version ID: 1246031915","source":"Wikipedia","title":"Hydrogen","URL":"https://en.wikipedia.org/w/index.php?title=Hydrogen&amp;oldid=1246031915","accessed":{"date-parts":[["2024",11,3]]},"issued":{"date-parts":[["2024",9,16]]}}}],"schema":"https://github.com/citation-style-language/schema/raw/master/csl-citation.json"} </w:instrText>
+      </w:r>
+      <w:r>
+        <w:fldChar w:fldCharType="separate"/>
+      </w:r>
+      <w:r>
+        <w:t>[14]</w:t>
+      </w:r>
+      <w:r>
+        <w:fldChar w:fldCharType="end"/>
+      </w:r>
+      <w:r>
+        <w:t>. Due to this, hydrogen is considered to be incondensable at this state</w:t>
+      </w:r>
+      <w:r>
+        <w:t xml:space="preserve">; it can’t be liquefied by changing pressure </w:t>
+      </w:r>
+      <w:r>
+        <w:fldChar w:fldCharType="begin"/>
+      </w:r>
+      <w:r>
+        <w:instrText xml:space="preserve"> ADDIN ZOTERO_ITEM CSL_CITATION {"citationID":"PYqgSX9D","properties":{"formattedCitation":"[18]","plainCitation":"[18]","noteIndex":0},"citationItems":[{"id":1089,"uris":["http://zotero.org/users/15288956/items/7GWQHEIJ"],"itemData":{"id":1089,"type":"chapter","abstract":"Chapter 7. Engineering Equations of State for PVT Properties\nI am more than ever an admirer of van der Waals.\nLord Rayleigh (1891)\n From Chapter 6, it is obvious that we can calculate changes in U,...","container-title":"Introductory Chemical Engineering Thermodynamics","ISBN":"978-0-13-278848-9","language":"en","publisher":"Pearson","source":"learning.oreilly.com","title":"Chapter 1.  Basic Concepts","URL":"https://learning.oreilly.com/library/view/introductory-chemical-engineering/9780132788489/ch07.xhtml","author":[{"family":"Elliot","given":"J. Richard"},{"family":"Lira","given":"Carl T."}],"accessed":{"date-parts":[["2026",3,25]]},"issued":{"date-parts":[["2012",2]]}}}],"schema":"https://github.com/citation-style-language/schema/raw/master/csl-citation.json"} </w:instrText>
+      </w:r>
+      <w:r>
+        <w:fldChar w:fldCharType="separate"/>
+      </w:r>
+      <w:r>
+        <w:t>[18]</w:t>
+      </w:r>
+      <w:r>
+        <w:fldChar w:fldCharType="end"/>
+      </w:r>
+      <w:r>
+        <w:t>. Therefore, the two streams coming out of this block are a vapour-phase hydrogen</w:t>
+      </w:r>
+      <w:r>
+        <w:t xml:space="preserve"> </w:t>
+      </w:r>
+      <w:r>
+        <w:t>stream and a liquid-phase water</w:t>
+      </w:r>
+      <w:r>
+        <w:t>-</w:t>
+      </w:r>
+      <w:r>
+        <w:t>aniline mix</w:t>
+      </w:r>
+      <w:r>
+        <w:t>ture</w:t>
+      </w:r>
+      <w:r>
+        <w:t>.</w:t>
+      </w:r>
+      <w:r>
+        <w:t xml:space="preserve"> </w:t>
+      </w:r>
+      <w:r>
+        <w:t xml:space="preserve">In a later section of this report, the hydrogen stream is recycled back into the reactor. However, for simplicity, the hydrogen stream is treated as a waste stream </w:t>
+      </w:r>
+      <w:r>
+        <w:t>during initial simulation of this separation step.</w:t>
+      </w:r>
+    </w:p>
+    <w:p/>
+    <w:p>
+      <w:r>
+        <w:t>Due to the large boiling point</w:t>
+      </w:r>
+      <w:r>
+        <w:t xml:space="preserve"> </w:t>
+      </w:r>
+      <w:r>
+        <w:t>difference between hydrogen to water and aniline, a simple flash chamber can be used to complete this separation.</w:t>
+      </w:r>
+      <w:r>
+        <w:t xml:space="preserve"> </w:t>
+      </w:r>
+      <w:r>
+        <w:t xml:space="preserve">Because compounds tend to condense more readily at higher pressure, this flash chamber is operated at the same pressure as the reactor, at 1.5 MPa. As hydrogen is non-condensable, </w:t>
+      </w:r>
+      <w:r>
+        <w:t xml:space="preserve">the </w:t>
+      </w:r>
+      <w:r>
+        <w:t xml:space="preserve">flash temperature is set </w:t>
+      </w:r>
+      <w:r>
+        <w:t xml:space="preserve">below </w:t>
+      </w:r>
+      <w:r>
+        <w:t xml:space="preserve">the </w:t>
+      </w:r>
+      <w:r>
+        <w:t xml:space="preserve">bubble point </w:t>
+      </w:r>
+      <w:r>
+        <w:t xml:space="preserve">of </w:t>
+      </w:r>
+      <w:r>
+        <w:t>a water-aniline mixture.</w:t>
+      </w:r>
+      <w:r>
+        <w:t xml:space="preserve"> From binary simulation </w:t>
+      </w:r>
+      <w:r>
+        <w:t xml:space="preserve">in Aspen, water and aniline form a vapour-liquid-liquid equilibrium, with the mixture </w:t>
+      </w:r>
+      <w:r>
+        <w:t>forming a liquid-liquid equilibrium below 195 C.</w:t>
+      </w:r>
+    </w:p>
+    <w:p/>
+    <w:p>
+      <w:pPr>
+        <w:pStyle w:val="Caption"/>
+        <w:keepNext/>
+        <w:rPr>
+          <w:i w:val="0"/>
+          <w:iCs w:val="0"/>
+          <w:color w:val="000000" w:themeColor="text1"/>
+          <w:sz w:val="24"/>
+          <w:szCs w:val="24"/>
+        </w:rPr>
+      </w:pPr>
+      <w:bookmarkStart w:id="26" w:name="_Ref225354603"/>
+      <w:bookmarkStart w:id="27" w:name="_Ref225354607"/>
+      <w:r>
+        <w:rPr>
+          <w:i w:val="0"/>
+          <w:iCs w:val="0"/>
+          <w:color w:val="000000" w:themeColor="text1"/>
+          <w:sz w:val="24"/>
+          <w:szCs w:val="24"/>
+        </w:rPr>
+        <w:t xml:space="preserve">Table </w:t>
+      </w:r>
+      <w:r>
+        <w:rPr>
+          <w:i w:val="0"/>
+          <w:iCs w:val="0"/>
+          <w:color w:val="000000" w:themeColor="text1"/>
+          <w:sz w:val="24"/>
+          <w:szCs w:val="24"/>
+        </w:rPr>
+        <w:fldChar w:fldCharType="begin"/>
+      </w:r>
+      <w:r>
+        <w:rPr>
+          <w:i w:val="0"/>
+          <w:iCs w:val="0"/>
+          <w:color w:val="000000" w:themeColor="text1"/>
+          <w:sz w:val="24"/>
+          <w:szCs w:val="24"/>
+        </w:rPr>
+        <w:instrText xml:space="preserve"> SEQ Table \* ARABIC </w:instrText>
+      </w:r>
+      <w:r>
+        <w:rPr>
+          <w:i w:val="0"/>
+          <w:iCs w:val="0"/>
+          <w:color w:val="000000" w:themeColor="text1"/>
+          <w:sz w:val="24"/>
+          <w:szCs w:val="24"/>
+        </w:rPr>
+        <w:fldChar w:fldCharType="separate"/>
+      </w:r>
+      <w:r>
+        <w:rPr>
+          <w:i w:val="0"/>
+          <w:iCs w:val="0"/>
+          <w:noProof/>
+          <w:color w:val="000000" w:themeColor="text1"/>
+          <w:sz w:val="24"/>
+          <w:szCs w:val="24"/>
+        </w:rPr>
+        <w:t>5</w:t>
+      </w:r>
+      <w:r>
+        <w:rPr>
+          <w:i w:val="0"/>
+          <w:iCs w:val="0"/>
+          <w:color w:val="000000" w:themeColor="text1"/>
+          <w:sz w:val="24"/>
+          <w:szCs w:val="24"/>
+        </w:rPr>
+        <w:fldChar w:fldCharType="end"/>
+      </w:r>
+      <w:bookmarkEnd w:id="26"/>
+      <w:r>
+        <w:rPr>
+          <w:i w:val="0"/>
+          <w:iCs w:val="0"/>
+          <w:color w:val="000000" w:themeColor="text1"/>
+          <w:sz w:val="24"/>
+          <w:szCs w:val="24"/>
+        </w:rPr>
+        <w:t xml:space="preserve">: Initial </w:t>
+      </w:r>
+      <w:r>
+        <w:rPr>
+          <w:i w:val="0"/>
+          <w:iCs w:val="0"/>
+          <w:color w:val="000000" w:themeColor="text1"/>
+          <w:sz w:val="24"/>
+          <w:szCs w:val="24"/>
+        </w:rPr>
+        <w:t>separation</w:t>
+      </w:r>
+      <w:r>
+        <w:rPr>
+          <w:i w:val="0"/>
+          <w:iCs w:val="0"/>
+          <w:color w:val="000000" w:themeColor="text1"/>
+          <w:sz w:val="24"/>
+          <w:szCs w:val="24"/>
+        </w:rPr>
+        <w:t xml:space="preserve"> </w:t>
+      </w:r>
+      <w:r>
+        <w:rPr>
+          <w:i w:val="0"/>
+          <w:iCs w:val="0"/>
+          <w:color w:val="000000" w:themeColor="text1"/>
+          <w:sz w:val="24"/>
+          <w:szCs w:val="24"/>
+        </w:rPr>
+        <w:t>results</w:t>
+      </w:r>
+      <w:r>
+        <w:rPr>
+          <w:i w:val="0"/>
+          <w:iCs w:val="0"/>
+          <w:color w:val="000000" w:themeColor="text1"/>
+          <w:sz w:val="24"/>
+          <w:szCs w:val="24"/>
+        </w:rPr>
+        <w:t xml:space="preserve"> from flash chamber operating at 1.5 MPa and 195 C</w:t>
+      </w:r>
+      <w:bookmarkEnd w:id="27"/>
+    </w:p>
+    <w:tbl>
+      <w:tblPr>
+        <w:tblStyle w:val="TableGrid"/>
+        <w:tblW w:w="0" w:type="auto"/>
+        <w:tblLook w:val="04A0" w:firstRow="1" w:lastRow="0" w:firstColumn="1" w:lastColumn="0" w:noHBand="0" w:noVBand="1"/>
+      </w:tblPr>
+      <w:tblGrid>
+        <w:gridCol w:w="3320"/>
+        <w:gridCol w:w="3321"/>
+        <w:gridCol w:w="3321"/>
+      </w:tblGrid>
+      <w:tr>
+        <w:tc>
+          <w:tcPr>
+            <w:tcW w:w="3320" w:type="dxa"/>
+          </w:tcPr>
+          <w:p>
+            <w:r>
+              <w:t>Compounds</w:t>
+            </w:r>
+          </w:p>
+        </w:tc>
+        <w:tc>
+          <w:tcPr>
+            <w:tcW w:w="3321" w:type="dxa"/>
+          </w:tcPr>
+          <w:p>
+            <w:r>
+              <w:t>Distillate Mole Flow (kmol/hr)</w:t>
+            </w:r>
+          </w:p>
+        </w:tc>
+        <w:tc>
+          <w:tcPr>
+            <w:tcW w:w="3321" w:type="dxa"/>
+          </w:tcPr>
+          <w:p>
+            <w:r>
+              <w:t>Bottom Mole Flow (kmol/hr)</w:t>
+            </w:r>
+          </w:p>
+        </w:tc>
+      </w:tr>
+      <w:tr>
+        <w:tc>
+          <w:tcPr>
+            <w:tcW w:w="3320" w:type="dxa"/>
+          </w:tcPr>
+          <w:p>
+            <w:r>
+              <w:t>Hydrogen</w:t>
+            </w:r>
+          </w:p>
+        </w:tc>
+        <w:tc>
+          <w:tcPr>
+            <w:tcW w:w="3321" w:type="dxa"/>
+          </w:tcPr>
+          <w:p>
+            <w:r>
+              <w:t>319.49</w:t>
+            </w:r>
+          </w:p>
+        </w:tc>
+        <w:tc>
+          <w:tcPr>
+            <w:tcW w:w="3321" w:type="dxa"/>
+          </w:tcPr>
+          <w:p>
+            <w:r>
+              <w:t>0.5</w:t>
+            </w:r>
+            <w:r>
+              <w:t>3</w:t>
+            </w:r>
+          </w:p>
+        </w:tc>
+      </w:tr>
+      <w:tr>
+        <w:tc>
+          <w:tcPr>
+            <w:tcW w:w="3320" w:type="dxa"/>
+          </w:tcPr>
+          <w:p>
+            <w:r>
+              <w:t>Nitrobenzene</w:t>
+            </w:r>
+          </w:p>
+        </w:tc>
+        <w:tc>
+          <w:tcPr>
+            <w:tcW w:w="3321" w:type="dxa"/>
+          </w:tcPr>
+          <w:p>
+            <w:r>
+              <w:t>0</w:t>
+            </w:r>
+          </w:p>
+        </w:tc>
+        <w:tc>
+          <w:tcPr>
+            <w:tcW w:w="3321" w:type="dxa"/>
+          </w:tcPr>
+          <w:p>
+            <w:r>
+              <w:t>0</w:t>
+            </w:r>
+          </w:p>
+        </w:tc>
+      </w:tr>
+      <w:tr>
+        <w:tc>
+          <w:tcPr>
+            <w:tcW w:w="3320" w:type="dxa"/>
+          </w:tcPr>
+          <w:p>
+            <w:r>
+              <w:t>Aniline</w:t>
+            </w:r>
+          </w:p>
+        </w:tc>
+        <w:tc>
+          <w:tcPr>
+            <w:tcW w:w="3321" w:type="dxa"/>
+          </w:tcPr>
+          <w:p>
+            <w:r>
+              <w:t>60.73</w:t>
+            </w:r>
+          </w:p>
+        </w:tc>
+        <w:tc>
+          <w:tcPr>
+            <w:tcW w:w="3321" w:type="dxa"/>
+          </w:tcPr>
+          <w:p>
+            <w:r>
+              <w:t>94.0</w:t>
+            </w:r>
+            <w:r>
+              <w:t>2</w:t>
+            </w:r>
+          </w:p>
+        </w:tc>
+      </w:tr>
+      <w:tr>
+        <w:tc>
+          <w:tcPr>
+            <w:tcW w:w="3320" w:type="dxa"/>
+          </w:tcPr>
+          <w:p>
+            <w:r>
+              <w:t>Water</w:t>
+            </w:r>
+          </w:p>
+        </w:tc>
+        <w:tc>
+          <w:tcPr>
+            <w:tcW w:w="3321" w:type="dxa"/>
+          </w:tcPr>
+          <w:p>
+            <w:r>
+              <w:t>295.57</w:t>
+            </w:r>
+          </w:p>
+        </w:tc>
+        <w:tc>
+          <w:tcPr>
+            <w:tcW w:w="3321" w:type="dxa"/>
+          </w:tcPr>
+          <w:p>
+            <w:r>
+              <w:t>16.05</w:t>
+            </w:r>
+          </w:p>
+        </w:tc>
+      </w:tr>
+    </w:tbl>
+    <w:p/>
+    <w:p>
+      <w:r>
+        <w:t xml:space="preserve">Operating at 1.5 MPa and 195 C, </w:t>
+      </w:r>
+      <w:r>
+        <w:fldChar w:fldCharType="begin"/>
+      </w:r>
+      <w:r>
+        <w:instrText xml:space="preserve"> REF _Ref225354603 \h </w:instrText>
+      </w:r>
+      <w:r>
+        <w:instrText xml:space="preserve"> \* MERGEFORMAT </w:instrText>
+      </w:r>
+      <w:r>
+        <w:fldChar w:fldCharType="separate"/>
+      </w:r>
+      <w:r>
+        <w:rPr>
+          <w:color w:val="000000" w:themeColor="text1"/>
+        </w:rPr>
+        <w:t xml:space="preserve">Table </w:t>
+      </w:r>
+      <w:r>
+        <w:rPr>
+          <w:noProof/>
+          <w:color w:val="000000" w:themeColor="text1"/>
+        </w:rPr>
+        <w:t>5</w:t>
+      </w:r>
+      <w:r>
+        <w:fldChar w:fldCharType="end"/>
+      </w:r>
+      <w:r>
+        <w:t xml:space="preserve"> </w:t>
+      </w:r>
+      <w:r>
+        <w:fldChar w:fldCharType="begin"/>
+      </w:r>
+      <w:r>
+        <w:instrText xml:space="preserve"> REF _Ref225354607 \p \h </w:instrText>
+      </w:r>
+      <w:r>
+        <w:instrText xml:space="preserve"> \* MERGEFORMAT </w:instrText>
+      </w:r>
+      <w:r>
+        <w:fldChar w:fldCharType="separate"/>
+      </w:r>
+      <w:r>
+        <w:t>above</w:t>
+      </w:r>
+      <w:r>
+        <w:fldChar w:fldCharType="end"/>
+      </w:r>
+      <w:r>
+        <w:t xml:space="preserve"> shows the stream mole flow achieved by the flash separation. Less than 63% of the aniline produced is recovered, indicating that this initial operating condition is not ideal.</w:t>
+      </w:r>
+    </w:p>
+    <w:p/>
+    <w:p>
+      <w:pPr>
+        <w:pStyle w:val="Heading3"/>
+      </w:pPr>
+      <w:r>
+        <w:t>Separation 2: Aniline Purification</w:t>
+      </w:r>
+    </w:p>
+    <w:p>
+      <w:r>
+        <w:t xml:space="preserve">The second separation of this process is focused on purifying aniline to achieve the targeted technical grade purity of 99.5 wt% </w:t>
+      </w:r>
+      <w:r>
+        <w:fldChar w:fldCharType="begin"/>
+      </w:r>
+      <w:r>
+        <w:instrText xml:space="preserve"> ADDIN ZOTERO_ITEM CSL_CITATION {"citationID":"SleHNWEJ","properties":{"formattedCitation":"[1]","plainCitation":"[1]","noteIndex":0},"citationItems":[{"id":1006,"uris":["http://zotero.org/users/15288956/items/N9P58XIJ"],"itemData":{"id":1006,"type":"report","collection-title":"Preview","number":"INTRATEC-ICC-PREV-038-A-PREM-USA","publisher-place":"United States","title":"Aniline Production from Nitrobenzene (Vapor-Phase Hydrogenation)","URL":"https://cdn.intratec.us/_nt/docs/icc/previews/INTRATEC-ICC-PREV-038-A-PREM-USA.pdf","author":[{"literal":"Intratec Solutions LLC (www.intratec.us)"}],"accessed":{"date-parts":[["2026",3,10]]},"issued":{"date-parts":[["2025"]]}}}],"schema":"https://github.com/citation-style-language/schema/raw/master/csl-citation.json"} </w:instrText>
+      </w:r>
+      <w:r>
+        <w:fldChar w:fldCharType="separate"/>
+      </w:r>
+      <w:r>
+        <w:t>[1]</w:t>
+      </w:r>
+      <w:r>
+        <w:fldChar w:fldCharType="end"/>
+      </w:r>
+      <w:r>
+        <w:t xml:space="preserve">. For </w:t>
+      </w:r>
+      <w:r>
+        <w:t xml:space="preserve">the initial setup of the column, it is assumed that separation 1 was completed successfully, resulting in the stream composition shown </w:t>
+      </w:r>
+      <w:r>
+        <w:t xml:space="preserve">in </w:t>
+      </w:r>
+      <w:r>
+        <w:fldChar w:fldCharType="begin"/>
+      </w:r>
+      <w:r>
+        <w:instrText xml:space="preserve"> REF _Ref225373694 \h </w:instrText>
+      </w:r>
+      <w:r>
+        <w:instrText xml:space="preserve"> \* MERGEFORMAT </w:instrText>
+      </w:r>
+      <w:r>
+        <w:fldChar w:fldCharType="separate"/>
+      </w:r>
+      <w:r>
+        <w:rPr>
+          <w:color w:val="000000" w:themeColor="text1"/>
+        </w:rPr>
+        <w:t xml:space="preserve">Table </w:t>
+      </w:r>
+      <w:r>
+        <w:rPr>
+          <w:noProof/>
+          <w:color w:val="000000" w:themeColor="text1"/>
+        </w:rPr>
+        <w:t>6</w:t>
+      </w:r>
+      <w:r>
+        <w:fldChar w:fldCharType="end"/>
+      </w:r>
+      <w:r>
+        <w:t>, at 1.5 MPa and 195 C</w:t>
+      </w:r>
+      <w:r>
+        <w:t>. This composition is a rough estimate and does differ from the actual stream composition. It will be revised in a later section after completion of the analysis for separation 1.</w:t>
+      </w:r>
+    </w:p>
+    <w:p/>
+    <w:p>
+      <w:pPr>
+        <w:pStyle w:val="Caption"/>
+        <w:keepNext/>
+        <w:rPr>
+          <w:i w:val="0"/>
+          <w:iCs w:val="0"/>
+          <w:color w:val="000000" w:themeColor="text1"/>
+          <w:sz w:val="24"/>
+          <w:szCs w:val="24"/>
+        </w:rPr>
+      </w:pPr>
+      <w:bookmarkStart w:id="28" w:name="_Ref225373694"/>
+      <w:r>
+        <w:rPr>
+          <w:i w:val="0"/>
+          <w:iCs w:val="0"/>
+          <w:color w:val="000000" w:themeColor="text1"/>
+          <w:sz w:val="24"/>
+          <w:szCs w:val="24"/>
+        </w:rPr>
         <w:lastRenderedPageBreak/>
-        <w:t>Separation 1: Hydrogen Recycle</w:t>
-      </w:r>
-    </w:p>
-    <w:p>
-      <w:r>
-        <w:t xml:space="preserve">Hydrogen has a critical temperature of  -240.2 C, far lower than the operating reactor temperature </w:t>
-      </w:r>
-      <w:r>
+        <w:t xml:space="preserve">Table </w:t>
+      </w:r>
+      <w:r>
+        <w:rPr>
+          <w:i w:val="0"/>
+          <w:iCs w:val="0"/>
+          <w:color w:val="000000" w:themeColor="text1"/>
+          <w:sz w:val="24"/>
+          <w:szCs w:val="24"/>
+        </w:rPr>
         <w:fldChar w:fldCharType="begin"/>
       </w:r>
       <w:r>
-        <w:instrText xml:space="preserve"> ADDIN ZOTERO_ITEM CSL_CITATION {"citationID":"NDdrJNs0","properties":{"formattedCitation":"[14]","plainCitation":"[14]","noteIndex":0},"citationItems":[{"id":11,"uris":["http://zotero.org/users/15288956/items/7RV45IQ5"],"itemData":{"id":11,"type":"entry-encyclopedia","abstract":"Hydrogen is a chemical element; it has symbol H and atomic number 1. It is the lightest element and, at standard conditions, is a gas of diatomic molecules with the formula H2, sometimes called dihydrogen, but more commonly called hydrogen gas, molecular hydrogen or simply hydrogen. It is colorless, odorless, non-toxic, and highly combustible. Constituting about 75% of all normal matter, hydrogen is the most abundant chemical element in the universe. Stars, including the Sun, mainly consist of hydrogen in a plasma state, while on Earth, hydrogen is found in water, organic compounds, as dihydrogen, and in other molecular forms. The most common isotope of hydrogen (protium, 1H) consists of one proton, one electron, and no neutrons.\nIn the early universe, the formation of hydrogen's protons occurred in the first second after the Big Bang; neutral hydrogen atoms only formed about 370,000 years later during the recombination epoch as the universe cooled and plasma had cooled enough for electrons to remain bound to protons. Hydrogen, typically nonmetallic except under extreme pressure, readily forms covalent bonds with most nonmetals, contributing to the formation of compounds like water and various organic substances. Its role is crucial in acid-base reactions, which mainly involve proton exchange among soluble molecules. In ionic compounds, hydrogen can take the form of either a negatively charged anion, where it is known as hydride, or as a positively charged cation, H+. The cation, usually just a proton (symbol p), exhibits specific behavior in aqueous solutions and in ionic compounds involves screening of its electric charge by surrounding polar molecules or anions. Hydrogen's unique position as the only neutral atom for which the Schrödinger equation can be directly solved, has significantly contributed to the foundational principles of quantum mechanics through the exploration of its energetics and chemical bonding.\nHydrogen gas was first produced artificially in the early 16th century by reacting acids with metals. Henry Cavendish, in 1766–81, identified hydrogen gas as a distinct substance and discovered its property of producing water when burned; hence its name means \"water-former\" in Greek.\nMost hydrogen production occurs through steam reforming of natural gas; a smaller portion comes from energy-intensive methods such as the electrolysis of water. Its main industrial uses include fossil fuel processing, such as hydrocracking, and ammonia production, with emerging uses in fuel cells for electricity generation and as a heat source. When used in fuel cells, hydrogen's only emission at point of use is water vapor, though combustion can produce nitrogen oxides. Hydrogen's interaction with metals may cause embrittlement.","container-title":"Wikipedia","language":"en","license":"Creative Commons Attribution-ShareAlike License","note":"Page Version ID: 1246031915","source":"Wikipedia","title":"Hydrogen","URL":"https://en.wikipedia.org/w/index.php?title=Hydrogen&amp;oldid=1246031915","accessed":{"date-parts":[["2024",11,3]]},"issued":{"date-parts":[["2024",9,16]]}}}],"schema":"https://github.com/citation-style-language/schema/raw/master/csl-citation.json"} </w:instrText>
-      </w:r>
-      <w:r>
+        <w:rPr>
+          <w:i w:val="0"/>
+          <w:iCs w:val="0"/>
+          <w:color w:val="000000" w:themeColor="text1"/>
+          <w:sz w:val="24"/>
+          <w:szCs w:val="24"/>
+        </w:rPr>
+        <w:instrText xml:space="preserve"> SEQ Table \* ARABIC </w:instrText>
+      </w:r>
+      <w:r>
+        <w:rPr>
+          <w:i w:val="0"/>
+          <w:iCs w:val="0"/>
+          <w:color w:val="000000" w:themeColor="text1"/>
+          <w:sz w:val="24"/>
+          <w:szCs w:val="24"/>
+        </w:rPr>
         <w:fldChar w:fldCharType="separate"/>
       </w:r>
       <w:r>
-        <w:t>[14]</w:t>
-      </w:r>
-      <w:r>
+        <w:rPr>
+          <w:i w:val="0"/>
+          <w:iCs w:val="0"/>
+          <w:noProof/>
+          <w:color w:val="000000" w:themeColor="text1"/>
+          <w:sz w:val="24"/>
+          <w:szCs w:val="24"/>
+        </w:rPr>
+        <w:t>6</w:t>
+      </w:r>
+      <w:r>
+        <w:rPr>
+          <w:i w:val="0"/>
+          <w:iCs w:val="0"/>
+          <w:color w:val="000000" w:themeColor="text1"/>
+          <w:sz w:val="24"/>
+          <w:szCs w:val="24"/>
+        </w:rPr>
         <w:fldChar w:fldCharType="end"/>
       </w:r>
-      <w:r>
-        <w:t>. Due to this, hydrogen is considered to be incondensable at this state</w:t>
-      </w:r>
-      <w:r>
-        <w:t xml:space="preserve">; it can’t be liquefied by changing pressure </w:t>
-      </w:r>
-      <w:r>
+      <w:bookmarkEnd w:id="28"/>
+      <w:r>
+        <w:rPr>
+          <w:i w:val="0"/>
+          <w:iCs w:val="0"/>
+          <w:color w:val="000000" w:themeColor="text1"/>
+          <w:sz w:val="24"/>
+          <w:szCs w:val="24"/>
+        </w:rPr>
+        <w:t xml:space="preserve">: Rough stream composition </w:t>
+      </w:r>
+      <w:r>
+        <w:rPr>
+          <w:i w:val="0"/>
+          <w:iCs w:val="0"/>
+          <w:color w:val="000000" w:themeColor="text1"/>
+          <w:sz w:val="24"/>
+          <w:szCs w:val="24"/>
+        </w:rPr>
+        <w:t>estimate</w:t>
+      </w:r>
+      <w:r>
+        <w:rPr>
+          <w:i w:val="0"/>
+          <w:iCs w:val="0"/>
+          <w:color w:val="000000" w:themeColor="text1"/>
+          <w:sz w:val="24"/>
+          <w:szCs w:val="24"/>
+        </w:rPr>
+        <w:t xml:space="preserve"> entering separation 2</w:t>
+      </w:r>
+    </w:p>
+    <w:tbl>
+      <w:tblPr>
+        <w:tblStyle w:val="TableGrid"/>
+        <w:tblW w:w="0" w:type="auto"/>
+        <w:tblLook w:val="04A0" w:firstRow="1" w:lastRow="0" w:firstColumn="1" w:lastColumn="0" w:noHBand="0" w:noVBand="1"/>
+      </w:tblPr>
+      <w:tblGrid>
+        <w:gridCol w:w="4981"/>
+        <w:gridCol w:w="4981"/>
+      </w:tblGrid>
+      <w:tr>
+        <w:tc>
+          <w:tcPr>
+            <w:tcW w:w="4981" w:type="dxa"/>
+          </w:tcPr>
+          <w:p>
+            <w:r>
+              <w:rPr>
+                <w:lang w:val="en-US" w:eastAsia="en-US"/>
+              </w:rPr>
+              <w:t>Compound</w:t>
+            </w:r>
+          </w:p>
+        </w:tc>
+        <w:tc>
+          <w:tcPr>
+            <w:tcW w:w="4981" w:type="dxa"/>
+          </w:tcPr>
+          <w:p>
+            <w:r>
+              <w:t>Mole Flow Entering Separation 2 (kmol/hr)</w:t>
+            </w:r>
+          </w:p>
+        </w:tc>
+      </w:tr>
+      <w:tr>
+        <w:tc>
+          <w:tcPr>
+            <w:tcW w:w="4981" w:type="dxa"/>
+          </w:tcPr>
+          <w:p>
+            <w:r>
+              <w:t>Hydrogen</w:t>
+            </w:r>
+          </w:p>
+        </w:tc>
+        <w:tc>
+          <w:tcPr>
+            <w:tcW w:w="4981" w:type="dxa"/>
+          </w:tcPr>
+          <w:p>
+            <w:r>
+              <w:t>1</w:t>
+            </w:r>
+          </w:p>
+        </w:tc>
+      </w:tr>
+      <w:tr>
+        <w:tc>
+          <w:tcPr>
+            <w:tcW w:w="4981" w:type="dxa"/>
+          </w:tcPr>
+          <w:p>
+            <w:r>
+              <w:t>Nitrobenzene</w:t>
+            </w:r>
+          </w:p>
+        </w:tc>
+        <w:tc>
+          <w:tcPr>
+            <w:tcW w:w="4981" w:type="dxa"/>
+          </w:tcPr>
+          <w:p>
+            <w:r>
+              <w:t>0</w:t>
+            </w:r>
+          </w:p>
+        </w:tc>
+      </w:tr>
+      <w:tr>
+        <w:tc>
+          <w:tcPr>
+            <w:tcW w:w="4981" w:type="dxa"/>
+          </w:tcPr>
+          <w:p>
+            <w:r>
+              <w:t>Water</w:t>
+            </w:r>
+          </w:p>
+        </w:tc>
+        <w:tc>
+          <w:tcPr>
+            <w:tcW w:w="4981" w:type="dxa"/>
+          </w:tcPr>
+          <w:p>
+            <w:r>
+              <w:t>310</w:t>
+            </w:r>
+          </w:p>
+        </w:tc>
+      </w:tr>
+      <w:tr>
+        <w:tc>
+          <w:tcPr>
+            <w:tcW w:w="4981" w:type="dxa"/>
+          </w:tcPr>
+          <w:p>
+            <w:r>
+              <w:t>Aniline</w:t>
+            </w:r>
+          </w:p>
+        </w:tc>
+        <w:tc>
+          <w:tcPr>
+            <w:tcW w:w="4981" w:type="dxa"/>
+          </w:tcPr>
+          <w:p>
+            <w:r>
+              <w:t>154</w:t>
+            </w:r>
+          </w:p>
+        </w:tc>
+      </w:tr>
+    </w:tbl>
+    <w:p/>
+    <w:p>
+      <w:r>
+        <w:t xml:space="preserve">For the initial simulation, a DSTWU column is used. </w:t>
+      </w:r>
+      <w:r>
+        <w:t xml:space="preserve">The column is operating at 1.5 MPa, similar to the flash chamber, and will be iterated later. Reflux ratio is set at 1.35 times minimum reflux, </w:t>
+      </w:r>
+      <w:r>
+        <w:t>and a total condenser is used as the hydrogen mole fraction in the stream is small.</w:t>
+      </w:r>
+      <w:r>
+        <w:t xml:space="preserve"> </w:t>
+      </w:r>
+      <w:r>
+        <w:t xml:space="preserve">In this column, water is the light key with </w:t>
+      </w:r>
+      <w:r>
+        <w:t>targeted recovery of 0.99, and aniline is the heavy key with targeted recovery of 0.01 in the distillate.</w:t>
+      </w:r>
+    </w:p>
+    <w:p/>
+    <w:p>
+      <w:pPr>
+        <w:pStyle w:val="Heading2"/>
+        <w:rPr>
+          <w:rFonts w:asciiTheme="majorBidi" w:hAnsiTheme="majorBidi" w:cstheme="majorBidi"/>
+        </w:rPr>
+      </w:pPr>
+      <w:bookmarkStart w:id="29" w:name="_Toc224148629"/>
+      <w:r>
+        <w:rPr>
+          <w:rFonts w:asciiTheme="majorBidi" w:hAnsiTheme="majorBidi" w:cstheme="majorBidi"/>
+        </w:rPr>
+        <w:t xml:space="preserve">Column </w:t>
+      </w:r>
+      <w:r>
+        <w:rPr>
+          <w:rFonts w:asciiTheme="majorBidi" w:hAnsiTheme="majorBidi" w:cstheme="majorBidi"/>
+        </w:rPr>
+        <w:t>Analysis</w:t>
+      </w:r>
+      <w:bookmarkEnd w:id="29"/>
+    </w:p>
+    <w:p>
+      <w:r>
+        <w:t>From section 7 above, it is clear that the initial separator designs are inefficient. In this section, three analysis is conducted: hydrogen recycle, flash chamber design, and distillation column design.</w:t>
+      </w:r>
+    </w:p>
+    <w:p/>
+    <w:p>
+      <w:pPr>
+        <w:pStyle w:val="Heading3"/>
+      </w:pPr>
+      <w:r>
+        <w:t xml:space="preserve">Flash Chamber </w:t>
+      </w:r>
+      <w:r>
+        <w:t>Design</w:t>
+      </w:r>
+    </w:p>
+    <w:p>
+      <w:r>
+        <w:t>The initial flash chamber design was inefficient, as it recovered only 60% of the aniline produced. To increase the recovery rate, operating temperature of the chamber is varied from 0 C to 200 C at 5 C intervals using sensitivity analysis.</w:t>
+      </w:r>
+    </w:p>
+    <w:p>
+      <w:pPr>
+        <w:keepNext/>
+      </w:pPr>
+      <w:r>
+        <w:drawing>
+          <wp:inline distT="0" distB="0" distL="0" distR="0" wp14:anchorId="2FC99AB5" wp14:editId="6AC8EE32">
+            <wp:extent cx="6332220" cy="3183890"/>
+            <wp:effectExtent l="0" t="0" r="0" b="0"/>
+            <wp:docPr id="2019655475" name="Picture 1"/>
+            <wp:cNvGraphicFramePr>
+              <a:graphicFrameLocks xmlns:a="http://schemas.openxmlformats.org/drawingml/2006/main" noChangeAspect="1"/>
+            </wp:cNvGraphicFramePr>
+            <a:graphic xmlns:a="http://schemas.openxmlformats.org/drawingml/2006/main">
+              <a:graphicData uri="http://schemas.openxmlformats.org/drawingml/2006/picture">
+                <pic:pic xmlns:pic="http://schemas.openxmlformats.org/drawingml/2006/picture">
+                  <pic:nvPicPr>
+                    <pic:cNvPr id="2019655475" name=""/>
+                    <pic:cNvPicPr/>
+                  </pic:nvPicPr>
+                  <pic:blipFill>
+                    <a:blip r:embed="rId26"/>
+                    <a:stretch>
+                      <a:fillRect/>
+                    </a:stretch>
+                  </pic:blipFill>
+                  <pic:spPr>
+                    <a:xfrm>
+                      <a:off x="0" y="0"/>
+                      <a:ext cx="6332220" cy="3183890"/>
+                    </a:xfrm>
+                    <a:prstGeom prst="rect">
+                      <a:avLst/>
+                    </a:prstGeom>
+                  </pic:spPr>
+                </pic:pic>
+              </a:graphicData>
+            </a:graphic>
+          </wp:inline>
+        </w:drawing>
+      </w:r>
+    </w:p>
+    <w:p>
+      <w:pPr>
+        <w:pStyle w:val="Caption"/>
+        <w:rPr>
+          <w:i w:val="0"/>
+          <w:iCs w:val="0"/>
+          <w:color w:val="000000" w:themeColor="text1"/>
+          <w:sz w:val="24"/>
+          <w:szCs w:val="24"/>
+        </w:rPr>
+      </w:pPr>
+      <w:bookmarkStart w:id="30" w:name="_Ref225383680"/>
+      <w:bookmarkStart w:id="31" w:name="_Ref225383685"/>
+      <w:r>
+        <w:rPr>
+          <w:i w:val="0"/>
+          <w:iCs w:val="0"/>
+          <w:color w:val="000000" w:themeColor="text1"/>
+          <w:sz w:val="24"/>
+          <w:szCs w:val="24"/>
+        </w:rPr>
+        <w:t xml:space="preserve">Figure </w:t>
+      </w:r>
+      <w:r>
+        <w:rPr>
+          <w:i w:val="0"/>
+          <w:iCs w:val="0"/>
+          <w:color w:val="000000" w:themeColor="text1"/>
+          <w:sz w:val="24"/>
+          <w:szCs w:val="24"/>
+        </w:rPr>
         <w:fldChar w:fldCharType="begin"/>
       </w:r>
       <w:r>
-        <w:instrText xml:space="preserve"> ADDIN ZOTERO_ITEM CSL_CITATION {"citationID":"PYqgSX9D","properties":{"formattedCitation":"[18]","plainCitation":"[18]","noteIndex":0},"citationItems":[{"id":1089,"uris":["http://zotero.org/users/15288956/items/7GWQHEIJ"],"itemData":{"id":1089,"type":"chapter","abstract":"Chapter 7. Engineering Equations of State for PVT Properties\nI am more than ever an admirer of van der Waals.\nLord Rayleigh (1891)\n From Chapter 6, it is obvious that we can calculate changes in U,...","container-title":"Introductory Chemical Engineering Thermodynamics","ISBN":"978-0-13-278848-9","language":"en","publisher":"Pearson","source":"learning.oreilly.com","title":"Chapter 1.  Basic Concepts","URL":"https://learning.oreilly.com/library/view/introductory-chemical-engineering/9780132788489/ch07.xhtml","author":[{"family":"Elliot","given":"J. Richard"},{"family":"Lira","given":"Carl T."}],"accessed":{"date-parts":[["2026",3,25]]},"issued":{"date-parts":[["2012",2]]}}}],"schema":"https://github.com/citation-style-language/schema/raw/master/csl-citation.json"} </w:instrText>
-      </w:r>
-      <w:r>
+        <w:rPr>
+          <w:i w:val="0"/>
+          <w:iCs w:val="0"/>
+          <w:color w:val="000000" w:themeColor="text1"/>
+          <w:sz w:val="24"/>
+          <w:szCs w:val="24"/>
+        </w:rPr>
+        <w:instrText xml:space="preserve"> SEQ Figure \* ARABIC </w:instrText>
+      </w:r>
+      <w:r>
+        <w:rPr>
+          <w:i w:val="0"/>
+          <w:iCs w:val="0"/>
+          <w:color w:val="000000" w:themeColor="text1"/>
+          <w:sz w:val="24"/>
+          <w:szCs w:val="24"/>
+        </w:rPr>
         <w:fldChar w:fldCharType="separate"/>
       </w:r>
       <w:r>
-        <w:t>[18]</w:t>
-      </w:r>
-      <w:r>
+        <w:rPr>
+          <w:i w:val="0"/>
+          <w:iCs w:val="0"/>
+          <w:noProof/>
+          <w:color w:val="000000" w:themeColor="text1"/>
+          <w:sz w:val="24"/>
+          <w:szCs w:val="24"/>
+        </w:rPr>
+        <w:t>4</w:t>
+      </w:r>
+      <w:r>
+        <w:rPr>
+          <w:i w:val="0"/>
+          <w:iCs w:val="0"/>
+          <w:color w:val="000000" w:themeColor="text1"/>
+          <w:sz w:val="24"/>
+          <w:szCs w:val="24"/>
+        </w:rPr>
         <w:fldChar w:fldCharType="end"/>
       </w:r>
-      <w:r>
-        <w:t>. Therefore, the two streams coming out of this block are a vapour-phase hydrogen</w:t>
+      <w:bookmarkEnd w:id="30"/>
+      <w:r>
+        <w:rPr>
+          <w:i w:val="0"/>
+          <w:iCs w:val="0"/>
+          <w:color w:val="000000" w:themeColor="text1"/>
+          <w:sz w:val="24"/>
+          <w:szCs w:val="24"/>
+        </w:rPr>
+        <w:t>: Fractional recovery of aniline and water from flash chamber by varying temperature</w:t>
+      </w:r>
+      <w:bookmarkEnd w:id="31"/>
+    </w:p>
+    <w:p>
+      <w:r>
+        <w:fldChar w:fldCharType="begin"/>
+      </w:r>
+      <w:r>
+        <w:instrText xml:space="preserve"> REF _Ref225383680 \h </w:instrText>
+      </w:r>
+      <w:r>
+        <w:instrText xml:space="preserve"> \* MERGEFORMAT </w:instrText>
+      </w:r>
+      <w:r>
+        <w:fldChar w:fldCharType="separate"/>
+      </w:r>
+      <w:r>
+        <w:rPr>
+          <w:color w:val="000000" w:themeColor="text1"/>
+        </w:rPr>
+        <w:t xml:space="preserve">Figure </w:t>
+      </w:r>
+      <w:r>
+        <w:rPr>
+          <w:noProof/>
+          <w:color w:val="000000" w:themeColor="text1"/>
+        </w:rPr>
+        <w:t>4</w:t>
+      </w:r>
+      <w:r>
+        <w:fldChar w:fldCharType="end"/>
       </w:r>
       <w:r>
         <w:t xml:space="preserve"> </w:t>
       </w:r>
       <w:r>
-        <w:t>stream and a liquid-phase water</w:t>
-      </w:r>
-      <w:r>
-        <w:t>-</w:t>
-      </w:r>
-      <w:r>
-        <w:t>aniline mix</w:t>
-      </w:r>
-      <w:r>
-        <w:t>ture</w:t>
+        <w:fldChar w:fldCharType="begin"/>
+      </w:r>
+      <w:r>
+        <w:instrText xml:space="preserve"> REF _Ref225383685 \p \h </w:instrText>
+      </w:r>
+      <w:r>
+        <w:instrText xml:space="preserve"> \* MERGEFORMAT </w:instrText>
+      </w:r>
+      <w:r>
+        <w:fldChar w:fldCharType="separate"/>
+      </w:r>
+      <w:r>
+        <w:t>above</w:t>
+      </w:r>
+      <w:r>
+        <w:fldChar w:fldCharType="end"/>
+      </w:r>
+      <w:r>
+        <w:t xml:space="preserve"> compares the fractional recovery of aniline and water as a result of varying temperature. </w:t>
+      </w:r>
+      <w:r>
+        <w:t xml:space="preserve">50 C is selected </w:t>
+      </w:r>
+      <w:r>
+        <w:t>because both water and aniline have bottom recovery above</w:t>
+      </w:r>
+      <w:r>
+        <w:t xml:space="preserve"> 99%, at 99% for water and 99.9% for aniline.</w:t>
+      </w:r>
+      <w:r>
+        <w:t xml:space="preserve"> This has an added benefit of the ability to use cooling water for flashing, one of the most economical utility options </w:t>
+      </w:r>
+      <w:r>
+        <w:fldChar w:fldCharType="begin"/>
+      </w:r>
+      <w:r>
+        <w:instrText xml:space="preserve"> ADDIN ZOTERO_ITEM CSL_CITATION {"citationID":"ZJAm6WNj","properties":{"formattedCitation":"[19]","plainCitation":"[19]","noteIndex":0},"citationItems":[{"id":1091,"uris":["http://zotero.org/users/15288956/items/8VH3FGAM"],"itemData":{"id":1091,"type":"article-journal","abstract":"Research on cooling systems to date has focussed on the individual components of cooling systems, not the system as a whole. Cooling water systems should be designed and operated with consideration of all the cooling system components because of the interactions between cooling water networks and the cooling tower performance. In re-circulating cooling water systems, cooling water from the cooling tower is supplied to a network of coolers that usually has a parallel configuration. However, re-use of cooling water between different cooling duties enables cooling water networks to be designed with series arrangements. This allows better cooling tower performance and increased cooling tower capacity, both in the context of new design and retrofit. A methodology has been developed for the design of cooling networks to satisfy any supply conditions for the cooling tower. A model of cooling tower performance allows interactions between the performance of the cooling tower and the design of cooling water networks to be explored systematically. In debottlenecking situations, better design of the cooling network using the new method, including increasing cooling tower blowdown, taking hot blowdown and strategic use of air coolers, can all be used to avoid investment in new cooling tower capacity and to improve the performance of the cooling tower in a systematic way.","container-title":"Chemical Engineering Science","DOI":"10.1016/S0009-2509(01)00091-4","ISSN":"0009-2509","issue":"12","journalAbbreviation":"Chemical Engineering Science","page":"3641-3658","source":"ScienceDirect","title":"Cooling water system design","volume":"56","author":[{"family":"Kim","given":"Jin-Kuk"},{"family":"Smith","given":"Robin"}],"issued":{"date-parts":[["2001",6,1]]}}}],"schema":"https://github.com/citation-style-language/schema/raw/master/csl-citation.json"} </w:instrText>
+      </w:r>
+      <w:r>
+        <w:fldChar w:fldCharType="separate"/>
+      </w:r>
+      <w:r>
+        <w:t>[19]</w:t>
+      </w:r>
+      <w:r>
+        <w:fldChar w:fldCharType="end"/>
       </w:r>
       <w:r>
         <w:t>.</w:t>
       </w:r>
       <w:r>
+        <w:t xml:space="preserve"> The resulting stream is shown </w:t>
+      </w:r>
+      <w:r>
+        <w:t xml:space="preserve">in </w:t>
+      </w:r>
+      <w:r>
+        <w:fldChar w:fldCharType="begin"/>
+      </w:r>
+      <w:r>
+        <w:instrText xml:space="preserve"> REF _Ref225384773 \h </w:instrText>
+      </w:r>
+      <w:r>
+        <w:instrText xml:space="preserve"> \* MERGEFORMAT </w:instrText>
+      </w:r>
+      <w:r>
+        <w:fldChar w:fldCharType="separate"/>
+      </w:r>
+      <w:r>
+        <w:rPr>
+          <w:color w:val="000000" w:themeColor="text1"/>
+        </w:rPr>
+        <w:t xml:space="preserve">Table </w:t>
+      </w:r>
+      <w:r>
+        <w:rPr>
+          <w:noProof/>
+          <w:color w:val="000000" w:themeColor="text1"/>
+        </w:rPr>
+        <w:t>7</w:t>
+      </w:r>
+      <w:r>
+        <w:fldChar w:fldCharType="end"/>
+      </w:r>
+      <w:r>
+        <w:t>.</w:t>
+      </w:r>
+    </w:p>
+    <w:p/>
+    <w:p>
+      <w:pPr>
+        <w:pStyle w:val="Caption"/>
+        <w:keepNext/>
+        <w:rPr>
+          <w:i w:val="0"/>
+          <w:iCs w:val="0"/>
+          <w:color w:val="000000" w:themeColor="text1"/>
+          <w:sz w:val="24"/>
+          <w:szCs w:val="24"/>
+        </w:rPr>
+      </w:pPr>
+      <w:bookmarkStart w:id="32" w:name="_Ref225384773"/>
+      <w:r>
+        <w:rPr>
+          <w:i w:val="0"/>
+          <w:iCs w:val="0"/>
+          <w:color w:val="000000" w:themeColor="text1"/>
+          <w:sz w:val="24"/>
+          <w:szCs w:val="24"/>
+        </w:rPr>
+        <w:t xml:space="preserve">Table </w:t>
+      </w:r>
+      <w:r>
+        <w:rPr>
+          <w:i w:val="0"/>
+          <w:iCs w:val="0"/>
+          <w:color w:val="000000" w:themeColor="text1"/>
+          <w:sz w:val="24"/>
+          <w:szCs w:val="24"/>
+        </w:rPr>
+        <w:fldChar w:fldCharType="begin"/>
+      </w:r>
+      <w:r>
+        <w:rPr>
+          <w:i w:val="0"/>
+          <w:iCs w:val="0"/>
+          <w:color w:val="000000" w:themeColor="text1"/>
+          <w:sz w:val="24"/>
+          <w:szCs w:val="24"/>
+        </w:rPr>
+        <w:instrText xml:space="preserve"> SEQ Table \* ARABIC </w:instrText>
+      </w:r>
+      <w:r>
+        <w:rPr>
+          <w:i w:val="0"/>
+          <w:iCs w:val="0"/>
+          <w:color w:val="000000" w:themeColor="text1"/>
+          <w:sz w:val="24"/>
+          <w:szCs w:val="24"/>
+        </w:rPr>
+        <w:fldChar w:fldCharType="separate"/>
+      </w:r>
+      <w:r>
+        <w:rPr>
+          <w:i w:val="0"/>
+          <w:iCs w:val="0"/>
+          <w:noProof/>
+          <w:color w:val="000000" w:themeColor="text1"/>
+          <w:sz w:val="24"/>
+          <w:szCs w:val="24"/>
+        </w:rPr>
+        <w:t>7</w:t>
+      </w:r>
+      <w:r>
+        <w:rPr>
+          <w:i w:val="0"/>
+          <w:iCs w:val="0"/>
+          <w:color w:val="000000" w:themeColor="text1"/>
+          <w:sz w:val="24"/>
+          <w:szCs w:val="24"/>
+        </w:rPr>
+        <w:fldChar w:fldCharType="end"/>
+      </w:r>
+      <w:bookmarkEnd w:id="32"/>
+      <w:r>
+        <w:rPr>
+          <w:i w:val="0"/>
+          <w:iCs w:val="0"/>
+          <w:color w:val="000000" w:themeColor="text1"/>
+          <w:sz w:val="24"/>
+          <w:szCs w:val="24"/>
+        </w:rPr>
+        <w:t>: Stream composition exiting flash chamber at 50 C, 1.5 MPa without recycle</w:t>
+      </w:r>
+    </w:p>
+    <w:tbl>
+      <w:tblPr>
+        <w:tblStyle w:val="TableGrid"/>
+        <w:tblW w:w="0" w:type="auto"/>
+        <w:tblLook w:val="04A0" w:firstRow="1" w:lastRow="0" w:firstColumn="1" w:lastColumn="0" w:noHBand="0" w:noVBand="1"/>
+      </w:tblPr>
+      <w:tblGrid>
+        <w:gridCol w:w="3320"/>
+        <w:gridCol w:w="3321"/>
+        <w:gridCol w:w="3321"/>
+      </w:tblGrid>
+      <w:tr>
+        <w:tc>
+          <w:tcPr>
+            <w:tcW w:w="3320" w:type="dxa"/>
+          </w:tcPr>
+          <w:p>
+            <w:r>
+              <w:rPr>
+                <w:lang w:val="en-US" w:eastAsia="en-US"/>
+              </w:rPr>
+              <w:t>Compound</w:t>
+            </w:r>
+          </w:p>
+        </w:tc>
+        <w:tc>
+          <w:tcPr>
+            <w:tcW w:w="3321" w:type="dxa"/>
+          </w:tcPr>
+          <w:p>
+            <w:r>
+              <w:t>Mole Flow Distillate (kmol/hr)</w:t>
+            </w:r>
+          </w:p>
+        </w:tc>
+        <w:tc>
+          <w:tcPr>
+            <w:tcW w:w="3321" w:type="dxa"/>
+          </w:tcPr>
+          <w:p>
+            <w:r>
+              <w:t>Mole Flow Bottom (kmol/hr)</w:t>
+            </w:r>
+          </w:p>
+        </w:tc>
+      </w:tr>
+      <w:tr>
+        <w:tc>
+          <w:tcPr>
+            <w:tcW w:w="3320" w:type="dxa"/>
+          </w:tcPr>
+          <w:p>
+            <w:r>
+              <w:t>Hydrogen</w:t>
+            </w:r>
+          </w:p>
+        </w:tc>
+        <w:tc>
+          <w:tcPr>
+            <w:tcW w:w="3321" w:type="dxa"/>
+          </w:tcPr>
+          <w:p>
+            <w:r>
+              <w:t>318.7</w:t>
+            </w:r>
+          </w:p>
+        </w:tc>
+        <w:tc>
+          <w:tcPr>
+            <w:tcW w:w="3321" w:type="dxa"/>
+          </w:tcPr>
+          <w:p>
+            <w:r>
+              <w:t>1.3</w:t>
+            </w:r>
+            <w:r>
+              <w:t>1</w:t>
+            </w:r>
+          </w:p>
+        </w:tc>
+      </w:tr>
+      <w:tr>
+        <w:tc>
+          <w:tcPr>
+            <w:tcW w:w="3320" w:type="dxa"/>
+          </w:tcPr>
+          <w:p>
+            <w:r>
+              <w:t>Nitrobenzene</w:t>
+            </w:r>
+          </w:p>
+        </w:tc>
+        <w:tc>
+          <w:tcPr>
+            <w:tcW w:w="3321" w:type="dxa"/>
+          </w:tcPr>
+          <w:p>
+            <w:r>
+              <w:t>0</w:t>
+            </w:r>
+          </w:p>
+        </w:tc>
+        <w:tc>
+          <w:tcPr>
+            <w:tcW w:w="3321" w:type="dxa"/>
+          </w:tcPr>
+          <w:p>
+            <w:r>
+              <w:t>0</w:t>
+            </w:r>
+          </w:p>
+        </w:tc>
+      </w:tr>
+      <w:tr>
+        <w:tc>
+          <w:tcPr>
+            <w:tcW w:w="3320" w:type="dxa"/>
+          </w:tcPr>
+          <w:p>
+            <w:r>
+              <w:t>Aniline</w:t>
+            </w:r>
+          </w:p>
+        </w:tc>
+        <w:tc>
+          <w:tcPr>
+            <w:tcW w:w="3321" w:type="dxa"/>
+          </w:tcPr>
+          <w:p>
+            <w:r>
+              <w:t>0.0</w:t>
+            </w:r>
+            <w:r>
+              <w:t>9</w:t>
+            </w:r>
+          </w:p>
+        </w:tc>
+        <w:tc>
+          <w:tcPr>
+            <w:tcW w:w="3321" w:type="dxa"/>
+          </w:tcPr>
+          <w:p>
+            <w:r>
+              <w:t>154.6</w:t>
+            </w:r>
+            <w:r>
+              <w:t>7</w:t>
+            </w:r>
+          </w:p>
+        </w:tc>
+      </w:tr>
+      <w:tr>
+        <w:tc>
+          <w:tcPr>
+            <w:tcW w:w="3320" w:type="dxa"/>
+          </w:tcPr>
+          <w:p>
+            <w:r>
+              <w:t>Water</w:t>
+            </w:r>
+          </w:p>
+        </w:tc>
+        <w:tc>
+          <w:tcPr>
+            <w:tcW w:w="3321" w:type="dxa"/>
+          </w:tcPr>
+          <w:p>
+            <w:r>
+              <w:t>2.8</w:t>
+            </w:r>
+            <w:r>
+              <w:t>7</w:t>
+            </w:r>
+          </w:p>
+        </w:tc>
+        <w:tc>
+          <w:tcPr>
+            <w:tcW w:w="3321" w:type="dxa"/>
+          </w:tcPr>
+          <w:p>
+            <w:r>
+              <w:t>308.7</w:t>
+            </w:r>
+            <w:r>
+              <w:t>6</w:t>
+            </w:r>
+          </w:p>
+        </w:tc>
+      </w:tr>
+    </w:tbl>
+    <w:p/>
+    <w:p>
+      <w:pPr>
+        <w:pStyle w:val="Heading3"/>
+      </w:pPr>
+      <w:r>
+        <w:t>Hydrogen Recycle</w:t>
+      </w:r>
+    </w:p>
+    <w:p>
+      <w:r>
+        <w:t xml:space="preserve">Ideally, </w:t>
+      </w:r>
+      <w:r>
+        <w:t xml:space="preserve">the </w:t>
+      </w:r>
+      <w:r>
+        <w:t xml:space="preserve">vapour stream exiting from </w:t>
+      </w:r>
+      <w:r>
+        <w:t xml:space="preserve">the flash chamber </w:t>
+      </w:r>
+      <w:r>
+        <w:t xml:space="preserve">is recycled back into the reactor to improve </w:t>
+      </w:r>
+      <w:r>
+        <w:t xml:space="preserve">process efficiency. It is desired that nitrobenzene and hydrogen are fed to the reactor at a 1:5 ratio after mixing with the recycle stream. </w:t>
+      </w:r>
+      <w:r>
+        <w:t xml:space="preserve">For process safety and to remove impurities, a </w:t>
+      </w:r>
+      <w:r>
+        <w:t xml:space="preserve">splitter to </w:t>
+      </w:r>
+      <w:r>
+        <w:t xml:space="preserve">purge stream is added to facilitate gas release. </w:t>
+      </w:r>
+      <w:r>
+        <w:t xml:space="preserve">This makes the molar flow rate of recycled hydrogen variable, especially during the design step when the split fraction is not finalised. </w:t>
+      </w:r>
+      <w:r>
+        <w:t>Therefore, a calculator block is needed to determine the amount of raw hydrogen feed needed to be mixed with the recycled stream to achieve a 5:1 ratio with nitrobenzene.</w:t>
+      </w:r>
+    </w:p>
+    <w:p/>
+    <w:p>
+      <w:pPr>
+        <w:pStyle w:val="Heading3"/>
+      </w:pPr>
+      <w:r>
+        <w:t>Distillation Column Design</w:t>
+      </w:r>
+    </w:p>
+    <w:p/>
+    <w:p>
+      <w:pPr>
+        <w:pStyle w:val="Heading2"/>
+      </w:pPr>
+      <w:bookmarkStart w:id="33" w:name="_Toc224148630"/>
+      <w:r>
+        <w:rPr>
+          <w:rFonts w:asciiTheme="majorBidi" w:hAnsiTheme="majorBidi" w:cstheme="majorBidi"/>
+        </w:rPr>
+        <w:t>Heat Exchanger Design</w:t>
+      </w:r>
+      <w:bookmarkEnd w:id="33"/>
+    </w:p>
+    <w:p>
+      <w:pPr>
+        <w:pStyle w:val="Heading2"/>
+      </w:pPr>
+      <w:bookmarkStart w:id="34" w:name="_Toc224148631"/>
+      <w:r>
+        <w:rPr>
+          <w:rFonts w:asciiTheme="majorBidi" w:hAnsiTheme="majorBidi" w:cstheme="majorBidi"/>
+        </w:rPr>
+        <w:t>Heat Exchanger Analysis</w:t>
+      </w:r>
+      <w:bookmarkEnd w:id="34"/>
+    </w:p>
+    <w:p>
+      <w:pPr>
+        <w:pStyle w:val="Heading2"/>
+      </w:pPr>
+      <w:bookmarkStart w:id="35" w:name="_Toc224148632"/>
+      <w:r>
+        <w:rPr>
+          <w:rFonts w:asciiTheme="majorBidi" w:hAnsiTheme="majorBidi" w:cstheme="majorBidi"/>
+        </w:rPr>
+        <w:t>Discussion/reflection</w:t>
+      </w:r>
+      <w:bookmarkEnd w:id="35"/>
+      <w:r>
+        <w:rPr>
+          <w:rFonts w:asciiTheme="majorBidi" w:hAnsiTheme="majorBidi" w:cstheme="majorBidi"/>
+        </w:rPr>
         <w:t xml:space="preserve"> </w:t>
       </w:r>
-      <w:r>
-        <w:t>In a later section of this report, the hydrogen stream is recycled back into the reactor. However, for simplicity, the hydrogen stream is treated as a waste stream in the next simulation.</w:t>
-      </w:r>
-    </w:p>
-    <w:p/>
-    <w:p>
-      <w:r>
-        <w:t>Due to the large boiling point</w:t>
-      </w:r>
-      <w:r>
-        <w:t xml:space="preserve"> </w:t>
-      </w:r>
-      <w:r>
-        <w:t>difference between hydrogen to water and aniline, a simple flash chamber can be used to complete this separation.</w:t>
-      </w:r>
-      <w:r>
-        <w:t xml:space="preserve"> </w:t>
-      </w:r>
-      <w:r>
-        <w:t xml:space="preserve">Because compounds tend to condense more readily at higher pressure, this flash chamber is operated at the same pressure as the reactor, at 1.5 MPa. As hydrogen is non-condensable, </w:t>
-      </w:r>
-      <w:r>
-        <w:t xml:space="preserve">the </w:t>
-      </w:r>
-      <w:r>
-        <w:t xml:space="preserve">flash temperature is set </w:t>
-      </w:r>
-      <w:r>
-        <w:t xml:space="preserve">below </w:t>
-      </w:r>
-      <w:r>
-        <w:t xml:space="preserve">the </w:t>
-      </w:r>
-      <w:r>
-        <w:t xml:space="preserve">bubble point </w:t>
-      </w:r>
-      <w:r>
-        <w:t xml:space="preserve">of </w:t>
-      </w:r>
-      <w:r>
-        <w:t>a water-aniline mixture.</w:t>
-      </w:r>
-    </w:p>
-    <w:p/>
-    <w:p>
-      <w:pPr>
-        <w:pStyle w:val="Heading3"/>
-      </w:pPr>
-      <w:r>
-        <w:t>Separation 2: Aniline Purification</w:t>
-      </w:r>
     </w:p>
     <w:p>
       <w:pPr>
         <w:pStyle w:val="Heading2"/>
       </w:pPr>
-      <w:bookmarkStart w:id="14" w:name="_Toc224148629"/>
+      <w:bookmarkStart w:id="36" w:name="_Toc224148633"/>
       <w:r>
         <w:rPr>
           <w:rFonts w:asciiTheme="majorBidi" w:hAnsiTheme="majorBidi" w:cstheme="majorBidi"/>
         </w:rPr>
-        <w:t xml:space="preserve">Column </w:t>
-      </w:r>
-      <w:r>
-        <w:rPr>
-          <w:rFonts w:asciiTheme="majorBidi" w:hAnsiTheme="majorBidi" w:cstheme="majorBidi"/>
-        </w:rPr>
-        <w:t>Analysis</w:t>
-      </w:r>
-      <w:bookmarkEnd w:id="14"/>
+        <w:t>Next steps</w:t>
+      </w:r>
+      <w:bookmarkEnd w:id="36"/>
+    </w:p>
+    <w:p>
+      <w:pPr>
+        <w:spacing w:line="360" w:lineRule="auto"/>
+      </w:pPr>
+      <w:r>
+        <w:br w:type="page"/>
+      </w:r>
+    </w:p>
+    <w:p>
+      <w:pPr>
+        <w:spacing w:line="360" w:lineRule="auto"/>
+      </w:pPr>
     </w:p>
     <w:p>
       <w:pPr>
         <w:pStyle w:val="Heading2"/>
       </w:pPr>
-      <w:bookmarkStart w:id="15" w:name="_Toc224148630"/>
-      <w:r>
-        <w:rPr>
-          <w:rFonts w:asciiTheme="majorBidi" w:hAnsiTheme="majorBidi" w:cstheme="majorBidi"/>
-        </w:rPr>
-        <w:t>Heat Exchanger Design</w:t>
-      </w:r>
-      <w:bookmarkEnd w:id="15"/>
-    </w:p>
-    <w:p>
-      <w:pPr>
-        <w:pStyle w:val="Heading2"/>
-      </w:pPr>
-      <w:bookmarkStart w:id="16" w:name="_Toc224148631"/>
-      <w:r>
-        <w:rPr>
-          <w:rFonts w:asciiTheme="majorBidi" w:hAnsiTheme="majorBidi" w:cstheme="majorBidi"/>
-        </w:rPr>
-        <w:t>Heat Exchanger Analysis</w:t>
-      </w:r>
-      <w:bookmarkEnd w:id="16"/>
-    </w:p>
-    <w:p>
-      <w:pPr>
-        <w:pStyle w:val="Heading2"/>
-      </w:pPr>
-      <w:bookmarkStart w:id="17" w:name="_Toc224148632"/>
-      <w:r>
-        <w:rPr>
-          <w:rFonts w:asciiTheme="majorBidi" w:hAnsiTheme="majorBidi" w:cstheme="majorBidi"/>
-        </w:rPr>
-        <w:t>Discussion/reflection</w:t>
-      </w:r>
-      <w:bookmarkEnd w:id="17"/>
-      <w:r>
-        <w:rPr>
-          <w:rFonts w:asciiTheme="majorBidi" w:hAnsiTheme="majorBidi" w:cstheme="majorBidi"/>
-        </w:rPr>
-        <w:t xml:space="preserve"> </w:t>
-      </w:r>
-    </w:p>
-    <w:p>
-      <w:pPr>
-        <w:pStyle w:val="Heading2"/>
-      </w:pPr>
-      <w:bookmarkStart w:id="18" w:name="_Toc224148633"/>
-      <w:r>
-        <w:rPr>
-          <w:rFonts w:asciiTheme="majorBidi" w:hAnsiTheme="majorBidi" w:cstheme="majorBidi"/>
-        </w:rPr>
-        <w:t>Next steps</w:t>
-      </w:r>
-      <w:bookmarkEnd w:id="18"/>
-    </w:p>
-    <w:p>
-      <w:pPr>
-        <w:spacing w:line="360" w:lineRule="auto"/>
-      </w:pPr>
-      <w:r>
-        <w:br w:type="page"/>
-      </w:r>
-    </w:p>
-    <w:p>
-      <w:pPr>
-        <w:spacing w:line="360" w:lineRule="auto"/>
-      </w:pPr>
-    </w:p>
-    <w:p>
-      <w:pPr>
-        <w:pStyle w:val="Heading2"/>
-      </w:pPr>
-      <w:bookmarkStart w:id="19" w:name="_Toc224148634"/>
+      <w:bookmarkStart w:id="37" w:name="_Toc224148634"/>
       <w:r>
         <w:t>References</w:t>
       </w:r>
-      <w:bookmarkEnd w:id="19"/>
+      <w:bookmarkEnd w:id="37"/>
     </w:p>
     <w:p>
       <w:pPr>
@@ -5535,6 +8101,28 @@
       </w:r>
       <w:r>
         <w:t>, Pearson, 2012. Accessed: Mar. 25, 2026. [Online]. Available: https://learning.oreilly.com/library/view/introductory-chemical-engineering/9780132788489/ch07.xhtml</w:t>
+      </w:r>
+    </w:p>
+    <w:p>
+      <w:pPr>
+        <w:pStyle w:val="Bibliography"/>
+      </w:pPr>
+      <w:r>
+        <w:t>[19]</w:t>
+      </w:r>
+      <w:r>
+        <w:tab/>
+        <w:t xml:space="preserve">J.-K. Kim and R. Smith, ‘Cooling water system design’, </w:t>
+      </w:r>
+      <w:r>
+        <w:rPr>
+          <w:i/>
+          <w:iCs/>
+        </w:rPr>
+        <w:t>Chemical Engineering Science</w:t>
+      </w:r>
+      <w:r>
+        <w:t>, vol. 56, no. 12, pp. 3641–3658, Jun. 2001, doi: 10.1016/S0009-2509(01)00091-4.</w:t>
       </w:r>
     </w:p>
     <w:p>
@@ -5615,7 +8203,7 @@
                     <pic:cNvPicPr/>
                   </pic:nvPicPr>
                   <pic:blipFill>
-                    <a:blip r:embed="rId26"/>
+                    <a:blip r:embed="rId27"/>
                     <a:stretch>
                       <a:fillRect/>
                     </a:stretch>
@@ -5655,7 +8243,7 @@
 
 <file path=word/comments.xml><?xml version="1.0" encoding="utf-8"?>
 <w:comments xmlns:wpc="http://schemas.microsoft.com/office/word/2010/wordprocessingCanvas" xmlns:cx="http://schemas.microsoft.com/office/drawing/2014/chartex" xmlns:cx1="http://schemas.microsoft.com/office/drawing/2015/9/8/chartex" xmlns:cx2="http://schemas.microsoft.com/office/drawing/2015/10/21/chartex" xmlns:cx3="http://schemas.microsoft.com/office/drawing/2016/5/9/chartex" xmlns:cx4="http://schemas.microsoft.com/office/drawing/2016/5/10/chartex" xmlns:cx5="http://schemas.microsoft.com/office/drawing/2016/5/11/chartex" xmlns:cx6="http://schemas.microsoft.com/office/drawing/2016/5/12/chartex" xmlns:cx7="http://schemas.microsoft.com/office/drawing/2016/5/13/chartex" xmlns:cx8="http://schemas.microsoft.com/office/drawing/2016/5/14/chartex" xmlns:mc="http://schemas.openxmlformats.org/markup-compatibility/2006" xmlns:aink="http://schemas.microsoft.com/office/drawing/2016/ink" xmlns:am3d="http://schemas.microsoft.com/office/drawing/2017/model3d" xmlns:o="urn:schemas-microsoft-com:office:office" xmlns:oel="http://schemas.microsoft.com/office/2019/extlst" xmlns:r="http://schemas.openxmlformats.org/officeDocument/2006/relationships" xmlns:m="http://schemas.openxmlformats.org/officeDocument/2006/math" xmlns:v="urn:schemas-microsoft-com:vml" xmlns:wp14="http://schemas.microsoft.com/office/word/2010/wordprocessingDrawing" xmlns:wp="http://schemas.openxmlformats.org/drawingml/2006/wordprocessingDrawing" xmlns:w10="urn:schemas-microsoft-com:office:word" xmlns:w="http://schemas.openxmlformats.org/wordprocessingml/2006/main" xmlns:w14="http://schemas.microsoft.com/office/word/2010/wordml" xmlns:w15="http://schemas.microsoft.com/office/word/2012/wordml" xmlns:w16cex="http://schemas.microsoft.com/office/word/2018/wordml/cex" xmlns:w16cid="http://schemas.microsoft.com/office/word/2016/wordml/cid" xmlns:w16="http://schemas.microsoft.com/office/word/2018/wordml" xmlns:w16du="http://schemas.microsoft.com/office/word/2023/wordml/word16du" xmlns:w16sdtdh="http://schemas.microsoft.com/office/word/2020/wordml/sdtdatahash" xmlns:w16sdtfl="http://schemas.microsoft.com/office/word/2024/wordml/sdtformatlock" xmlns:w16se="http://schemas.microsoft.com/office/word/2015/wordml/symex" xmlns:wpg="http://schemas.microsoft.com/office/word/2010/wordprocessingGroup" xmlns:wpi="http://schemas.microsoft.com/office/word/2010/wordprocessingInk" xmlns:wne="http://schemas.microsoft.com/office/word/2006/wordml" xmlns:wps="http://schemas.microsoft.com/office/word/2010/wordprocessingShape" mc:Ignorable="w14 w15 w16se w16cid w16 w16cex w16sdtdh w16sdtfl w16du wp14">
-  <w:comment w:id="6" w:author="malhanif@student.ubc.ca" w:date="2026-03-11T00:18:00Z" w:initials="m">
+  <w:comment w:id="10" w:author="malhanif@student.ubc.ca" w:date="2026-03-11T00:18:00Z" w:initials="m">
     <w:p>
       <w:pPr>
         <w:pStyle w:val="CommentText"/>
@@ -5671,7 +8259,7 @@
       </w:r>
     </w:p>
   </w:comment>
-  <w:comment w:id="8" w:author="malhanif@student.ubc.ca" w:date="2026-03-11T00:19:00Z" w:initials="m">
+  <w:comment w:id="14" w:author="malhanif@student.ubc.ca" w:date="2026-03-11T00:19:00Z" w:initials="m">
     <w:p>
       <w:pPr>
         <w:pStyle w:val="CommentText"/>
@@ -5687,7 +8275,7 @@
       </w:r>
     </w:p>
   </w:comment>
-  <w:comment w:id="9" w:author="malhanif@student.ubc.ca" w:date="2026-03-11T00:19:00Z" w:initials="m">
+  <w:comment w:id="15" w:author="malhanif@student.ubc.ca" w:date="2026-03-11T00:19:00Z" w:initials="m">
     <w:p>
       <w:pPr>
         <w:pStyle w:val="CommentText"/>
@@ -5711,7 +8299,7 @@
       </w:r>
     </w:p>
   </w:comment>
-  <w:comment w:id="10" w:author="malhanif@student.ubc.ca" w:date="2026-03-11T00:37:00Z" w:initials="m">
+  <w:comment w:id="16" w:author="malhanif@student.ubc.ca" w:date="2026-03-11T00:37:00Z" w:initials="m">
     <w:p>
       <w:pPr>
         <w:pStyle w:val="CommentText"/>
@@ -9668,6 +12256,25 @@
       <w:ind w:left="480"/>
     </w:pPr>
   </w:style>
+  <w:style w:type="paragraph" w:styleId="Caption">
+    <w:name w:val="caption"/>
+    <w:basedOn w:val="Normal"/>
+    <w:next w:val="Normal"/>
+    <w:uiPriority w:val="35"/>
+    <w:unhideWhenUsed/>
+    <w:qFormat/>
+    <w:rsid w:val="009C3186"/>
+    <w:pPr>
+      <w:spacing w:after="200"/>
+    </w:pPr>
+    <w:rPr>
+      <w:i/>
+      <w:iCs/>
+      <w:color w:val="44546A" w:themeColor="text2"/>
+      <w:sz w:val="18"/>
+      <w:szCs w:val="18"/>
+    </w:rPr>
+  </w:style>
 </w:styles>
 </file>
 

</xml_diff>

<commit_message>
Finished analysis of hydrogen recycle stream
</commit_message>
<xml_diff>
--- a/Term Project - WORKING.docx
+++ b/Term Project - WORKING.docx
@@ -2600,10 +2600,7 @@
         <w:fldChar w:fldCharType="begin"/>
       </w:r>
       <w:r>
-        <w:instrText xml:space="preserve"> REF _Ref225351832 \h </w:instrText>
-      </w:r>
-      <w:r>
-        <w:instrText xml:space="preserve"> \* MERGEFORMAT </w:instrText>
+        <w:instrText xml:space="preserve"> REF _Ref225351832 \h  \* MERGEFORMAT </w:instrText>
       </w:r>
       <w:r>
         <w:fldChar w:fldCharType="separate"/>
@@ -3057,7 +3054,7 @@
         <w:rPr>
           <w:lang w:val="en-CA"/>
         </w:rPr>
-        <w:instrText xml:space="preserve"> REF _Ref225351914 \h </w:instrText>
+        <w:instrText xml:space="preserve"> REF _Ref225351914 \h  \* MERGEFORMAT </w:instrText>
       </w:r>
       <w:r>
         <w:rPr>
@@ -3068,61 +3065,49 @@
         <w:rPr>
           <w:lang w:val="en-CA"/>
         </w:rPr>
-        <w:instrText xml:space="preserve"> \* MERGEFORMAT </w:instrText>
+        <w:fldChar w:fldCharType="separate"/>
+      </w:r>
+      <w:r>
+        <w:rPr>
+          <w:color w:val="000000" w:themeColor="text1"/>
+        </w:rPr>
+        <w:t xml:space="preserve">Table </w:t>
+      </w:r>
+      <w:r>
+        <w:rPr>
+          <w:noProof/>
+          <w:color w:val="000000" w:themeColor="text1"/>
+        </w:rPr>
+        <w:t>1</w:t>
       </w:r>
       <w:r>
         <w:rPr>
           <w:lang w:val="en-CA"/>
         </w:rPr>
-        <w:fldChar w:fldCharType="separate"/>
-      </w:r>
-      <w:r>
-        <w:rPr>
-          <w:color w:val="000000" w:themeColor="text1"/>
-        </w:rPr>
-        <w:t xml:space="preserve">Table </w:t>
-      </w:r>
-      <w:r>
-        <w:rPr>
-          <w:noProof/>
-          <w:color w:val="000000" w:themeColor="text1"/>
-        </w:rPr>
-        <w:t>1</w:t>
+        <w:fldChar w:fldCharType="end"/>
       </w:r>
       <w:r>
         <w:rPr>
           <w:lang w:val="en-CA"/>
         </w:rPr>
-        <w:fldChar w:fldCharType="end"/>
+        <w:t xml:space="preserve"> </w:t>
       </w:r>
       <w:r>
         <w:rPr>
           <w:lang w:val="en-CA"/>
         </w:rPr>
-        <w:t xml:space="preserve"> </w:t>
+        <w:fldChar w:fldCharType="begin"/>
       </w:r>
       <w:r>
         <w:rPr>
           <w:lang w:val="en-CA"/>
         </w:rPr>
-        <w:fldChar w:fldCharType="begin"/>
+        <w:instrText xml:space="preserve"> REF _Ref225351922 \p \h  \* MERGEFORMAT </w:instrText>
       </w:r>
       <w:r>
         <w:rPr>
           <w:lang w:val="en-CA"/>
         </w:rPr>
-        <w:instrText xml:space="preserve"> REF _Ref225351922 \p \h </w:instrText>
-      </w:r>
-      <w:r>
-        <w:rPr>
-          <w:lang w:val="en-CA"/>
-        </w:rPr>
-      </w:r>
-      <w:r>
-        <w:rPr>
-          <w:lang w:val="en-CA"/>
-        </w:rPr>
-        <w:instrText xml:space="preserve"> \* MERGEFORMAT </w:instrText>
       </w:r>
       <w:r>
         <w:rPr>
@@ -4706,10 +4691,7 @@
         <w:fldChar w:fldCharType="begin"/>
       </w:r>
       <w:r>
-        <w:instrText xml:space="preserve"> REF _Ref225351975 \h </w:instrText>
-      </w:r>
-      <w:r>
-        <w:instrText xml:space="preserve"> \* MERGEFORMAT </w:instrText>
+        <w:instrText xml:space="preserve"> REF _Ref225351975 \h  \* MERGEFORMAT </w:instrText>
       </w:r>
       <w:r>
         <w:fldChar w:fldCharType="separate"/>
@@ -4737,10 +4719,7 @@
         <w:fldChar w:fldCharType="begin"/>
       </w:r>
       <w:r>
-        <w:instrText xml:space="preserve"> REF _Ref225351983 \p \h </w:instrText>
-      </w:r>
-      <w:r>
-        <w:instrText xml:space="preserve"> \* MERGEFORMAT </w:instrText>
+        <w:instrText xml:space="preserve"> REF _Ref225351983 \p \h  \* MERGEFORMAT </w:instrText>
       </w:r>
       <w:r>
         <w:fldChar w:fldCharType="separate"/>
@@ -4961,10 +4940,7 @@
         <w:fldChar w:fldCharType="begin"/>
       </w:r>
       <w:r>
-        <w:instrText xml:space="preserve"> REF _Ref225351975 \h </w:instrText>
-      </w:r>
-      <w:r>
-        <w:instrText xml:space="preserve"> \* MERGEFORMAT </w:instrText>
+        <w:instrText xml:space="preserve"> REF _Ref225351975 \h  \* MERGEFORMAT </w:instrText>
       </w:r>
       <w:r>
         <w:fldChar w:fldCharType="separate"/>
@@ -5035,10 +5011,7 @@
         <w:fldChar w:fldCharType="begin"/>
       </w:r>
       <w:r>
-        <w:instrText xml:space="preserve"> REF _Ref225352090 \h </w:instrText>
-      </w:r>
-      <w:r>
-        <w:instrText xml:space="preserve"> \* MERGEFORMAT </w:instrText>
+        <w:instrText xml:space="preserve"> REF _Ref225352090 \h  \* MERGEFORMAT </w:instrText>
       </w:r>
       <w:r>
         <w:fldChar w:fldCharType="separate"/>
@@ -5377,10 +5350,7 @@
         <w:fldChar w:fldCharType="begin"/>
       </w:r>
       <w:r>
-        <w:instrText xml:space="preserve"> REF _Ref225352147 \h </w:instrText>
-      </w:r>
-      <w:r>
-        <w:instrText xml:space="preserve"> \* MERGEFORMAT </w:instrText>
+        <w:instrText xml:space="preserve"> REF _Ref225352147 \h  \* MERGEFORMAT </w:instrText>
       </w:r>
       <w:r>
         <w:fldChar w:fldCharType="separate"/>
@@ -5408,10 +5378,7 @@
         <w:fldChar w:fldCharType="begin"/>
       </w:r>
       <w:r>
-        <w:instrText xml:space="preserve"> REF _Ref225352155 \p \h </w:instrText>
-      </w:r>
-      <w:r>
-        <w:instrText xml:space="preserve"> \* MERGEFORMAT </w:instrText>
+        <w:instrText xml:space="preserve"> REF _Ref225352155 \p \h  \* MERGEFORMAT </w:instrText>
       </w:r>
       <w:r>
         <w:fldChar w:fldCharType="separate"/>
@@ -5432,10 +5399,7 @@
         <w:t xml:space="preserve"> nitrobenzene conversion is achieved near the reactor outlet, utilising the entire reactor. </w:t>
       </w:r>
       <w:r>
-        <w:t xml:space="preserve">Stream composition exiting from the reactor </w:t>
-      </w:r>
-      <w:r>
-        <w:t xml:space="preserve">is shown </w:t>
+        <w:t xml:space="preserve">Stream composition exiting from the reactor is shown </w:t>
       </w:r>
       <w:r>
         <w:t xml:space="preserve">in </w:t>
@@ -5444,10 +5408,7 @@
         <w:fldChar w:fldCharType="begin"/>
       </w:r>
       <w:r>
-        <w:instrText xml:space="preserve"> REF _Ref225352380 \h </w:instrText>
-      </w:r>
-      <w:r>
-        <w:instrText xml:space="preserve"> \* MERGEFORMAT </w:instrText>
+        <w:instrText xml:space="preserve"> REF _Ref225352380 \h  \* MERGEFORMAT </w:instrText>
       </w:r>
       <w:r>
         <w:fldChar w:fldCharType="separate"/>
@@ -6305,10 +6266,7 @@
         <w:t>.</w:t>
       </w:r>
       <w:r>
-        <w:t xml:space="preserve"> </w:t>
-      </w:r>
-      <w:r>
-        <w:t xml:space="preserve">In a later section of this report, the hydrogen stream is recycled back into the reactor. However, for simplicity, the hydrogen stream is treated as a waste stream </w:t>
+        <w:t xml:space="preserve"> In a later section of this report, the hydrogen stream is recycled back into the reactor. However, for simplicity, the hydrogen stream is treated as a waste stream </w:t>
       </w:r>
       <w:r>
         <w:t>during initial simulation of this separation step.</w:t>
@@ -6678,10 +6636,7 @@
         <w:fldChar w:fldCharType="begin"/>
       </w:r>
       <w:r>
-        <w:instrText xml:space="preserve"> REF _Ref225354603 \h </w:instrText>
-      </w:r>
-      <w:r>
-        <w:instrText xml:space="preserve"> \* MERGEFORMAT </w:instrText>
+        <w:instrText xml:space="preserve"> REF _Ref225354603 \h  \* MERGEFORMAT </w:instrText>
       </w:r>
       <w:r>
         <w:fldChar w:fldCharType="separate"/>
@@ -6709,10 +6664,7 @@
         <w:fldChar w:fldCharType="begin"/>
       </w:r>
       <w:r>
-        <w:instrText xml:space="preserve"> REF _Ref225354607 \p \h </w:instrText>
-      </w:r>
-      <w:r>
-        <w:instrText xml:space="preserve"> \* MERGEFORMAT </w:instrText>
+        <w:instrText xml:space="preserve"> REF _Ref225354607 \p \h  \* MERGEFORMAT </w:instrText>
       </w:r>
       <w:r>
         <w:fldChar w:fldCharType="separate"/>
@@ -6768,10 +6720,7 @@
         <w:fldChar w:fldCharType="begin"/>
       </w:r>
       <w:r>
-        <w:instrText xml:space="preserve"> REF _Ref225373694 \h </w:instrText>
-      </w:r>
-      <w:r>
-        <w:instrText xml:space="preserve"> \* MERGEFORMAT </w:instrText>
+        <w:instrText xml:space="preserve"> REF _Ref225373694 \h  \* MERGEFORMAT </w:instrText>
       </w:r>
       <w:r>
         <w:fldChar w:fldCharType="separate"/>
@@ -7033,6 +6982,7 @@
     </w:tbl>
     <w:p/>
     <w:p>
+      <w:commentRangeStart w:id="29"/>
       <w:r>
         <w:t xml:space="preserve">For the initial simulation, a DSTWU column is used. </w:t>
       </w:r>
@@ -7051,6 +7001,15 @@
       <w:r>
         <w:t>targeted recovery of 0.99, and aniline is the heavy key with targeted recovery of 0.01 in the distillate.</w:t>
       </w:r>
+      <w:commentRangeEnd w:id="29"/>
+      <w:r>
+        <w:rPr>
+          <w:rStyle w:val="CommentReference"/>
+          <w:sz w:val="24"/>
+          <w:szCs w:val="24"/>
+        </w:rPr>
+        <w:commentReference w:id="29"/>
+      </w:r>
     </w:p>
     <w:p/>
     <w:p>
@@ -7060,7 +7019,7 @@
           <w:rFonts w:asciiTheme="majorBidi" w:hAnsiTheme="majorBidi" w:cstheme="majorBidi"/>
         </w:rPr>
       </w:pPr>
-      <w:bookmarkStart w:id="29" w:name="_Toc224148629"/>
+      <w:bookmarkStart w:id="30" w:name="_Toc224148629"/>
       <w:r>
         <w:rPr>
           <w:rFonts w:asciiTheme="majorBidi" w:hAnsiTheme="majorBidi" w:cstheme="majorBidi"/>
@@ -7073,7 +7032,7 @@
         </w:rPr>
         <w:t>Analysis</w:t>
       </w:r>
-      <w:bookmarkEnd w:id="29"/>
+      <w:bookmarkEnd w:id="30"/>
     </w:p>
     <w:p>
       <w:r>
@@ -7102,6 +7061,9 @@
         <w:keepNext/>
       </w:pPr>
       <w:r>
+        <w:rPr>
+          <w:noProof/>
+        </w:rPr>
         <w:drawing>
           <wp:inline distT="0" distB="0" distL="0" distR="0" wp14:anchorId="2FC99AB5" wp14:editId="6AC8EE32">
             <wp:extent cx="6332220" cy="3183890"/>
@@ -7150,8 +7112,8 @@
           <w:szCs w:val="24"/>
         </w:rPr>
       </w:pPr>
-      <w:bookmarkStart w:id="30" w:name="_Ref225383680"/>
-      <w:bookmarkStart w:id="31" w:name="_Ref225383685"/>
+      <w:bookmarkStart w:id="31" w:name="_Ref225383680"/>
+      <w:bookmarkStart w:id="32" w:name="_Ref225383685"/>
       <w:r>
         <w:rPr>
           <w:i w:val="0"/>
@@ -7213,7 +7175,7 @@
         </w:rPr>
         <w:fldChar w:fldCharType="end"/>
       </w:r>
-      <w:bookmarkEnd w:id="30"/>
+      <w:bookmarkEnd w:id="31"/>
       <w:r>
         <w:rPr>
           <w:i w:val="0"/>
@@ -7224,17 +7186,14 @@
         </w:rPr>
         <w:t>: Fractional recovery of aniline and water from flash chamber by varying temperature</w:t>
       </w:r>
-      <w:bookmarkEnd w:id="31"/>
+      <w:bookmarkEnd w:id="32"/>
     </w:p>
     <w:p>
       <w:r>
         <w:fldChar w:fldCharType="begin"/>
       </w:r>
       <w:r>
-        <w:instrText xml:space="preserve"> REF _Ref225383680 \h </w:instrText>
-      </w:r>
-      <w:r>
-        <w:instrText xml:space="preserve"> \* MERGEFORMAT </w:instrText>
+        <w:instrText xml:space="preserve"> REF _Ref225383680 \h  \* MERGEFORMAT </w:instrText>
       </w:r>
       <w:r>
         <w:fldChar w:fldCharType="separate"/>
@@ -7262,10 +7221,7 @@
         <w:fldChar w:fldCharType="begin"/>
       </w:r>
       <w:r>
-        <w:instrText xml:space="preserve"> REF _Ref225383685 \p \h </w:instrText>
-      </w:r>
-      <w:r>
-        <w:instrText xml:space="preserve"> \* MERGEFORMAT </w:instrText>
+        <w:instrText xml:space="preserve"> REF _Ref225383685 \p \h  \* MERGEFORMAT </w:instrText>
       </w:r>
       <w:r>
         <w:fldChar w:fldCharType="separate"/>
@@ -7319,10 +7275,7 @@
         <w:fldChar w:fldCharType="begin"/>
       </w:r>
       <w:r>
-        <w:instrText xml:space="preserve"> REF _Ref225384773 \h </w:instrText>
-      </w:r>
-      <w:r>
-        <w:instrText xml:space="preserve"> \* MERGEFORMAT </w:instrText>
+        <w:instrText xml:space="preserve"> REF _Ref225384773 \h  \* MERGEFORMAT </w:instrText>
       </w:r>
       <w:r>
         <w:fldChar w:fldCharType="separate"/>
@@ -7360,7 +7313,7 @@
           <w:szCs w:val="24"/>
         </w:rPr>
       </w:pPr>
-      <w:bookmarkStart w:id="32" w:name="_Ref225384773"/>
+      <w:bookmarkStart w:id="33" w:name="_Ref225384773"/>
       <w:r>
         <w:rPr>
           <w:i w:val="0"/>
@@ -7422,7 +7375,7 @@
         </w:rPr>
         <w:fldChar w:fldCharType="end"/>
       </w:r>
-      <w:bookmarkEnd w:id="32"/>
+      <w:bookmarkEnd w:id="33"/>
       <w:r>
         <w:rPr>
           <w:i w:val="0"/>
@@ -7650,7 +7603,13 @@
         <w:t xml:space="preserve">is recycled back into the reactor to improve </w:t>
       </w:r>
       <w:r>
-        <w:t xml:space="preserve">process efficiency. It is desired that nitrobenzene and hydrogen are fed to the reactor at a 1:5 ratio after mixing with the recycle stream. </w:t>
+        <w:t xml:space="preserve">process efficiency. It is desired that nitrobenzene and hydrogen </w:t>
+      </w:r>
+      <w:r>
+        <w:t>be fed to the reactor at a 1:5 ratio after being mixed</w:t>
+      </w:r>
+      <w:r>
+        <w:t xml:space="preserve"> with the recycle stream. </w:t>
       </w:r>
       <w:r>
         <w:t xml:space="preserve">For process safety and to remove impurities, a </w:t>
@@ -7670,10 +7629,188 @@
     </w:p>
     <w:p/>
     <w:p>
+      <w:r>
+        <w:t xml:space="preserve">To analyse the impact of </w:t>
+      </w:r>
+      <w:r>
+        <w:t xml:space="preserve">the splitting </w:t>
+      </w:r>
+      <w:r>
+        <w:t xml:space="preserve">fraction, sensitivity analysis is used. The varied variable is </w:t>
+      </w:r>
+      <w:r>
+        <w:t xml:space="preserve">the splitter split fraction, varied from 0.05 to 0.95 with an interval of 0.05. </w:t>
+      </w:r>
+      <w:r>
+        <w:fldChar w:fldCharType="begin"/>
+      </w:r>
+      <w:r>
+        <w:instrText xml:space="preserve"> REF _Ref225387465 \h </w:instrText>
+      </w:r>
+      <w:r>
+        <w:instrText xml:space="preserve"> \* MERGEFORMAT </w:instrText>
+      </w:r>
+      <w:r>
+        <w:fldChar w:fldCharType="separate"/>
+      </w:r>
+      <w:r>
+        <w:rPr>
+          <w:color w:val="000000" w:themeColor="text1"/>
+        </w:rPr>
+        <w:t xml:space="preserve">Figure </w:t>
+      </w:r>
+      <w:r>
+        <w:rPr>
+          <w:noProof/>
+          <w:color w:val="000000" w:themeColor="text1"/>
+        </w:rPr>
+        <w:t>5</w:t>
+      </w:r>
+      <w:r>
+        <w:fldChar w:fldCharType="end"/>
+      </w:r>
+      <w:r>
+        <w:t xml:space="preserve"> shows</w:t>
+      </w:r>
+      <w:r>
+        <w:t xml:space="preserve"> the nitrobenzene conversion and fractional recovery of aniline from varying recycled split fractions. There are no noticeable differences in the measured variable, likely due to the calculator block keeping a constant feed ratio to the reactor. Hence, the selected recycled split fraction is 0.8, maximising hydrogen feed while keeping a purge line open to remove impurity.</w:t>
+      </w:r>
+    </w:p>
+    <w:p/>
+    <w:p>
+      <w:pPr>
+        <w:keepNext/>
+      </w:pPr>
+      <w:r>
+        <w:drawing>
+          <wp:inline distT="0" distB="0" distL="0" distR="0" wp14:anchorId="6D81E9BB" wp14:editId="25D0A9FF">
+            <wp:extent cx="6332220" cy="3206750"/>
+            <wp:effectExtent l="0" t="0" r="0" b="0"/>
+            <wp:docPr id="1488004443" name="Picture 1"/>
+            <wp:cNvGraphicFramePr>
+              <a:graphicFrameLocks xmlns:a="http://schemas.openxmlformats.org/drawingml/2006/main" noChangeAspect="1"/>
+            </wp:cNvGraphicFramePr>
+            <a:graphic xmlns:a="http://schemas.openxmlformats.org/drawingml/2006/main">
+              <a:graphicData uri="http://schemas.openxmlformats.org/drawingml/2006/picture">
+                <pic:pic xmlns:pic="http://schemas.openxmlformats.org/drawingml/2006/picture">
+                  <pic:nvPicPr>
+                    <pic:cNvPr id="1488004443" name=""/>
+                    <pic:cNvPicPr/>
+                  </pic:nvPicPr>
+                  <pic:blipFill>
+                    <a:blip r:embed="rId27"/>
+                    <a:stretch>
+                      <a:fillRect/>
+                    </a:stretch>
+                  </pic:blipFill>
+                  <pic:spPr>
+                    <a:xfrm>
+                      <a:off x="0" y="0"/>
+                      <a:ext cx="6332220" cy="3206750"/>
+                    </a:xfrm>
+                    <a:prstGeom prst="rect">
+                      <a:avLst/>
+                    </a:prstGeom>
+                  </pic:spPr>
+                </pic:pic>
+              </a:graphicData>
+            </a:graphic>
+          </wp:inline>
+        </w:drawing>
+      </w:r>
+    </w:p>
+    <w:p>
+      <w:pPr>
+        <w:pStyle w:val="Caption"/>
+        <w:rPr>
+          <w:i w:val="0"/>
+          <w:iCs w:val="0"/>
+          <w:color w:val="000000" w:themeColor="text1"/>
+          <w:sz w:val="24"/>
+          <w:szCs w:val="24"/>
+        </w:rPr>
+      </w:pPr>
+      <w:bookmarkStart w:id="34" w:name="_Ref225387465"/>
+      <w:r>
+        <w:rPr>
+          <w:i w:val="0"/>
+          <w:iCs w:val="0"/>
+          <w:color w:val="000000" w:themeColor="text1"/>
+          <w:sz w:val="24"/>
+          <w:szCs w:val="24"/>
+        </w:rPr>
+        <w:t xml:space="preserve">Figure </w:t>
+      </w:r>
+      <w:r>
+        <w:rPr>
+          <w:i w:val="0"/>
+          <w:iCs w:val="0"/>
+          <w:color w:val="000000" w:themeColor="text1"/>
+          <w:sz w:val="24"/>
+          <w:szCs w:val="24"/>
+        </w:rPr>
+        <w:fldChar w:fldCharType="begin"/>
+      </w:r>
+      <w:r>
+        <w:rPr>
+          <w:i w:val="0"/>
+          <w:iCs w:val="0"/>
+          <w:color w:val="000000" w:themeColor="text1"/>
+          <w:sz w:val="24"/>
+          <w:szCs w:val="24"/>
+        </w:rPr>
+        <w:instrText xml:space="preserve"> SEQ Figure \* ARABIC </w:instrText>
+      </w:r>
+      <w:r>
+        <w:rPr>
+          <w:i w:val="0"/>
+          <w:iCs w:val="0"/>
+          <w:color w:val="000000" w:themeColor="text1"/>
+          <w:sz w:val="24"/>
+          <w:szCs w:val="24"/>
+        </w:rPr>
+        <w:fldChar w:fldCharType="separate"/>
+      </w:r>
+      <w:r>
+        <w:rPr>
+          <w:i w:val="0"/>
+          <w:iCs w:val="0"/>
+          <w:noProof/>
+          <w:color w:val="000000" w:themeColor="text1"/>
+          <w:sz w:val="24"/>
+          <w:szCs w:val="24"/>
+        </w:rPr>
+        <w:t>5</w:t>
+      </w:r>
+      <w:r>
+        <w:rPr>
+          <w:i w:val="0"/>
+          <w:iCs w:val="0"/>
+          <w:color w:val="000000" w:themeColor="text1"/>
+          <w:sz w:val="24"/>
+          <w:szCs w:val="24"/>
+        </w:rPr>
+        <w:fldChar w:fldCharType="end"/>
+      </w:r>
+      <w:bookmarkEnd w:id="34"/>
+      <w:r>
+        <w:rPr>
+          <w:i w:val="0"/>
+          <w:iCs w:val="0"/>
+          <w:color w:val="000000" w:themeColor="text1"/>
+          <w:sz w:val="24"/>
+          <w:szCs w:val="24"/>
+        </w:rPr>
+        <w:t>: Impact of recycle stream split fraction on nitrobenzene conversion and fractional recovery of aniline from flash chamber</w:t>
+      </w:r>
+    </w:p>
+    <w:p/>
+    <w:p>
       <w:pPr>
         <w:pStyle w:val="Heading3"/>
       </w:pPr>
       <w:r>
+        <w:lastRenderedPageBreak/>
         <w:t>Distillation Column Design</w:t>
       </w:r>
     </w:p>
@@ -7682,40 +7819,40 @@
       <w:pPr>
         <w:pStyle w:val="Heading2"/>
       </w:pPr>
-      <w:bookmarkStart w:id="33" w:name="_Toc224148630"/>
+      <w:bookmarkStart w:id="35" w:name="_Toc224148630"/>
       <w:r>
         <w:rPr>
           <w:rFonts w:asciiTheme="majorBidi" w:hAnsiTheme="majorBidi" w:cstheme="majorBidi"/>
         </w:rPr>
         <w:t>Heat Exchanger Design</w:t>
       </w:r>
-      <w:bookmarkEnd w:id="33"/>
+      <w:bookmarkEnd w:id="35"/>
     </w:p>
     <w:p>
       <w:pPr>
         <w:pStyle w:val="Heading2"/>
       </w:pPr>
-      <w:bookmarkStart w:id="34" w:name="_Toc224148631"/>
+      <w:bookmarkStart w:id="36" w:name="_Toc224148631"/>
       <w:r>
         <w:rPr>
           <w:rFonts w:asciiTheme="majorBidi" w:hAnsiTheme="majorBidi" w:cstheme="majorBidi"/>
         </w:rPr>
         <w:t>Heat Exchanger Analysis</w:t>
       </w:r>
-      <w:bookmarkEnd w:id="34"/>
+      <w:bookmarkEnd w:id="36"/>
     </w:p>
     <w:p>
       <w:pPr>
         <w:pStyle w:val="Heading2"/>
       </w:pPr>
-      <w:bookmarkStart w:id="35" w:name="_Toc224148632"/>
+      <w:bookmarkStart w:id="37" w:name="_Toc224148632"/>
       <w:r>
         <w:rPr>
           <w:rFonts w:asciiTheme="majorBidi" w:hAnsiTheme="majorBidi" w:cstheme="majorBidi"/>
         </w:rPr>
         <w:t>Discussion/reflection</w:t>
       </w:r>
-      <w:bookmarkEnd w:id="35"/>
+      <w:bookmarkEnd w:id="37"/>
       <w:r>
         <w:rPr>
           <w:rFonts w:asciiTheme="majorBidi" w:hAnsiTheme="majorBidi" w:cstheme="majorBidi"/>
@@ -7727,14 +7864,14 @@
       <w:pPr>
         <w:pStyle w:val="Heading2"/>
       </w:pPr>
-      <w:bookmarkStart w:id="36" w:name="_Toc224148633"/>
+      <w:bookmarkStart w:id="38" w:name="_Toc224148633"/>
       <w:r>
         <w:rPr>
           <w:rFonts w:asciiTheme="majorBidi" w:hAnsiTheme="majorBidi" w:cstheme="majorBidi"/>
         </w:rPr>
         <w:t>Next steps</w:t>
       </w:r>
-      <w:bookmarkEnd w:id="36"/>
+      <w:bookmarkEnd w:id="38"/>
     </w:p>
     <w:p>
       <w:pPr>
@@ -7753,11 +7890,11 @@
       <w:pPr>
         <w:pStyle w:val="Heading2"/>
       </w:pPr>
-      <w:bookmarkStart w:id="37" w:name="_Toc224148634"/>
+      <w:bookmarkStart w:id="39" w:name="_Toc224148634"/>
       <w:r>
         <w:t>References</w:t>
       </w:r>
-      <w:bookmarkEnd w:id="37"/>
+      <w:bookmarkEnd w:id="39"/>
     </w:p>
     <w:p>
       <w:pPr>
@@ -8203,7 +8340,7 @@
                     <pic:cNvPicPr/>
                   </pic:nvPicPr>
                   <pic:blipFill>
-                    <a:blip r:embed="rId27"/>
+                    <a:blip r:embed="rId28"/>
                     <a:stretch>
                       <a:fillRect/>
                     </a:stretch>
@@ -8315,15 +8452,32 @@
       </w:r>
     </w:p>
   </w:comment>
+  <w:comment w:id="29" w:author="malhanif@student.ubc.ca" w:date="2026-03-26T02:53:00Z" w:initials="m">
+    <w:p>
+      <w:pPr>
+        <w:pStyle w:val="CommentText"/>
+      </w:pPr>
+      <w:r>
+        <w:rPr>
+          <w:rStyle w:val="CommentReference"/>
+        </w:rPr>
+        <w:annotationRef/>
+      </w:r>
+      <w:r>
+        <w:t>Could not converge</w:t>
+      </w:r>
+    </w:p>
+  </w:comment>
 </w:comments>
 </file>
 
 <file path=word/commentsExtended.xml><?xml version="1.0" encoding="utf-8"?>
 <w15:commentsEx xmlns:wpc="http://schemas.microsoft.com/office/word/2010/wordprocessingCanvas" xmlns:cx="http://schemas.microsoft.com/office/drawing/2014/chartex" xmlns:cx1="http://schemas.microsoft.com/office/drawing/2015/9/8/chartex" xmlns:cx2="http://schemas.microsoft.com/office/drawing/2015/10/21/chartex" xmlns:cx3="http://schemas.microsoft.com/office/drawing/2016/5/9/chartex" xmlns:cx4="http://schemas.microsoft.com/office/drawing/2016/5/10/chartex" xmlns:cx5="http://schemas.microsoft.com/office/drawing/2016/5/11/chartex" xmlns:cx6="http://schemas.microsoft.com/office/drawing/2016/5/12/chartex" xmlns:cx7="http://schemas.microsoft.com/office/drawing/2016/5/13/chartex" xmlns:cx8="http://schemas.microsoft.com/office/drawing/2016/5/14/chartex" xmlns:mc="http://schemas.openxmlformats.org/markup-compatibility/2006" xmlns:aink="http://schemas.microsoft.com/office/drawing/2016/ink" xmlns:am3d="http://schemas.microsoft.com/office/drawing/2017/model3d" xmlns:o="urn:schemas-microsoft-com:office:office" xmlns:oel="http://schemas.microsoft.com/office/2019/extlst" xmlns:r="http://schemas.openxmlformats.org/officeDocument/2006/relationships" xmlns:m="http://schemas.openxmlformats.org/officeDocument/2006/math" xmlns:v="urn:schemas-microsoft-com:vml" xmlns:wp14="http://schemas.microsoft.com/office/word/2010/wordprocessingDrawing" xmlns:wp="http://schemas.openxmlformats.org/drawingml/2006/wordprocessingDrawing" xmlns:w10="urn:schemas-microsoft-com:office:word" xmlns:w="http://schemas.openxmlformats.org/wordprocessingml/2006/main" xmlns:w14="http://schemas.microsoft.com/office/word/2010/wordml" xmlns:w15="http://schemas.microsoft.com/office/word/2012/wordml" xmlns:w16cex="http://schemas.microsoft.com/office/word/2018/wordml/cex" xmlns:w16cid="http://schemas.microsoft.com/office/word/2016/wordml/cid" xmlns:w16="http://schemas.microsoft.com/office/word/2018/wordml" xmlns:w16du="http://schemas.microsoft.com/office/word/2023/wordml/word16du" xmlns:w16sdtdh="http://schemas.microsoft.com/office/word/2020/wordml/sdtdatahash" xmlns:w16sdtfl="http://schemas.microsoft.com/office/word/2024/wordml/sdtformatlock" xmlns:w16se="http://schemas.microsoft.com/office/word/2015/wordml/symex" xmlns:wpg="http://schemas.microsoft.com/office/word/2010/wordprocessingGroup" xmlns:wpi="http://schemas.microsoft.com/office/word/2010/wordprocessingInk" xmlns:wne="http://schemas.microsoft.com/office/word/2006/wordml" xmlns:wps="http://schemas.microsoft.com/office/word/2010/wordprocessingShape" mc:Ignorable="w14 w15 w16se w16cid w16 w16cex w16sdtdh w16sdtfl w16du wp14">
-  <w15:commentEx w15:paraId="713B7780" w15:done="0"/>
+  <w15:commentEx w15:paraId="713B7780" w15:done="1"/>
   <w15:commentEx w15:paraId="4EAD9D93" w15:done="1"/>
   <w15:commentEx w15:paraId="1DD2819C" w15:paraIdParent="4EAD9D93" w15:done="1"/>
   <w15:commentEx w15:paraId="2598566A" w15:paraIdParent="4EAD9D93" w15:done="1"/>
+  <w15:commentEx w15:paraId="0B3EB5F9" w15:done="0"/>
 </w15:commentsEx>
 </file>
 
@@ -8333,6 +8487,7 @@
   <w16cex:commentExtensible w16cex:durableId="06942322" w16cex:dateUtc="2026-03-11T04:19:00Z"/>
   <w16cex:commentExtensible w16cex:durableId="55B11D6C" w16cex:dateUtc="2026-03-11T04:19:00Z"/>
   <w16cex:commentExtensible w16cex:durableId="4C9A56EC" w16cex:dateUtc="2026-03-11T04:37:00Z"/>
+  <w16cex:commentExtensible w16cex:durableId="69E379BB" w16cex:dateUtc="2026-03-26T06:53:00Z"/>
 </w16cex:commentsExtensible>
 </file>
 
@@ -8342,6 +8497,7 @@
   <w16cid:commentId w16cid:paraId="4EAD9D93" w16cid:durableId="06942322"/>
   <w16cid:commentId w16cid:paraId="1DD2819C" w16cid:durableId="55B11D6C"/>
   <w16cid:commentId w16cid:paraId="2598566A" w16cid:durableId="4C9A56EC"/>
+  <w16cid:commentId w16cid:paraId="0B3EB5F9" w16cid:durableId="69E379BB"/>
 </w16cid:commentsIds>
 </file>
 
@@ -11833,6 +11989,7 @@
   <w:style w:type="character" w:default="1" w:styleId="DefaultParagraphFont">
     <w:name w:val="Default Paragraph Font"/>
     <w:uiPriority w:val="1"/>
+    <w:semiHidden/>
     <w:unhideWhenUsed/>
   </w:style>
   <w:style w:type="table" w:default="1" w:styleId="TableNormal">
@@ -12548,6 +12705,19 @@
 </file>
 
 <file path=customXml/item2.xml><?xml version="1.0" encoding="utf-8"?>
+<?mso-contentType ?>
+<FormTemplates xmlns="http://schemas.microsoft.com/sharepoint/v3/contenttype/forms">
+  <Display>DocumentLibraryForm</Display>
+  <Edit>DocumentLibraryForm</Edit>
+  <New>DocumentLibraryForm</New>
+</FormTemplates>
+</file>
+
+<file path=customXml/item3.xml><?xml version="1.0" encoding="utf-8"?>
+<b:Sources xmlns:b="http://schemas.openxmlformats.org/officeDocument/2006/bibliography" xmlns="http://schemas.openxmlformats.org/officeDocument/2006/bibliography" SelectedStyle="\APASixthEditionOfficeOnline.xsl" StyleName="APA" Version="6"/>
+</file>
+
+<file path=customXml/item4.xml><?xml version="1.0" encoding="utf-8"?>
 <ct:contentTypeSchema xmlns:ct="http://schemas.microsoft.com/office/2006/metadata/contentType" xmlns:ma="http://schemas.microsoft.com/office/2006/metadata/properties/metaAttributes" ct:_="" ma:_="" ma:contentTypeName="Document" ma:contentTypeID="0x010100C107646D0035FA4C8F1F95DBA74C7670" ma:contentTypeVersion="18" ma:contentTypeDescription="Create a new document." ma:contentTypeScope="" ma:versionID="cee5fd123a01e1fbef544806d63a7bbe">
   <xsd:schema xmlns:xsd="http://www.w3.org/2001/XMLSchema" xmlns:xs="http://www.w3.org/2001/XMLSchema" xmlns:p="http://schemas.microsoft.com/office/2006/metadata/properties" xmlns:ns3="a169fe49-86d9-4b9f-a163-9271c3e82536" xmlns:ns4="9ec2d0b7-503f-4434-bd5e-691963e6366e" targetNamespace="http://schemas.microsoft.com/office/2006/metadata/properties" ma:root="true" ma:fieldsID="dda71d5f438c7df1ac194e497a63c795" ns3:_="" ns4:_="">
     <xsd:import namespace="a169fe49-86d9-4b9f-a163-9271c3e82536"/>
@@ -12800,19 +12970,6 @@
 </ct:contentTypeSchema>
 </file>
 
-<file path=customXml/item3.xml><?xml version="1.0" encoding="utf-8"?>
-<b:Sources xmlns:b="http://schemas.openxmlformats.org/officeDocument/2006/bibliography" xmlns="http://schemas.openxmlformats.org/officeDocument/2006/bibliography" SelectedStyle="\APASixthEditionOfficeOnline.xsl" StyleName="APA" Version="6"/>
-</file>
-
-<file path=customXml/item4.xml><?xml version="1.0" encoding="utf-8"?>
-<?mso-contentType ?>
-<FormTemplates xmlns="http://schemas.microsoft.com/sharepoint/v3/contenttype/forms">
-  <Display>DocumentLibraryForm</Display>
-  <Edit>DocumentLibraryForm</Edit>
-  <New>DocumentLibraryForm</New>
-</FormTemplates>
-</file>
-
 <file path=customXml/itemProps1.xml><?xml version="1.0" encoding="utf-8"?>
 <ds:datastoreItem xmlns:ds="http://schemas.openxmlformats.org/officeDocument/2006/customXml" ds:itemID="{2A4AFB90-AA70-40CB-8FEE-062855DEC269}">
   <ds:schemaRefs>
@@ -12824,6 +12981,22 @@
 </file>
 
 <file path=customXml/itemProps2.xml><?xml version="1.0" encoding="utf-8"?>
+<ds:datastoreItem xmlns:ds="http://schemas.openxmlformats.org/officeDocument/2006/customXml" ds:itemID="{04D26766-6D42-46FD-AE9C-F80BA223CA67}">
+  <ds:schemaRefs>
+    <ds:schemaRef ds:uri="http://schemas.microsoft.com/sharepoint/v3/contenttype/forms"/>
+  </ds:schemaRefs>
+</ds:datastoreItem>
+</file>
+
+<file path=customXml/itemProps3.xml><?xml version="1.0" encoding="utf-8"?>
+<ds:datastoreItem xmlns:ds="http://schemas.openxmlformats.org/officeDocument/2006/customXml" ds:itemID="{88749F4F-A6E8-4DC0-9276-CAFEB15C1658}">
+  <ds:schemaRefs>
+    <ds:schemaRef ds:uri="http://schemas.openxmlformats.org/officeDocument/2006/bibliography"/>
+  </ds:schemaRefs>
+</ds:datastoreItem>
+</file>
+
+<file path=customXml/itemProps4.xml><?xml version="1.0" encoding="utf-8"?>
 <ds:datastoreItem xmlns:ds="http://schemas.openxmlformats.org/officeDocument/2006/customXml" ds:itemID="{8D503597-69F4-42D1-91A8-F656D146B62B}">
   <ds:schemaRefs>
     <ds:schemaRef ds:uri="http://schemas.microsoft.com/office/2006/metadata/contentType"/>
@@ -12840,20 +13013,4 @@
     <ds:schemaRef ds:uri="http://schemas.microsoft.com/internal/obd"/>
   </ds:schemaRefs>
 </ds:datastoreItem>
-</file>
-
-<file path=customXml/itemProps3.xml><?xml version="1.0" encoding="utf-8"?>
-<ds:datastoreItem xmlns:ds="http://schemas.openxmlformats.org/officeDocument/2006/customXml" ds:itemID="{88749F4F-A6E8-4DC0-9276-CAFEB15C1658}">
-  <ds:schemaRefs>
-    <ds:schemaRef ds:uri="http://schemas.openxmlformats.org/officeDocument/2006/bibliography"/>
-  </ds:schemaRefs>
-</ds:datastoreItem>
-</file>
-
-<file path=customXml/itemProps4.xml><?xml version="1.0" encoding="utf-8"?>
-<ds:datastoreItem xmlns:ds="http://schemas.openxmlformats.org/officeDocument/2006/customXml" ds:itemID="{04D26766-6D42-46FD-AE9C-F80BA223CA67}">
-  <ds:schemaRefs>
-    <ds:schemaRef ds:uri="http://schemas.microsoft.com/sharepoint/v3/contenttype/forms"/>
-  </ds:schemaRefs>
-</ds:datastoreItem>
 </file>
</xml_diff>

<commit_message>
Finished initial radfrac column setup
</commit_message>
<xml_diff>
--- a/Term Project - WORKING.docx
+++ b/Term Project - WORKING.docx
@@ -6106,7 +6106,7 @@
               <w:fldChar w:fldCharType="begin"/>
             </w:r>
             <w:r>
-              <w:instrText xml:space="preserve"> ADDIN ZOTERO_ITEM CSL_CITATION {"citationID":"gzdlZ9PK","properties":{"formattedCitation":"[15]","plainCitation":"[15]","noteIndex":0},"citationItems":[{"id":1081,"uris":["http://zotero.org/users/15288956/items/U3EQFVJU"],"itemData":{"id":1081,"type":"webpage","abstract":"Nitrobenzene | C6H5NO2 | CID 7416 - structure, chemical names, physical and chemical properties, classification, patents, literature, biological activities, safety/hazards/toxicity information, supplier lists, and more.","container-title":"PubChem","language":"en","title":"Nitrobenzene","URL":"https://pubchem.ncbi.nlm.nih.gov/compound/7416","accessed":{"date-parts":[["2026",3,25]]}}}],"schema":"https://github.com/citation-style-language/schema/raw/master/csl-citation.json"} </w:instrText>
+              <w:instrText xml:space="preserve"> ADDIN ZOTERO_ITEM CSL_CITATION {"citationID":"gzdlZ9PK","properties":{"formattedCitation":"[15]","plainCitation":"[15]","noteIndex":0},"citationItems":[{"id":1081,"uris":["http://zotero.org/users/15288956/items/U3EQFVJU"],"itemData":{"id":1081,"type":"webpage","abstract":"Nitrobenzene | C6H5NO2 | CID 7416 - structure, chemical names, physical and chemical properties, classification, patents, literature, biological activities, safety/hazards/toxicity information, supplier lists, and more.","language":"en","title":"Nitrobenzene","URL":"https://pubchem.ncbi.nlm.nih.gov/compound/7416","author":[{"literal":"PubChem"}],"accessed":{"date-parts":[["2026",3,25]]}}}],"schema":"https://github.com/citation-style-language/schema/raw/master/csl-citation.json"} </w:instrText>
             </w:r>
             <w:r>
               <w:fldChar w:fldCharType="separate"/>
@@ -6143,7 +6143,7 @@
               <w:fldChar w:fldCharType="begin"/>
             </w:r>
             <w:r>
-              <w:instrText xml:space="preserve"> ADDIN ZOTERO_ITEM CSL_CITATION {"citationID":"B3idRBNI","properties":{"formattedCitation":"[16]","plainCitation":"[16]","noteIndex":0},"citationItems":[{"id":1083,"uris":["http://zotero.org/users/15288956/items/AFSJ824L"],"itemData":{"id":1083,"type":"webpage","abstract":"Water | H2O | CID 962 - structure, chemical names, physical and chemical properties, classification, patents, literature, biological activities, safety/hazards/toxicity information, supplier lists, and more.","container-title":"PubChem","language":"en","title":"Water","URL":"https://pubchem.ncbi.nlm.nih.gov/compound/962","accessed":{"date-parts":[["2024",10,3]]}}}],"schema":"https://github.com/citation-style-language/schema/raw/master/csl-citation.json"} </w:instrText>
+              <w:instrText xml:space="preserve"> ADDIN ZOTERO_ITEM CSL_CITATION {"citationID":"B3idRBNI","properties":{"formattedCitation":"[16]","plainCitation":"[16]","noteIndex":0},"citationItems":[{"id":1083,"uris":["http://zotero.org/users/15288956/items/AFSJ824L"],"itemData":{"id":1083,"type":"webpage","abstract":"Water | H2O | CID 962 - structure, chemical names, physical and chemical properties, classification, patents, literature, biological activities, safety/hazards/toxicity information, supplier lists, and more.","language":"en","title":"Water","URL":"https://pubchem.ncbi.nlm.nih.gov/compound/962","author":[{"literal":"PubChem"}],"accessed":{"date-parts":[["2024",10,3]]}}}],"schema":"https://github.com/citation-style-language/schema/raw/master/csl-citation.json"} </w:instrText>
             </w:r>
             <w:r>
               <w:fldChar w:fldCharType="separate"/>
@@ -6180,7 +6180,7 @@
               <w:fldChar w:fldCharType="begin"/>
             </w:r>
             <w:r>
-              <w:instrText xml:space="preserve"> ADDIN ZOTERO_ITEM CSL_CITATION {"citationID":"WlqiRYjb","properties":{"formattedCitation":"[17]","plainCitation":"[17]","noteIndex":0},"citationItems":[{"id":1085,"uris":["http://zotero.org/users/15288956/items/SYPBJPTR"],"itemData":{"id":1085,"type":"webpage","abstract":"Aniline | C6H5NH2 or C6H7N | CID 6115 - structure, chemical names, physical and chemical properties, classification, patents, literature, biological activities, safety/hazards/toxicity information, supplier lists, and more.","container-title":"PubChem","language":"en","title":"Aniline","URL":"https://pubchem.ncbi.nlm.nih.gov/compound/6115","accessed":{"date-parts":[["2026",3,25]]}}}],"schema":"https://github.com/citation-style-language/schema/raw/master/csl-citation.json"} </w:instrText>
+              <w:instrText xml:space="preserve"> ADDIN ZOTERO_ITEM CSL_CITATION {"citationID":"WlqiRYjb","properties":{"formattedCitation":"[17]","plainCitation":"[17]","noteIndex":0},"citationItems":[{"id":1085,"uris":["http://zotero.org/users/15288956/items/SYPBJPTR"],"itemData":{"id":1085,"type":"webpage","abstract":"Aniline | C6H5NH2 or C6H7N | CID 6115 - structure, chemical names, physical and chemical properties, classification, patents, literature, biological activities, safety/hazards/toxicity information, supplier lists, and more.","language":"en","title":"Aniline","URL":"https://pubchem.ncbi.nlm.nih.gov/compound/6115","author":[{"literal":"PubChem"}],"accessed":{"date-parts":[["2026",3,25]]}}}],"schema":"https://github.com/citation-style-language/schema/raw/master/csl-citation.json"} </w:instrText>
             </w:r>
             <w:r>
               <w:fldChar w:fldCharType="separate"/>
@@ -6982,44 +6982,998 @@
     </w:tbl>
     <w:p/>
     <w:p>
-      <w:commentRangeStart w:id="29"/>
-      <w:r>
-        <w:t xml:space="preserve">For the initial simulation, a DSTWU column is used. </w:t>
-      </w:r>
-      <w:r>
-        <w:t xml:space="preserve">The column is operating at 1.5 MPa, similar to the flash chamber, and will be iterated later. Reflux ratio is set at 1.35 times minimum reflux, </w:t>
-      </w:r>
-      <w:r>
-        <w:t>and a total condenser is used as the hydrogen mole fraction in the stream is small.</w:t>
+      <w:r>
+        <w:t>As the aniline-water mixture forms a liquid-liquid equilibrium, feeding this stream directly into a DSTWU proves problematic, resulting in negative minimum reflux and feed stage. For this reason, a liquid-liquid extraction technique is performed</w:t>
       </w:r>
       <w:r>
         <w:t xml:space="preserve"> </w:t>
       </w:r>
       <w:r>
-        <w:t xml:space="preserve">In this column, water is the light key with </w:t>
-      </w:r>
-      <w:r>
-        <w:t>targeted recovery of 0.99, and aniline is the heavy key with targeted recovery of 0.01 in the distillate.</w:t>
-      </w:r>
-      <w:commentRangeEnd w:id="29"/>
-      <w:r>
-        <w:rPr>
-          <w:rStyle w:val="CommentReference"/>
+        <w:fldChar w:fldCharType="begin"/>
+      </w:r>
+      <w:r>
+        <w:instrText xml:space="preserve"> ADDIN ZOTERO_ITEM CSL_CITATION {"citationID":"24x4RjVX","properties":{"formattedCitation":"[19]","plainCitation":"[19]","noteIndex":0},"citationItems":[{"id":1100,"uris":["http://zotero.org/users/15288956/items/RLGT4IG4"],"itemData":{"id":1100,"type":"chapter","container-title":"Aspen Plus®","DOI":"https://doi.org/10.1002%2F9781119293644.ch5","ISBN":"978-1-119-13123-6","language":"en","note":"ISBN: 9781119293644","page":"131-153","publisher":"Wiley Online Books","source":"onlinelibrary.wiley.com","title":"Liquid–Liquid Extraction Process","URL":"https://onlinelibrary.wiley.com/doi/chapter-epub/10.1002/9781119293644.ch5?saml_referrer=","author":[{"family":"Al‐Malah","given":"Kamal I.M."}],"accessed":{"date-parts":[["2026",3,26]]},"issued":{"date-parts":[["2017"]]}}}],"schema":"https://github.com/citation-style-language/schema/raw/master/csl-citation.json"} </w:instrText>
+      </w:r>
+      <w:r>
+        <w:fldChar w:fldCharType="separate"/>
+      </w:r>
+      <w:r>
+        <w:t>[19]</w:t>
+      </w:r>
+      <w:r>
+        <w:fldChar w:fldCharType="end"/>
+      </w:r>
+      <w:r>
+        <w:t>. In a liquid-liquid extraction process, a solvent is used to transfer the solute (in this case, aniline) from one liquid phase to another. The remaining liquid, low on solute, is called the diluent and is disposed of</w:t>
+      </w:r>
+      <w:r>
+        <w:t xml:space="preserve"> </w:t>
+      </w:r>
+      <w:r>
+        <w:fldChar w:fldCharType="begin"/>
+      </w:r>
+      <w:r>
+        <w:instrText xml:space="preserve"> ADDIN ZOTERO_ITEM CSL_CITATION {"citationID":"GzoZG0qt","properties":{"formattedCitation":"[20]","plainCitation":"[20]","noteIndex":0},"citationItems":[{"id":1103,"uris":["http://zotero.org/users/15288956/items/XB956PFH"],"itemData":{"id":1103,"type":"chapter","abstract":"Chapter 13\nLiquid-Liquid Extraction\n\n13.0 Summary—Objectives\nIn this chapter, we consider what extraction is used for, develop McCabe-Thiele and Kremser methods for immiscible extraction, and...","container-title":"Separation Process Engineering","edition":"5","ISBN":"978-0-13-746818-8","language":"en","publisher":"Pearson","source":"learning.oreilly.com","title":"Chapter 13. Liquid-Liquid Extraction","URL":"https://learning.oreilly.com/library/view/separation-process-engineering/9780137468188/ch13.xhtml","author":[{"family":"Wankat","given":"Phillip C."}],"accessed":{"date-parts":[["2026",3,26]]}}}],"schema":"https://github.com/citation-style-language/schema/raw/master/csl-citation.json"} </w:instrText>
+      </w:r>
+      <w:r>
+        <w:fldChar w:fldCharType="separate"/>
+      </w:r>
+      <w:r>
+        <w:t>[20]</w:t>
+      </w:r>
+      <w:r>
+        <w:fldChar w:fldCharType="end"/>
+      </w:r>
+      <w:r>
+        <w:t>.</w:t>
+      </w:r>
+      <w:r>
+        <w:t xml:space="preserve"> For </w:t>
+      </w:r>
+      <w:r>
+        <w:t>this process, heptane is selected as the solvent</w:t>
+      </w:r>
+      <w:r>
+        <w:t xml:space="preserve">, as it has previously been successfully used for aniline purification </w:t>
+      </w:r>
+      <w:r>
+        <w:fldChar w:fldCharType="begin"/>
+      </w:r>
+      <w:r>
+        <w:instrText xml:space="preserve"> ADDIN ZOTERO_ITEM CSL_CITATION {"citationID":"Z5lLi0rr","properties":{"formattedCitation":"[21], [22]","plainCitation":"[21], [22]","noteIndex":0},"citationItems":[{"id":1098,"uris":["http://zotero.org/users/15288956/items/BQEHKB8Y"],"itemData":{"id":1098,"type":"chapter","container-title":"Perry's Chemical Engineers' Handbook","DOI":"10.1036/0071511385","edition":"8","ISBN":"0-07-154222-1","publisher":"The McGraw-Hill Companies","title":"Section 15: Liquid-Liquid Extraction and Other Liquid-Liquid Operations and Equipment","author":[{"family":"Frank","given":"Timothy C."},{"family":"Dahuron","given":"Lise"},{"family":"Holden","given":"Bruce S."},{"family":"Prince","given":"William D."},{"family":"Seibert","given":"A. Frank"},{"family":"Wilson","given":"Loren C."}],"issued":{"date-parts":[["2008"]]}}},{"id":1102,"uris":["http://zotero.org/users/15288956/items/3ZJB8AV2"],"itemData":{"id":1102,"type":"article-journal","abstract":"Abstract\n            \n              Ternary liquid‐liquid equilibrium data at 20° are reported for the systems α‐picoline‐water‐hydrocarbon, and α‐picoline‐triethylene glycol‐hydrocarbon, where the hydrocarbons are benzene, ‘heptane’,\n              diiso\n              butylene and methyl\n              cyclo\n              hexane.","container-title":"Journal of Applied Chemistry","DOI":"10.1002/jctb.5010070107","ISSN":"0021-8871, 1934-998X","issue":"1","journalAbbreviation":"J. Appl. Chem.","language":"en","license":"http://onlinelibrary.wiley.com/termsAndConditions#vor","page":"39-46","source":"DOI.org (Crossref)","title":"Liquid‐liquid equilibrium data for ternary systems containing α‐picoline, hydrocarbons and water or triethylene glycol at 20°","volume":"7","author":[{"family":"Charles","given":"E. J."},{"family":"Morton","given":"F."}],"issued":{"date-parts":[["1957",1]]}}}],"schema":"https://github.com/citation-style-language/schema/raw/master/csl-citation.json"} </w:instrText>
+      </w:r>
+      <w:r>
+        <w:fldChar w:fldCharType="separate"/>
+      </w:r>
+      <w:r>
+        <w:t>[21], [22]</w:t>
+      </w:r>
+      <w:r>
+        <w:fldChar w:fldCharType="end"/>
+      </w:r>
+      <w:r>
+        <w:t>.</w:t>
+      </w:r>
+    </w:p>
+    <w:p/>
+    <w:p>
+      <w:r>
+        <w:t xml:space="preserve">For initial setup, </w:t>
+      </w:r>
+      <w:r>
+        <w:t xml:space="preserve">an adiabatic column with 10 stages is used. The column is operating </w:t>
+      </w:r>
+      <w:r>
+        <w:t>0.1 MPa, reducing the need for pressurising, saving operating costs.</w:t>
+      </w:r>
+      <w:r>
+        <w:t xml:space="preserve"> </w:t>
+      </w:r>
+      <w:r>
+        <w:t xml:space="preserve">Water is the key component </w:t>
+      </w:r>
+      <w:r>
+        <w:t>of the 1st liquid phase, while heptane is the key component of the</w:t>
+      </w:r>
+      <w:r>
+        <w:t xml:space="preserve"> 2</w:t>
+      </w:r>
+      <w:r>
+        <w:rPr>
+          <w:vertAlign w:val="superscript"/>
+        </w:rPr>
+        <w:t>nd</w:t>
+      </w:r>
+      <w:r>
+        <w:t xml:space="preserve"> liquid phase. </w:t>
+      </w:r>
+      <w:r>
+        <w:t>H</w:t>
+      </w:r>
+      <w:r>
+        <w:t xml:space="preserve">eptane is fed at 150 kmol/hr </w:t>
+      </w:r>
+      <w:r>
+        <w:t>into the column from the bottom going u</w:t>
+      </w:r>
+      <w:r>
+        <w:t>p</w:t>
+      </w:r>
+      <w:r>
+        <w:t>. Aniline-water mix is coming into the column from the top going down. Thus, the column is operating in counter-current. The heavier water is recovered from the raffinate, while the aniline-heptane mix is recovered from the extract and transferred to a second distillation column to</w:t>
+      </w:r>
+      <w:r>
+        <w:t xml:space="preserve"> further</w:t>
+      </w:r>
+      <w:r>
+        <w:t xml:space="preserve"> purify the aniline.</w:t>
+      </w:r>
+    </w:p>
+    <w:p/>
+    <w:p>
+      <w:pPr>
+        <w:pStyle w:val="Caption"/>
+        <w:keepNext/>
+        <w:rPr>
+          <w:i w:val="0"/>
+          <w:iCs w:val="0"/>
+          <w:color w:val="000000" w:themeColor="text1"/>
           <w:sz w:val="24"/>
           <w:szCs w:val="24"/>
         </w:rPr>
-        <w:commentReference w:id="29"/>
-      </w:r>
-    </w:p>
+      </w:pPr>
+      <w:bookmarkStart w:id="29" w:name="_Ref225460715"/>
+      <w:r>
+        <w:rPr>
+          <w:i w:val="0"/>
+          <w:iCs w:val="0"/>
+          <w:color w:val="000000" w:themeColor="text1"/>
+          <w:sz w:val="24"/>
+          <w:szCs w:val="24"/>
+        </w:rPr>
+        <w:t xml:space="preserve">Table </w:t>
+      </w:r>
+      <w:r>
+        <w:rPr>
+          <w:i w:val="0"/>
+          <w:iCs w:val="0"/>
+          <w:color w:val="000000" w:themeColor="text1"/>
+          <w:sz w:val="24"/>
+          <w:szCs w:val="24"/>
+        </w:rPr>
+        <w:fldChar w:fldCharType="begin"/>
+      </w:r>
+      <w:r>
+        <w:rPr>
+          <w:i w:val="0"/>
+          <w:iCs w:val="0"/>
+          <w:color w:val="000000" w:themeColor="text1"/>
+          <w:sz w:val="24"/>
+          <w:szCs w:val="24"/>
+        </w:rPr>
+        <w:instrText xml:space="preserve"> SEQ Table \* ARABIC </w:instrText>
+      </w:r>
+      <w:r>
+        <w:rPr>
+          <w:i w:val="0"/>
+          <w:iCs w:val="0"/>
+          <w:color w:val="000000" w:themeColor="text1"/>
+          <w:sz w:val="24"/>
+          <w:szCs w:val="24"/>
+        </w:rPr>
+        <w:fldChar w:fldCharType="separate"/>
+      </w:r>
+      <w:r>
+        <w:rPr>
+          <w:i w:val="0"/>
+          <w:iCs w:val="0"/>
+          <w:noProof/>
+          <w:color w:val="000000" w:themeColor="text1"/>
+          <w:sz w:val="24"/>
+          <w:szCs w:val="24"/>
+        </w:rPr>
+        <w:t>7</w:t>
+      </w:r>
+      <w:r>
+        <w:rPr>
+          <w:i w:val="0"/>
+          <w:iCs w:val="0"/>
+          <w:color w:val="000000" w:themeColor="text1"/>
+          <w:sz w:val="24"/>
+          <w:szCs w:val="24"/>
+        </w:rPr>
+        <w:fldChar w:fldCharType="end"/>
+      </w:r>
+      <w:bookmarkEnd w:id="29"/>
+      <w:r>
+        <w:rPr>
+          <w:i w:val="0"/>
+          <w:iCs w:val="0"/>
+          <w:color w:val="000000" w:themeColor="text1"/>
+          <w:sz w:val="24"/>
+          <w:szCs w:val="24"/>
+        </w:rPr>
+        <w:t>: Liquid liquid extraction result for estimate stream</w:t>
+      </w:r>
+    </w:p>
+    <w:tbl>
+      <w:tblPr>
+        <w:tblStyle w:val="TableGrid"/>
+        <w:tblW w:w="0" w:type="auto"/>
+        <w:tblLook w:val="04A0" w:firstRow="1" w:lastRow="0" w:firstColumn="1" w:lastColumn="0" w:noHBand="0" w:noVBand="1"/>
+      </w:tblPr>
+      <w:tblGrid>
+        <w:gridCol w:w="3320"/>
+        <w:gridCol w:w="3321"/>
+        <w:gridCol w:w="3321"/>
+      </w:tblGrid>
+      <w:tr>
+        <w:tc>
+          <w:tcPr>
+            <w:tcW w:w="3320" w:type="dxa"/>
+          </w:tcPr>
+          <w:p>
+            <w:r>
+              <w:rPr>
+                <w:lang w:val="en-US" w:eastAsia="en-US"/>
+              </w:rPr>
+              <w:t>Compound</w:t>
+            </w:r>
+          </w:p>
+        </w:tc>
+        <w:tc>
+          <w:tcPr>
+            <w:tcW w:w="3321" w:type="dxa"/>
+          </w:tcPr>
+          <w:p>
+            <w:r>
+              <w:t>Extract Mole Flow (kmol/hr)</w:t>
+            </w:r>
+          </w:p>
+        </w:tc>
+        <w:tc>
+          <w:tcPr>
+            <w:tcW w:w="3321" w:type="dxa"/>
+          </w:tcPr>
+          <w:p>
+            <w:r>
+              <w:t>Raffinate Mole Flow (kmol/hr)</w:t>
+            </w:r>
+          </w:p>
+        </w:tc>
+      </w:tr>
+      <w:tr>
+        <w:tc>
+          <w:tcPr>
+            <w:tcW w:w="3320" w:type="dxa"/>
+          </w:tcPr>
+          <w:p>
+            <w:r>
+              <w:t>Hydrogen</w:t>
+            </w:r>
+          </w:p>
+        </w:tc>
+        <w:tc>
+          <w:tcPr>
+            <w:tcW w:w="3321" w:type="dxa"/>
+          </w:tcPr>
+          <w:p>
+            <w:r>
+              <w:t>1</w:t>
+            </w:r>
+          </w:p>
+        </w:tc>
+        <w:tc>
+          <w:tcPr>
+            <w:tcW w:w="3321" w:type="dxa"/>
+          </w:tcPr>
+          <w:p>
+            <w:r>
+              <w:t>Trace</w:t>
+            </w:r>
+          </w:p>
+        </w:tc>
+      </w:tr>
+      <w:tr>
+        <w:tc>
+          <w:tcPr>
+            <w:tcW w:w="3320" w:type="dxa"/>
+          </w:tcPr>
+          <w:p>
+            <w:r>
+              <w:t>Nitrobenzene</w:t>
+            </w:r>
+          </w:p>
+        </w:tc>
+        <w:tc>
+          <w:tcPr>
+            <w:tcW w:w="3321" w:type="dxa"/>
+          </w:tcPr>
+          <w:p>
+            <w:r>
+              <w:t>0</w:t>
+            </w:r>
+          </w:p>
+        </w:tc>
+        <w:tc>
+          <w:tcPr>
+            <w:tcW w:w="3321" w:type="dxa"/>
+          </w:tcPr>
+          <w:p>
+            <w:r>
+              <w:t>0</w:t>
+            </w:r>
+          </w:p>
+        </w:tc>
+      </w:tr>
+      <w:tr>
+        <w:tc>
+          <w:tcPr>
+            <w:tcW w:w="3320" w:type="dxa"/>
+          </w:tcPr>
+          <w:p>
+            <w:r>
+              <w:t>Aniline</w:t>
+            </w:r>
+          </w:p>
+        </w:tc>
+        <w:tc>
+          <w:tcPr>
+            <w:tcW w:w="3321" w:type="dxa"/>
+          </w:tcPr>
+          <w:p>
+            <w:r>
+              <w:t>15</w:t>
+            </w:r>
+            <w:r>
+              <w:t>4</w:t>
+            </w:r>
+          </w:p>
+        </w:tc>
+        <w:tc>
+          <w:tcPr>
+            <w:tcW w:w="3321" w:type="dxa"/>
+          </w:tcPr>
+          <w:p>
+            <w:r>
+              <w:t>Trace</w:t>
+            </w:r>
+          </w:p>
+        </w:tc>
+      </w:tr>
+      <w:tr>
+        <w:tc>
+          <w:tcPr>
+            <w:tcW w:w="3320" w:type="dxa"/>
+          </w:tcPr>
+          <w:p>
+            <w:r>
+              <w:t>Water</w:t>
+            </w:r>
+          </w:p>
+        </w:tc>
+        <w:tc>
+          <w:tcPr>
+            <w:tcW w:w="3321" w:type="dxa"/>
+          </w:tcPr>
+          <w:p>
+            <w:r>
+              <w:t>59.6</w:t>
+            </w:r>
+            <w:r>
+              <w:t>4</w:t>
+            </w:r>
+          </w:p>
+        </w:tc>
+        <w:tc>
+          <w:tcPr>
+            <w:tcW w:w="3321" w:type="dxa"/>
+          </w:tcPr>
+          <w:p>
+            <w:r>
+              <w:t>250.36</w:t>
+            </w:r>
+          </w:p>
+        </w:tc>
+      </w:tr>
+      <w:tr>
+        <w:tc>
+          <w:tcPr>
+            <w:tcW w:w="3320" w:type="dxa"/>
+          </w:tcPr>
+          <w:p>
+            <w:r>
+              <w:t>Heptane</w:t>
+            </w:r>
+          </w:p>
+        </w:tc>
+        <w:tc>
+          <w:tcPr>
+            <w:tcW w:w="3321" w:type="dxa"/>
+          </w:tcPr>
+          <w:p>
+            <w:r>
+              <w:t>149.98</w:t>
+            </w:r>
+          </w:p>
+        </w:tc>
+        <w:tc>
+          <w:tcPr>
+            <w:tcW w:w="3321" w:type="dxa"/>
+          </w:tcPr>
+          <w:p>
+            <w:r>
+              <w:t>0.0</w:t>
+            </w:r>
+            <w:r>
+              <w:t>2</w:t>
+            </w:r>
+          </w:p>
+        </w:tc>
+      </w:tr>
+    </w:tbl>
     <w:p/>
     <w:p>
+      <w:r>
+        <w:t xml:space="preserve">From </w:t>
+      </w:r>
+      <w:r>
+        <w:fldChar w:fldCharType="begin"/>
+      </w:r>
+      <w:r>
+        <w:instrText xml:space="preserve"> REF _Ref225460715 \h </w:instrText>
+      </w:r>
+      <w:r>
+        <w:instrText xml:space="preserve"> \* MERGEFORMAT </w:instrText>
+      </w:r>
+      <w:r>
+        <w:fldChar w:fldCharType="separate"/>
+      </w:r>
+      <w:r>
+        <w:rPr>
+          <w:color w:val="000000" w:themeColor="text1"/>
+        </w:rPr>
+        <w:t xml:space="preserve">Table </w:t>
+      </w:r>
+      <w:r>
+        <w:rPr>
+          <w:noProof/>
+          <w:color w:val="000000" w:themeColor="text1"/>
+        </w:rPr>
+        <w:t>7</w:t>
+      </w:r>
+      <w:r>
+        <w:fldChar w:fldCharType="end"/>
+      </w:r>
+      <w:r>
+        <w:t>, it is clear that the extract stream needs another distillation step to obtain technical grade aniline. To obtain an initial estimate of the column, a DSTWU is used</w:t>
+      </w:r>
+      <w:r>
+        <w:t xml:space="preserve"> before performing a more rigorous simulation with RadFrac</w:t>
+      </w:r>
+      <w:r>
+        <w:t xml:space="preserve">. </w:t>
+      </w:r>
+      <w:r>
+        <w:t xml:space="preserve">The column is operating at 0.1 MPa condenser and reboiler pressure, with a </w:t>
+      </w:r>
+      <w:r>
+        <w:t>partial reboiler with all vapour distillate.</w:t>
+      </w:r>
+      <w:r>
+        <w:t xml:space="preserve"> Reflux ratio is set at 1.35 times the minimum reflux.</w:t>
+      </w:r>
+      <w:r>
+        <w:t xml:space="preserve"> Heptane boiling point is 98 C, lower than water </w:t>
+      </w:r>
+      <w:r>
+        <w:fldChar w:fldCharType="begin"/>
+      </w:r>
+      <w:r>
+        <w:instrText xml:space="preserve"> ADDIN ZOTERO_ITEM CSL_CITATION {"citationID":"snlCqMew","properties":{"formattedCitation":"[23]","plainCitation":"[23]","noteIndex":0},"citationItems":[{"id":1105,"uris":["http://zotero.org/users/15288956/items/8TM6RMXF"],"itemData":{"id":1105,"type":"webpage","abstract":"Heptane | C7H16 | CID 8900 - structure, chemical names, physical and chemical properties, classification, patents, literature, biological activities, safety/hazards/toxicity information, supplier lists, and more.","language":"en","title":"Heptane","URL":"https://pubchem.ncbi.nlm.nih.gov/compound/8900","author":[{"literal":"PubChem"}],"accessed":{"date-parts":[["2026",3,26]]}}}],"schema":"https://github.com/citation-style-language/schema/raw/master/csl-citation.json"} </w:instrText>
+      </w:r>
+      <w:r>
+        <w:fldChar w:fldCharType="separate"/>
+      </w:r>
+      <w:r>
+        <w:t>[23]</w:t>
+      </w:r>
+      <w:r>
+        <w:fldChar w:fldCharType="end"/>
+      </w:r>
+      <w:r>
+        <w:t>. As such, water is the light key, with an initial recovery guess of 0.99. Similarly, aniline is the heavy key with an initial recovery guess of 0.01. This recovery value will be iterated upon during later analysis to achieve the target aniline purity.</w:t>
+      </w:r>
+    </w:p>
+    <w:p/>
+    <w:p>
+      <w:r>
+        <w:t>Running the simulation at this throws the following error in Aspen:</w:t>
+      </w:r>
+    </w:p>
+    <w:p>
+      <w:r>
+        <w:t>** ERROR</w:t>
+      </w:r>
+    </w:p>
+    <w:p>
+      <w:r>
+        <w:t xml:space="preserve">   MINIMUM REFLUX RATIO CALCULATED FROM UNDERWOOD EQUATION</w:t>
+      </w:r>
+    </w:p>
+    <w:p>
+      <w:r>
+        <w:t xml:space="preserve">   IS -0.78951.  REFLUX RATIO RESET TO 0.1.</w:t>
+      </w:r>
+    </w:p>
+    <w:p>
+      <w:r>
+        <w:t xml:space="preserve">Due to this error, </w:t>
+      </w:r>
+      <w:r>
+        <w:t>the reflux ratio profile can’t be generated,</w:t>
+      </w:r>
+      <w:r>
+        <w:t xml:space="preserve"> and analysis must be conducted directly on the RadFrac column. </w:t>
+      </w:r>
+      <w:r>
+        <w:t>However, the simulation still produces a feasible design summary:</w:t>
+      </w:r>
+    </w:p>
+    <w:p>
+      <w:pPr>
+        <w:pStyle w:val="ListParagraph"/>
+        <w:numPr>
+          <w:ilvl w:val="0"/>
+          <w:numId w:val="26"/>
+        </w:numPr>
+      </w:pPr>
+      <w:r>
+        <w:t>Actual reflux ratio: 0.135</w:t>
+      </w:r>
+    </w:p>
+    <w:p>
+      <w:pPr>
+        <w:pStyle w:val="ListParagraph"/>
+        <w:numPr>
+          <w:ilvl w:val="0"/>
+          <w:numId w:val="26"/>
+        </w:numPr>
+      </w:pPr>
+      <w:r>
+        <w:t>Actual number of stages: 8</w:t>
+      </w:r>
+    </w:p>
+    <w:p>
+      <w:pPr>
+        <w:pStyle w:val="ListParagraph"/>
+        <w:numPr>
+          <w:ilvl w:val="0"/>
+          <w:numId w:val="26"/>
+        </w:numPr>
+      </w:pPr>
+      <w:r>
+        <w:lastRenderedPageBreak/>
+        <w:t>Feed stage: 3</w:t>
+      </w:r>
+    </w:p>
+    <w:p>
+      <w:pPr>
+        <w:pStyle w:val="ListParagraph"/>
+        <w:numPr>
+          <w:ilvl w:val="0"/>
+          <w:numId w:val="26"/>
+        </w:numPr>
+      </w:pPr>
+      <w:r>
+        <w:t xml:space="preserve">Distillate to feed ratio: </w:t>
+      </w:r>
+      <w:r>
+        <w:t>0.577</w:t>
+      </w:r>
+    </w:p>
+    <w:p>
+      <w:r>
+        <w:t xml:space="preserve">These values are used as </w:t>
+      </w:r>
+      <w:r>
+        <w:t xml:space="preserve">an </w:t>
+      </w:r>
+      <w:r>
+        <w:t xml:space="preserve">initial design specification for a </w:t>
+      </w:r>
+      <w:r>
+        <w:t xml:space="preserve">RadFrac </w:t>
+      </w:r>
+      <w:r>
+        <w:t xml:space="preserve">column. Due to </w:t>
+      </w:r>
+      <w:r>
+        <w:t>the potential existence of a liquid-liquid equilibrium region, the 3-Phase option is enabled and tested for all equilibrium stages.</w:t>
+      </w:r>
+      <w:r>
+        <w:t xml:space="preserve"> Internal stages have an assumed efficiency of 80%, while the condenser and reboiler are assumed to be 100% efficient</w:t>
+      </w:r>
+      <w:r>
+        <w:t>,</w:t>
+      </w:r>
+      <w:r>
+        <w:t xml:space="preserve"> as components are condensing or vapourising </w:t>
+      </w:r>
+      <w:r>
+        <w:fldChar w:fldCharType="begin"/>
+      </w:r>
+      <w:r>
+        <w:instrText xml:space="preserve"> ADDIN ZOTERO_ITEM CSL_CITATION {"citationID":"1CcWqOAg","properties":{"formattedCitation":"[24]","plainCitation":"[24]","noteIndex":0},"citationItems":[{"id":1107,"uris":["http://zotero.org/users/15288956/items/AY3DUK4A"],"itemData":{"id":1107,"type":"webpage","title":"CHBE 376 [2025W] Block 07 (Columns).pdf: CHBE_V 376 201 2025W2 Computer Flowsheeting and Unit Operation Design","URL":"https://canvas.ubc.ca/courses/177702/files/44912135?module_item_id=9073805","author":[{"family":"Verrett","given":"Jonathan"}],"accessed":{"date-parts":[["2026",3,27]]}}}],"schema":"https://github.com/citation-style-language/schema/raw/master/csl-citation.json"} </w:instrText>
+      </w:r>
+      <w:r>
+        <w:fldChar w:fldCharType="separate"/>
+      </w:r>
+      <w:r>
+        <w:t>[24]</w:t>
+      </w:r>
+      <w:r>
+        <w:fldChar w:fldCharType="end"/>
+      </w:r>
+      <w:r>
+        <w:t>.</w:t>
+      </w:r>
+    </w:p>
+    <w:p/>
+    <w:p>
+      <w:pPr>
+        <w:pStyle w:val="Caption"/>
+        <w:keepNext/>
+        <w:rPr>
+          <w:i w:val="0"/>
+          <w:iCs w:val="0"/>
+          <w:color w:val="000000" w:themeColor="text1"/>
+          <w:sz w:val="24"/>
+          <w:szCs w:val="24"/>
+        </w:rPr>
+      </w:pPr>
+      <w:bookmarkStart w:id="30" w:name="_Ref225464844"/>
+      <w:r>
+        <w:rPr>
+          <w:i w:val="0"/>
+          <w:iCs w:val="0"/>
+          <w:color w:val="000000" w:themeColor="text1"/>
+          <w:sz w:val="24"/>
+          <w:szCs w:val="24"/>
+        </w:rPr>
+        <w:t xml:space="preserve">Table </w:t>
+      </w:r>
+      <w:r>
+        <w:rPr>
+          <w:i w:val="0"/>
+          <w:iCs w:val="0"/>
+          <w:color w:val="000000" w:themeColor="text1"/>
+          <w:sz w:val="24"/>
+          <w:szCs w:val="24"/>
+        </w:rPr>
+        <w:fldChar w:fldCharType="begin"/>
+      </w:r>
+      <w:r>
+        <w:rPr>
+          <w:i w:val="0"/>
+          <w:iCs w:val="0"/>
+          <w:color w:val="000000" w:themeColor="text1"/>
+          <w:sz w:val="24"/>
+          <w:szCs w:val="24"/>
+        </w:rPr>
+        <w:instrText xml:space="preserve"> SEQ Table \* ARABIC </w:instrText>
+      </w:r>
+      <w:r>
+        <w:rPr>
+          <w:i w:val="0"/>
+          <w:iCs w:val="0"/>
+          <w:color w:val="000000" w:themeColor="text1"/>
+          <w:sz w:val="24"/>
+          <w:szCs w:val="24"/>
+        </w:rPr>
+        <w:fldChar w:fldCharType="separate"/>
+      </w:r>
+      <w:r>
+        <w:rPr>
+          <w:i w:val="0"/>
+          <w:iCs w:val="0"/>
+          <w:noProof/>
+          <w:color w:val="000000" w:themeColor="text1"/>
+          <w:sz w:val="24"/>
+          <w:szCs w:val="24"/>
+        </w:rPr>
+        <w:t>8</w:t>
+      </w:r>
+      <w:r>
+        <w:rPr>
+          <w:i w:val="0"/>
+          <w:iCs w:val="0"/>
+          <w:color w:val="000000" w:themeColor="text1"/>
+          <w:sz w:val="24"/>
+          <w:szCs w:val="24"/>
+        </w:rPr>
+        <w:fldChar w:fldCharType="end"/>
+      </w:r>
+      <w:bookmarkEnd w:id="30"/>
+      <w:r>
+        <w:rPr>
+          <w:i w:val="0"/>
+          <w:iCs w:val="0"/>
+          <w:color w:val="000000" w:themeColor="text1"/>
+          <w:sz w:val="24"/>
+          <w:szCs w:val="24"/>
+        </w:rPr>
+        <w:t>: Output stream of RadFrac simulation for aniline purification</w:t>
+      </w:r>
+    </w:p>
+    <w:tbl>
+      <w:tblPr>
+        <w:tblStyle w:val="TableGrid"/>
+        <w:tblW w:w="0" w:type="auto"/>
+        <w:tblLook w:val="04A0" w:firstRow="1" w:lastRow="0" w:firstColumn="1" w:lastColumn="0" w:noHBand="0" w:noVBand="1"/>
+      </w:tblPr>
+      <w:tblGrid>
+        <w:gridCol w:w="3320"/>
+        <w:gridCol w:w="3321"/>
+        <w:gridCol w:w="3321"/>
+      </w:tblGrid>
+      <w:tr>
+        <w:tc>
+          <w:tcPr>
+            <w:tcW w:w="3320" w:type="dxa"/>
+          </w:tcPr>
+          <w:p>
+            <w:r>
+              <w:rPr>
+                <w:lang w:val="en-US" w:eastAsia="en-US"/>
+              </w:rPr>
+              <w:t>Compound</w:t>
+            </w:r>
+          </w:p>
+        </w:tc>
+        <w:tc>
+          <w:tcPr>
+            <w:tcW w:w="3321" w:type="dxa"/>
+          </w:tcPr>
+          <w:p>
+            <w:r>
+              <w:t>Distillate</w:t>
+            </w:r>
+            <w:r>
+              <w:t xml:space="preserve"> Mole Flow (kmol/hr)</w:t>
+            </w:r>
+          </w:p>
+        </w:tc>
+        <w:tc>
+          <w:tcPr>
+            <w:tcW w:w="3321" w:type="dxa"/>
+          </w:tcPr>
+          <w:p>
+            <w:r>
+              <w:t xml:space="preserve">Bottom </w:t>
+            </w:r>
+            <w:r>
+              <w:t>Mole Flow (kmol/hr)</w:t>
+            </w:r>
+          </w:p>
+        </w:tc>
+      </w:tr>
+      <w:tr>
+        <w:tc>
+          <w:tcPr>
+            <w:tcW w:w="3320" w:type="dxa"/>
+          </w:tcPr>
+          <w:p>
+            <w:r>
+              <w:t>Hydrogen</w:t>
+            </w:r>
+          </w:p>
+        </w:tc>
+        <w:tc>
+          <w:tcPr>
+            <w:tcW w:w="3321" w:type="dxa"/>
+          </w:tcPr>
+          <w:p>
+            <w:r>
+              <w:t>1</w:t>
+            </w:r>
+          </w:p>
+        </w:tc>
+        <w:tc>
+          <w:tcPr>
+            <w:tcW w:w="3321" w:type="dxa"/>
+          </w:tcPr>
+          <w:p>
+            <w:r>
+              <w:t>Trace</w:t>
+            </w:r>
+          </w:p>
+        </w:tc>
+      </w:tr>
+      <w:tr>
+        <w:tc>
+          <w:tcPr>
+            <w:tcW w:w="3320" w:type="dxa"/>
+          </w:tcPr>
+          <w:p>
+            <w:r>
+              <w:t>Nitrobenzene</w:t>
+            </w:r>
+          </w:p>
+        </w:tc>
+        <w:tc>
+          <w:tcPr>
+            <w:tcW w:w="3321" w:type="dxa"/>
+          </w:tcPr>
+          <w:p>
+            <w:r>
+              <w:t>0</w:t>
+            </w:r>
+          </w:p>
+        </w:tc>
+        <w:tc>
+          <w:tcPr>
+            <w:tcW w:w="3321" w:type="dxa"/>
+          </w:tcPr>
+          <w:p>
+            <w:r>
+              <w:t>0</w:t>
+            </w:r>
+          </w:p>
+        </w:tc>
+      </w:tr>
+      <w:tr>
+        <w:tc>
+          <w:tcPr>
+            <w:tcW w:w="3320" w:type="dxa"/>
+          </w:tcPr>
+          <w:p>
+            <w:r>
+              <w:t>Aniline</w:t>
+            </w:r>
+          </w:p>
+        </w:tc>
+        <w:tc>
+          <w:tcPr>
+            <w:tcW w:w="3321" w:type="dxa"/>
+          </w:tcPr>
+          <w:p>
+            <w:r>
+              <w:t>1.6</w:t>
+            </w:r>
+            <w:r>
+              <w:t>1</w:t>
+            </w:r>
+          </w:p>
+        </w:tc>
+        <w:tc>
+          <w:tcPr>
+            <w:tcW w:w="3321" w:type="dxa"/>
+          </w:tcPr>
+          <w:p>
+            <w:r>
+              <w:t>152.39</w:t>
+            </w:r>
+          </w:p>
+        </w:tc>
+      </w:tr>
+      <w:tr>
+        <w:tc>
+          <w:tcPr>
+            <w:tcW w:w="3320" w:type="dxa"/>
+          </w:tcPr>
+          <w:p>
+            <w:r>
+              <w:t>Water</w:t>
+            </w:r>
+          </w:p>
+        </w:tc>
+        <w:tc>
+          <w:tcPr>
+            <w:tcW w:w="3321" w:type="dxa"/>
+          </w:tcPr>
+          <w:p>
+            <w:r>
+              <w:t>59.6</w:t>
+            </w:r>
+            <w:r>
+              <w:t>4</w:t>
+            </w:r>
+          </w:p>
+        </w:tc>
+        <w:tc>
+          <w:tcPr>
+            <w:tcW w:w="3321" w:type="dxa"/>
+          </w:tcPr>
+          <w:p>
+            <w:r>
+              <w:t>Trace</w:t>
+            </w:r>
+          </w:p>
+        </w:tc>
+      </w:tr>
+      <w:tr>
+        <w:tc>
+          <w:tcPr>
+            <w:tcW w:w="3320" w:type="dxa"/>
+          </w:tcPr>
+          <w:p>
+            <w:r>
+              <w:t>Heptane</w:t>
+            </w:r>
+          </w:p>
+        </w:tc>
+        <w:tc>
+          <w:tcPr>
+            <w:tcW w:w="3321" w:type="dxa"/>
+          </w:tcPr>
+          <w:p>
+            <w:r>
+              <w:t>148.2</w:t>
+            </w:r>
+            <w:r>
+              <w:t>4</w:t>
+            </w:r>
+          </w:p>
+        </w:tc>
+        <w:tc>
+          <w:tcPr>
+            <w:tcW w:w="3321" w:type="dxa"/>
+          </w:tcPr>
+          <w:p>
+            <w:r>
+              <w:t>1.74</w:t>
+            </w:r>
+          </w:p>
+        </w:tc>
+      </w:tr>
+    </w:tbl>
+    <w:p/>
+    <w:p>
+      <w:r>
+        <w:fldChar w:fldCharType="begin"/>
+      </w:r>
+      <w:r>
+        <w:instrText xml:space="preserve"> REF _Ref225464844 \h </w:instrText>
+      </w:r>
+      <w:r>
+        <w:instrText xml:space="preserve"> \* MERGEFORMAT </w:instrText>
+      </w:r>
+      <w:r>
+        <w:fldChar w:fldCharType="separate"/>
+      </w:r>
+      <w:r>
+        <w:rPr>
+          <w:color w:val="000000" w:themeColor="text1"/>
+        </w:rPr>
+        <w:t xml:space="preserve">Table </w:t>
+      </w:r>
+      <w:r>
+        <w:rPr>
+          <w:noProof/>
+          <w:color w:val="000000" w:themeColor="text1"/>
+        </w:rPr>
+        <w:t>8</w:t>
+      </w:r>
+      <w:r>
+        <w:fldChar w:fldCharType="end"/>
+      </w:r>
+      <w:r>
+        <w:t xml:space="preserve"> </w:t>
+      </w:r>
+      <w:r>
+        <w:t>presents the stream composition of RadFrac’s outlets. In the bottom stream, aniline has a purity of 98.8 wt%, lower than the targeted 99.5 wt%. Increasing this final purity is one of the analysis target later.</w:t>
+      </w:r>
+    </w:p>
+    <w:p/>
+    <w:p>
       <w:pPr>
         <w:pStyle w:val="Heading2"/>
         <w:rPr>
           <w:rFonts w:asciiTheme="majorBidi" w:hAnsiTheme="majorBidi" w:cstheme="majorBidi"/>
         </w:rPr>
       </w:pPr>
-      <w:bookmarkStart w:id="30" w:name="_Toc224148629"/>
+      <w:bookmarkStart w:id="31" w:name="_Toc224148629"/>
       <w:r>
         <w:rPr>
           <w:rFonts w:asciiTheme="majorBidi" w:hAnsiTheme="majorBidi" w:cstheme="majorBidi"/>
@@ -7032,11 +7986,17 @@
         </w:rPr>
         <w:t>Analysis</w:t>
       </w:r>
-      <w:bookmarkEnd w:id="30"/>
-    </w:p>
-    <w:p>
-      <w:r>
-        <w:t>From section 7 above, it is clear that the initial separator designs are inefficient. In this section, three analysis is conducted: hydrogen recycle, flash chamber design, and distillation column design.</w:t>
+      <w:bookmarkEnd w:id="31"/>
+    </w:p>
+    <w:p>
+      <w:r>
+        <w:t xml:space="preserve">From section 7 above, it is clear that the initial separator designs are inefficient. In this section, three </w:t>
+      </w:r>
+      <w:r>
+        <w:t>analyses are</w:t>
+      </w:r>
+      <w:r>
+        <w:t xml:space="preserve"> conducted: hydrogen recycle, flash chamber design, and distillation column design.</w:t>
       </w:r>
     </w:p>
     <w:p/>
@@ -7045,10 +8005,7 @@
         <w:pStyle w:val="Heading3"/>
       </w:pPr>
       <w:r>
-        <w:t xml:space="preserve">Flash Chamber </w:t>
-      </w:r>
-      <w:r>
-        <w:t>Design</w:t>
+        <w:t>Aniline &amp; Water Recovery</w:t>
       </w:r>
     </w:p>
     <w:p>
@@ -7064,6 +8021,7 @@
         <w:rPr>
           <w:noProof/>
         </w:rPr>
+        <w:lastRenderedPageBreak/>
         <w:drawing>
           <wp:inline distT="0" distB="0" distL="0" distR="0" wp14:anchorId="2FC99AB5" wp14:editId="6AC8EE32">
             <wp:extent cx="6332220" cy="3183890"/>
@@ -7112,8 +8070,8 @@
           <w:szCs w:val="24"/>
         </w:rPr>
       </w:pPr>
-      <w:bookmarkStart w:id="31" w:name="_Ref225383680"/>
-      <w:bookmarkStart w:id="32" w:name="_Ref225383685"/>
+      <w:bookmarkStart w:id="32" w:name="_Ref225383680"/>
+      <w:bookmarkStart w:id="33" w:name="_Ref225383685"/>
       <w:r>
         <w:rPr>
           <w:i w:val="0"/>
@@ -7175,7 +8133,7 @@
         </w:rPr>
         <w:fldChar w:fldCharType="end"/>
       </w:r>
-      <w:bookmarkEnd w:id="31"/>
+      <w:bookmarkEnd w:id="32"/>
       <w:r>
         <w:rPr>
           <w:i w:val="0"/>
@@ -7186,7 +8144,7 @@
         </w:rPr>
         <w:t>: Fractional recovery of aniline and water from flash chamber by varying temperature</w:t>
       </w:r>
-      <w:bookmarkEnd w:id="32"/>
+      <w:bookmarkEnd w:id="33"/>
     </w:p>
     <w:p>
       <w:r>
@@ -7251,13 +8209,13 @@
         <w:fldChar w:fldCharType="begin"/>
       </w:r>
       <w:r>
-        <w:instrText xml:space="preserve"> ADDIN ZOTERO_ITEM CSL_CITATION {"citationID":"ZJAm6WNj","properties":{"formattedCitation":"[19]","plainCitation":"[19]","noteIndex":0},"citationItems":[{"id":1091,"uris":["http://zotero.org/users/15288956/items/8VH3FGAM"],"itemData":{"id":1091,"type":"article-journal","abstract":"Research on cooling systems to date has focussed on the individual components of cooling systems, not the system as a whole. Cooling water systems should be designed and operated with consideration of all the cooling system components because of the interactions between cooling water networks and the cooling tower performance. In re-circulating cooling water systems, cooling water from the cooling tower is supplied to a network of coolers that usually has a parallel configuration. However, re-use of cooling water between different cooling duties enables cooling water networks to be designed with series arrangements. This allows better cooling tower performance and increased cooling tower capacity, both in the context of new design and retrofit. A methodology has been developed for the design of cooling networks to satisfy any supply conditions for the cooling tower. A model of cooling tower performance allows interactions between the performance of the cooling tower and the design of cooling water networks to be explored systematically. In debottlenecking situations, better design of the cooling network using the new method, including increasing cooling tower blowdown, taking hot blowdown and strategic use of air coolers, can all be used to avoid investment in new cooling tower capacity and to improve the performance of the cooling tower in a systematic way.","container-title":"Chemical Engineering Science","DOI":"10.1016/S0009-2509(01)00091-4","ISSN":"0009-2509","issue":"12","journalAbbreviation":"Chemical Engineering Science","page":"3641-3658","source":"ScienceDirect","title":"Cooling water system design","volume":"56","author":[{"family":"Kim","given":"Jin-Kuk"},{"family":"Smith","given":"Robin"}],"issued":{"date-parts":[["2001",6,1]]}}}],"schema":"https://github.com/citation-style-language/schema/raw/master/csl-citation.json"} </w:instrText>
+        <w:instrText xml:space="preserve"> ADDIN ZOTERO_ITEM CSL_CITATION {"citationID":"ZJAm6WNj","properties":{"formattedCitation":"[25]","plainCitation":"[25]","noteIndex":0},"citationItems":[{"id":1091,"uris":["http://zotero.org/users/15288956/items/8VH3FGAM"],"itemData":{"id":1091,"type":"article-journal","abstract":"Research on cooling systems to date has focussed on the individual components of cooling systems, not the system as a whole. Cooling water systems should be designed and operated with consideration of all the cooling system components because of the interactions between cooling water networks and the cooling tower performance. In re-circulating cooling water systems, cooling water from the cooling tower is supplied to a network of coolers that usually has a parallel configuration. However, re-use of cooling water between different cooling duties enables cooling water networks to be designed with series arrangements. This allows better cooling tower performance and increased cooling tower capacity, both in the context of new design and retrofit. A methodology has been developed for the design of cooling networks to satisfy any supply conditions for the cooling tower. A model of cooling tower performance allows interactions between the performance of the cooling tower and the design of cooling water networks to be explored systematically. In debottlenecking situations, better design of the cooling network using the new method, including increasing cooling tower blowdown, taking hot blowdown and strategic use of air coolers, can all be used to avoid investment in new cooling tower capacity and to improve the performance of the cooling tower in a systematic way.","container-title":"Chemical Engineering Science","DOI":"10.1016/S0009-2509(01)00091-4","ISSN":"0009-2509","issue":"12","journalAbbreviation":"Chemical Engineering Science","page":"3641-3658","source":"ScienceDirect","title":"Cooling water system design","volume":"56","author":[{"family":"Kim","given":"Jin-Kuk"},{"family":"Smith","given":"Robin"}],"issued":{"date-parts":[["2001",6,1]]}}}],"schema":"https://github.com/citation-style-language/schema/raw/master/csl-citation.json"} </w:instrText>
       </w:r>
       <w:r>
         <w:fldChar w:fldCharType="separate"/>
       </w:r>
       <w:r>
-        <w:t>[19]</w:t>
+        <w:t>[25]</w:t>
       </w:r>
       <w:r>
         <w:fldChar w:fldCharType="end"/>
@@ -7313,7 +8271,7 @@
           <w:szCs w:val="24"/>
         </w:rPr>
       </w:pPr>
-      <w:bookmarkStart w:id="33" w:name="_Ref225384773"/>
+      <w:bookmarkStart w:id="34" w:name="_Ref225384773"/>
       <w:r>
         <w:rPr>
           <w:i w:val="0"/>
@@ -7363,7 +8321,7 @@
           <w:sz w:val="24"/>
           <w:szCs w:val="24"/>
         </w:rPr>
-        <w:t>7</w:t>
+        <w:t>9</w:t>
       </w:r>
       <w:r>
         <w:rPr>
@@ -7375,7 +8333,7 @@
         </w:rPr>
         <w:fldChar w:fldCharType="end"/>
       </w:r>
-      <w:bookmarkEnd w:id="33"/>
+      <w:bookmarkEnd w:id="34"/>
       <w:r>
         <w:rPr>
           <w:i w:val="0"/>
@@ -7645,10 +8603,7 @@
         <w:fldChar w:fldCharType="begin"/>
       </w:r>
       <w:r>
-        <w:instrText xml:space="preserve"> REF _Ref225387465 \h </w:instrText>
-      </w:r>
-      <w:r>
-        <w:instrText xml:space="preserve"> \* MERGEFORMAT </w:instrText>
+        <w:instrText xml:space="preserve"> REF _Ref225387465 \h  \* MERGEFORMAT </w:instrText>
       </w:r>
       <w:r>
         <w:fldChar w:fldCharType="separate"/>
@@ -7682,6 +8637,9 @@
         <w:keepNext/>
       </w:pPr>
       <w:r>
+        <w:rPr>
+          <w:noProof/>
+        </w:rPr>
         <w:drawing>
           <wp:inline distT="0" distB="0" distL="0" distR="0" wp14:anchorId="6D81E9BB" wp14:editId="25D0A9FF">
             <wp:extent cx="6332220" cy="3206750"/>
@@ -7730,7 +8688,7 @@
           <w:szCs w:val="24"/>
         </w:rPr>
       </w:pPr>
-      <w:bookmarkStart w:id="34" w:name="_Ref225387465"/>
+      <w:bookmarkStart w:id="35" w:name="_Ref225387465"/>
       <w:r>
         <w:rPr>
           <w:i w:val="0"/>
@@ -7792,7 +8750,7 @@
         </w:rPr>
         <w:fldChar w:fldCharType="end"/>
       </w:r>
-      <w:bookmarkEnd w:id="34"/>
+      <w:bookmarkEnd w:id="35"/>
       <w:r>
         <w:rPr>
           <w:i w:val="0"/>
@@ -7810,8 +8768,18 @@
         <w:pStyle w:val="Heading3"/>
       </w:pPr>
       <w:r>
-        <w:lastRenderedPageBreak/>
-        <w:t>Distillation Column Design</w:t>
+        <w:t>Aniline Purification</w:t>
+      </w:r>
+    </w:p>
+    <w:p>
+      <w:r>
+        <w:t xml:space="preserve">The bottom stream from the flash chamber contains mostly aniline and water, as shown in &lt;TABLE&gt;. The objective of this analysis is to design a distillation column </w:t>
+      </w:r>
+      <w:r>
+        <w:t>capable of purifying</w:t>
+      </w:r>
+      <w:r>
+        <w:t xml:space="preserve"> aniline to 99.5 wt% purity.</w:t>
       </w:r>
     </w:p>
     <w:p/>
@@ -7819,40 +8787,40 @@
       <w:pPr>
         <w:pStyle w:val="Heading2"/>
       </w:pPr>
-      <w:bookmarkStart w:id="35" w:name="_Toc224148630"/>
+      <w:bookmarkStart w:id="36" w:name="_Toc224148630"/>
       <w:r>
         <w:rPr>
           <w:rFonts w:asciiTheme="majorBidi" w:hAnsiTheme="majorBidi" w:cstheme="majorBidi"/>
         </w:rPr>
         <w:t>Heat Exchanger Design</w:t>
       </w:r>
-      <w:bookmarkEnd w:id="35"/>
+      <w:bookmarkEnd w:id="36"/>
     </w:p>
     <w:p>
       <w:pPr>
         <w:pStyle w:val="Heading2"/>
       </w:pPr>
-      <w:bookmarkStart w:id="36" w:name="_Toc224148631"/>
+      <w:bookmarkStart w:id="37" w:name="_Toc224148631"/>
       <w:r>
         <w:rPr>
           <w:rFonts w:asciiTheme="majorBidi" w:hAnsiTheme="majorBidi" w:cstheme="majorBidi"/>
         </w:rPr>
         <w:t>Heat Exchanger Analysis</w:t>
       </w:r>
-      <w:bookmarkEnd w:id="36"/>
+      <w:bookmarkEnd w:id="37"/>
     </w:p>
     <w:p>
       <w:pPr>
         <w:pStyle w:val="Heading2"/>
       </w:pPr>
-      <w:bookmarkStart w:id="37" w:name="_Toc224148632"/>
+      <w:bookmarkStart w:id="38" w:name="_Toc224148632"/>
       <w:r>
         <w:rPr>
           <w:rFonts w:asciiTheme="majorBidi" w:hAnsiTheme="majorBidi" w:cstheme="majorBidi"/>
         </w:rPr>
         <w:t>Discussion/reflection</w:t>
       </w:r>
-      <w:bookmarkEnd w:id="37"/>
+      <w:bookmarkEnd w:id="38"/>
       <w:r>
         <w:rPr>
           <w:rFonts w:asciiTheme="majorBidi" w:hAnsiTheme="majorBidi" w:cstheme="majorBidi"/>
@@ -7864,14 +8832,14 @@
       <w:pPr>
         <w:pStyle w:val="Heading2"/>
       </w:pPr>
-      <w:bookmarkStart w:id="38" w:name="_Toc224148633"/>
+      <w:bookmarkStart w:id="39" w:name="_Toc224148633"/>
       <w:r>
         <w:rPr>
           <w:rFonts w:asciiTheme="majorBidi" w:hAnsiTheme="majorBidi" w:cstheme="majorBidi"/>
         </w:rPr>
         <w:t>Next steps</w:t>
       </w:r>
-      <w:bookmarkEnd w:id="38"/>
+      <w:bookmarkEnd w:id="39"/>
     </w:p>
     <w:p>
       <w:pPr>
@@ -7890,11 +8858,11 @@
       <w:pPr>
         <w:pStyle w:val="Heading2"/>
       </w:pPr>
-      <w:bookmarkStart w:id="39" w:name="_Toc224148634"/>
+      <w:bookmarkStart w:id="40" w:name="_Toc224148634"/>
       <w:r>
         <w:t>References</w:t>
       </w:r>
-      <w:bookmarkEnd w:id="39"/>
+      <w:bookmarkEnd w:id="40"/>
     </w:p>
     <w:p>
       <w:pPr>
@@ -8191,7 +9159,7 @@
       </w:r>
       <w:r>
         <w:tab/>
-        <w:t>‘Nitrobenzene’, PubChem. Accessed: Mar. 25, 2026. [Online]. Available: https://pubchem.ncbi.nlm.nih.gov/compound/7416</w:t>
+        <w:t>PubChem, ‘Nitrobenzene’. Accessed: Mar. 25, 2026. [Online]. Available: https://pubchem.ncbi.nlm.nih.gov/compound/7416</w:t>
       </w:r>
     </w:p>
     <w:p>
@@ -8203,7 +9171,7 @@
       </w:r>
       <w:r>
         <w:tab/>
-        <w:t>‘Water’, PubChem. Accessed: Oct. 03, 2024. [Online]. Available: https://pubchem.ncbi.nlm.nih.gov/compound/962</w:t>
+        <w:t>PubChem, ‘Water’. Accessed: Oct. 03, 2024. [Online]. Available: https://pubchem.ncbi.nlm.nih.gov/compound/962</w:t>
       </w:r>
     </w:p>
     <w:p>
@@ -8215,7 +9183,7 @@
       </w:r>
       <w:r>
         <w:tab/>
-        <w:t>‘Aniline’, PubChem. Accessed: Mar. 25, 2026. [Online]. Available: https://pubchem.ncbi.nlm.nih.gov/compound/6115</w:t>
+        <w:t>PubChem, ‘Aniline’. Accessed: Mar. 25, 2026. [Online]. Available: https://pubchem.ncbi.nlm.nih.gov/compound/6115</w:t>
       </w:r>
     </w:p>
     <w:p>
@@ -8246,6 +9214,118 @@
       </w:pPr>
       <w:r>
         <w:t>[19]</w:t>
+      </w:r>
+      <w:r>
+        <w:tab/>
+        <w:t xml:space="preserve">K. I. M. Al‐Malah, ‘Liquid–Liquid Extraction Process’, in </w:t>
+      </w:r>
+      <w:r>
+        <w:rPr>
+          <w:i/>
+          <w:iCs/>
+        </w:rPr>
+        <w:t>Aspen Plus®</w:t>
+      </w:r>
+      <w:r>
+        <w:t>, Wiley Online Books, 2017, pp. 131–153. doi: https://doi.org/10.1002%2F9781119293644.ch5.</w:t>
+      </w:r>
+    </w:p>
+    <w:p>
+      <w:pPr>
+        <w:pStyle w:val="Bibliography"/>
+      </w:pPr>
+      <w:r>
+        <w:t>[20]</w:t>
+      </w:r>
+      <w:r>
+        <w:tab/>
+        <w:t xml:space="preserve">P. C. Wankat, ‘Chapter 13. Liquid-Liquid Extraction’, in </w:t>
+      </w:r>
+      <w:r>
+        <w:rPr>
+          <w:i/>
+          <w:iCs/>
+        </w:rPr>
+        <w:t>Separation Process Engineering</w:t>
+      </w:r>
+      <w:r>
+        <w:t>, 5th edn, Pearson. Accessed: Mar. 26, 2026. [Online]. Available: https://learning.oreilly.com/library/view/separation-process-engineering/9780137468188/ch13.xhtml</w:t>
+      </w:r>
+    </w:p>
+    <w:p>
+      <w:pPr>
+        <w:pStyle w:val="Bibliography"/>
+      </w:pPr>
+      <w:r>
+        <w:t>[21]</w:t>
+      </w:r>
+      <w:r>
+        <w:tab/>
+        <w:t xml:space="preserve">T. C. Frank, L. Dahuron, B. S. Holden, W. D. Prince, A. F. Seibert, and L. C. Wilson, ‘Section 15: Liquid-Liquid Extraction and Other Liquid-Liquid Operations and Equipment’, in </w:t>
+      </w:r>
+      <w:r>
+        <w:rPr>
+          <w:i/>
+          <w:iCs/>
+        </w:rPr>
+        <w:t>Perry’s Chemical Engineers’ Handbook</w:t>
+      </w:r>
+      <w:r>
+        <w:t>, 8th edn, The McGraw-Hill Companies, 2008. doi: 10.1036/0071511385.</w:t>
+      </w:r>
+    </w:p>
+    <w:p>
+      <w:pPr>
+        <w:pStyle w:val="Bibliography"/>
+      </w:pPr>
+      <w:r>
+        <w:t>[22]</w:t>
+      </w:r>
+      <w:r>
+        <w:tab/>
+        <w:t xml:space="preserve">E. J. Charles and F. Morton, ‘Liquid‐liquid equilibrium data for ternary systems containing α‐picoline, hydrocarbons and water or triethylene glycol at 20°’, </w:t>
+      </w:r>
+      <w:r>
+        <w:rPr>
+          <w:i/>
+          <w:iCs/>
+        </w:rPr>
+        <w:t>J. Appl. Chem.</w:t>
+      </w:r>
+      <w:r>
+        <w:t>, vol. 7, no. 1, pp. 39–46, Jan. 1957, doi: 10.1002/jctb.5010070107.</w:t>
+      </w:r>
+    </w:p>
+    <w:p>
+      <w:pPr>
+        <w:pStyle w:val="Bibliography"/>
+      </w:pPr>
+      <w:r>
+        <w:t>[23]</w:t>
+      </w:r>
+      <w:r>
+        <w:tab/>
+        <w:t>PubChem, ‘Heptane’. Accessed: Mar. 26, 2026. [Online]. Available: https://pubchem.ncbi.nlm.nih.gov/compound/8900</w:t>
+      </w:r>
+    </w:p>
+    <w:p>
+      <w:pPr>
+        <w:pStyle w:val="Bibliography"/>
+      </w:pPr>
+      <w:r>
+        <w:t>[24]</w:t>
+      </w:r>
+      <w:r>
+        <w:tab/>
+        <w:t>J. Verrett, ‘CHBE 376 [2025W] Block 07 (Columns).pdf: CHBE_V 376 201 2025W2 Computer Flowsheeting and Unit Operation Design’. Accessed: Mar. 27, 2026. [Online]. Available: https://canvas.ubc.ca/courses/177702/files/44912135?module_item_id=9073805</w:t>
+      </w:r>
+    </w:p>
+    <w:p>
+      <w:pPr>
+        <w:pStyle w:val="Bibliography"/>
+      </w:pPr>
+      <w:r>
+        <w:t>[25]</w:t>
       </w:r>
       <w:r>
         <w:tab/>
@@ -8452,22 +9532,6 @@
       </w:r>
     </w:p>
   </w:comment>
-  <w:comment w:id="29" w:author="malhanif@student.ubc.ca" w:date="2026-03-26T02:53:00Z" w:initials="m">
-    <w:p>
-      <w:pPr>
-        <w:pStyle w:val="CommentText"/>
-      </w:pPr>
-      <w:r>
-        <w:rPr>
-          <w:rStyle w:val="CommentReference"/>
-        </w:rPr>
-        <w:annotationRef/>
-      </w:r>
-      <w:r>
-        <w:t>Could not converge</w:t>
-      </w:r>
-    </w:p>
-  </w:comment>
 </w:comments>
 </file>
 
@@ -8477,7 +9541,6 @@
   <w15:commentEx w15:paraId="4EAD9D93" w15:done="1"/>
   <w15:commentEx w15:paraId="1DD2819C" w15:paraIdParent="4EAD9D93" w15:done="1"/>
   <w15:commentEx w15:paraId="2598566A" w15:paraIdParent="4EAD9D93" w15:done="1"/>
-  <w15:commentEx w15:paraId="0B3EB5F9" w15:done="0"/>
 </w15:commentsEx>
 </file>
 
@@ -8487,7 +9550,6 @@
   <w16cex:commentExtensible w16cex:durableId="06942322" w16cex:dateUtc="2026-03-11T04:19:00Z"/>
   <w16cex:commentExtensible w16cex:durableId="55B11D6C" w16cex:dateUtc="2026-03-11T04:19:00Z"/>
   <w16cex:commentExtensible w16cex:durableId="4C9A56EC" w16cex:dateUtc="2026-03-11T04:37:00Z"/>
-  <w16cex:commentExtensible w16cex:durableId="69E379BB" w16cex:dateUtc="2026-03-26T06:53:00Z"/>
 </w16cex:commentsExtensible>
 </file>
 
@@ -8497,7 +9559,6 @@
   <w16cid:commentId w16cid:paraId="4EAD9D93" w16cid:durableId="06942322"/>
   <w16cid:commentId w16cid:paraId="1DD2819C" w16cid:durableId="55B11D6C"/>
   <w16cid:commentId w16cid:paraId="2598566A" w16cid:durableId="4C9A56EC"/>
-  <w16cid:commentId w16cid:paraId="0B3EB5F9" w16cid:durableId="69E379BB"/>
 </w16cid:commentsIds>
 </file>
 
@@ -11989,7 +13050,6 @@
   <w:style w:type="character" w:default="1" w:styleId="DefaultParagraphFont">
     <w:name w:val="Default Paragraph Font"/>
     <w:uiPriority w:val="1"/>
-    <w:semiHidden/>
     <w:unhideWhenUsed/>
   </w:style>
   <w:style w:type="table" w:default="1" w:styleId="TableNormal">
@@ -12705,19 +13765,6 @@
 </file>
 
 <file path=customXml/item2.xml><?xml version="1.0" encoding="utf-8"?>
-<?mso-contentType ?>
-<FormTemplates xmlns="http://schemas.microsoft.com/sharepoint/v3/contenttype/forms">
-  <Display>DocumentLibraryForm</Display>
-  <Edit>DocumentLibraryForm</Edit>
-  <New>DocumentLibraryForm</New>
-</FormTemplates>
-</file>
-
-<file path=customXml/item3.xml><?xml version="1.0" encoding="utf-8"?>
-<b:Sources xmlns:b="http://schemas.openxmlformats.org/officeDocument/2006/bibliography" xmlns="http://schemas.openxmlformats.org/officeDocument/2006/bibliography" SelectedStyle="\APASixthEditionOfficeOnline.xsl" StyleName="APA" Version="6"/>
-</file>
-
-<file path=customXml/item4.xml><?xml version="1.0" encoding="utf-8"?>
 <ct:contentTypeSchema xmlns:ct="http://schemas.microsoft.com/office/2006/metadata/contentType" xmlns:ma="http://schemas.microsoft.com/office/2006/metadata/properties/metaAttributes" ct:_="" ma:_="" ma:contentTypeName="Document" ma:contentTypeID="0x010100C107646D0035FA4C8F1F95DBA74C7670" ma:contentTypeVersion="18" ma:contentTypeDescription="Create a new document." ma:contentTypeScope="" ma:versionID="cee5fd123a01e1fbef544806d63a7bbe">
   <xsd:schema xmlns:xsd="http://www.w3.org/2001/XMLSchema" xmlns:xs="http://www.w3.org/2001/XMLSchema" xmlns:p="http://schemas.microsoft.com/office/2006/metadata/properties" xmlns:ns3="a169fe49-86d9-4b9f-a163-9271c3e82536" xmlns:ns4="9ec2d0b7-503f-4434-bd5e-691963e6366e" targetNamespace="http://schemas.microsoft.com/office/2006/metadata/properties" ma:root="true" ma:fieldsID="dda71d5f438c7df1ac194e497a63c795" ns3:_="" ns4:_="">
     <xsd:import namespace="a169fe49-86d9-4b9f-a163-9271c3e82536"/>
@@ -12970,6 +14017,19 @@
 </ct:contentTypeSchema>
 </file>
 
+<file path=customXml/item3.xml><?xml version="1.0" encoding="utf-8"?>
+<b:Sources xmlns:b="http://schemas.openxmlformats.org/officeDocument/2006/bibliography" xmlns="http://schemas.openxmlformats.org/officeDocument/2006/bibliography" SelectedStyle="\APASixthEditionOfficeOnline.xsl" StyleName="APA" Version="6"/>
+</file>
+
+<file path=customXml/item4.xml><?xml version="1.0" encoding="utf-8"?>
+<?mso-contentType ?>
+<FormTemplates xmlns="http://schemas.microsoft.com/sharepoint/v3/contenttype/forms">
+  <Display>DocumentLibraryForm</Display>
+  <Edit>DocumentLibraryForm</Edit>
+  <New>DocumentLibraryForm</New>
+</FormTemplates>
+</file>
+
 <file path=customXml/itemProps1.xml><?xml version="1.0" encoding="utf-8"?>
 <ds:datastoreItem xmlns:ds="http://schemas.openxmlformats.org/officeDocument/2006/customXml" ds:itemID="{2A4AFB90-AA70-40CB-8FEE-062855DEC269}">
   <ds:schemaRefs>
@@ -12981,22 +14041,6 @@
 </file>
 
 <file path=customXml/itemProps2.xml><?xml version="1.0" encoding="utf-8"?>
-<ds:datastoreItem xmlns:ds="http://schemas.openxmlformats.org/officeDocument/2006/customXml" ds:itemID="{04D26766-6D42-46FD-AE9C-F80BA223CA67}">
-  <ds:schemaRefs>
-    <ds:schemaRef ds:uri="http://schemas.microsoft.com/sharepoint/v3/contenttype/forms"/>
-  </ds:schemaRefs>
-</ds:datastoreItem>
-</file>
-
-<file path=customXml/itemProps3.xml><?xml version="1.0" encoding="utf-8"?>
-<ds:datastoreItem xmlns:ds="http://schemas.openxmlformats.org/officeDocument/2006/customXml" ds:itemID="{88749F4F-A6E8-4DC0-9276-CAFEB15C1658}">
-  <ds:schemaRefs>
-    <ds:schemaRef ds:uri="http://schemas.openxmlformats.org/officeDocument/2006/bibliography"/>
-  </ds:schemaRefs>
-</ds:datastoreItem>
-</file>
-
-<file path=customXml/itemProps4.xml><?xml version="1.0" encoding="utf-8"?>
 <ds:datastoreItem xmlns:ds="http://schemas.openxmlformats.org/officeDocument/2006/customXml" ds:itemID="{8D503597-69F4-42D1-91A8-F656D146B62B}">
   <ds:schemaRefs>
     <ds:schemaRef ds:uri="http://schemas.microsoft.com/office/2006/metadata/contentType"/>
@@ -13013,4 +14057,20 @@
     <ds:schemaRef ds:uri="http://schemas.microsoft.com/internal/obd"/>
   </ds:schemaRefs>
 </ds:datastoreItem>
+</file>
+
+<file path=customXml/itemProps3.xml><?xml version="1.0" encoding="utf-8"?>
+<ds:datastoreItem xmlns:ds="http://schemas.openxmlformats.org/officeDocument/2006/customXml" ds:itemID="{88749F4F-A6E8-4DC0-9276-CAFEB15C1658}">
+  <ds:schemaRefs>
+    <ds:schemaRef ds:uri="http://schemas.openxmlformats.org/officeDocument/2006/bibliography"/>
+  </ds:schemaRefs>
+</ds:datastoreItem>
+</file>
+
+<file path=customXml/itemProps4.xml><?xml version="1.0" encoding="utf-8"?>
+<ds:datastoreItem xmlns:ds="http://schemas.openxmlformats.org/officeDocument/2006/customXml" ds:itemID="{04D26766-6D42-46FD-AE9C-F80BA223CA67}">
+  <ds:schemaRefs>
+    <ds:schemaRef ds:uri="http://schemas.microsoft.com/sharepoint/v3/contenttype/forms"/>
+  </ds:schemaRefs>
+</ds:datastoreItem>
 </file>
</xml_diff>

<commit_message>
Completed Checkpoint 3: Column Design & Analysis
</commit_message>
<xml_diff>
--- a/Term Project - WORKING.docx
+++ b/Term Project - WORKING.docx
@@ -6986,6 +6986,12 @@
         <w:t>As the aniline-water mixture forms a liquid-liquid equilibrium, feeding this stream directly into a DSTWU proves problematic, resulting in negative minimum reflux and feed stage. For this reason, a liquid-liquid extraction technique is performed</w:t>
       </w:r>
       <w:r>
+        <w:t xml:space="preserve">. </w:t>
+      </w:r>
+      <w:r>
+        <w:t xml:space="preserve">It is for the same reason that the property method is changed to UNIFAC with Henry’s Components for this separation stage; UNIFAC models non-ideal liquid-liquid interaction much better than PSRK </w:t>
+      </w:r>
+      <w:r>
         <w:t xml:space="preserve"> </w:t>
       </w:r>
       <w:r>
@@ -7004,7 +7010,13 @@
         <w:fldChar w:fldCharType="end"/>
       </w:r>
       <w:r>
-        <w:t>. In a liquid-liquid extraction process, a solvent is used to transfer the solute (in this case, aniline) from one liquid phase to another. The remaining liquid, low on solute, is called the diluent and is disposed of</w:t>
+        <w:t>.</w:t>
+      </w:r>
+    </w:p>
+    <w:p/>
+    <w:p>
+      <w:r>
+        <w:t>In a liquid-liquid extraction process, a solvent is used to transfer the solute (in this case, aniline) from one liquid phase to another. The remaining liquid, low on solute, is called the diluent and is disposed of</w:t>
       </w:r>
       <w:r>
         <w:t xml:space="preserve"> </w:t>
@@ -7061,13 +7073,19 @@
         <w:t xml:space="preserve">For initial setup, </w:t>
       </w:r>
       <w:r>
-        <w:t xml:space="preserve">an adiabatic column with 10 stages is used. The column is operating </w:t>
-      </w:r>
-      <w:r>
-        <w:t>0.1 MPa, reducing the need for pressurising, saving operating costs.</w:t>
-      </w:r>
-      <w:r>
-        <w:t xml:space="preserve"> </w:t>
+        <w:t xml:space="preserve">an adiabatic </w:t>
+      </w:r>
+      <w:r>
+        <w:t xml:space="preserve">Extract </w:t>
+      </w:r>
+      <w:r>
+        <w:t xml:space="preserve">column with 10 stages is used. The column is operating </w:t>
+      </w:r>
+      <w:r>
+        <w:t>at 0.1 MPa, reducing the need to pressurise feed</w:t>
+      </w:r>
+      <w:r>
+        <w:t xml:space="preserve">, saving operating costs. </w:t>
       </w:r>
       <w:r>
         <w:t xml:space="preserve">Water is the key component </w:t>
@@ -7358,10 +7376,7 @@
           </w:tcPr>
           <w:p>
             <w:r>
-              <w:t>59.6</w:t>
-            </w:r>
-            <w:r>
-              <w:t>4</w:t>
+              <w:t>47.69</w:t>
             </w:r>
           </w:p>
         </w:tc>
@@ -7371,7 +7386,10 @@
           </w:tcPr>
           <w:p>
             <w:r>
-              <w:t>250.36</w:t>
+              <w:t>262.3</w:t>
+            </w:r>
+            <w:r>
+              <w:t>1</w:t>
             </w:r>
           </w:p>
         </w:tc>
@@ -7393,7 +7411,10 @@
           </w:tcPr>
           <w:p>
             <w:r>
-              <w:t>149.98</w:t>
+              <w:t>149.9</w:t>
+            </w:r>
+            <w:r>
+              <w:t>9</w:t>
             </w:r>
           </w:p>
         </w:tc>
@@ -7403,10 +7424,7 @@
           </w:tcPr>
           <w:p>
             <w:r>
-              <w:t>0.0</w:t>
-            </w:r>
-            <w:r>
-              <w:t>2</w:t>
+              <w:t>0.01</w:t>
             </w:r>
           </w:p>
         </w:tc>
@@ -7421,10 +7439,7 @@
         <w:fldChar w:fldCharType="begin"/>
       </w:r>
       <w:r>
-        <w:instrText xml:space="preserve"> REF _Ref225460715 \h </w:instrText>
-      </w:r>
-      <w:r>
-        <w:instrText xml:space="preserve"> \* MERGEFORMAT </w:instrText>
+        <w:instrText xml:space="preserve"> REF _Ref225460715 \h  \* MERGEFORMAT </w:instrText>
       </w:r>
       <w:r>
         <w:fldChar w:fldCharType="separate"/>
@@ -7508,6 +7523,7 @@
     </w:p>
     <w:p>
       <w:r>
+        <w:lastRenderedPageBreak/>
         <w:t xml:space="preserve">Due to this error, </w:t>
       </w:r>
       <w:r>
@@ -7553,8 +7569,10 @@
         </w:numPr>
       </w:pPr>
       <w:r>
-        <w:lastRenderedPageBreak/>
-        <w:t>Feed stage: 3</w:t>
+        <w:t xml:space="preserve">Feed stage: </w:t>
+      </w:r>
+      <w:r>
+        <w:t>2</w:t>
       </w:r>
     </w:p>
     <w:p>
@@ -7569,7 +7587,7 @@
         <w:t xml:space="preserve">Distillate to feed ratio: </w:t>
       </w:r>
       <w:r>
-        <w:t>0.577</w:t>
+        <w:t>0.562</w:t>
       </w:r>
     </w:p>
     <w:p>
@@ -7586,7 +7604,13 @@
         <w:t xml:space="preserve">RadFrac </w:t>
       </w:r>
       <w:r>
-        <w:t xml:space="preserve">column. Due to </w:t>
+        <w:t>column</w:t>
+      </w:r>
+      <w:r>
+        <w:t xml:space="preserve"> with a partial condenser with all vapour distillate</w:t>
+      </w:r>
+      <w:r>
+        <w:t xml:space="preserve">. Due to </w:t>
       </w:r>
       <w:r>
         <w:t>the potential existence of a liquid-liquid equilibrium region, the 3-Phase option is enabled and tested for all equilibrium stages.</w:t>
@@ -7737,10 +7761,7 @@
           </w:tcPr>
           <w:p>
             <w:r>
-              <w:t>Distillate</w:t>
-            </w:r>
-            <w:r>
-              <w:t xml:space="preserve"> Mole Flow (kmol/hr)</w:t>
+              <w:t>Distillate Mole Flow (kmol/hr)</w:t>
             </w:r>
           </w:p>
         </w:tc>
@@ -7750,10 +7771,7 @@
           </w:tcPr>
           <w:p>
             <w:r>
-              <w:t xml:space="preserve">Bottom </w:t>
-            </w:r>
-            <w:r>
-              <w:t>Mole Flow (kmol/hr)</w:t>
+              <w:t>Bottom Mole Flow (kmol/hr)</w:t>
             </w:r>
           </w:p>
         </w:tc>
@@ -7839,10 +7857,7 @@
           </w:tcPr>
           <w:p>
             <w:r>
-              <w:t>1.6</w:t>
-            </w:r>
-            <w:r>
-              <w:t>1</w:t>
+              <w:t>2.96</w:t>
             </w:r>
           </w:p>
         </w:tc>
@@ -7852,7 +7867,10 @@
           </w:tcPr>
           <w:p>
             <w:r>
-              <w:t>152.39</w:t>
+              <w:t>151.0</w:t>
+            </w:r>
+            <w:r>
+              <w:t>4</w:t>
             </w:r>
           </w:p>
         </w:tc>
@@ -7874,10 +7892,7 @@
           </w:tcPr>
           <w:p>
             <w:r>
-              <w:t>59.6</w:t>
-            </w:r>
-            <w:r>
-              <w:t>4</w:t>
+              <w:t>47.69</w:t>
             </w:r>
           </w:p>
         </w:tc>
@@ -7909,10 +7924,7 @@
           </w:tcPr>
           <w:p>
             <w:r>
-              <w:t>148.2</w:t>
-            </w:r>
-            <w:r>
-              <w:t>4</w:t>
+              <w:t>146.67</w:t>
             </w:r>
           </w:p>
         </w:tc>
@@ -7922,7 +7934,10 @@
           </w:tcPr>
           <w:p>
             <w:r>
-              <w:t>1.74</w:t>
+              <w:t>3.3</w:t>
+            </w:r>
+            <w:r>
+              <w:t>2</w:t>
             </w:r>
           </w:p>
         </w:tc>
@@ -7934,10 +7949,7 @@
         <w:fldChar w:fldCharType="begin"/>
       </w:r>
       <w:r>
-        <w:instrText xml:space="preserve"> REF _Ref225464844 \h </w:instrText>
-      </w:r>
-      <w:r>
-        <w:instrText xml:space="preserve"> \* MERGEFORMAT </w:instrText>
+        <w:instrText xml:space="preserve"> REF _Ref225464844 \h  \* MERGEFORMAT </w:instrText>
       </w:r>
       <w:r>
         <w:fldChar w:fldCharType="separate"/>
@@ -7962,7 +7974,19 @@
         <w:t xml:space="preserve"> </w:t>
       </w:r>
       <w:r>
-        <w:t>presents the stream composition of RadFrac’s outlets. In the bottom stream, aniline has a purity of 98.8 wt%, lower than the targeted 99.5 wt%. Increasing this final purity is one of the analysis target later.</w:t>
+        <w:t>presents the stream composition of RadFrac’s outlets. In the bottom stream, aniline has a purity of 9</w:t>
+      </w:r>
+      <w:r>
+        <w:t>7.7</w:t>
+      </w:r>
+      <w:r>
+        <w:t xml:space="preserve"> wt%, lower than the targeted 99.5 wt%. Increasing this final purity is one of the analysis </w:t>
+      </w:r>
+      <w:r>
+        <w:t>targets</w:t>
+      </w:r>
+      <w:r>
+        <w:t xml:space="preserve"> later.</w:t>
       </w:r>
     </w:p>
     <w:p/>
@@ -7993,10 +8017,22 @@
         <w:t xml:space="preserve">From section 7 above, it is clear that the initial separator designs are inefficient. In this section, three </w:t>
       </w:r>
       <w:r>
-        <w:t>analyses are</w:t>
-      </w:r>
-      <w:r>
-        <w:t xml:space="preserve"> conducted: hydrogen recycle, flash chamber design, and distillation column design.</w:t>
+        <w:t>analys</w:t>
+      </w:r>
+      <w:r>
+        <w:t>i</w:t>
+      </w:r>
+      <w:r>
+        <w:t>s are</w:t>
+      </w:r>
+      <w:r>
+        <w:t xml:space="preserve"> conducted: </w:t>
+      </w:r>
+      <w:r>
+        <w:t>Aniline &amp; water recovery, hydrogen recycle, and aniline purification</w:t>
+      </w:r>
+      <w:r>
+        <w:t>.</w:t>
       </w:r>
     </w:p>
     <w:p/>
@@ -8630,6 +8666,39 @@
       <w:r>
         <w:t xml:space="preserve"> the nitrobenzene conversion and fractional recovery of aniline from varying recycled split fractions. There are no noticeable differences in the measured variable, likely due to the calculator block keeping a constant feed ratio to the reactor. Hence, the selected recycled split fraction is 0.8, maximising hydrogen feed while keeping a purge line open to remove impurity.</w:t>
       </w:r>
+      <w:r>
+        <w:t xml:space="preserve"> Flashing results are shown </w:t>
+      </w:r>
+      <w:r>
+        <w:t xml:space="preserve">in </w:t>
+      </w:r>
+      <w:r>
+        <w:fldChar w:fldCharType="begin"/>
+      </w:r>
+      <w:r>
+        <w:instrText xml:space="preserve"> REF _Ref225467358 \h </w:instrText>
+      </w:r>
+      <w:r>
+        <w:instrText xml:space="preserve"> \* MERGEFORMAT </w:instrText>
+      </w:r>
+      <w:r>
+        <w:fldChar w:fldCharType="separate"/>
+      </w:r>
+      <w:r>
+        <w:t xml:space="preserve">Table </w:t>
+      </w:r>
+      <w:r>
+        <w:rPr>
+          <w:noProof/>
+        </w:rPr>
+        <w:t>10</w:t>
+      </w:r>
+      <w:r>
+        <w:fldChar w:fldCharType="end"/>
+      </w:r>
+      <w:r>
+        <w:t>.</w:t>
+      </w:r>
     </w:p>
     <w:p/>
     <w:p>
@@ -8762,7 +8831,304 @@
         <w:t>: Impact of recycle stream split fraction on nitrobenzene conversion and fractional recovery of aniline from flash chamber</w:t>
       </w:r>
     </w:p>
+    <w:p>
+      <w:pPr>
+        <w:pStyle w:val="Caption"/>
+        <w:keepNext/>
+      </w:pPr>
+      <w:bookmarkStart w:id="36" w:name="_Ref225467358"/>
+      <w:r>
+        <w:rPr>
+          <w:i w:val="0"/>
+          <w:iCs w:val="0"/>
+          <w:color w:val="auto"/>
+          <w:sz w:val="24"/>
+          <w:szCs w:val="24"/>
+        </w:rPr>
+        <w:t xml:space="preserve">Table </w:t>
+      </w:r>
+      <w:r>
+        <w:rPr>
+          <w:i w:val="0"/>
+          <w:iCs w:val="0"/>
+          <w:color w:val="auto"/>
+          <w:sz w:val="24"/>
+          <w:szCs w:val="24"/>
+        </w:rPr>
+        <w:fldChar w:fldCharType="begin"/>
+      </w:r>
+      <w:r>
+        <w:rPr>
+          <w:i w:val="0"/>
+          <w:iCs w:val="0"/>
+          <w:color w:val="auto"/>
+          <w:sz w:val="24"/>
+          <w:szCs w:val="24"/>
+        </w:rPr>
+        <w:instrText xml:space="preserve"> SEQ Table \* ARABIC </w:instrText>
+      </w:r>
+      <w:r>
+        <w:rPr>
+          <w:i w:val="0"/>
+          <w:iCs w:val="0"/>
+          <w:color w:val="auto"/>
+          <w:sz w:val="24"/>
+          <w:szCs w:val="24"/>
+        </w:rPr>
+        <w:fldChar w:fldCharType="separate"/>
+      </w:r>
+      <w:r>
+        <w:rPr>
+          <w:i w:val="0"/>
+          <w:iCs w:val="0"/>
+          <w:noProof/>
+          <w:color w:val="auto"/>
+          <w:sz w:val="24"/>
+          <w:szCs w:val="24"/>
+        </w:rPr>
+        <w:t>10</w:t>
+      </w:r>
+      <w:r>
+        <w:rPr>
+          <w:i w:val="0"/>
+          <w:iCs w:val="0"/>
+          <w:color w:val="auto"/>
+          <w:sz w:val="24"/>
+          <w:szCs w:val="24"/>
+        </w:rPr>
+        <w:fldChar w:fldCharType="end"/>
+      </w:r>
+      <w:bookmarkEnd w:id="36"/>
+      <w:r>
+        <w:rPr>
+          <w:i w:val="0"/>
+          <w:iCs w:val="0"/>
+          <w:color w:val="auto"/>
+          <w:sz w:val="24"/>
+          <w:szCs w:val="24"/>
+        </w:rPr>
+        <w:t xml:space="preserve">: Stream </w:t>
+      </w:r>
+      <w:r>
+        <w:rPr>
+          <w:i w:val="0"/>
+          <w:iCs w:val="0"/>
+          <w:color w:val="000000" w:themeColor="text1"/>
+          <w:sz w:val="24"/>
+          <w:szCs w:val="24"/>
+        </w:rPr>
+        <w:t xml:space="preserve">composition exiting flash chamber at 50 C, 1.5 MPa </w:t>
+      </w:r>
+      <w:r>
+        <w:rPr>
+          <w:i w:val="0"/>
+          <w:iCs w:val="0"/>
+          <w:color w:val="000000" w:themeColor="text1"/>
+          <w:sz w:val="24"/>
+          <w:szCs w:val="24"/>
+        </w:rPr>
+        <w:t>with</w:t>
+      </w:r>
+      <w:r>
+        <w:rPr>
+          <w:i w:val="0"/>
+          <w:iCs w:val="0"/>
+          <w:color w:val="000000" w:themeColor="text1"/>
+          <w:sz w:val="24"/>
+          <w:szCs w:val="24"/>
+        </w:rPr>
+        <w:t xml:space="preserve"> recycle</w:t>
+      </w:r>
+    </w:p>
+    <w:tbl>
+      <w:tblPr>
+        <w:tblStyle w:val="TableGrid"/>
+        <w:tblW w:w="0" w:type="auto"/>
+        <w:tblLook w:val="04A0" w:firstRow="1" w:lastRow="0" w:firstColumn="1" w:lastColumn="0" w:noHBand="0" w:noVBand="1"/>
+      </w:tblPr>
+      <w:tblGrid>
+        <w:gridCol w:w="3320"/>
+        <w:gridCol w:w="3321"/>
+        <w:gridCol w:w="3321"/>
+      </w:tblGrid>
+      <w:tr>
+        <w:tc>
+          <w:tcPr>
+            <w:tcW w:w="3320" w:type="dxa"/>
+          </w:tcPr>
+          <w:p>
+            <w:r>
+              <w:rPr>
+                <w:lang w:val="en-US" w:eastAsia="en-US"/>
+              </w:rPr>
+              <w:t>Compound</w:t>
+            </w:r>
+          </w:p>
+        </w:tc>
+        <w:tc>
+          <w:tcPr>
+            <w:tcW w:w="3321" w:type="dxa"/>
+          </w:tcPr>
+          <w:p>
+            <w:r>
+              <w:t>Mole Flow Distillate (kmol/hr)</w:t>
+            </w:r>
+          </w:p>
+        </w:tc>
+        <w:tc>
+          <w:tcPr>
+            <w:tcW w:w="3321" w:type="dxa"/>
+          </w:tcPr>
+          <w:p>
+            <w:r>
+              <w:t>Mole Flow Bottom (kmol/hr)</w:t>
+            </w:r>
+          </w:p>
+        </w:tc>
+      </w:tr>
+      <w:tr>
+        <w:tc>
+          <w:tcPr>
+            <w:tcW w:w="3320" w:type="dxa"/>
+          </w:tcPr>
+          <w:p>
+            <w:r>
+              <w:t>Hydrogen</w:t>
+            </w:r>
+          </w:p>
+        </w:tc>
+        <w:tc>
+          <w:tcPr>
+            <w:tcW w:w="3321" w:type="dxa"/>
+          </w:tcPr>
+          <w:p>
+            <w:r>
+              <w:t>308.1</w:t>
+            </w:r>
+            <w:r>
+              <w:t>2</w:t>
+            </w:r>
+          </w:p>
+        </w:tc>
+        <w:tc>
+          <w:tcPr>
+            <w:tcW w:w="3321" w:type="dxa"/>
+          </w:tcPr>
+          <w:p>
+            <w:r>
+              <w:t>1.3</w:t>
+            </w:r>
+            <w:r>
+              <w:t>2</w:t>
+            </w:r>
+          </w:p>
+        </w:tc>
+      </w:tr>
+      <w:tr>
+        <w:tc>
+          <w:tcPr>
+            <w:tcW w:w="3320" w:type="dxa"/>
+          </w:tcPr>
+          <w:p>
+            <w:r>
+              <w:t>Nitrobenzene</w:t>
+            </w:r>
+          </w:p>
+        </w:tc>
+        <w:tc>
+          <w:tcPr>
+            <w:tcW w:w="3321" w:type="dxa"/>
+          </w:tcPr>
+          <w:p>
+            <w:r>
+              <w:t>0</w:t>
+            </w:r>
+          </w:p>
+        </w:tc>
+        <w:tc>
+          <w:tcPr>
+            <w:tcW w:w="3321" w:type="dxa"/>
+          </w:tcPr>
+          <w:p>
+            <w:r>
+              <w:t>0</w:t>
+            </w:r>
+          </w:p>
+        </w:tc>
+      </w:tr>
+      <w:tr>
+        <w:tc>
+          <w:tcPr>
+            <w:tcW w:w="3320" w:type="dxa"/>
+          </w:tcPr>
+          <w:p>
+            <w:r>
+              <w:t>Aniline</w:t>
+            </w:r>
+          </w:p>
+        </w:tc>
+        <w:tc>
+          <w:tcPr>
+            <w:tcW w:w="3321" w:type="dxa"/>
+          </w:tcPr>
+          <w:p>
+            <w:r>
+              <w:t>0.0</w:t>
+            </w:r>
+            <w:r>
+              <w:t>9</w:t>
+            </w:r>
+          </w:p>
+        </w:tc>
+        <w:tc>
+          <w:tcPr>
+            <w:tcW w:w="3321" w:type="dxa"/>
+          </w:tcPr>
+          <w:p>
+            <w:r>
+              <w:t>154.7</w:t>
+            </w:r>
+            <w:r>
+              <w:t>4</w:t>
+            </w:r>
+          </w:p>
+        </w:tc>
+      </w:tr>
+      <w:tr>
+        <w:tc>
+          <w:tcPr>
+            <w:tcW w:w="3320" w:type="dxa"/>
+          </w:tcPr>
+          <w:p>
+            <w:r>
+              <w:t>Water</w:t>
+            </w:r>
+          </w:p>
+        </w:tc>
+        <w:tc>
+          <w:tcPr>
+            <w:tcW w:w="3321" w:type="dxa"/>
+          </w:tcPr>
+          <w:p>
+            <w:r>
+              <w:t>2.77</w:t>
+            </w:r>
+          </w:p>
+        </w:tc>
+        <w:tc>
+          <w:tcPr>
+            <w:tcW w:w="3321" w:type="dxa"/>
+          </w:tcPr>
+          <w:p>
+            <w:r>
+              <w:t>311.07</w:t>
+            </w:r>
+          </w:p>
+        </w:tc>
+      </w:tr>
+    </w:tbl>
     <w:p/>
+    <w:p/>
     <w:p>
       <w:pPr>
         <w:pStyle w:val="Heading3"/>
@@ -8773,54 +9139,792 @@
     </w:p>
     <w:p>
       <w:r>
-        <w:t xml:space="preserve">The bottom stream from the flash chamber contains mostly aniline and water, as shown in &lt;TABLE&gt;. The objective of this analysis is to design a distillation column </w:t>
-      </w:r>
-      <w:r>
-        <w:t>capable of purifying</w:t>
-      </w:r>
-      <w:r>
-        <w:t xml:space="preserve"> aniline to 99.5 wt% purity.</w:t>
+        <w:t xml:space="preserve">The initial </w:t>
+      </w:r>
+      <w:r>
+        <w:t xml:space="preserve">aniline purification </w:t>
+      </w:r>
+      <w:r>
+        <w:t>setup defined in section 7 has t</w:t>
+      </w:r>
+      <w:r>
+        <w:t>hree</w:t>
+      </w:r>
+      <w:r>
+        <w:t xml:space="preserve"> main shortcomings. First, the feed stream is only an estimate and is not connected to the flash chamber. Second, the heptane solvent flow rate </w:t>
+      </w:r>
+      <w:r>
+        <w:t xml:space="preserve">to liquid-liquid extraction column </w:t>
+      </w:r>
+      <w:r>
+        <w:t>is also an estimate</w:t>
+      </w:r>
+      <w:r>
+        <w:t xml:space="preserve"> and might not be optimal</w:t>
+      </w:r>
+      <w:r>
+        <w:t>.</w:t>
+      </w:r>
+      <w:r>
+        <w:t xml:space="preserve"> Third, mass purity for aniline is lower than desired.</w:t>
+      </w:r>
+      <w:r>
+        <w:t xml:space="preserve"> In this analysis section, the liquid-liquid extraction column will be connected to the flash chamber, taking its bottom stream (</w:t>
+      </w:r>
+      <w:r>
+        <w:fldChar w:fldCharType="begin"/>
+      </w:r>
+      <w:r>
+        <w:instrText xml:space="preserve"> REF _Ref225467358 \h </w:instrText>
+      </w:r>
+      <w:r>
+        <w:instrText xml:space="preserve"> \* MERGEFORMAT </w:instrText>
+      </w:r>
+      <w:r>
+        <w:fldChar w:fldCharType="separate"/>
+      </w:r>
+      <w:r>
+        <w:t xml:space="preserve">Table </w:t>
+      </w:r>
+      <w:r>
+        <w:rPr>
+          <w:noProof/>
+        </w:rPr>
+        <w:t>10</w:t>
+      </w:r>
+      <w:r>
+        <w:fldChar w:fldCharType="end"/>
+      </w:r>
+      <w:r>
+        <w:t>) as the top feed</w:t>
+      </w:r>
+      <w:r>
+        <w:t xml:space="preserve">. </w:t>
+      </w:r>
+      <w:r>
+        <w:t>A</w:t>
+      </w:r>
+      <w:r>
+        <w:t>s mentioned in section 7, the property method for this column is UNIFAC with Henry’s Components.</w:t>
       </w:r>
     </w:p>
     <w:p/>
     <w:p>
+      <w:r>
+        <w:t xml:space="preserve">To improve mass purity, several variables can be manipulated: heptane molar flow, RadFrac reflux ratio, and RadFrac distillate-to-feed (D/F) ratio. Reflux ratio is kept at 0.135 to avoid </w:t>
+      </w:r>
+      <w:r>
+        <w:t xml:space="preserve">instability issues, as seen in the previous DSTWU error. </w:t>
+      </w:r>
+      <w:r>
+        <w:t>To analyse the impact of heptane molar flow and D/F ratio on aniline purity and recovery, sensitivity analysis are used.</w:t>
+      </w:r>
+    </w:p>
+    <w:p/>
+    <w:p>
+      <w:r>
+        <w:t xml:space="preserve">Each variables are first analysed separately. On </w:t>
+      </w:r>
+      <w:r>
+        <w:t>the heptane molar flow rate, increasing values initially result</w:t>
+      </w:r>
+      <w:r>
+        <w:t xml:space="preserve"> in higher RadFrac recovery before reaching an inflexion point around 125 kmol/hr heptane. This is likely caused by the heptane saturating the RadFrac column and “bleeds” into the distillate stream. This theory is supported by the aniline mass fraction in RadFrac distillate</w:t>
+      </w:r>
+      <w:r>
+        <w:t xml:space="preserve">, decreasing as the heptane </w:t>
+      </w:r>
+      <w:r>
+        <w:lastRenderedPageBreak/>
+        <w:t xml:space="preserve">flow rate increases. For liquid-liquid aniline recovery, a higher heptane flow rate results in a higher recovery, reaching 100% at 100 kmol/hr heptane. </w:t>
+      </w:r>
+      <w:r>
+        <w:t xml:space="preserve">For </w:t>
+      </w:r>
+      <w:r>
+        <w:t xml:space="preserve">the D/F ratio, a higher ratio results in a higher aniline mass fraction but a </w:t>
+      </w:r>
+      <w:r>
+        <w:t xml:space="preserve">lower recovery. </w:t>
+      </w:r>
+      <w:r>
+        <w:t xml:space="preserve">This is shown in </w:t>
+      </w:r>
+      <w:r>
+        <w:fldChar w:fldCharType="begin"/>
+      </w:r>
+      <w:r>
+        <w:instrText xml:space="preserve"> REF _Ref225475213 \h </w:instrText>
+      </w:r>
+      <w:r>
+        <w:fldChar w:fldCharType="separate"/>
+      </w:r>
+      <w:r>
+        <w:t xml:space="preserve">Figure </w:t>
+      </w:r>
+      <w:r>
+        <w:rPr>
+          <w:noProof/>
+        </w:rPr>
+        <w:t>6</w:t>
+      </w:r>
+      <w:r>
+        <w:fldChar w:fldCharType="end"/>
+      </w:r>
+      <w:r>
+        <w:t>.</w:t>
+      </w:r>
+    </w:p>
+    <w:p/>
+    <w:p>
+      <w:pPr>
+        <w:keepNext/>
+      </w:pPr>
+      <w:r>
+        <w:drawing>
+          <wp:inline distT="0" distB="0" distL="0" distR="0" wp14:anchorId="0CFD9CE6" wp14:editId="219FDC62">
+            <wp:extent cx="6332220" cy="3195955"/>
+            <wp:effectExtent l="0" t="0" r="0" b="4445"/>
+            <wp:docPr id="1459333075" name="Picture 1"/>
+            <wp:cNvGraphicFramePr>
+              <a:graphicFrameLocks xmlns:a="http://schemas.openxmlformats.org/drawingml/2006/main" noChangeAspect="1"/>
+            </wp:cNvGraphicFramePr>
+            <a:graphic xmlns:a="http://schemas.openxmlformats.org/drawingml/2006/main">
+              <a:graphicData uri="http://schemas.openxmlformats.org/drawingml/2006/picture">
+                <pic:pic xmlns:pic="http://schemas.openxmlformats.org/drawingml/2006/picture">
+                  <pic:nvPicPr>
+                    <pic:cNvPr id="1459333075" name=""/>
+                    <pic:cNvPicPr/>
+                  </pic:nvPicPr>
+                  <pic:blipFill>
+                    <a:blip r:embed="rId28"/>
+                    <a:stretch>
+                      <a:fillRect/>
+                    </a:stretch>
+                  </pic:blipFill>
+                  <pic:spPr>
+                    <a:xfrm>
+                      <a:off x="0" y="0"/>
+                      <a:ext cx="6332220" cy="3195955"/>
+                    </a:xfrm>
+                    <a:prstGeom prst="rect">
+                      <a:avLst/>
+                    </a:prstGeom>
+                  </pic:spPr>
+                </pic:pic>
+              </a:graphicData>
+            </a:graphic>
+          </wp:inline>
+        </w:drawing>
+      </w:r>
+    </w:p>
+    <w:p>
+      <w:pPr>
+        <w:pStyle w:val="Caption"/>
+        <w:rPr>
+          <w:i w:val="0"/>
+          <w:iCs w:val="0"/>
+          <w:color w:val="auto"/>
+          <w:sz w:val="24"/>
+          <w:szCs w:val="24"/>
+        </w:rPr>
+      </w:pPr>
+      <w:bookmarkStart w:id="37" w:name="_Ref225475213"/>
+      <w:r>
+        <w:rPr>
+          <w:i w:val="0"/>
+          <w:iCs w:val="0"/>
+          <w:color w:val="auto"/>
+          <w:sz w:val="24"/>
+          <w:szCs w:val="24"/>
+        </w:rPr>
+        <w:t xml:space="preserve">Figure </w:t>
+      </w:r>
+      <w:r>
+        <w:rPr>
+          <w:i w:val="0"/>
+          <w:iCs w:val="0"/>
+          <w:color w:val="auto"/>
+          <w:sz w:val="24"/>
+          <w:szCs w:val="24"/>
+        </w:rPr>
+        <w:fldChar w:fldCharType="begin"/>
+      </w:r>
+      <w:r>
+        <w:rPr>
+          <w:i w:val="0"/>
+          <w:iCs w:val="0"/>
+          <w:color w:val="auto"/>
+          <w:sz w:val="24"/>
+          <w:szCs w:val="24"/>
+        </w:rPr>
+        <w:instrText xml:space="preserve"> SEQ Figure \* ARABIC </w:instrText>
+      </w:r>
+      <w:r>
+        <w:rPr>
+          <w:i w:val="0"/>
+          <w:iCs w:val="0"/>
+          <w:color w:val="auto"/>
+          <w:sz w:val="24"/>
+          <w:szCs w:val="24"/>
+        </w:rPr>
+        <w:fldChar w:fldCharType="separate"/>
+      </w:r>
+      <w:r>
+        <w:rPr>
+          <w:i w:val="0"/>
+          <w:iCs w:val="0"/>
+          <w:noProof/>
+          <w:color w:val="auto"/>
+          <w:sz w:val="24"/>
+          <w:szCs w:val="24"/>
+        </w:rPr>
+        <w:t>6</w:t>
+      </w:r>
+      <w:r>
+        <w:rPr>
+          <w:i w:val="0"/>
+          <w:iCs w:val="0"/>
+          <w:color w:val="auto"/>
+          <w:sz w:val="24"/>
+          <w:szCs w:val="24"/>
+        </w:rPr>
+        <w:fldChar w:fldCharType="end"/>
+      </w:r>
+      <w:bookmarkEnd w:id="37"/>
+      <w:r>
+        <w:rPr>
+          <w:i w:val="0"/>
+          <w:iCs w:val="0"/>
+          <w:color w:val="auto"/>
+          <w:sz w:val="24"/>
+          <w:szCs w:val="24"/>
+        </w:rPr>
+        <w:t>: Impact of heptane molar flow rate to aniline recovery and mass fraction</w:t>
+      </w:r>
+    </w:p>
+    <w:p>
+      <w:pPr>
+        <w:keepNext/>
+      </w:pPr>
+      <w:r>
+        <w:drawing>
+          <wp:inline distT="0" distB="0" distL="0" distR="0" wp14:anchorId="2DB3A0C3" wp14:editId="277714FA">
+            <wp:extent cx="6332220" cy="3176905"/>
+            <wp:effectExtent l="0" t="0" r="0" b="4445"/>
+            <wp:docPr id="233848050" name="Picture 1"/>
+            <wp:cNvGraphicFramePr>
+              <a:graphicFrameLocks xmlns:a="http://schemas.openxmlformats.org/drawingml/2006/main" noChangeAspect="1"/>
+            </wp:cNvGraphicFramePr>
+            <a:graphic xmlns:a="http://schemas.openxmlformats.org/drawingml/2006/main">
+              <a:graphicData uri="http://schemas.openxmlformats.org/drawingml/2006/picture">
+                <pic:pic xmlns:pic="http://schemas.openxmlformats.org/drawingml/2006/picture">
+                  <pic:nvPicPr>
+                    <pic:cNvPr id="233848050" name=""/>
+                    <pic:cNvPicPr/>
+                  </pic:nvPicPr>
+                  <pic:blipFill>
+                    <a:blip r:embed="rId29"/>
+                    <a:stretch>
+                      <a:fillRect/>
+                    </a:stretch>
+                  </pic:blipFill>
+                  <pic:spPr>
+                    <a:xfrm>
+                      <a:off x="0" y="0"/>
+                      <a:ext cx="6332220" cy="3176905"/>
+                    </a:xfrm>
+                    <a:prstGeom prst="rect">
+                      <a:avLst/>
+                    </a:prstGeom>
+                  </pic:spPr>
+                </pic:pic>
+              </a:graphicData>
+            </a:graphic>
+          </wp:inline>
+        </w:drawing>
+      </w:r>
+    </w:p>
+    <w:p>
+      <w:pPr>
+        <w:pStyle w:val="Caption"/>
+        <w:rPr>
+          <w:i w:val="0"/>
+          <w:iCs w:val="0"/>
+          <w:color w:val="auto"/>
+          <w:sz w:val="24"/>
+          <w:szCs w:val="24"/>
+        </w:rPr>
+      </w:pPr>
+      <w:r>
+        <w:rPr>
+          <w:i w:val="0"/>
+          <w:iCs w:val="0"/>
+          <w:color w:val="auto"/>
+          <w:sz w:val="24"/>
+          <w:szCs w:val="24"/>
+        </w:rPr>
+        <w:t xml:space="preserve">Figure </w:t>
+      </w:r>
+      <w:r>
+        <w:rPr>
+          <w:i w:val="0"/>
+          <w:iCs w:val="0"/>
+          <w:color w:val="auto"/>
+          <w:sz w:val="24"/>
+          <w:szCs w:val="24"/>
+        </w:rPr>
+        <w:fldChar w:fldCharType="begin"/>
+      </w:r>
+      <w:r>
+        <w:rPr>
+          <w:i w:val="0"/>
+          <w:iCs w:val="0"/>
+          <w:color w:val="auto"/>
+          <w:sz w:val="24"/>
+          <w:szCs w:val="24"/>
+        </w:rPr>
+        <w:instrText xml:space="preserve"> SEQ Figure \* ARABIC </w:instrText>
+      </w:r>
+      <w:r>
+        <w:rPr>
+          <w:i w:val="0"/>
+          <w:iCs w:val="0"/>
+          <w:color w:val="auto"/>
+          <w:sz w:val="24"/>
+          <w:szCs w:val="24"/>
+        </w:rPr>
+        <w:fldChar w:fldCharType="separate"/>
+      </w:r>
+      <w:r>
+        <w:rPr>
+          <w:i w:val="0"/>
+          <w:iCs w:val="0"/>
+          <w:noProof/>
+          <w:color w:val="auto"/>
+          <w:sz w:val="24"/>
+          <w:szCs w:val="24"/>
+        </w:rPr>
+        <w:t>7</w:t>
+      </w:r>
+      <w:r>
+        <w:rPr>
+          <w:i w:val="0"/>
+          <w:iCs w:val="0"/>
+          <w:color w:val="auto"/>
+          <w:sz w:val="24"/>
+          <w:szCs w:val="24"/>
+        </w:rPr>
+        <w:fldChar w:fldCharType="end"/>
+      </w:r>
+      <w:r>
+        <w:rPr>
+          <w:i w:val="0"/>
+          <w:iCs w:val="0"/>
+          <w:color w:val="auto"/>
+          <w:sz w:val="24"/>
+          <w:szCs w:val="24"/>
+        </w:rPr>
+        <w:t>: Impact of RadFrac D/F ratio on aniline recovery and mass fraction</w:t>
+      </w:r>
+    </w:p>
+    <w:p>
+      <w:r>
+        <w:t>Based on the observations above, there appears to be a sweet spot between heptane molar flow rate and D/F ratio producing high purity aniline with good recovery. To find this, a third sensitivity analysis is devised, varying the heptane flow rate between 1</w:t>
+      </w:r>
+      <w:r>
+        <w:t>1</w:t>
+      </w:r>
+      <w:r>
+        <w:t>5 and 150 kmol/hr and the D/F ratio between 0.35 and 0.55.</w:t>
+      </w:r>
+    </w:p>
+    <w:p/>
+    <w:p>
+      <w:r>
+        <w:lastRenderedPageBreak/>
+        <w:t xml:space="preserve">The final selected specification is 100 kmol/hr heptane molar flow rate and 0.51 RadFrac D/F ratio. At this condition, aniline output is of 99.7% purity and recovery in RadFrac column is 98.1%. Final stream composition is listed </w:t>
+      </w:r>
+      <w:r>
+        <w:t xml:space="preserve">in </w:t>
+      </w:r>
+      <w:r>
+        <w:fldChar w:fldCharType="begin"/>
+      </w:r>
+      <w:r>
+        <w:instrText xml:space="preserve"> REF _Ref225476828 \h </w:instrText>
+      </w:r>
+      <w:r>
+        <w:instrText xml:space="preserve"> \* MERGEFORMAT </w:instrText>
+      </w:r>
+      <w:r>
+        <w:fldChar w:fldCharType="separate"/>
+      </w:r>
+      <w:r>
+        <w:t xml:space="preserve">Table </w:t>
+      </w:r>
+      <w:r>
+        <w:rPr>
+          <w:noProof/>
+        </w:rPr>
+        <w:t>11</w:t>
+      </w:r>
+      <w:r>
+        <w:fldChar w:fldCharType="end"/>
+      </w:r>
+      <w:r>
+        <w:t>.</w:t>
+      </w:r>
+    </w:p>
+    <w:p/>
+    <w:p>
+      <w:pPr>
+        <w:pStyle w:val="Caption"/>
+        <w:keepNext/>
+        <w:rPr>
+          <w:i w:val="0"/>
+          <w:iCs w:val="0"/>
+          <w:color w:val="auto"/>
+          <w:sz w:val="24"/>
+          <w:szCs w:val="24"/>
+        </w:rPr>
+      </w:pPr>
+      <w:bookmarkStart w:id="38" w:name="_Ref225476828"/>
+      <w:r>
+        <w:rPr>
+          <w:i w:val="0"/>
+          <w:iCs w:val="0"/>
+          <w:color w:val="auto"/>
+          <w:sz w:val="24"/>
+          <w:szCs w:val="24"/>
+        </w:rPr>
+        <w:t xml:space="preserve">Table </w:t>
+      </w:r>
+      <w:r>
+        <w:rPr>
+          <w:i w:val="0"/>
+          <w:iCs w:val="0"/>
+          <w:color w:val="auto"/>
+          <w:sz w:val="24"/>
+          <w:szCs w:val="24"/>
+        </w:rPr>
+        <w:fldChar w:fldCharType="begin"/>
+      </w:r>
+      <w:r>
+        <w:rPr>
+          <w:i w:val="0"/>
+          <w:iCs w:val="0"/>
+          <w:color w:val="auto"/>
+          <w:sz w:val="24"/>
+          <w:szCs w:val="24"/>
+        </w:rPr>
+        <w:instrText xml:space="preserve"> SEQ Table \* ARABIC </w:instrText>
+      </w:r>
+      <w:r>
+        <w:rPr>
+          <w:i w:val="0"/>
+          <w:iCs w:val="0"/>
+          <w:color w:val="auto"/>
+          <w:sz w:val="24"/>
+          <w:szCs w:val="24"/>
+        </w:rPr>
+        <w:fldChar w:fldCharType="separate"/>
+      </w:r>
+      <w:r>
+        <w:rPr>
+          <w:i w:val="0"/>
+          <w:iCs w:val="0"/>
+          <w:noProof/>
+          <w:color w:val="auto"/>
+          <w:sz w:val="24"/>
+          <w:szCs w:val="24"/>
+        </w:rPr>
+        <w:t>11</w:t>
+      </w:r>
+      <w:r>
+        <w:rPr>
+          <w:i w:val="0"/>
+          <w:iCs w:val="0"/>
+          <w:color w:val="auto"/>
+          <w:sz w:val="24"/>
+          <w:szCs w:val="24"/>
+        </w:rPr>
+        <w:fldChar w:fldCharType="end"/>
+      </w:r>
+      <w:bookmarkEnd w:id="38"/>
+      <w:r>
+        <w:rPr>
+          <w:i w:val="0"/>
+          <w:iCs w:val="0"/>
+          <w:color w:val="auto"/>
+          <w:sz w:val="24"/>
+          <w:szCs w:val="24"/>
+        </w:rPr>
+        <w:t>:</w:t>
+      </w:r>
+      <w:r>
+        <w:rPr>
+          <w:i w:val="0"/>
+          <w:iCs w:val="0"/>
+          <w:color w:val="auto"/>
+          <w:sz w:val="24"/>
+          <w:szCs w:val="24"/>
+        </w:rPr>
+        <w:t xml:space="preserve"> Final stream composition leaving RadFrac distillation column</w:t>
+      </w:r>
+    </w:p>
+    <w:tbl>
+      <w:tblPr>
+        <w:tblStyle w:val="TableGrid"/>
+        <w:tblW w:w="0" w:type="auto"/>
+        <w:tblLook w:val="04A0" w:firstRow="1" w:lastRow="0" w:firstColumn="1" w:lastColumn="0" w:noHBand="0" w:noVBand="1"/>
+      </w:tblPr>
+      <w:tblGrid>
+        <w:gridCol w:w="3320"/>
+        <w:gridCol w:w="3321"/>
+        <w:gridCol w:w="3321"/>
+      </w:tblGrid>
+      <w:tr>
+        <w:tc>
+          <w:tcPr>
+            <w:tcW w:w="3320" w:type="dxa"/>
+          </w:tcPr>
+          <w:p>
+            <w:r>
+              <w:rPr>
+                <w:lang w:val="en-US" w:eastAsia="en-US"/>
+              </w:rPr>
+              <w:t>Compound</w:t>
+            </w:r>
+          </w:p>
+        </w:tc>
+        <w:tc>
+          <w:tcPr>
+            <w:tcW w:w="3321" w:type="dxa"/>
+          </w:tcPr>
+          <w:p>
+            <w:r>
+              <w:t>Mole Flow Distillate (kmol/hr)</w:t>
+            </w:r>
+          </w:p>
+        </w:tc>
+        <w:tc>
+          <w:tcPr>
+            <w:tcW w:w="3321" w:type="dxa"/>
+          </w:tcPr>
+          <w:p>
+            <w:r>
+              <w:t>Mole Flow Bottom (kmol/hr)</w:t>
+            </w:r>
+          </w:p>
+        </w:tc>
+      </w:tr>
+      <w:tr>
+        <w:tc>
+          <w:tcPr>
+            <w:tcW w:w="3320" w:type="dxa"/>
+          </w:tcPr>
+          <w:p>
+            <w:r>
+              <w:t>Hydrogen</w:t>
+            </w:r>
+          </w:p>
+        </w:tc>
+        <w:tc>
+          <w:tcPr>
+            <w:tcW w:w="3321" w:type="dxa"/>
+          </w:tcPr>
+          <w:p>
+            <w:r>
+              <w:t>1.3</w:t>
+            </w:r>
+            <w:r>
+              <w:t>2</w:t>
+            </w:r>
+          </w:p>
+        </w:tc>
+        <w:tc>
+          <w:tcPr>
+            <w:tcW w:w="3321" w:type="dxa"/>
+          </w:tcPr>
+          <w:p>
+            <w:r>
+              <w:t>Trace</w:t>
+            </w:r>
+          </w:p>
+        </w:tc>
+      </w:tr>
+      <w:tr>
+        <w:tc>
+          <w:tcPr>
+            <w:tcW w:w="3320" w:type="dxa"/>
+          </w:tcPr>
+          <w:p>
+            <w:r>
+              <w:t>Nitrobenzene</w:t>
+            </w:r>
+          </w:p>
+        </w:tc>
+        <w:tc>
+          <w:tcPr>
+            <w:tcW w:w="3321" w:type="dxa"/>
+          </w:tcPr>
+          <w:p>
+            <w:r>
+              <w:t>0</w:t>
+            </w:r>
+          </w:p>
+        </w:tc>
+        <w:tc>
+          <w:tcPr>
+            <w:tcW w:w="3321" w:type="dxa"/>
+          </w:tcPr>
+          <w:p>
+            <w:r>
+              <w:t>0</w:t>
+            </w:r>
+          </w:p>
+        </w:tc>
+      </w:tr>
+      <w:tr>
+        <w:tc>
+          <w:tcPr>
+            <w:tcW w:w="3320" w:type="dxa"/>
+          </w:tcPr>
+          <w:p>
+            <w:r>
+              <w:t>Aniline</w:t>
+            </w:r>
+          </w:p>
+        </w:tc>
+        <w:tc>
+          <w:tcPr>
+            <w:tcW w:w="3321" w:type="dxa"/>
+          </w:tcPr>
+          <w:p>
+            <w:r>
+              <w:t>2.8</w:t>
+            </w:r>
+            <w:r>
+              <w:t>9</w:t>
+            </w:r>
+          </w:p>
+        </w:tc>
+        <w:tc>
+          <w:tcPr>
+            <w:tcW w:w="3321" w:type="dxa"/>
+          </w:tcPr>
+          <w:p>
+            <w:r>
+              <w:t>151.85</w:t>
+            </w:r>
+          </w:p>
+        </w:tc>
+      </w:tr>
+      <w:tr>
+        <w:tc>
+          <w:tcPr>
+            <w:tcW w:w="3320" w:type="dxa"/>
+          </w:tcPr>
+          <w:p>
+            <w:r>
+              <w:t>Water</w:t>
+            </w:r>
+          </w:p>
+        </w:tc>
+        <w:tc>
+          <w:tcPr>
+            <w:tcW w:w="3321" w:type="dxa"/>
+          </w:tcPr>
+          <w:p>
+            <w:r>
+              <w:t>54.78</w:t>
+            </w:r>
+          </w:p>
+        </w:tc>
+        <w:tc>
+          <w:tcPr>
+            <w:tcW w:w="3321" w:type="dxa"/>
+          </w:tcPr>
+          <w:p>
+            <w:r>
+              <w:t>Trace</w:t>
+            </w:r>
+          </w:p>
+        </w:tc>
+      </w:tr>
+      <w:tr>
+        <w:tc>
+          <w:tcPr>
+            <w:tcW w:w="3320" w:type="dxa"/>
+          </w:tcPr>
+          <w:p>
+            <w:r>
+              <w:t>Heptane</w:t>
+            </w:r>
+          </w:p>
+        </w:tc>
+        <w:tc>
+          <w:tcPr>
+            <w:tcW w:w="3321" w:type="dxa"/>
+          </w:tcPr>
+          <w:p>
+            <w:r>
+              <w:t>99.53</w:t>
+            </w:r>
+          </w:p>
+        </w:tc>
+        <w:tc>
+          <w:tcPr>
+            <w:tcW w:w="3321" w:type="dxa"/>
+          </w:tcPr>
+          <w:p>
+            <w:r>
+              <w:t>0.45</w:t>
+            </w:r>
+          </w:p>
+        </w:tc>
+      </w:tr>
+    </w:tbl>
+    <w:p/>
+    <w:p>
       <w:pPr>
         <w:pStyle w:val="Heading2"/>
       </w:pPr>
-      <w:bookmarkStart w:id="36" w:name="_Toc224148630"/>
+      <w:bookmarkStart w:id="39" w:name="_Toc224148630"/>
       <w:r>
         <w:rPr>
           <w:rFonts w:asciiTheme="majorBidi" w:hAnsiTheme="majorBidi" w:cstheme="majorBidi"/>
         </w:rPr>
         <w:t>Heat Exchanger Design</w:t>
       </w:r>
-      <w:bookmarkEnd w:id="36"/>
+      <w:bookmarkEnd w:id="39"/>
     </w:p>
     <w:p>
       <w:pPr>
         <w:pStyle w:val="Heading2"/>
       </w:pPr>
-      <w:bookmarkStart w:id="37" w:name="_Toc224148631"/>
+      <w:bookmarkStart w:id="40" w:name="_Toc224148631"/>
       <w:r>
         <w:rPr>
           <w:rFonts w:asciiTheme="majorBidi" w:hAnsiTheme="majorBidi" w:cstheme="majorBidi"/>
         </w:rPr>
         <w:t>Heat Exchanger Analysis</w:t>
       </w:r>
-      <w:bookmarkEnd w:id="37"/>
+      <w:bookmarkEnd w:id="40"/>
     </w:p>
     <w:p>
       <w:pPr>
         <w:pStyle w:val="Heading2"/>
       </w:pPr>
-      <w:bookmarkStart w:id="38" w:name="_Toc224148632"/>
+      <w:bookmarkStart w:id="41" w:name="_Toc224148632"/>
       <w:r>
         <w:rPr>
           <w:rFonts w:asciiTheme="majorBidi" w:hAnsiTheme="majorBidi" w:cstheme="majorBidi"/>
         </w:rPr>
         <w:t>Discussion/reflection</w:t>
       </w:r>
-      <w:bookmarkEnd w:id="38"/>
+      <w:bookmarkEnd w:id="41"/>
       <w:r>
         <w:rPr>
           <w:rFonts w:asciiTheme="majorBidi" w:hAnsiTheme="majorBidi" w:cstheme="majorBidi"/>
@@ -8832,14 +9936,14 @@
       <w:pPr>
         <w:pStyle w:val="Heading2"/>
       </w:pPr>
-      <w:bookmarkStart w:id="39" w:name="_Toc224148633"/>
+      <w:bookmarkStart w:id="42" w:name="_Toc224148633"/>
       <w:r>
         <w:rPr>
           <w:rFonts w:asciiTheme="majorBidi" w:hAnsiTheme="majorBidi" w:cstheme="majorBidi"/>
         </w:rPr>
         <w:t>Next steps</w:t>
       </w:r>
-      <w:bookmarkEnd w:id="39"/>
+      <w:bookmarkEnd w:id="42"/>
     </w:p>
     <w:p>
       <w:pPr>
@@ -8858,11 +9962,11 @@
       <w:pPr>
         <w:pStyle w:val="Heading2"/>
       </w:pPr>
-      <w:bookmarkStart w:id="40" w:name="_Toc224148634"/>
+      <w:bookmarkStart w:id="43" w:name="_Toc224148634"/>
       <w:r>
         <w:t>References</w:t>
       </w:r>
-      <w:bookmarkEnd w:id="40"/>
+      <w:bookmarkEnd w:id="43"/>
     </w:p>
     <w:p>
       <w:pPr>
@@ -9420,7 +10524,7 @@
                     <pic:cNvPicPr/>
                   </pic:nvPicPr>
                   <pic:blipFill>
-                    <a:blip r:embed="rId28"/>
+                    <a:blip r:embed="rId30"/>
                     <a:stretch>
                       <a:fillRect/>
                     </a:stretch>
@@ -12337,6 +13441,95 @@
       <w:lvlJc w:val="right"/>
       <w:pPr>
         <w:ind w:left="7200" w:hanging="180"/>
+      </w:pPr>
+    </w:lvl>
+  </w:abstractNum>
+  <w:abstractNum w:abstractNumId="24" w15:restartNumberingAfterBreak="0">
+    <w:nsid w:val="7BF24BC7"/>
+    <w:multiLevelType w:val="hybridMultilevel"/>
+    <w:tmpl w:val="87ECEA46"/>
+    <w:lvl w:ilvl="0" w:tplc="1009000F">
+      <w:start w:val="1"/>
+      <w:numFmt w:val="decimal"/>
+      <w:lvlText w:val="%1."/>
+      <w:lvlJc w:val="left"/>
+      <w:pPr>
+        <w:ind w:left="720" w:hanging="360"/>
+      </w:pPr>
+      <w:rPr>
+        <w:rFonts w:hint="default"/>
+      </w:rPr>
+    </w:lvl>
+    <w:lvl w:ilvl="1" w:tplc="10090019" w:tentative="1">
+      <w:start w:val="1"/>
+      <w:numFmt w:val="lowerLetter"/>
+      <w:lvlText w:val="%2."/>
+      <w:lvlJc w:val="left"/>
+      <w:pPr>
+        <w:ind w:left="1440" w:hanging="360"/>
+      </w:pPr>
+    </w:lvl>
+    <w:lvl w:ilvl="2" w:tplc="1009001B" w:tentative="1">
+      <w:start w:val="1"/>
+      <w:numFmt w:val="lowerRoman"/>
+      <w:lvlText w:val="%3."/>
+      <w:lvlJc w:val="right"/>
+      <w:pPr>
+        <w:ind w:left="2160" w:hanging="180"/>
+      </w:pPr>
+    </w:lvl>
+    <w:lvl w:ilvl="3" w:tplc="1009000F" w:tentative="1">
+      <w:start w:val="1"/>
+      <w:numFmt w:val="decimal"/>
+      <w:lvlText w:val="%4."/>
+      <w:lvlJc w:val="left"/>
+      <w:pPr>
+        <w:ind w:left="2880" w:hanging="360"/>
+      </w:pPr>
+    </w:lvl>
+    <w:lvl w:ilvl="4" w:tplc="10090019" w:tentative="1">
+      <w:start w:val="1"/>
+      <w:numFmt w:val="lowerLetter"/>
+      <w:lvlText w:val="%5."/>
+      <w:lvlJc w:val="left"/>
+      <w:pPr>
+        <w:ind w:left="3600" w:hanging="360"/>
+      </w:pPr>
+    </w:lvl>
+    <w:lvl w:ilvl="5" w:tplc="1009001B" w:tentative="1">
+      <w:start w:val="1"/>
+      <w:numFmt w:val="lowerRoman"/>
+      <w:lvlText w:val="%6."/>
+      <w:lvlJc w:val="right"/>
+      <w:pPr>
+        <w:ind w:left="4320" w:hanging="180"/>
+      </w:pPr>
+    </w:lvl>
+    <w:lvl w:ilvl="6" w:tplc="1009000F" w:tentative="1">
+      <w:start w:val="1"/>
+      <w:numFmt w:val="decimal"/>
+      <w:lvlText w:val="%7."/>
+      <w:lvlJc w:val="left"/>
+      <w:pPr>
+        <w:ind w:left="5040" w:hanging="360"/>
+      </w:pPr>
+    </w:lvl>
+    <w:lvl w:ilvl="7" w:tplc="10090019" w:tentative="1">
+      <w:start w:val="1"/>
+      <w:numFmt w:val="lowerLetter"/>
+      <w:lvlText w:val="%8."/>
+      <w:lvlJc w:val="left"/>
+      <w:pPr>
+        <w:ind w:left="5760" w:hanging="360"/>
+      </w:pPr>
+    </w:lvl>
+    <w:lvl w:ilvl="8" w:tplc="1009001B" w:tentative="1">
+      <w:start w:val="1"/>
+      <w:numFmt w:val="lowerRoman"/>
+      <w:lvlText w:val="%9."/>
+      <w:lvlJc w:val="right"/>
+      <w:pPr>
+        <w:ind w:left="6480" w:hanging="180"/>
       </w:pPr>
     </w:lvl>
   </w:abstractNum>
@@ -12417,6 +13610,9 @@
   </w:num>
   <w:num w:numId="26" w16cid:durableId="1662344992">
     <w:abstractNumId w:val="2"/>
+  </w:num>
+  <w:num w:numId="27" w16cid:durableId="645160714">
+    <w:abstractNumId w:val="24"/>
   </w:num>
 </w:numbering>
 </file>
@@ -13050,6 +14246,7 @@
   <w:style w:type="character" w:default="1" w:styleId="DefaultParagraphFont">
     <w:name w:val="Default Paragraph Font"/>
     <w:uiPriority w:val="1"/>
+    <w:semiHidden/>
     <w:unhideWhenUsed/>
   </w:style>
   <w:style w:type="table" w:default="1" w:styleId="TableNormal">
@@ -13765,6 +14962,19 @@
 </file>
 
 <file path=customXml/item2.xml><?xml version="1.0" encoding="utf-8"?>
+<?mso-contentType ?>
+<FormTemplates xmlns="http://schemas.microsoft.com/sharepoint/v3/contenttype/forms">
+  <Display>DocumentLibraryForm</Display>
+  <Edit>DocumentLibraryForm</Edit>
+  <New>DocumentLibraryForm</New>
+</FormTemplates>
+</file>
+
+<file path=customXml/item3.xml><?xml version="1.0" encoding="utf-8"?>
+<b:Sources xmlns:b="http://schemas.openxmlformats.org/officeDocument/2006/bibliography" xmlns="http://schemas.openxmlformats.org/officeDocument/2006/bibliography" SelectedStyle="\APASixthEditionOfficeOnline.xsl" StyleName="APA" Version="6"/>
+</file>
+
+<file path=customXml/item4.xml><?xml version="1.0" encoding="utf-8"?>
 <ct:contentTypeSchema xmlns:ct="http://schemas.microsoft.com/office/2006/metadata/contentType" xmlns:ma="http://schemas.microsoft.com/office/2006/metadata/properties/metaAttributes" ct:_="" ma:_="" ma:contentTypeName="Document" ma:contentTypeID="0x010100C107646D0035FA4C8F1F95DBA74C7670" ma:contentTypeVersion="18" ma:contentTypeDescription="Create a new document." ma:contentTypeScope="" ma:versionID="cee5fd123a01e1fbef544806d63a7bbe">
   <xsd:schema xmlns:xsd="http://www.w3.org/2001/XMLSchema" xmlns:xs="http://www.w3.org/2001/XMLSchema" xmlns:p="http://schemas.microsoft.com/office/2006/metadata/properties" xmlns:ns3="a169fe49-86d9-4b9f-a163-9271c3e82536" xmlns:ns4="9ec2d0b7-503f-4434-bd5e-691963e6366e" targetNamespace="http://schemas.microsoft.com/office/2006/metadata/properties" ma:root="true" ma:fieldsID="dda71d5f438c7df1ac194e497a63c795" ns3:_="" ns4:_="">
     <xsd:import namespace="a169fe49-86d9-4b9f-a163-9271c3e82536"/>
@@ -14017,19 +15227,6 @@
 </ct:contentTypeSchema>
 </file>
 
-<file path=customXml/item3.xml><?xml version="1.0" encoding="utf-8"?>
-<b:Sources xmlns:b="http://schemas.openxmlformats.org/officeDocument/2006/bibliography" xmlns="http://schemas.openxmlformats.org/officeDocument/2006/bibliography" SelectedStyle="\APASixthEditionOfficeOnline.xsl" StyleName="APA" Version="6"/>
-</file>
-
-<file path=customXml/item4.xml><?xml version="1.0" encoding="utf-8"?>
-<?mso-contentType ?>
-<FormTemplates xmlns="http://schemas.microsoft.com/sharepoint/v3/contenttype/forms">
-  <Display>DocumentLibraryForm</Display>
-  <Edit>DocumentLibraryForm</Edit>
-  <New>DocumentLibraryForm</New>
-</FormTemplates>
-</file>
-
 <file path=customXml/itemProps1.xml><?xml version="1.0" encoding="utf-8"?>
 <ds:datastoreItem xmlns:ds="http://schemas.openxmlformats.org/officeDocument/2006/customXml" ds:itemID="{2A4AFB90-AA70-40CB-8FEE-062855DEC269}">
   <ds:schemaRefs>
@@ -14041,6 +15238,22 @@
 </file>
 
 <file path=customXml/itemProps2.xml><?xml version="1.0" encoding="utf-8"?>
+<ds:datastoreItem xmlns:ds="http://schemas.openxmlformats.org/officeDocument/2006/customXml" ds:itemID="{04D26766-6D42-46FD-AE9C-F80BA223CA67}">
+  <ds:schemaRefs>
+    <ds:schemaRef ds:uri="http://schemas.microsoft.com/sharepoint/v3/contenttype/forms"/>
+  </ds:schemaRefs>
+</ds:datastoreItem>
+</file>
+
+<file path=customXml/itemProps3.xml><?xml version="1.0" encoding="utf-8"?>
+<ds:datastoreItem xmlns:ds="http://schemas.openxmlformats.org/officeDocument/2006/customXml" ds:itemID="{88749F4F-A6E8-4DC0-9276-CAFEB15C1658}">
+  <ds:schemaRefs>
+    <ds:schemaRef ds:uri="http://schemas.openxmlformats.org/officeDocument/2006/bibliography"/>
+  </ds:schemaRefs>
+</ds:datastoreItem>
+</file>
+
+<file path=customXml/itemProps4.xml><?xml version="1.0" encoding="utf-8"?>
 <ds:datastoreItem xmlns:ds="http://schemas.openxmlformats.org/officeDocument/2006/customXml" ds:itemID="{8D503597-69F4-42D1-91A8-F656D146B62B}">
   <ds:schemaRefs>
     <ds:schemaRef ds:uri="http://schemas.microsoft.com/office/2006/metadata/contentType"/>
@@ -14057,20 +15270,4 @@
     <ds:schemaRef ds:uri="http://schemas.microsoft.com/internal/obd"/>
   </ds:schemaRefs>
 </ds:datastoreItem>
-</file>
-
-<file path=customXml/itemProps3.xml><?xml version="1.0" encoding="utf-8"?>
-<ds:datastoreItem xmlns:ds="http://schemas.openxmlformats.org/officeDocument/2006/customXml" ds:itemID="{88749F4F-A6E8-4DC0-9276-CAFEB15C1658}">
-  <ds:schemaRefs>
-    <ds:schemaRef ds:uri="http://schemas.openxmlformats.org/officeDocument/2006/bibliography"/>
-  </ds:schemaRefs>
-</ds:datastoreItem>
-</file>
-
-<file path=customXml/itemProps4.xml><?xml version="1.0" encoding="utf-8"?>
-<ds:datastoreItem xmlns:ds="http://schemas.openxmlformats.org/officeDocument/2006/customXml" ds:itemID="{04D26766-6D42-46FD-AE9C-F80BA223CA67}">
-  <ds:schemaRefs>
-    <ds:schemaRef ds:uri="http://schemas.microsoft.com/sharepoint/v3/contenttype/forms"/>
-  </ds:schemaRefs>
-</ds:datastoreItem>
 </file>
</xml_diff>

<commit_message>
Completed Checkpoint 4: Heat Exchanger Design & Analysis
</commit_message>
<xml_diff>
--- a/Term Project - WORKING.docx
+++ b/Term Project - WORKING.docx
@@ -6989,10 +6989,7 @@
         <w:t xml:space="preserve">. </w:t>
       </w:r>
       <w:r>
-        <w:t xml:space="preserve">It is for the same reason that the property method is changed to UNIFAC with Henry’s Components for this separation stage; UNIFAC models non-ideal liquid-liquid interaction much better than PSRK </w:t>
-      </w:r>
-      <w:r>
-        <w:t xml:space="preserve"> </w:t>
+        <w:t xml:space="preserve">It is for the same reason that the property method is changed to UNIFAC with Henry’s Components for this separation stage; UNIFAC models non-ideal liquid-liquid interaction much better than PSRK  </w:t>
       </w:r>
       <w:r>
         <w:fldChar w:fldCharType="begin"/>
@@ -8676,10 +8673,7 @@
         <w:fldChar w:fldCharType="begin"/>
       </w:r>
       <w:r>
-        <w:instrText xml:space="preserve"> REF _Ref225467358 \h </w:instrText>
-      </w:r>
-      <w:r>
-        <w:instrText xml:space="preserve"> \* MERGEFORMAT </w:instrText>
+        <w:instrText xml:space="preserve"> REF _Ref225467358 \h  \* MERGEFORMAT </w:instrText>
       </w:r>
       <w:r>
         <w:fldChar w:fldCharType="separate"/>
@@ -9175,10 +9169,7 @@
         <w:fldChar w:fldCharType="begin"/>
       </w:r>
       <w:r>
-        <w:instrText xml:space="preserve"> REF _Ref225467358 \h </w:instrText>
-      </w:r>
-      <w:r>
-        <w:instrText xml:space="preserve"> \* MERGEFORMAT </w:instrText>
+        <w:instrText xml:space="preserve"> REF _Ref225467358 \h  \* MERGEFORMAT </w:instrText>
       </w:r>
       <w:r>
         <w:fldChar w:fldCharType="separate"/>
@@ -9202,22 +9193,13 @@
         <w:t xml:space="preserve">. </w:t>
       </w:r>
       <w:r>
-        <w:t>A</w:t>
-      </w:r>
-      <w:r>
-        <w:t>s mentioned in section 7, the property method for this column is UNIFAC with Henry’s Components.</w:t>
+        <w:t>As mentioned in section 7, the property method for this column is UNIFAC with Henry’s Components.</w:t>
       </w:r>
     </w:p>
     <w:p/>
     <w:p>
       <w:r>
-        <w:t xml:space="preserve">To improve mass purity, several variables can be manipulated: heptane molar flow, RadFrac reflux ratio, and RadFrac distillate-to-feed (D/F) ratio. Reflux ratio is kept at 0.135 to avoid </w:t>
-      </w:r>
-      <w:r>
-        <w:t xml:space="preserve">instability issues, as seen in the previous DSTWU error. </w:t>
-      </w:r>
-      <w:r>
-        <w:t>To analyse the impact of heptane molar flow and D/F ratio on aniline purity and recovery, sensitivity analysis are used.</w:t>
+        <w:t>To improve mass purity, several variables can be manipulated: heptane molar flow, RadFrac reflux ratio, and RadFrac distillate-to-feed (D/F) ratio. Reflux ratio is kept at 0.135 to avoid instability issues, as seen in the previous DSTWU error. To analyse the impact of heptane molar flow and D/F ratio on aniline purity and recovery, sensitivity analysis are used.</w:t>
       </w:r>
     </w:p>
     <w:p/>
@@ -9236,19 +9218,7 @@
       </w:r>
       <w:r>
         <w:lastRenderedPageBreak/>
-        <w:t xml:space="preserve">flow rate increases. For liquid-liquid aniline recovery, a higher heptane flow rate results in a higher recovery, reaching 100% at 100 kmol/hr heptane. </w:t>
-      </w:r>
-      <w:r>
-        <w:t xml:space="preserve">For </w:t>
-      </w:r>
-      <w:r>
-        <w:t xml:space="preserve">the D/F ratio, a higher ratio results in a higher aniline mass fraction but a </w:t>
-      </w:r>
-      <w:r>
-        <w:t xml:space="preserve">lower recovery. </w:t>
-      </w:r>
-      <w:r>
-        <w:t xml:space="preserve">This is shown in </w:t>
+        <w:t xml:space="preserve">flow rate increases. For liquid-liquid aniline recovery, a higher heptane flow rate results in a higher recovery, reaching 100% at 100 kmol/hr heptane. For the D/F ratio, a higher ratio results in a higher aniline mass fraction but a lower recovery. This is shown in </w:t>
       </w:r>
       <w:r>
         <w:fldChar w:fldCharType="begin"/>
@@ -9281,6 +9251,9 @@
         <w:keepNext/>
       </w:pPr>
       <w:r>
+        <w:rPr>
+          <w:noProof/>
+        </w:rPr>
         <w:drawing>
           <wp:inline distT="0" distB="0" distL="0" distR="0" wp14:anchorId="0CFD9CE6" wp14:editId="219FDC62">
             <wp:extent cx="6332220" cy="3195955"/>
@@ -9408,6 +9381,9 @@
         <w:keepNext/>
       </w:pPr>
       <w:r>
+        <w:rPr>
+          <w:noProof/>
+        </w:rPr>
         <w:drawing>
           <wp:inline distT="0" distB="0" distL="0" distR="0" wp14:anchorId="2DB3A0C3" wp14:editId="277714FA">
             <wp:extent cx="6332220" cy="3176905"/>
@@ -9552,10 +9528,7 @@
         <w:fldChar w:fldCharType="begin"/>
       </w:r>
       <w:r>
-        <w:instrText xml:space="preserve"> REF _Ref225476828 \h </w:instrText>
-      </w:r>
-      <w:r>
-        <w:instrText xml:space="preserve"> \* MERGEFORMAT </w:instrText>
+        <w:instrText xml:space="preserve"> REF _Ref225476828 \h  \* MERGEFORMAT </w:instrText>
       </w:r>
       <w:r>
         <w:fldChar w:fldCharType="separate"/>
@@ -9890,6 +9863,9 @@
     <w:p>
       <w:pPr>
         <w:pStyle w:val="Heading2"/>
+        <w:rPr>
+          <w:rFonts w:asciiTheme="majorBidi" w:hAnsiTheme="majorBidi" w:cstheme="majorBidi"/>
+        </w:rPr>
       </w:pPr>
       <w:bookmarkStart w:id="39" w:name="_Toc224148630"/>
       <w:r>
@@ -9901,30 +9877,791 @@
       <w:bookmarkEnd w:id="39"/>
     </w:p>
     <w:p>
+      <w:r>
+        <w:t xml:space="preserve">To separate and recycle excess hydrogen, the reactor product stream is cooled down to 50 C prior to entering the flash block for separation. Reactor product stream is exiting at 350 C, with composition shown in </w:t>
+      </w:r>
+      <w:r>
+        <w:fldChar w:fldCharType="begin"/>
+      </w:r>
+      <w:r>
+        <w:instrText xml:space="preserve"> REF _Ref225352380 \h </w:instrText>
+      </w:r>
+      <w:r>
+        <w:fldChar w:fldCharType="separate"/>
+      </w:r>
+      <w:r>
+        <w:rPr>
+          <w:color w:val="000000" w:themeColor="text1"/>
+        </w:rPr>
+        <w:t xml:space="preserve">Table </w:t>
+      </w:r>
+      <w:r>
+        <w:rPr>
+          <w:noProof/>
+          <w:color w:val="000000" w:themeColor="text1"/>
+        </w:rPr>
+        <w:t>3</w:t>
+      </w:r>
+      <w:r>
+        <w:fldChar w:fldCharType="end"/>
+      </w:r>
+      <w:r>
+        <w:t xml:space="preserve">. The utility used to perform this cooling is cooling water at 20 C, recovered at 95 C </w:t>
+      </w:r>
+      <w:r>
+        <w:t xml:space="preserve">at 1 atm </w:t>
+      </w:r>
+      <w:r>
+        <w:t>while still in the liquid phase.</w:t>
+      </w:r>
+    </w:p>
+    <w:p/>
+    <w:p>
+      <w:r>
+        <w:t xml:space="preserve">The required cooling water flow is determined using a HEATER block, </w:t>
+      </w:r>
+      <w:r>
+        <w:t>requiring</w:t>
+      </w:r>
+      <w:r>
+        <w:t xml:space="preserve"> </w:t>
+      </w:r>
+      <w:r>
+        <w:t>11</w:t>
+      </w:r>
+      <w:r>
+        <w:t>1 tonnes/hr</w:t>
+      </w:r>
+      <w:r>
+        <w:t xml:space="preserve"> in total</w:t>
+      </w:r>
+      <w:r>
+        <w:t>.</w:t>
+      </w:r>
+      <w:r>
+        <w:t xml:space="preserve"> </w:t>
+      </w:r>
+      <w:r>
+        <w:t>Heat exchanger design calculations are then performed using a HEATX block, with a pure water feed at 20 C fed into</w:t>
+      </w:r>
+      <w:r>
+        <w:t xml:space="preserve"> the cold inlet at a flow rate of 111 tonnes/hr. Reactor product stream is fed to the hot inlet</w:t>
+      </w:r>
+      <w:r>
+        <w:t>, and is flown in the tube side due to its higher pressure</w:t>
+      </w:r>
+      <w:r>
+        <w:t xml:space="preserve"> </w:t>
+      </w:r>
+      <w:r>
+        <w:fldChar w:fldCharType="begin"/>
+      </w:r>
+      <w:r>
+        <w:instrText xml:space="preserve"> ADDIN ZOTERO_ITEM CSL_CITATION {"citationID":"RweYyKli","properties":{"formattedCitation":"[26]","plainCitation":"[26]","noteIndex":0},"citationItems":[{"id":1123,"uris":["http://zotero.org/users/15288956/items/PAQ9GW66"],"itemData":{"id":1123,"type":"post-weblog","abstract":"Choose carefully when deciding which fluid to put on the shell side and which to allocate to the tube side.","citation-key":"enerquipTubeSideShell2025","container-title":"Enerquip Thermal Solutions","language":"en","title":"Tube side or shell side: Comparing fluid allocation options for your shell and tube heat exchanger","title-short":"Tube side or shell side","URL":"https://www.enerquip.com/tubeside-or-shellside-comparing-fluid-allocation-options-for-your-shell-and-tube-heat-exchanger/","author":[{"literal":"Enerquip"}],"accessed":{"date-parts":[["2026",4,8]]},"issued":{"date-parts":[["2025",2,6]]}}}],"schema":"https://github.com/citation-style-language/schema/raw/master/csl-citation.json"} </w:instrText>
+      </w:r>
+      <w:r>
+        <w:fldChar w:fldCharType="separate"/>
+      </w:r>
+      <w:r>
+        <w:t>[26]</w:t>
+      </w:r>
+      <w:r>
+        <w:fldChar w:fldCharType="end"/>
+      </w:r>
+      <w:r>
+        <w:t xml:space="preserve">. The HEATX block uses the shortcut model with a countercurrent direction to maximise heat transfer. The hot outlet stream is specified at 50 C. With this configuration, the vapour and condensing phases are present on the hot side, while only the liquid phase is present on the cold side, as shown </w:t>
+      </w:r>
+      <w:r>
+        <w:t xml:space="preserve">in </w:t>
+      </w:r>
+      <w:r>
+        <w:fldChar w:fldCharType="begin"/>
+      </w:r>
+      <w:r>
+        <w:instrText xml:space="preserve"> REF _Ref226569485 \h  \* MERGEFORMAT </w:instrText>
+      </w:r>
+      <w:r>
+        <w:fldChar w:fldCharType="separate"/>
+      </w:r>
+      <w:r>
+        <w:t xml:space="preserve">Figure </w:t>
+      </w:r>
+      <w:r>
+        <w:rPr>
+          <w:noProof/>
+        </w:rPr>
+        <w:t>8</w:t>
+      </w:r>
+      <w:r>
+        <w:fldChar w:fldCharType="end"/>
+      </w:r>
+      <w:r>
+        <w:t>.</w:t>
+      </w:r>
+    </w:p>
+    <w:p/>
+    <w:p>
+      <w:pPr>
+        <w:keepNext/>
+      </w:pPr>
+      <w:r>
+        <w:rPr>
+          <w:noProof/>
+        </w:rPr>
+        <w:drawing>
+          <wp:inline distT="0" distB="0" distL="0" distR="0" wp14:anchorId="4927740F" wp14:editId="2F301265">
+            <wp:extent cx="6332220" cy="3205480"/>
+            <wp:effectExtent l="0" t="0" r="0" b="0"/>
+            <wp:docPr id="478428667" name="Picture 1"/>
+            <wp:cNvGraphicFramePr>
+              <a:graphicFrameLocks xmlns:a="http://schemas.openxmlformats.org/drawingml/2006/main" noChangeAspect="1"/>
+            </wp:cNvGraphicFramePr>
+            <a:graphic xmlns:a="http://schemas.openxmlformats.org/drawingml/2006/main">
+              <a:graphicData uri="http://schemas.openxmlformats.org/drawingml/2006/picture">
+                <pic:pic xmlns:pic="http://schemas.openxmlformats.org/drawingml/2006/picture">
+                  <pic:nvPicPr>
+                    <pic:cNvPr id="478428667" name=""/>
+                    <pic:cNvPicPr/>
+                  </pic:nvPicPr>
+                  <pic:blipFill>
+                    <a:blip r:embed="rId30"/>
+                    <a:stretch>
+                      <a:fillRect/>
+                    </a:stretch>
+                  </pic:blipFill>
+                  <pic:spPr>
+                    <a:xfrm>
+                      <a:off x="0" y="0"/>
+                      <a:ext cx="6332220" cy="3205480"/>
+                    </a:xfrm>
+                    <a:prstGeom prst="rect">
+                      <a:avLst/>
+                    </a:prstGeom>
+                  </pic:spPr>
+                </pic:pic>
+              </a:graphicData>
+            </a:graphic>
+          </wp:inline>
+        </w:drawing>
+      </w:r>
+    </w:p>
+    <w:p>
+      <w:pPr>
+        <w:pStyle w:val="Caption"/>
+        <w:rPr>
+          <w:i w:val="0"/>
+          <w:iCs w:val="0"/>
+          <w:color w:val="auto"/>
+          <w:sz w:val="24"/>
+          <w:szCs w:val="24"/>
+        </w:rPr>
+      </w:pPr>
+      <w:bookmarkStart w:id="40" w:name="_Ref226569485"/>
+      <w:r>
+        <w:rPr>
+          <w:i w:val="0"/>
+          <w:iCs w:val="0"/>
+          <w:color w:val="auto"/>
+          <w:sz w:val="24"/>
+          <w:szCs w:val="24"/>
+        </w:rPr>
+        <w:t xml:space="preserve">Figure </w:t>
+      </w:r>
+      <w:r>
+        <w:rPr>
+          <w:i w:val="0"/>
+          <w:iCs w:val="0"/>
+          <w:color w:val="auto"/>
+          <w:sz w:val="24"/>
+          <w:szCs w:val="24"/>
+        </w:rPr>
+        <w:fldChar w:fldCharType="begin"/>
+      </w:r>
+      <w:r>
+        <w:rPr>
+          <w:i w:val="0"/>
+          <w:iCs w:val="0"/>
+          <w:color w:val="auto"/>
+          <w:sz w:val="24"/>
+          <w:szCs w:val="24"/>
+        </w:rPr>
+        <w:instrText xml:space="preserve"> SEQ Figure \* ARABIC </w:instrText>
+      </w:r>
+      <w:r>
+        <w:rPr>
+          <w:i w:val="0"/>
+          <w:iCs w:val="0"/>
+          <w:color w:val="auto"/>
+          <w:sz w:val="24"/>
+          <w:szCs w:val="24"/>
+        </w:rPr>
+        <w:fldChar w:fldCharType="separate"/>
+      </w:r>
+      <w:r>
+        <w:rPr>
+          <w:i w:val="0"/>
+          <w:iCs w:val="0"/>
+          <w:noProof/>
+          <w:color w:val="auto"/>
+          <w:sz w:val="24"/>
+          <w:szCs w:val="24"/>
+        </w:rPr>
+        <w:t>8</w:t>
+      </w:r>
+      <w:r>
+        <w:rPr>
+          <w:i w:val="0"/>
+          <w:iCs w:val="0"/>
+          <w:color w:val="auto"/>
+          <w:sz w:val="24"/>
+          <w:szCs w:val="24"/>
+        </w:rPr>
+        <w:fldChar w:fldCharType="end"/>
+      </w:r>
+      <w:bookmarkEnd w:id="40"/>
+      <w:r>
+        <w:rPr>
+          <w:i w:val="0"/>
+          <w:iCs w:val="0"/>
+          <w:color w:val="auto"/>
+          <w:sz w:val="24"/>
+          <w:szCs w:val="24"/>
+        </w:rPr>
+        <w:t>. Vapour fraction of hot and cold side in HEATX heat exchanger</w:t>
+      </w:r>
+    </w:p>
+    <w:p>
+      <w:r>
+        <w:lastRenderedPageBreak/>
+        <w:t xml:space="preserve">Overall heat transfer coefficients (U) for the components present are estimated as average from literature values </w:t>
+      </w:r>
+      <w:r>
+        <w:fldChar w:fldCharType="begin"/>
+      </w:r>
+      <w:r>
+        <w:instrText xml:space="preserve"> ADDIN ZOTERO_ITEM CSL_CITATION {"citationID":"EznhG6y0","properties":{"formattedCitation":"[27]","plainCitation":"[27]","noteIndex":0},"citationItems":[{"id":1109,"uris":["http://zotero.org/users/15288956/items/G3RSYDH8"],"itemData":{"id":1109,"type":"chapter","citation-key":"HeattransferEquipment","collection-title":"Chemical Engineering","container-title":"Chemical Engineering Design (Sixth Edition)","DOI":"10.1016/B978-0-08-102599-4.00012-6","edition":"SI","language":"en-US","note":"DOI: 10.1016/B978-0-08-102599-4.00012-6","page":"773-927","title":"Chapter 12 - Heat-transfer Equipment","URL":"https://www.sciencedirect.com/science/chapter/monograph/pii/B9780081025994000126","author":[{"family":"Sinnott","given":"Ray"},{"family":"Towler","given":"Gavin"}],"accessed":{"date-parts":[["2026",4,8]]},"issued":{"date-parts":[["2020"]]}}}],"schema":"https://github.com/citation-style-language/schema/raw/master/csl-citation.json"} </w:instrText>
+      </w:r>
+      <w:r>
+        <w:fldChar w:fldCharType="separate"/>
+      </w:r>
+      <w:r>
+        <w:t>[27]</w:t>
+      </w:r>
+      <w:r>
+        <w:fldChar w:fldCharType="end"/>
+      </w:r>
+      <w:r>
+        <w:t xml:space="preserve">. The hot side is taken as organics with some non-condensable as aniline is an organic compound. Overall heat transfer coefficient between vapour hot side with liquid water is 500 W/m^2-C, while coefficient between condensing hot side with liquid water is 600 W/m^2-C. </w:t>
+      </w:r>
+      <w:r>
+        <w:t>In this configuration, the needed heat exchanger area is 197.95 m^2.</w:t>
+      </w:r>
+      <w:r>
+        <w:t xml:space="preserve"> This large area requirement indicates the possibility that a multipass heat exchanger might work better than singlepass countercurrent.</w:t>
+      </w:r>
+    </w:p>
+    <w:p/>
+    <w:p>
       <w:pPr>
         <w:pStyle w:val="Heading2"/>
-      </w:pPr>
-      <w:bookmarkStart w:id="40" w:name="_Toc224148631"/>
-      <w:r>
         <w:rPr>
           <w:rFonts w:asciiTheme="majorBidi" w:hAnsiTheme="majorBidi" w:cstheme="majorBidi"/>
         </w:rPr>
+      </w:pPr>
+      <w:bookmarkStart w:id="41" w:name="_Toc224148631"/>
+      <w:r>
+        <w:rPr>
+          <w:rFonts w:asciiTheme="majorBidi" w:hAnsiTheme="majorBidi" w:cstheme="majorBidi"/>
+        </w:rPr>
         <w:t>Heat Exchanger Analysis</w:t>
       </w:r>
-      <w:bookmarkEnd w:id="40"/>
-    </w:p>
+      <w:bookmarkEnd w:id="41"/>
+    </w:p>
+    <w:p>
+      <w:r>
+        <w:t xml:space="preserve">Sensitivity analysis are used to investigate the impact of overall heat transfer coefficient estimate on heat exchanger area. </w:t>
+      </w:r>
+      <w:r>
+        <w:t>As there are two coefficient used in this simulation, they are assessed separately, with a final assessment to analyse the best and worse case scenarios.</w:t>
+      </w:r>
+    </w:p>
+    <w:p/>
+    <w:p>
+      <w:pPr>
+        <w:pStyle w:val="Heading3"/>
+      </w:pPr>
+      <w:r>
+        <w:t>Vapour Hot Side – Liquid Cold Side</w:t>
+      </w:r>
+    </w:p>
+    <w:p>
+      <w:r>
+        <w:t xml:space="preserve">In this analysis, the heat transfer coefficient for vapour hot side – liquid cold side is varied from 250 – 750 </w:t>
+      </w:r>
+      <w:r>
+        <w:t>W/m^2-C</w:t>
+      </w:r>
+      <w:r>
+        <w:t>, while keeping the condensing heat transfer coefficient constant</w:t>
+      </w:r>
+      <w:r>
+        <w:t xml:space="preserve"> </w:t>
+      </w:r>
+      <w:r>
+        <w:fldChar w:fldCharType="begin"/>
+      </w:r>
+      <w:r>
+        <w:instrText xml:space="preserve"> ADDIN ZOTERO_ITEM CSL_CITATION {"citationID":"EznhG6y0","properties":{"formattedCitation":"[27]","plainCitation":"[27]","noteIndex":0},"citationItems":[{"id":1109,"uris":["http://zotero.org/users/15288956/items/G3RSYDH8"],"itemData":{"id":1109,"type":"chapter","citation-key":"HeattransferEquipment","collection-title":"Chemical Engineering","container-title":"Chemical Engineering Design (Sixth Edition)","DOI":"10.1016/B978-0-08-102599-4.00012-6","edition":"SI","language":"en-US","note":"DOI: 10.1016/B978-0-08-102599-4.00012-6","page":"773-927","title":"Chapter 12 - Heat-transfer Equipment","URL":"https://www.sciencedirect.com/science/chapter/monograph/pii/B9780081025994000126","author":[{"family":"Sinnott","given":"Ray"},{"family":"Towler","given":"Gavin"}],"accessed":{"date-parts":[["2026",4,8]]},"issued":{"date-parts":[["2020"]]}}}],"schema":"https://github.com/citation-style-language/schema/raw/master/csl-citation.json"} </w:instrText>
+      </w:r>
+      <w:r>
+        <w:fldChar w:fldCharType="separate"/>
+      </w:r>
+      <w:r>
+        <w:t>[27]</w:t>
+      </w:r>
+      <w:r>
+        <w:fldChar w:fldCharType="end"/>
+      </w:r>
+      <w:r>
+        <w:t>. In Aspen, this is the V-L block variable. As a result, the heat exchanger area varies between 215.5</w:t>
+      </w:r>
+      <w:r>
+        <w:t xml:space="preserve"> m^2</w:t>
+      </w:r>
+      <w:r>
+        <w:t xml:space="preserve"> and 192.1 m^2, a change of </w:t>
+      </w:r>
+      <w:r>
+        <w:t xml:space="preserve">8.9% and -3% respectively. This shown </w:t>
+      </w:r>
+      <w:r>
+        <w:t xml:space="preserve">in </w:t>
+      </w:r>
+      <w:r>
+        <w:fldChar w:fldCharType="begin"/>
+      </w:r>
+      <w:r>
+        <w:instrText xml:space="preserve"> REF _Ref226575678 \h </w:instrText>
+      </w:r>
+      <w:r>
+        <w:instrText xml:space="preserve"> \* MERGEFORMAT </w:instrText>
+      </w:r>
+      <w:r>
+        <w:fldChar w:fldCharType="separate"/>
+      </w:r>
+      <w:r>
+        <w:t xml:space="preserve">Figure </w:t>
+      </w:r>
+      <w:r>
+        <w:rPr>
+          <w:noProof/>
+        </w:rPr>
+        <w:t>9</w:t>
+      </w:r>
+      <w:r>
+        <w:fldChar w:fldCharType="end"/>
+      </w:r>
+      <w:r>
+        <w:t>.</w:t>
+      </w:r>
+    </w:p>
+    <w:p/>
+    <w:p>
+      <w:pPr>
+        <w:keepNext/>
+      </w:pPr>
+      <w:r>
+        <w:drawing>
+          <wp:inline distT="0" distB="0" distL="0" distR="0" wp14:anchorId="24564019" wp14:editId="0A4D5269">
+            <wp:extent cx="6332220" cy="3199765"/>
+            <wp:effectExtent l="0" t="0" r="0" b="635"/>
+            <wp:docPr id="460544214" name="Picture 1"/>
+            <wp:cNvGraphicFramePr>
+              <a:graphicFrameLocks xmlns:a="http://schemas.openxmlformats.org/drawingml/2006/main" noChangeAspect="1"/>
+            </wp:cNvGraphicFramePr>
+            <a:graphic xmlns:a="http://schemas.openxmlformats.org/drawingml/2006/main">
+              <a:graphicData uri="http://schemas.openxmlformats.org/drawingml/2006/picture">
+                <pic:pic xmlns:pic="http://schemas.openxmlformats.org/drawingml/2006/picture">
+                  <pic:nvPicPr>
+                    <pic:cNvPr id="460544214" name=""/>
+                    <pic:cNvPicPr/>
+                  </pic:nvPicPr>
+                  <pic:blipFill>
+                    <a:blip r:embed="rId31"/>
+                    <a:stretch>
+                      <a:fillRect/>
+                    </a:stretch>
+                  </pic:blipFill>
+                  <pic:spPr>
+                    <a:xfrm>
+                      <a:off x="0" y="0"/>
+                      <a:ext cx="6332220" cy="3199765"/>
+                    </a:xfrm>
+                    <a:prstGeom prst="rect">
+                      <a:avLst/>
+                    </a:prstGeom>
+                  </pic:spPr>
+                </pic:pic>
+              </a:graphicData>
+            </a:graphic>
+          </wp:inline>
+        </w:drawing>
+      </w:r>
+    </w:p>
+    <w:p>
+      <w:pPr>
+        <w:pStyle w:val="Caption"/>
+        <w:rPr>
+          <w:i w:val="0"/>
+          <w:iCs w:val="0"/>
+          <w:color w:val="auto"/>
+          <w:sz w:val="24"/>
+          <w:szCs w:val="24"/>
+        </w:rPr>
+      </w:pPr>
+      <w:bookmarkStart w:id="42" w:name="_Ref226575678"/>
+      <w:r>
+        <w:rPr>
+          <w:i w:val="0"/>
+          <w:iCs w:val="0"/>
+          <w:color w:val="auto"/>
+          <w:sz w:val="24"/>
+          <w:szCs w:val="24"/>
+        </w:rPr>
+        <w:t xml:space="preserve">Figure </w:t>
+      </w:r>
+      <w:r>
+        <w:rPr>
+          <w:i w:val="0"/>
+          <w:iCs w:val="0"/>
+          <w:color w:val="auto"/>
+          <w:sz w:val="24"/>
+          <w:szCs w:val="24"/>
+        </w:rPr>
+        <w:fldChar w:fldCharType="begin"/>
+      </w:r>
+      <w:r>
+        <w:rPr>
+          <w:i w:val="0"/>
+          <w:iCs w:val="0"/>
+          <w:color w:val="auto"/>
+          <w:sz w:val="24"/>
+          <w:szCs w:val="24"/>
+        </w:rPr>
+        <w:instrText xml:space="preserve"> SEQ Figure \* ARABIC </w:instrText>
+      </w:r>
+      <w:r>
+        <w:rPr>
+          <w:i w:val="0"/>
+          <w:iCs w:val="0"/>
+          <w:color w:val="auto"/>
+          <w:sz w:val="24"/>
+          <w:szCs w:val="24"/>
+        </w:rPr>
+        <w:fldChar w:fldCharType="separate"/>
+      </w:r>
+      <w:r>
+        <w:rPr>
+          <w:i w:val="0"/>
+          <w:iCs w:val="0"/>
+          <w:noProof/>
+          <w:color w:val="auto"/>
+          <w:sz w:val="24"/>
+          <w:szCs w:val="24"/>
+        </w:rPr>
+        <w:t>9</w:t>
+      </w:r>
+      <w:r>
+        <w:rPr>
+          <w:i w:val="0"/>
+          <w:iCs w:val="0"/>
+          <w:color w:val="auto"/>
+          <w:sz w:val="24"/>
+          <w:szCs w:val="24"/>
+        </w:rPr>
+        <w:fldChar w:fldCharType="end"/>
+      </w:r>
+      <w:bookmarkEnd w:id="42"/>
+      <w:r>
+        <w:rPr>
+          <w:i w:val="0"/>
+          <w:iCs w:val="0"/>
+          <w:color w:val="auto"/>
+          <w:sz w:val="24"/>
+          <w:szCs w:val="24"/>
+        </w:rPr>
+        <w:t>. Heat exchanger area on different vapour hot side - liquid cold side heat transfer coefficient</w:t>
+      </w:r>
+    </w:p>
+    <w:p>
+      <w:pPr>
+        <w:pStyle w:val="Heading3"/>
+      </w:pPr>
+      <w:r>
+        <w:t>Condensing Hot Side – Liquid Cold Side</w:t>
+      </w:r>
+    </w:p>
+    <w:p>
+      <w:r>
+        <w:t xml:space="preserve">Heat transfer coefficient for condensing hot side – liquid cold side is varied between 500 – 700 </w:t>
+      </w:r>
+      <w:r>
+        <w:t>W/m^2-C</w:t>
+      </w:r>
+      <w:r>
+        <w:t>, while keeping the V-L heat transfer coefficient constant. In Aspen, this is the B-L variable. As a result, the heat exchanger area varies between 234 m^2 – 172.2 m^2, a change of 18.2% and -13% respectively. This i</w:t>
+      </w:r>
+      <w:r>
+        <w:t xml:space="preserve">s shown in </w:t>
+      </w:r>
+      <w:r>
+        <w:fldChar w:fldCharType="begin"/>
+      </w:r>
+      <w:r>
+        <w:instrText xml:space="preserve"> REF _Ref226576202 \h </w:instrText>
+      </w:r>
+      <w:r>
+        <w:instrText xml:space="preserve"> \* MERGEFORMAT </w:instrText>
+      </w:r>
+      <w:r>
+        <w:fldChar w:fldCharType="separate"/>
+      </w:r>
+      <w:r>
+        <w:t xml:space="preserve">Figure </w:t>
+      </w:r>
+      <w:r>
+        <w:rPr>
+          <w:noProof/>
+        </w:rPr>
+        <w:t>10</w:t>
+      </w:r>
+      <w:r>
+        <w:fldChar w:fldCharType="end"/>
+      </w:r>
+      <w:r>
+        <w:t xml:space="preserve">, </w:t>
+      </w:r>
+      <w:r>
+        <w:t xml:space="preserve">with a more linear curve compared to </w:t>
+      </w:r>
+      <w:r>
+        <w:fldChar w:fldCharType="begin"/>
+      </w:r>
+      <w:r>
+        <w:instrText xml:space="preserve"> REF _Ref226575678 \h </w:instrText>
+      </w:r>
+      <w:r>
+        <w:instrText xml:space="preserve"> \* MERGEFORMAT </w:instrText>
+      </w:r>
+      <w:r>
+        <w:fldChar w:fldCharType="separate"/>
+      </w:r>
+      <w:r>
+        <w:t xml:space="preserve">Figure </w:t>
+      </w:r>
+      <w:r>
+        <w:rPr>
+          <w:noProof/>
+        </w:rPr>
+        <w:t>9</w:t>
+      </w:r>
+      <w:r>
+        <w:fldChar w:fldCharType="end"/>
+      </w:r>
+      <w:r>
+        <w:t>.</w:t>
+      </w:r>
+    </w:p>
+    <w:p>
+      <w:pPr>
+        <w:keepNext/>
+      </w:pPr>
+      <w:r>
+        <w:rPr>
+          <w:b/>
+          <w:bCs/>
+        </w:rPr>
+        <w:lastRenderedPageBreak/>
+        <w:drawing>
+          <wp:inline distT="0" distB="0" distL="0" distR="0" wp14:anchorId="0F02725D" wp14:editId="17C6B714">
+            <wp:extent cx="6332220" cy="3205480"/>
+            <wp:effectExtent l="0" t="0" r="0" b="0"/>
+            <wp:docPr id="243234852" name="Picture 1"/>
+            <wp:cNvGraphicFramePr>
+              <a:graphicFrameLocks xmlns:a="http://schemas.openxmlformats.org/drawingml/2006/main" noChangeAspect="1"/>
+            </wp:cNvGraphicFramePr>
+            <a:graphic xmlns:a="http://schemas.openxmlformats.org/drawingml/2006/main">
+              <a:graphicData uri="http://schemas.openxmlformats.org/drawingml/2006/picture">
+                <pic:pic xmlns:pic="http://schemas.openxmlformats.org/drawingml/2006/picture">
+                  <pic:nvPicPr>
+                    <pic:cNvPr id="243234852" name=""/>
+                    <pic:cNvPicPr/>
+                  </pic:nvPicPr>
+                  <pic:blipFill>
+                    <a:blip r:embed="rId32"/>
+                    <a:stretch>
+                      <a:fillRect/>
+                    </a:stretch>
+                  </pic:blipFill>
+                  <pic:spPr>
+                    <a:xfrm>
+                      <a:off x="0" y="0"/>
+                      <a:ext cx="6332220" cy="3205480"/>
+                    </a:xfrm>
+                    <a:prstGeom prst="rect">
+                      <a:avLst/>
+                    </a:prstGeom>
+                  </pic:spPr>
+                </pic:pic>
+              </a:graphicData>
+            </a:graphic>
+          </wp:inline>
+        </w:drawing>
+      </w:r>
+    </w:p>
+    <w:p>
+      <w:pPr>
+        <w:pStyle w:val="Caption"/>
+        <w:rPr>
+          <w:b/>
+          <w:bCs/>
+          <w:i w:val="0"/>
+          <w:iCs w:val="0"/>
+          <w:color w:val="auto"/>
+          <w:sz w:val="24"/>
+          <w:szCs w:val="24"/>
+        </w:rPr>
+      </w:pPr>
+      <w:bookmarkStart w:id="43" w:name="_Ref226576202"/>
+      <w:r>
+        <w:rPr>
+          <w:i w:val="0"/>
+          <w:iCs w:val="0"/>
+          <w:color w:val="auto"/>
+          <w:sz w:val="24"/>
+          <w:szCs w:val="24"/>
+        </w:rPr>
+        <w:t xml:space="preserve">Figure </w:t>
+      </w:r>
+      <w:r>
+        <w:rPr>
+          <w:i w:val="0"/>
+          <w:iCs w:val="0"/>
+          <w:color w:val="auto"/>
+          <w:sz w:val="24"/>
+          <w:szCs w:val="24"/>
+        </w:rPr>
+        <w:fldChar w:fldCharType="begin"/>
+      </w:r>
+      <w:r>
+        <w:rPr>
+          <w:i w:val="0"/>
+          <w:iCs w:val="0"/>
+          <w:color w:val="auto"/>
+          <w:sz w:val="24"/>
+          <w:szCs w:val="24"/>
+        </w:rPr>
+        <w:instrText xml:space="preserve"> SEQ Figure \* ARABIC </w:instrText>
+      </w:r>
+      <w:r>
+        <w:rPr>
+          <w:i w:val="0"/>
+          <w:iCs w:val="0"/>
+          <w:color w:val="auto"/>
+          <w:sz w:val="24"/>
+          <w:szCs w:val="24"/>
+        </w:rPr>
+        <w:fldChar w:fldCharType="separate"/>
+      </w:r>
+      <w:r>
+        <w:rPr>
+          <w:i w:val="0"/>
+          <w:iCs w:val="0"/>
+          <w:noProof/>
+          <w:color w:val="auto"/>
+          <w:sz w:val="24"/>
+          <w:szCs w:val="24"/>
+        </w:rPr>
+        <w:t>10</w:t>
+      </w:r>
+      <w:r>
+        <w:rPr>
+          <w:i w:val="0"/>
+          <w:iCs w:val="0"/>
+          <w:color w:val="auto"/>
+          <w:sz w:val="24"/>
+          <w:szCs w:val="24"/>
+        </w:rPr>
+        <w:fldChar w:fldCharType="end"/>
+      </w:r>
+      <w:bookmarkEnd w:id="43"/>
+      <w:r>
+        <w:rPr>
+          <w:i w:val="0"/>
+          <w:iCs w:val="0"/>
+          <w:color w:val="auto"/>
+          <w:sz w:val="24"/>
+          <w:szCs w:val="24"/>
+        </w:rPr>
+        <w:t>. Heat exchanger area on different condensing hot side - liquid cold side heat transfer coefficient</w:t>
+      </w:r>
+    </w:p>
+    <w:p>
+      <w:pPr>
+        <w:pStyle w:val="Heading3"/>
+      </w:pPr>
+      <w:r>
+        <w:t>Overall Assessment</w:t>
+      </w:r>
+    </w:p>
+    <w:p>
+      <w:r>
+        <w:t xml:space="preserve">The best and worst case scenarios for the heat exchanger area are assessed using both ends of the heat transfer coefficient range. For the best case scenario, V-L and C-L have coefficients of 750 and 700 </w:t>
+      </w:r>
+      <w:r>
+        <w:t>W/m^2-C</w:t>
+      </w:r>
+      <w:r>
+        <w:t xml:space="preserve">, respectively. This results in 166.32 m^2. For the worst case scenario, V-L and C-L have coefficients of 250 and 500 </w:t>
+      </w:r>
+      <w:r>
+        <w:t>W/m^2-C</w:t>
+      </w:r>
+      <w:r>
+        <w:t>, respectively, resulting in 251.62 m^2.</w:t>
+      </w:r>
+    </w:p>
+    <w:p/>
+    <w:p>
+      <w:r>
+        <w:t>Overall, heat exchangers are reduced by 16% in the best case, and increased by 27% in the worst case. This large difference signifies the importance of having accurate heat transfer coefficient measurement</w:t>
+      </w:r>
+      <w:r>
+        <w:t>s</w:t>
+      </w:r>
+      <w:r>
+        <w:t xml:space="preserve">. Furthermore, </w:t>
+      </w:r>
+      <w:r>
+        <w:t xml:space="preserve">the C-L heat transfer coefficient has a larger impact on the </w:t>
+      </w:r>
+      <w:r>
+        <w:t>final heat exchanger area, and thus must be prioritised when searching for data or conduction experiments.</w:t>
+      </w:r>
+    </w:p>
+    <w:p/>
     <w:p>
       <w:pPr>
         <w:pStyle w:val="Heading2"/>
       </w:pPr>
-      <w:bookmarkStart w:id="41" w:name="_Toc224148632"/>
+      <w:bookmarkStart w:id="44" w:name="_Toc224148632"/>
       <w:r>
         <w:rPr>
           <w:rFonts w:asciiTheme="majorBidi" w:hAnsiTheme="majorBidi" w:cstheme="majorBidi"/>
         </w:rPr>
         <w:t>Discussion/reflection</w:t>
       </w:r>
-      <w:bookmarkEnd w:id="41"/>
+      <w:bookmarkEnd w:id="44"/>
       <w:r>
         <w:rPr>
           <w:rFonts w:asciiTheme="majorBidi" w:hAnsiTheme="majorBidi" w:cstheme="majorBidi"/>
@@ -9936,14 +10673,14 @@
       <w:pPr>
         <w:pStyle w:val="Heading2"/>
       </w:pPr>
-      <w:bookmarkStart w:id="42" w:name="_Toc224148633"/>
+      <w:bookmarkStart w:id="45" w:name="_Toc224148633"/>
       <w:r>
         <w:rPr>
           <w:rFonts w:asciiTheme="majorBidi" w:hAnsiTheme="majorBidi" w:cstheme="majorBidi"/>
         </w:rPr>
         <w:t>Next steps</w:t>
       </w:r>
-      <w:bookmarkEnd w:id="42"/>
+      <w:bookmarkEnd w:id="45"/>
     </w:p>
     <w:p>
       <w:pPr>
@@ -9962,11 +10699,11 @@
       <w:pPr>
         <w:pStyle w:val="Heading2"/>
       </w:pPr>
-      <w:bookmarkStart w:id="43" w:name="_Toc224148634"/>
+      <w:bookmarkStart w:id="46" w:name="_Toc224148634"/>
       <w:r>
         <w:t>References</w:t>
       </w:r>
-      <w:bookmarkEnd w:id="43"/>
+      <w:bookmarkEnd w:id="46"/>
     </w:p>
     <w:p>
       <w:pPr>
@@ -10444,6 +11181,40 @@
       </w:r>
       <w:r>
         <w:t>, vol. 56, no. 12, pp. 3641–3658, Jun. 2001, doi: 10.1016/S0009-2509(01)00091-4.</w:t>
+      </w:r>
+    </w:p>
+    <w:p>
+      <w:pPr>
+        <w:pStyle w:val="Bibliography"/>
+      </w:pPr>
+      <w:r>
+        <w:t>[26]</w:t>
+      </w:r>
+      <w:r>
+        <w:tab/>
+        <w:t>Enerquip, ‘Tube side or shell side: Comparing fluid allocation options for your shell and tube heat exchanger’, Enerquip Thermal Solutions. Accessed: Apr. 08, 2026. [Online]. Available: https://www.enerquip.com/tubeside-or-shellside-comparing-fluid-allocation-options-for-your-shell-and-tube-heat-exchanger/</w:t>
+      </w:r>
+    </w:p>
+    <w:p>
+      <w:pPr>
+        <w:pStyle w:val="Bibliography"/>
+      </w:pPr>
+      <w:r>
+        <w:t>[27]</w:t>
+      </w:r>
+      <w:r>
+        <w:tab/>
+        <w:t xml:space="preserve">R. Sinnott and G. Towler, ‘Chapter 12 - Heat-transfer Equipment’, in </w:t>
+      </w:r>
+      <w:r>
+        <w:rPr>
+          <w:i/>
+          <w:iCs/>
+        </w:rPr>
+        <w:t>Chemical Engineering Design (Sixth Edition)</w:t>
+      </w:r>
+      <w:r>
+        <w:t>, SI., in Chemical Engineering. , 2020, pp. 773–927. doi: 10.1016/B978-0-08-102599-4.00012-6.</w:t>
       </w:r>
     </w:p>
     <w:p>
@@ -10524,7 +11295,7 @@
                     <pic:cNvPicPr/>
                   </pic:nvPicPr>
                   <pic:blipFill>
-                    <a:blip r:embed="rId30"/>
+                    <a:blip r:embed="rId33"/>
                     <a:stretch>
                       <a:fillRect/>
                     </a:stretch>
@@ -14962,19 +15733,6 @@
 </file>
 
 <file path=customXml/item2.xml><?xml version="1.0" encoding="utf-8"?>
-<?mso-contentType ?>
-<FormTemplates xmlns="http://schemas.microsoft.com/sharepoint/v3/contenttype/forms">
-  <Display>DocumentLibraryForm</Display>
-  <Edit>DocumentLibraryForm</Edit>
-  <New>DocumentLibraryForm</New>
-</FormTemplates>
-</file>
-
-<file path=customXml/item3.xml><?xml version="1.0" encoding="utf-8"?>
-<b:Sources xmlns:b="http://schemas.openxmlformats.org/officeDocument/2006/bibliography" xmlns="http://schemas.openxmlformats.org/officeDocument/2006/bibliography" SelectedStyle="\APASixthEditionOfficeOnline.xsl" StyleName="APA" Version="6"/>
-</file>
-
-<file path=customXml/item4.xml><?xml version="1.0" encoding="utf-8"?>
 <ct:contentTypeSchema xmlns:ct="http://schemas.microsoft.com/office/2006/metadata/contentType" xmlns:ma="http://schemas.microsoft.com/office/2006/metadata/properties/metaAttributes" ct:_="" ma:_="" ma:contentTypeName="Document" ma:contentTypeID="0x010100C107646D0035FA4C8F1F95DBA74C7670" ma:contentTypeVersion="18" ma:contentTypeDescription="Create a new document." ma:contentTypeScope="" ma:versionID="cee5fd123a01e1fbef544806d63a7bbe">
   <xsd:schema xmlns:xsd="http://www.w3.org/2001/XMLSchema" xmlns:xs="http://www.w3.org/2001/XMLSchema" xmlns:p="http://schemas.microsoft.com/office/2006/metadata/properties" xmlns:ns3="a169fe49-86d9-4b9f-a163-9271c3e82536" xmlns:ns4="9ec2d0b7-503f-4434-bd5e-691963e6366e" targetNamespace="http://schemas.microsoft.com/office/2006/metadata/properties" ma:root="true" ma:fieldsID="dda71d5f438c7df1ac194e497a63c795" ns3:_="" ns4:_="">
     <xsd:import namespace="a169fe49-86d9-4b9f-a163-9271c3e82536"/>
@@ -15227,6 +15985,19 @@
 </ct:contentTypeSchema>
 </file>
 
+<file path=customXml/item3.xml><?xml version="1.0" encoding="utf-8"?>
+<b:Sources xmlns:b="http://schemas.openxmlformats.org/officeDocument/2006/bibliography" xmlns="http://schemas.openxmlformats.org/officeDocument/2006/bibliography" SelectedStyle="\APASixthEditionOfficeOnline.xsl" StyleName="APA" Version="6"/>
+</file>
+
+<file path=customXml/item4.xml><?xml version="1.0" encoding="utf-8"?>
+<?mso-contentType ?>
+<FormTemplates xmlns="http://schemas.microsoft.com/sharepoint/v3/contenttype/forms">
+  <Display>DocumentLibraryForm</Display>
+  <Edit>DocumentLibraryForm</Edit>
+  <New>DocumentLibraryForm</New>
+</FormTemplates>
+</file>
+
 <file path=customXml/itemProps1.xml><?xml version="1.0" encoding="utf-8"?>
 <ds:datastoreItem xmlns:ds="http://schemas.openxmlformats.org/officeDocument/2006/customXml" ds:itemID="{2A4AFB90-AA70-40CB-8FEE-062855DEC269}">
   <ds:schemaRefs>
@@ -15238,22 +16009,6 @@
 </file>
 
 <file path=customXml/itemProps2.xml><?xml version="1.0" encoding="utf-8"?>
-<ds:datastoreItem xmlns:ds="http://schemas.openxmlformats.org/officeDocument/2006/customXml" ds:itemID="{04D26766-6D42-46FD-AE9C-F80BA223CA67}">
-  <ds:schemaRefs>
-    <ds:schemaRef ds:uri="http://schemas.microsoft.com/sharepoint/v3/contenttype/forms"/>
-  </ds:schemaRefs>
-</ds:datastoreItem>
-</file>
-
-<file path=customXml/itemProps3.xml><?xml version="1.0" encoding="utf-8"?>
-<ds:datastoreItem xmlns:ds="http://schemas.openxmlformats.org/officeDocument/2006/customXml" ds:itemID="{88749F4F-A6E8-4DC0-9276-CAFEB15C1658}">
-  <ds:schemaRefs>
-    <ds:schemaRef ds:uri="http://schemas.openxmlformats.org/officeDocument/2006/bibliography"/>
-  </ds:schemaRefs>
-</ds:datastoreItem>
-</file>
-
-<file path=customXml/itemProps4.xml><?xml version="1.0" encoding="utf-8"?>
 <ds:datastoreItem xmlns:ds="http://schemas.openxmlformats.org/officeDocument/2006/customXml" ds:itemID="{8D503597-69F4-42D1-91A8-F656D146B62B}">
   <ds:schemaRefs>
     <ds:schemaRef ds:uri="http://schemas.microsoft.com/office/2006/metadata/contentType"/>
@@ -15270,4 +16025,20 @@
     <ds:schemaRef ds:uri="http://schemas.microsoft.com/internal/obd"/>
   </ds:schemaRefs>
 </ds:datastoreItem>
+</file>
+
+<file path=customXml/itemProps3.xml><?xml version="1.0" encoding="utf-8"?>
+<ds:datastoreItem xmlns:ds="http://schemas.openxmlformats.org/officeDocument/2006/customXml" ds:itemID="{88749F4F-A6E8-4DC0-9276-CAFEB15C1658}">
+  <ds:schemaRefs>
+    <ds:schemaRef ds:uri="http://schemas.openxmlformats.org/officeDocument/2006/bibliography"/>
+  </ds:schemaRefs>
+</ds:datastoreItem>
+</file>
+
+<file path=customXml/itemProps4.xml><?xml version="1.0" encoding="utf-8"?>
+<ds:datastoreItem xmlns:ds="http://schemas.openxmlformats.org/officeDocument/2006/customXml" ds:itemID="{04D26766-6D42-46FD-AE9C-F80BA223CA67}">
+  <ds:schemaRefs>
+    <ds:schemaRef ds:uri="http://schemas.microsoft.com/sharepoint/v3/contenttype/forms"/>
+  </ds:schemaRefs>
+</ds:datastoreItem>
 </file>
</xml_diff>